<commit_message>
update manuscript on relevance of low Sc cloud
</commit_message>
<xml_diff>
--- a/doc/DiM_ms20260511.docx
+++ b/doc/DiM_ms20260511.docx
@@ -23,695 +23,513 @@
         <w:t xml:space="preserve"> tropical overturning circulation</w:t>
       </w:r>
     </w:p>
-    <w:p/>
     <w:p>
-      <w:r>
-        <w:t>Notes</w:t>
+      <w:pPr>
+        <w:pStyle w:val="Heading1"/>
+      </w:pPr>
+      <w:bookmarkStart w:id="1" w:name="abstract"/>
+      <w:r>
+        <w:t>Abstract</w:t>
       </w:r>
     </w:p>
     <w:p>
       <w:pPr>
-        <w:ind w:left="720"/>
+        <w:pStyle w:val="FirstParagraph"/>
+        <w:spacing w:line="276" w:lineRule="auto"/>
+        <w:rPr>
+          <w:rFonts w:ascii="Aptos" w:hAnsi="Aptos"/>
+        </w:rPr>
       </w:pPr>
       <w:r>
-        <w:t>The</w:t>
-      </w:r>
-      <w:r>
-        <w:t xml:space="preserve"> hypothesis </w:t>
-      </w:r>
-      <w:r>
-        <w:t xml:space="preserve">for </w:t>
-      </w:r>
-      <w:r>
-        <w:t xml:space="preserve">explaining shallow cumulus clouds </w:t>
-      </w:r>
-      <w:r>
-        <w:t xml:space="preserve">is called the </w:t>
-      </w:r>
-      <w:r>
-        <w:t xml:space="preserve">Dynamical Moisture </w:t>
-      </w:r>
-      <w:r>
-        <w:t>(</w:t>
-      </w:r>
-      <w:proofErr w:type="spellStart"/>
-      <w:r>
-        <w:t>DiM</w:t>
-      </w:r>
-      <w:proofErr w:type="spellEnd"/>
-      <w:r>
-        <w:t xml:space="preserve">) cloud </w:t>
-      </w:r>
-      <w:r>
-        <w:t>equilibrium</w:t>
-      </w:r>
-      <w:r>
-        <w:t>, choosing th</w:t>
-      </w:r>
-      <w:r>
+        <w:rPr>
+          <w:rFonts w:ascii="Aptos" w:hAnsi="Aptos"/>
+        </w:rPr>
+        <w:t xml:space="preserve">Shallow cumulus clouds affect Earth’s planetary albedo and cloud </w:t>
+      </w:r>
+      <w:proofErr w:type="gramStart"/>
+      <w:r>
+        <w:rPr>
+          <w:rFonts w:ascii="Aptos" w:hAnsi="Aptos"/>
+        </w:rPr>
+        <w:t>feedback, and</w:t>
+      </w:r>
+      <w:proofErr w:type="gramEnd"/>
+      <w:r>
+        <w:rPr>
+          <w:rFonts w:ascii="Aptos" w:hAnsi="Aptos"/>
+        </w:rPr>
+        <w:t xml:space="preserve"> explain climate model sensitivity to atmospheric CO</w:t>
+      </w:r>
+      <m:oMath>
+        <m:sSub>
+          <m:sSubPr>
+            <m:ctrlPr>
+              <w:rPr>
+                <w:rFonts w:ascii="Cambria Math" w:hAnsi="Cambria Math"/>
+              </w:rPr>
+            </m:ctrlPr>
+          </m:sSubPr>
+          <m:e>
+            <m:r>
+              <w:rPr>
+                <w:rFonts w:ascii="Cambria Math" w:hAnsi="Cambria Math"/>
+              </w:rPr>
+              <m:t>​</m:t>
+            </m:r>
+          </m:e>
+          <m:sub>
+            <m:r>
+              <w:rPr>
+                <w:rFonts w:ascii="Cambria Math" w:hAnsi="Cambria Math"/>
+              </w:rPr>
+              <m:t>2</m:t>
+            </m:r>
+          </m:sub>
+        </m:sSub>
+      </m:oMath>
+      <w:r>
+        <w:rPr>
+          <w:rFonts w:ascii="Aptos" w:hAnsi="Aptos"/>
+        </w:rPr>
+        <w:t xml:space="preserve">. </w:t>
+      </w:r>
+      <w:r>
+        <w:rPr>
+          <w:rFonts w:ascii="Aptos" w:hAnsi="Aptos"/>
+        </w:rPr>
+        <w:t>I</w:t>
+      </w:r>
+      <w:r>
+        <w:rPr>
+          <w:rFonts w:ascii="Aptos" w:hAnsi="Aptos"/>
+        </w:rPr>
+        <w:t xml:space="preserve">ncreased vertical mixing </w:t>
+      </w:r>
+      <w:r>
+        <w:rPr>
+          <w:rFonts w:ascii="Aptos" w:hAnsi="Aptos"/>
+        </w:rPr>
+        <w:t xml:space="preserve">was previously proposed to </w:t>
+      </w:r>
+      <w:r>
+        <w:rPr>
+          <w:rFonts w:ascii="Aptos" w:hAnsi="Aptos"/>
+        </w:rPr>
+        <w:t xml:space="preserve">reduce cloud </w:t>
+      </w:r>
+      <w:r>
+        <w:rPr>
+          <w:rFonts w:ascii="Aptos" w:hAnsi="Aptos"/>
+        </w:rPr>
+        <w:t>area</w:t>
+      </w:r>
+      <w:r>
+        <w:rPr>
+          <w:rFonts w:ascii="Aptos" w:hAnsi="Aptos"/>
+        </w:rPr>
+        <w:t xml:space="preserve"> by desiccating the relative humidity of the shallow cumulus layer</w:t>
+      </w:r>
+      <w:r>
+        <w:rPr>
+          <w:rFonts w:ascii="Aptos" w:hAnsi="Aptos"/>
+        </w:rPr>
+        <w:t xml:space="preserve">. </w:t>
+      </w:r>
+      <w:r>
+        <w:rPr>
+          <w:rFonts w:ascii="Aptos" w:hAnsi="Aptos"/>
+        </w:rPr>
+        <w:t>R</w:t>
+      </w:r>
+      <w:r>
+        <w:rPr>
+          <w:rFonts w:ascii="Aptos" w:hAnsi="Aptos"/>
+        </w:rPr>
+        <w:t xml:space="preserve">ecent </w:t>
+      </w:r>
+      <w:r>
+        <w:rPr>
+          <w:rFonts w:ascii="Aptos" w:hAnsi="Aptos"/>
+        </w:rPr>
+        <w:t xml:space="preserve">observations </w:t>
+      </w:r>
+      <w:r>
+        <w:rPr>
+          <w:rFonts w:ascii="Aptos" w:hAnsi="Aptos"/>
+        </w:rPr>
+        <w:t>refut</w:t>
+      </w:r>
+      <w:r>
+        <w:rPr>
+          <w:rFonts w:ascii="Aptos" w:hAnsi="Aptos"/>
+        </w:rPr>
+        <w:t>e</w:t>
+      </w:r>
+      <w:r>
+        <w:rPr>
+          <w:rFonts w:ascii="Aptos" w:hAnsi="Aptos"/>
+        </w:rPr>
+        <w:t xml:space="preserve"> th</w:t>
+      </w:r>
+      <w:r>
+        <w:rPr>
+          <w:rFonts w:ascii="Aptos" w:hAnsi="Aptos"/>
+        </w:rPr>
         <w:t>is</w:t>
       </w:r>
       <w:r>
+        <w:rPr>
+          <w:rFonts w:ascii="Aptos" w:hAnsi="Aptos"/>
+        </w:rPr>
+        <w:t xml:space="preserve"> desic</w:t>
+      </w:r>
+      <w:r>
+        <w:rPr>
+          <w:rFonts w:ascii="Aptos" w:hAnsi="Aptos"/>
+        </w:rPr>
+        <w:t>c</w:t>
+      </w:r>
+      <w:r>
+        <w:rPr>
+          <w:rFonts w:ascii="Aptos" w:hAnsi="Aptos"/>
+        </w:rPr>
+        <w:t>ation hypothesis</w:t>
+      </w:r>
+      <w:r>
+        <w:rPr>
+          <w:rFonts w:ascii="Aptos" w:hAnsi="Aptos"/>
+        </w:rPr>
+        <w:t xml:space="preserve"> by </w:t>
+      </w:r>
+      <w:r>
+        <w:rPr>
+          <w:rFonts w:ascii="Aptos" w:hAnsi="Aptos"/>
+        </w:rPr>
+        <w:t>showing that</w:t>
+      </w:r>
+      <w:r>
+        <w:rPr>
+          <w:rFonts w:ascii="Aptos" w:hAnsi="Aptos"/>
+        </w:rPr>
+        <w:t xml:space="preserve"> mass flux rather than humidity explains mesoscale</w:t>
+      </w:r>
+      <w:r>
+        <w:rPr>
+          <w:rFonts w:ascii="Aptos" w:hAnsi="Aptos"/>
+        </w:rPr>
         <w:t xml:space="preserve"> </w:t>
       </w:r>
       <w:r>
-        <w:t>mnemonic acronym</w:t>
-      </w:r>
-      <w:r>
-        <w:t xml:space="preserve"> because </w:t>
-      </w:r>
-      <w:r>
-        <w:t>the reduction of clous</w:t>
-      </w:r>
-      <w:r>
+        <w:rPr>
+          <w:rFonts w:ascii="Aptos" w:hAnsi="Aptos"/>
+        </w:rPr>
+        <w:t>cloud</w:t>
+      </w:r>
+      <w:r>
+        <w:rPr>
+          <w:rFonts w:ascii="Aptos" w:hAnsi="Aptos"/>
+        </w:rPr>
         <w:t xml:space="preserve"> </w:t>
       </w:r>
-      <w:r>
-        <w:rPr>
-          <w:i/>
-          <w:iCs/>
-        </w:rPr>
-        <w:t>dim</w:t>
-      </w:r>
-      <w:r>
-        <w:rPr>
-          <w:i/>
-          <w:iCs/>
-        </w:rPr>
-        <w:t xml:space="preserve">s </w:t>
-      </w:r>
-      <w:r>
-        <w:t>the planetary albedo</w:t>
-      </w:r>
-      <w:r>
-        <w:t>.</w:t>
-      </w:r>
-    </w:p>
-    <w:p>
-      <w:pPr>
-        <w:ind w:left="720"/>
-      </w:pPr>
-      <w:r>
-        <w:t xml:space="preserve">This behavior should be found in climate models. The hypothesis provides a way to narrow the expected spread of climate </w:t>
-      </w:r>
       <w:proofErr w:type="gramStart"/>
       <w:r>
-        <w:t>feedbacks</w:t>
+        <w:rPr>
+          <w:rFonts w:ascii="Aptos" w:hAnsi="Aptos"/>
+        </w:rPr>
+        <w:t>area</w:t>
+      </w:r>
+      <w:r>
+        <w:rPr>
+          <w:rFonts w:ascii="Aptos" w:hAnsi="Aptos"/>
+        </w:rPr>
+        <w:t>, and</w:t>
       </w:r>
       <w:proofErr w:type="gramEnd"/>
       <w:r>
-        <w:t xml:space="preserve"> from climate models. We should be able to look at climate </w:t>
+        <w:rPr>
+          <w:rFonts w:ascii="Aptos" w:hAnsi="Aptos"/>
+        </w:rPr>
+        <w:t xml:space="preserve"> </w:t>
+      </w:r>
+      <w:r>
+        <w:rPr>
+          <w:rFonts w:ascii="Aptos" w:hAnsi="Aptos"/>
+        </w:rPr>
+        <w:t>show t</w:t>
+      </w:r>
+      <w:r>
+        <w:rPr>
+          <w:rFonts w:ascii="Aptos" w:hAnsi="Aptos"/>
+        </w:rPr>
+        <w:t>hat m</w:t>
+      </w:r>
+      <w:r>
+        <w:rPr>
+          <w:rFonts w:ascii="Aptos" w:hAnsi="Aptos"/>
+        </w:rPr>
+        <w:t xml:space="preserve">odels </w:t>
+      </w:r>
+      <w:r>
+        <w:rPr>
+          <w:rFonts w:ascii="Aptos" w:hAnsi="Aptos"/>
+        </w:rPr>
+        <w:t>reproducing</w:t>
+      </w:r>
+      <w:r>
+        <w:rPr>
+          <w:rFonts w:ascii="Aptos" w:hAnsi="Aptos"/>
+        </w:rPr>
+        <w:t xml:space="preserve"> </w:t>
+      </w:r>
+      <w:r>
+        <w:rPr>
+          <w:rFonts w:ascii="Aptos" w:hAnsi="Aptos"/>
+        </w:rPr>
+        <w:t xml:space="preserve">this mesoscale </w:t>
+      </w:r>
+      <w:r>
+        <w:rPr>
+          <w:rFonts w:ascii="Aptos" w:hAnsi="Aptos"/>
+        </w:rPr>
+        <w:t xml:space="preserve">correlation have weaker </w:t>
+      </w:r>
+      <w:r>
+        <w:rPr>
+          <w:rFonts w:ascii="Aptos" w:hAnsi="Aptos"/>
+        </w:rPr>
+        <w:t xml:space="preserve">climate sensitivity. </w:t>
+      </w:r>
+      <w:r>
+        <w:rPr>
+          <w:rFonts w:ascii="Aptos" w:hAnsi="Aptos"/>
+        </w:rPr>
+        <w:t>Here</w:t>
+      </w:r>
+      <w:r>
+        <w:rPr>
+          <w:rFonts w:ascii="Aptos" w:hAnsi="Aptos"/>
+        </w:rPr>
+        <w:t xml:space="preserve"> we predict a decrease of shallow cumulus cloud fraction using a heuristic </w:t>
+      </w:r>
+      <w:r>
+        <w:rPr>
+          <w:rFonts w:ascii="Aptos" w:hAnsi="Aptos"/>
+        </w:rPr>
+        <w:t xml:space="preserve">model </w:t>
+      </w:r>
+      <w:r>
+        <w:rPr>
+          <w:rFonts w:ascii="Aptos" w:hAnsi="Aptos"/>
+        </w:rPr>
+        <w:t>of</w:t>
+      </w:r>
+      <w:r>
+        <w:rPr>
+          <w:rFonts w:ascii="Aptos" w:hAnsi="Aptos"/>
+        </w:rPr>
+        <w:t xml:space="preserve"> clouds </w:t>
+      </w:r>
+      <w:r>
+        <w:rPr>
+          <w:rFonts w:ascii="Aptos" w:hAnsi="Aptos"/>
+        </w:rPr>
+        <w:t>whose</w:t>
+      </w:r>
+      <w:r>
+        <w:rPr>
+          <w:rFonts w:ascii="Aptos" w:hAnsi="Aptos"/>
+        </w:rPr>
+        <w:t xml:space="preserve"> moisture flux balances</w:t>
+      </w:r>
+      <w:r>
+        <w:rPr>
+          <w:rFonts w:ascii="Aptos" w:hAnsi="Aptos"/>
+        </w:rPr>
+        <w:t xml:space="preserve"> </w:t>
+      </w:r>
+      <w:r>
+        <w:rPr>
+          <w:rFonts w:ascii="Aptos" w:hAnsi="Aptos"/>
+        </w:rPr>
+        <w:t>the</w:t>
+      </w:r>
+      <w:r>
+        <w:rPr>
+          <w:rFonts w:ascii="Aptos" w:hAnsi="Aptos"/>
+        </w:rPr>
+        <w:t xml:space="preserve"> drying by </w:t>
+      </w:r>
+      <w:r>
+        <w:rPr>
+          <w:rFonts w:ascii="Aptos" w:hAnsi="Aptos"/>
+        </w:rPr>
+        <w:t xml:space="preserve">the </w:t>
+      </w:r>
+      <w:r>
+        <w:rPr>
+          <w:rFonts w:ascii="Aptos" w:hAnsi="Aptos"/>
+        </w:rPr>
+        <w:t xml:space="preserve">large-scale </w:t>
+      </w:r>
+      <w:r>
+        <w:rPr>
+          <w:rFonts w:ascii="Aptos" w:hAnsi="Aptos"/>
+        </w:rPr>
+        <w:t>tropical atmospheric overturning</w:t>
+      </w:r>
+      <w:r>
+        <w:rPr>
+          <w:rFonts w:ascii="Aptos" w:hAnsi="Aptos"/>
+        </w:rPr>
+        <w:t xml:space="preserve"> circulation</w:t>
+      </w:r>
+      <w:r>
+        <w:rPr>
+          <w:rFonts w:ascii="Aptos" w:hAnsi="Aptos"/>
+        </w:rPr>
+        <w:t xml:space="preserve">. </w:t>
+      </w:r>
+      <w:r>
+        <w:rPr>
+          <w:rFonts w:ascii="Aptos" w:hAnsi="Aptos"/>
+        </w:rPr>
+        <w:t>Th</w:t>
+      </w:r>
+      <w:r>
+        <w:rPr>
+          <w:rFonts w:ascii="Aptos" w:hAnsi="Aptos"/>
+        </w:rPr>
+        <w:t xml:space="preserve">e </w:t>
+      </w:r>
+      <w:r>
+        <w:rPr>
+          <w:rFonts w:ascii="Aptos" w:hAnsi="Aptos"/>
+        </w:rPr>
+        <w:t xml:space="preserve">moisture balance predicts clouds decrease </w:t>
+      </w:r>
+      <w:r>
+        <w:rPr>
+          <w:rFonts w:ascii="Aptos" w:hAnsi="Aptos"/>
+        </w:rPr>
+        <w:t xml:space="preserve">with warming in </w:t>
+      </w:r>
+      <w:r>
+        <w:rPr>
+          <w:rFonts w:ascii="Aptos" w:hAnsi="Aptos"/>
+        </w:rPr>
+        <w:t>proportion</w:t>
+      </w:r>
+      <w:r>
+        <w:rPr>
+          <w:rFonts w:ascii="Aptos" w:hAnsi="Aptos"/>
+        </w:rPr>
+        <w:t xml:space="preserve"> to</w:t>
+      </w:r>
+      <w:r>
+        <w:rPr>
+          <w:rFonts w:ascii="Aptos" w:hAnsi="Aptos"/>
+        </w:rPr>
+        <w:t xml:space="preserve"> the </w:t>
       </w:r>
       <w:proofErr w:type="gramStart"/>
       <w:r>
-        <w:t>feedbacks</w:t>
+        <w:rPr>
+          <w:rFonts w:ascii="Aptos" w:hAnsi="Aptos"/>
+        </w:rPr>
+        <w:t>large scale</w:t>
       </w:r>
       <w:proofErr w:type="gramEnd"/>
       <w:r>
-        <w:t xml:space="preserve"> in models and say which of them is consistent.</w:t>
-      </w:r>
-      <w:r>
+        <w:rPr>
+          <w:rFonts w:ascii="Aptos" w:hAnsi="Aptos"/>
+        </w:rPr>
+        <w:t xml:space="preserve"> circulation</w:t>
+      </w:r>
+      <w:r>
+        <w:rPr>
+          <w:rFonts w:ascii="Aptos" w:hAnsi="Aptos"/>
+        </w:rPr>
+        <w:t xml:space="preserve">, which in turn decreases </w:t>
+      </w:r>
+      <w:r>
+        <w:rPr>
+          <w:rFonts w:ascii="Aptos" w:hAnsi="Aptos"/>
+        </w:rPr>
+        <w:t>5 % K</w:t>
+      </w:r>
+      <w:r>
+        <w:rPr>
+          <w:rFonts w:ascii="Aptos" w:hAnsi="Aptos"/>
+          <w:vertAlign w:val="superscript"/>
+        </w:rPr>
+        <w:t>-1</w:t>
+      </w:r>
+      <w:r>
+        <w:rPr>
+          <w:rFonts w:ascii="Aptos" w:hAnsi="Aptos"/>
+        </w:rPr>
         <w:t xml:space="preserve"> </w:t>
       </w:r>
       <w:r>
-        <w:t xml:space="preserve">Models that are inconsistent with the </w:t>
-      </w:r>
-      <w:proofErr w:type="spellStart"/>
-      <w:r>
-        <w:t>DiM</w:t>
-      </w:r>
-      <w:proofErr w:type="spellEnd"/>
-      <w:r>
-        <w:t xml:space="preserve"> hypothesis require further explanation.</w:t>
-      </w:r>
-    </w:p>
-    <w:p>
-      <w:pPr>
-        <w:ind w:left="720"/>
-        <w:rPr>
-          <w:noProof/>
-        </w:rPr>
-      </w:pPr>
-      <w:r>
-        <w:t>An-Yi is downloading ISCCP cloud fraction, cumulus mass flux (</w:t>
-      </w:r>
-      <w:r>
-        <w:rPr>
-          <w:rFonts w:ascii="ComicShannsMono Nerd Font" w:hAnsi="ComicShannsMono Nerd Font"/>
-        </w:rPr>
-        <w:t>cm</w:t>
-      </w:r>
-      <w:r>
-        <w:t xml:space="preserve">), and mean vertical velocity variables from </w:t>
-      </w:r>
-      <w:proofErr w:type="spellStart"/>
-      <w:r>
-        <w:rPr>
-          <w:rFonts w:ascii="ComicShannsMono Nerd Font" w:hAnsi="ComicShannsMono Nerd Font"/>
-        </w:rPr>
-        <w:t>amip</w:t>
-      </w:r>
-      <w:proofErr w:type="spellEnd"/>
-      <w:r>
-        <w:t xml:space="preserve"> (historical) and </w:t>
-      </w:r>
-      <w:r>
-        <w:rPr>
-          <w:rFonts w:ascii="ComicShannsMono Nerd Font" w:hAnsi="ComicShannsMono Nerd Font"/>
-        </w:rPr>
-        <w:t>amip-p4k</w:t>
-      </w:r>
-      <w:r>
-        <w:t xml:space="preserve"> (historical SST + 4 K) from the 5 models where they are available in the CMIP6/CFMIP archive.</w:t>
-      </w:r>
-    </w:p>
-    <w:p>
-      <w:pPr>
-        <w:ind w:left="720"/>
-      </w:pPr>
+        <w:rPr>
+          <w:rFonts w:ascii="Aptos" w:hAnsi="Aptos"/>
+        </w:rPr>
+        <w:t xml:space="preserve">surface temperature </w:t>
+      </w:r>
+      <w:r>
+        <w:rPr>
+          <w:rFonts w:ascii="Aptos" w:hAnsi="Aptos"/>
+        </w:rPr>
+        <w:t>by energetics</w:t>
+      </w:r>
+      <w:r>
+        <w:rPr>
+          <w:rFonts w:ascii="Aptos" w:hAnsi="Aptos"/>
+        </w:rPr>
+        <w:t xml:space="preserve">. </w:t>
+      </w:r>
+      <w:r>
+        <w:rPr>
+          <w:rFonts w:ascii="Aptos" w:hAnsi="Aptos"/>
+        </w:rPr>
+        <w:t xml:space="preserve">Tuned to </w:t>
+      </w:r>
+      <w:r>
+        <w:rPr>
+          <w:rFonts w:ascii="Aptos" w:hAnsi="Aptos"/>
+        </w:rPr>
+        <w:t xml:space="preserve">the </w:t>
+      </w:r>
+      <w:r>
+        <w:rPr>
+          <w:rFonts w:ascii="Aptos" w:hAnsi="Aptos"/>
+        </w:rPr>
+        <w:t xml:space="preserve">observed </w:t>
+      </w:r>
+      <w:r>
+        <w:rPr>
+          <w:rFonts w:ascii="Aptos" w:hAnsi="Aptos"/>
+        </w:rPr>
+        <w:t xml:space="preserve">moisture budget and </w:t>
+      </w:r>
+      <w:r>
+        <w:rPr>
+          <w:rFonts w:ascii="Aptos" w:hAnsi="Aptos"/>
+        </w:rPr>
+        <w:t xml:space="preserve">cloud top height distribution, the cloud model independently </w:t>
+      </w:r>
+      <w:r>
+        <w:rPr>
+          <w:rFonts w:ascii="Aptos" w:hAnsi="Aptos"/>
+        </w:rPr>
+        <w:t>reproduces the mesoscale correlation of cloud fraction to cloud base mass flux found over the northeastern tropical Atlantic Ocean in EUREC4A.</w:t>
+      </w:r>
     </w:p>
     <w:p>
       <w:pPr>
         <w:pStyle w:val="Heading1"/>
       </w:pPr>
-      <w:bookmarkStart w:id="1" w:name="abstract"/>
-      <w:r>
-        <w:t>Abstract</w:t>
-      </w:r>
-    </w:p>
-    <w:p>
-      <w:pPr>
-        <w:pStyle w:val="FirstParagraph"/>
-        <w:spacing w:line="276" w:lineRule="auto"/>
-        <w:rPr>
-          <w:rFonts w:ascii="Aptos" w:hAnsi="Aptos"/>
-        </w:rPr>
-      </w:pPr>
-      <w:r>
-        <w:rPr>
-          <w:rFonts w:ascii="Aptos" w:hAnsi="Aptos"/>
-        </w:rPr>
-        <w:t xml:space="preserve">Shallow cumulus clouds affect Earth’s planetary albedo and cloud </w:t>
-      </w:r>
-      <w:proofErr w:type="gramStart"/>
-      <w:r>
-        <w:rPr>
-          <w:rFonts w:ascii="Aptos" w:hAnsi="Aptos"/>
-        </w:rPr>
-        <w:t>feedback, and</w:t>
-      </w:r>
-      <w:proofErr w:type="gramEnd"/>
-      <w:r>
-        <w:rPr>
-          <w:rFonts w:ascii="Aptos" w:hAnsi="Aptos"/>
-        </w:rPr>
-        <w:t xml:space="preserve"> explain climate model sensitivity to atmospheric CO</w:t>
-      </w:r>
-      <m:oMath>
-        <m:sSub>
-          <m:sSubPr>
-            <m:ctrlPr>
-              <w:rPr>
-                <w:rFonts w:ascii="Cambria Math" w:hAnsi="Cambria Math"/>
-              </w:rPr>
-            </m:ctrlPr>
-          </m:sSubPr>
-          <m:e>
-            <m:r>
-              <w:rPr>
-                <w:rFonts w:ascii="Cambria Math" w:hAnsi="Cambria Math"/>
-              </w:rPr>
-              <m:t>​</m:t>
-            </m:r>
-          </m:e>
-          <m:sub>
-            <m:r>
-              <w:rPr>
-                <w:rFonts w:ascii="Cambria Math" w:hAnsi="Cambria Math"/>
-              </w:rPr>
-              <m:t>2</m:t>
-            </m:r>
-          </m:sub>
-        </m:sSub>
-      </m:oMath>
-      <w:r>
-        <w:rPr>
-          <w:rFonts w:ascii="Aptos" w:hAnsi="Aptos"/>
-        </w:rPr>
-        <w:t xml:space="preserve">. </w:t>
-      </w:r>
-      <w:r>
-        <w:rPr>
-          <w:rFonts w:ascii="Aptos" w:hAnsi="Aptos"/>
-        </w:rPr>
-        <w:t>I</w:t>
-      </w:r>
-      <w:r>
-        <w:rPr>
-          <w:rFonts w:ascii="Aptos" w:hAnsi="Aptos"/>
-        </w:rPr>
-        <w:t xml:space="preserve">ncreased vertical mixing </w:t>
-      </w:r>
-      <w:r>
-        <w:rPr>
-          <w:rFonts w:ascii="Aptos" w:hAnsi="Aptos"/>
-        </w:rPr>
-        <w:t xml:space="preserve">was previously proposed to </w:t>
-      </w:r>
-      <w:r>
-        <w:rPr>
-          <w:rFonts w:ascii="Aptos" w:hAnsi="Aptos"/>
-        </w:rPr>
-        <w:t xml:space="preserve">reduce cloud </w:t>
-      </w:r>
-      <w:r>
-        <w:rPr>
-          <w:rFonts w:ascii="Aptos" w:hAnsi="Aptos"/>
-        </w:rPr>
-        <w:t>area</w:t>
-      </w:r>
-      <w:r>
-        <w:rPr>
-          <w:rFonts w:ascii="Aptos" w:hAnsi="Aptos"/>
-        </w:rPr>
-        <w:t xml:space="preserve"> by desiccating the relative humidity of the shallow cumulus layer</w:t>
-      </w:r>
-      <w:r>
-        <w:rPr>
-          <w:rFonts w:ascii="Aptos" w:hAnsi="Aptos"/>
-        </w:rPr>
-        <w:t xml:space="preserve">. </w:t>
-      </w:r>
-      <w:r>
-        <w:rPr>
-          <w:rFonts w:ascii="Aptos" w:hAnsi="Aptos"/>
-        </w:rPr>
-        <w:t>R</w:t>
-      </w:r>
-      <w:r>
-        <w:rPr>
-          <w:rFonts w:ascii="Aptos" w:hAnsi="Aptos"/>
-        </w:rPr>
-        <w:t xml:space="preserve">ecent </w:t>
-      </w:r>
-      <w:r>
-        <w:rPr>
-          <w:rFonts w:ascii="Aptos" w:hAnsi="Aptos"/>
-        </w:rPr>
-        <w:t xml:space="preserve">observations </w:t>
-      </w:r>
-      <w:r>
-        <w:rPr>
-          <w:rFonts w:ascii="Aptos" w:hAnsi="Aptos"/>
-        </w:rPr>
-        <w:t>refut</w:t>
-      </w:r>
-      <w:r>
-        <w:rPr>
-          <w:rFonts w:ascii="Aptos" w:hAnsi="Aptos"/>
-        </w:rPr>
-        <w:t>e</w:t>
-      </w:r>
-      <w:r>
-        <w:rPr>
-          <w:rFonts w:ascii="Aptos" w:hAnsi="Aptos"/>
-        </w:rPr>
-        <w:t xml:space="preserve"> th</w:t>
-      </w:r>
-      <w:r>
-        <w:rPr>
-          <w:rFonts w:ascii="Aptos" w:hAnsi="Aptos"/>
-        </w:rPr>
-        <w:t>is</w:t>
-      </w:r>
-      <w:r>
-        <w:rPr>
-          <w:rFonts w:ascii="Aptos" w:hAnsi="Aptos"/>
-        </w:rPr>
-        <w:t xml:space="preserve"> desic</w:t>
-      </w:r>
-      <w:r>
-        <w:rPr>
-          <w:rFonts w:ascii="Aptos" w:hAnsi="Aptos"/>
-        </w:rPr>
-        <w:t>c</w:t>
-      </w:r>
-      <w:r>
-        <w:rPr>
-          <w:rFonts w:ascii="Aptos" w:hAnsi="Aptos"/>
-        </w:rPr>
-        <w:t>ation hypothesis</w:t>
-      </w:r>
-      <w:r>
-        <w:rPr>
-          <w:rFonts w:ascii="Aptos" w:hAnsi="Aptos"/>
-        </w:rPr>
-        <w:t xml:space="preserve"> </w:t>
-      </w:r>
-      <w:proofErr w:type="spellStart"/>
-      <w:r>
-        <w:rPr>
-          <w:rFonts w:ascii="Aptos" w:hAnsi="Aptos"/>
-        </w:rPr>
-        <w:t xml:space="preserve">by </w:t>
-      </w:r>
-      <w:r>
-        <w:rPr>
-          <w:rFonts w:ascii="Aptos" w:hAnsi="Aptos"/>
-        </w:rPr>
-        <w:t>showin</w:t>
-      </w:r>
-      <w:proofErr w:type="spellEnd"/>
-      <w:r>
-        <w:rPr>
-          <w:rFonts w:ascii="Aptos" w:hAnsi="Aptos"/>
-        </w:rPr>
-        <w:t>g that</w:t>
-      </w:r>
-      <w:r>
-        <w:rPr>
-          <w:rFonts w:ascii="Aptos" w:hAnsi="Aptos"/>
-        </w:rPr>
-        <w:t xml:space="preserve"> mass flux rather than humidity explains mesoscale</w:t>
-      </w:r>
-      <w:r>
-        <w:rPr>
-          <w:rFonts w:ascii="Aptos" w:hAnsi="Aptos"/>
-        </w:rPr>
-        <w:t xml:space="preserve"> </w:t>
-      </w:r>
-      <w:r>
-        <w:rPr>
-          <w:rFonts w:ascii="Aptos" w:hAnsi="Aptos"/>
-        </w:rPr>
-        <w:t>cloud</w:t>
-      </w:r>
-      <w:r>
-        <w:rPr>
-          <w:rFonts w:ascii="Aptos" w:hAnsi="Aptos"/>
-        </w:rPr>
-        <w:t xml:space="preserve"> </w:t>
-      </w:r>
-      <w:proofErr w:type="gramStart"/>
-      <w:r>
-        <w:rPr>
-          <w:rFonts w:ascii="Aptos" w:hAnsi="Aptos"/>
-        </w:rPr>
-        <w:t>area</w:t>
-      </w:r>
-      <w:r>
-        <w:rPr>
-          <w:rFonts w:ascii="Aptos" w:hAnsi="Aptos"/>
-        </w:rPr>
-        <w:t>, and</w:t>
-      </w:r>
-      <w:proofErr w:type="gramEnd"/>
-      <w:r>
-        <w:rPr>
-          <w:rFonts w:ascii="Aptos" w:hAnsi="Aptos"/>
-        </w:rPr>
-        <w:t xml:space="preserve"> </w:t>
-      </w:r>
-      <w:r>
-        <w:rPr>
-          <w:rFonts w:ascii="Aptos" w:hAnsi="Aptos"/>
-        </w:rPr>
-        <w:t>show t</w:t>
-      </w:r>
-      <w:r>
-        <w:rPr>
-          <w:rFonts w:ascii="Aptos" w:hAnsi="Aptos"/>
-        </w:rPr>
-        <w:t>hat m</w:t>
-      </w:r>
-      <w:r>
-        <w:rPr>
-          <w:rFonts w:ascii="Aptos" w:hAnsi="Aptos"/>
-        </w:rPr>
-        <w:t xml:space="preserve">odels </w:t>
-      </w:r>
-      <w:r>
-        <w:rPr>
-          <w:rFonts w:ascii="Aptos" w:hAnsi="Aptos"/>
-        </w:rPr>
-        <w:t>reproducing</w:t>
-      </w:r>
-      <w:r>
-        <w:rPr>
-          <w:rFonts w:ascii="Aptos" w:hAnsi="Aptos"/>
-        </w:rPr>
-        <w:t xml:space="preserve"> </w:t>
-      </w:r>
-      <w:r>
-        <w:rPr>
-          <w:rFonts w:ascii="Aptos" w:hAnsi="Aptos"/>
-        </w:rPr>
-        <w:t xml:space="preserve">this mesoscale </w:t>
-      </w:r>
-      <w:r>
-        <w:rPr>
-          <w:rFonts w:ascii="Aptos" w:hAnsi="Aptos"/>
-        </w:rPr>
-        <w:t xml:space="preserve">correlation have weaker </w:t>
-      </w:r>
-      <w:r>
-        <w:rPr>
-          <w:rFonts w:ascii="Aptos" w:hAnsi="Aptos"/>
-        </w:rPr>
-        <w:t xml:space="preserve">climate sensitivity. </w:t>
-      </w:r>
-      <w:r>
-        <w:rPr>
-          <w:rFonts w:ascii="Aptos" w:hAnsi="Aptos"/>
-        </w:rPr>
-        <w:t>Here</w:t>
-      </w:r>
-      <w:r>
-        <w:rPr>
-          <w:rFonts w:ascii="Aptos" w:hAnsi="Aptos"/>
-        </w:rPr>
-        <w:t xml:space="preserve"> we predict a decrease of shallow cumulus cloud fraction using a heuristic </w:t>
-      </w:r>
-      <w:r>
-        <w:rPr>
-          <w:rFonts w:ascii="Aptos" w:hAnsi="Aptos"/>
-        </w:rPr>
-        <w:t xml:space="preserve">model </w:t>
-      </w:r>
-      <w:r>
-        <w:rPr>
-          <w:rFonts w:ascii="Aptos" w:hAnsi="Aptos"/>
-        </w:rPr>
-        <w:t>of</w:t>
-      </w:r>
-      <w:r>
-        <w:rPr>
-          <w:rFonts w:ascii="Aptos" w:hAnsi="Aptos"/>
-        </w:rPr>
-        <w:t xml:space="preserve"> clouds </w:t>
-      </w:r>
-      <w:r>
-        <w:rPr>
-          <w:rFonts w:ascii="Aptos" w:hAnsi="Aptos"/>
-        </w:rPr>
-        <w:t>whose</w:t>
-      </w:r>
-      <w:r>
-        <w:rPr>
-          <w:rFonts w:ascii="Aptos" w:hAnsi="Aptos"/>
-        </w:rPr>
-        <w:t xml:space="preserve"> moisture flux balances</w:t>
-      </w:r>
-      <w:r>
-        <w:rPr>
-          <w:rFonts w:ascii="Aptos" w:hAnsi="Aptos"/>
-        </w:rPr>
-        <w:t xml:space="preserve"> </w:t>
-      </w:r>
-      <w:r>
-        <w:rPr>
-          <w:rFonts w:ascii="Aptos" w:hAnsi="Aptos"/>
-        </w:rPr>
-        <w:t>the</w:t>
-      </w:r>
-      <w:r>
-        <w:rPr>
-          <w:rFonts w:ascii="Aptos" w:hAnsi="Aptos"/>
-        </w:rPr>
-        <w:t xml:space="preserve"> drying by </w:t>
-      </w:r>
-      <w:r>
-        <w:rPr>
-          <w:rFonts w:ascii="Aptos" w:hAnsi="Aptos"/>
-        </w:rPr>
-        <w:t xml:space="preserve">the </w:t>
-      </w:r>
-      <w:r>
-        <w:rPr>
-          <w:rFonts w:ascii="Aptos" w:hAnsi="Aptos"/>
-        </w:rPr>
-        <w:t xml:space="preserve">large-scale </w:t>
-      </w:r>
-      <w:r>
-        <w:rPr>
-          <w:rFonts w:ascii="Aptos" w:hAnsi="Aptos"/>
-        </w:rPr>
-        <w:t>tropical atmospheric overturning</w:t>
-      </w:r>
-      <w:r>
-        <w:rPr>
-          <w:rFonts w:ascii="Aptos" w:hAnsi="Aptos"/>
-        </w:rPr>
-        <w:t xml:space="preserve"> circulation</w:t>
-      </w:r>
-      <w:r>
-        <w:rPr>
-          <w:rFonts w:ascii="Aptos" w:hAnsi="Aptos"/>
-        </w:rPr>
-        <w:t xml:space="preserve">. </w:t>
-      </w:r>
-      <w:r>
-        <w:rPr>
-          <w:rFonts w:ascii="Aptos" w:hAnsi="Aptos"/>
-        </w:rPr>
-        <w:t>Th</w:t>
-      </w:r>
-      <w:r>
-        <w:rPr>
-          <w:rFonts w:ascii="Aptos" w:hAnsi="Aptos"/>
-        </w:rPr>
-        <w:t xml:space="preserve">e </w:t>
-      </w:r>
-      <w:r>
-        <w:rPr>
-          <w:rFonts w:ascii="Aptos" w:hAnsi="Aptos"/>
-        </w:rPr>
-        <w:t xml:space="preserve">moisture balance predicts clouds decrease </w:t>
-      </w:r>
-      <w:r>
-        <w:rPr>
-          <w:rFonts w:ascii="Aptos" w:hAnsi="Aptos"/>
-        </w:rPr>
-        <w:t xml:space="preserve">with warming in </w:t>
-      </w:r>
-      <w:r>
-        <w:rPr>
-          <w:rFonts w:ascii="Aptos" w:hAnsi="Aptos"/>
-        </w:rPr>
-        <w:t>proportion</w:t>
-      </w:r>
-      <w:r>
-        <w:rPr>
-          <w:rFonts w:ascii="Aptos" w:hAnsi="Aptos"/>
-        </w:rPr>
-        <w:t xml:space="preserve"> to</w:t>
-      </w:r>
-      <w:r>
-        <w:rPr>
-          <w:rFonts w:ascii="Aptos" w:hAnsi="Aptos"/>
-        </w:rPr>
-        <w:t xml:space="preserve"> the </w:t>
-      </w:r>
-      <w:proofErr w:type="gramStart"/>
-      <w:r>
-        <w:rPr>
-          <w:rFonts w:ascii="Aptos" w:hAnsi="Aptos"/>
-        </w:rPr>
-        <w:t>large scale</w:t>
-      </w:r>
-      <w:proofErr w:type="gramEnd"/>
-      <w:r>
-        <w:rPr>
-          <w:rFonts w:ascii="Aptos" w:hAnsi="Aptos"/>
-        </w:rPr>
-        <w:t xml:space="preserve"> circulation</w:t>
-      </w:r>
-      <w:r>
-        <w:rPr>
-          <w:rFonts w:ascii="Aptos" w:hAnsi="Aptos"/>
-        </w:rPr>
-        <w:t xml:space="preserve">, which in turn decreases </w:t>
-      </w:r>
-      <w:r>
-        <w:rPr>
-          <w:rFonts w:ascii="Aptos" w:hAnsi="Aptos"/>
-        </w:rPr>
-        <w:t>5 % K</w:t>
-      </w:r>
-      <w:r>
-        <w:rPr>
-          <w:rFonts w:ascii="Aptos" w:hAnsi="Aptos"/>
-          <w:vertAlign w:val="superscript"/>
-        </w:rPr>
-        <w:t>-1</w:t>
-      </w:r>
-      <w:r>
-        <w:rPr>
-          <w:rFonts w:ascii="Aptos" w:hAnsi="Aptos"/>
-        </w:rPr>
-        <w:t xml:space="preserve"> </w:t>
-      </w:r>
-      <w:r>
-        <w:rPr>
-          <w:rFonts w:ascii="Aptos" w:hAnsi="Aptos"/>
-        </w:rPr>
-        <w:t xml:space="preserve">surface temperature </w:t>
-      </w:r>
-      <w:r>
-        <w:rPr>
-          <w:rFonts w:ascii="Aptos" w:hAnsi="Aptos"/>
-        </w:rPr>
-        <w:t>by energetics</w:t>
-      </w:r>
-      <w:r>
-        <w:rPr>
-          <w:rFonts w:ascii="Aptos" w:hAnsi="Aptos"/>
-        </w:rPr>
-        <w:t xml:space="preserve">. </w:t>
-      </w:r>
-      <w:r>
-        <w:rPr>
-          <w:rFonts w:ascii="Aptos" w:hAnsi="Aptos"/>
-        </w:rPr>
-        <w:t xml:space="preserve">Tuned to </w:t>
-      </w:r>
-      <w:r>
-        <w:rPr>
-          <w:rFonts w:ascii="Aptos" w:hAnsi="Aptos"/>
-        </w:rPr>
-        <w:t xml:space="preserve">the </w:t>
-      </w:r>
-      <w:r>
-        <w:rPr>
-          <w:rFonts w:ascii="Aptos" w:hAnsi="Aptos"/>
-        </w:rPr>
-        <w:t xml:space="preserve">observed </w:t>
-      </w:r>
-      <w:r>
-        <w:rPr>
-          <w:rFonts w:ascii="Aptos" w:hAnsi="Aptos"/>
-        </w:rPr>
-        <w:t xml:space="preserve">moisture budget and </w:t>
-      </w:r>
-      <w:r>
-        <w:rPr>
-          <w:rFonts w:ascii="Aptos" w:hAnsi="Aptos"/>
-        </w:rPr>
-        <w:t xml:space="preserve">cloud top height distribution, the cloud model independently </w:t>
-      </w:r>
-      <w:r>
-        <w:rPr>
-          <w:rFonts w:ascii="Aptos" w:hAnsi="Aptos"/>
-        </w:rPr>
-        <w:t>reproduces the mesoscale correlation of cloud fraction to cloud base mass flux found over the northeastern tropical Atlantic Ocean in EUREC4A.</w:t>
-      </w:r>
-    </w:p>
-    <w:p>
-      <w:pPr>
-        <w:pStyle w:val="Heading1"/>
-      </w:pPr>
-      <w:r>
-        <w:lastRenderedPageBreak/>
+      <w:r>
         <w:t>Abstract - alternate ideas</w:t>
       </w:r>
     </w:p>
@@ -857,7 +675,7 @@
           <w:szCs w:val="24"/>
           <w14:ligatures w14:val="none"/>
         </w:rPr>
-        <w:t xml:space="preserve">, </w:t>
+        <w:t xml:space="preserve">, in a steady climate, </w:t>
       </w:r>
       <w:r>
         <w:rPr>
@@ -868,7 +686,7 @@
           <w:szCs w:val="24"/>
           <w14:ligatures w14:val="none"/>
         </w:rPr>
-        <w:t xml:space="preserve">in a steady climate, </w:t>
+        <w:t xml:space="preserve">the moisture flux </w:t>
       </w:r>
       <w:r>
         <w:rPr>
@@ -879,7 +697,7 @@
           <w:szCs w:val="24"/>
           <w14:ligatures w14:val="none"/>
         </w:rPr>
-        <w:t xml:space="preserve">the moisture flux </w:t>
+        <w:t xml:space="preserve">by </w:t>
       </w:r>
       <w:r>
         <w:rPr>
@@ -890,7 +708,7 @@
           <w:szCs w:val="24"/>
           <w14:ligatures w14:val="none"/>
         </w:rPr>
-        <w:t xml:space="preserve">by </w:t>
+        <w:t>shallow cumulus cloud</w:t>
       </w:r>
       <w:r>
         <w:rPr>
@@ -901,8 +719,9 @@
           <w:szCs w:val="24"/>
           <w14:ligatures w14:val="none"/>
         </w:rPr>
-        <w:t>shallow cumulus cloud</w:t>
-      </w:r>
+        <w:t xml:space="preserve">s balances drying by the </w:t>
+      </w:r>
+      <w:proofErr w:type="gramStart"/>
       <w:r>
         <w:rPr>
           <w:rFonts w:ascii="Aptos" w:eastAsiaTheme="minorHAnsi" w:hAnsi="Aptos" w:cstheme="minorBidi"/>
@@ -912,9 +731,9 @@
           <w:szCs w:val="24"/>
           <w14:ligatures w14:val="none"/>
         </w:rPr>
-        <w:t xml:space="preserve">s balances drying by the </w:t>
-      </w:r>
-      <w:proofErr w:type="gramStart"/>
+        <w:t>large scale</w:t>
+      </w:r>
+      <w:proofErr w:type="gramEnd"/>
       <w:r>
         <w:rPr>
           <w:rFonts w:ascii="Aptos" w:eastAsiaTheme="minorHAnsi" w:hAnsi="Aptos" w:cstheme="minorBidi"/>
@@ -924,9 +743,8 @@
           <w:szCs w:val="24"/>
           <w14:ligatures w14:val="none"/>
         </w:rPr>
-        <w:t>large scale</w:t>
-      </w:r>
-      <w:proofErr w:type="gramEnd"/>
+        <w:t xml:space="preserve"> circulation.</w:t>
+      </w:r>
       <w:r>
         <w:rPr>
           <w:rFonts w:ascii="Aptos" w:eastAsiaTheme="minorHAnsi" w:hAnsi="Aptos" w:cstheme="minorBidi"/>
@@ -936,17 +754,6 @@
           <w:szCs w:val="24"/>
           <w14:ligatures w14:val="none"/>
         </w:rPr>
-        <w:t xml:space="preserve"> circulation.</w:t>
-      </w:r>
-      <w:r>
-        <w:rPr>
-          <w:rFonts w:ascii="Aptos" w:eastAsiaTheme="minorHAnsi" w:hAnsi="Aptos" w:cstheme="minorBidi"/>
-          <w:color w:val="auto"/>
-          <w:kern w:val="0"/>
-          <w:sz w:val="24"/>
-          <w:szCs w:val="24"/>
-          <w14:ligatures w14:val="none"/>
-        </w:rPr>
         <w:t xml:space="preserve"> </w:t>
       </w:r>
       <w:r>
@@ -1079,18 +886,7 @@
           <w:szCs w:val="24"/>
           <w14:ligatures w14:val="none"/>
         </w:rPr>
-        <w:t xml:space="preserve"> </w:t>
-      </w:r>
-      <w:r>
-        <w:rPr>
-          <w:rFonts w:ascii="Aptos" w:eastAsiaTheme="minorHAnsi" w:hAnsi="Aptos" w:cstheme="minorBidi"/>
-          <w:color w:val="000000" w:themeColor="text1"/>
-          <w:kern w:val="0"/>
-          <w:sz w:val="24"/>
-          <w:szCs w:val="24"/>
-          <w14:ligatures w14:val="none"/>
-        </w:rPr>
-        <w:t>(–5 % K</w:t>
+        <w:t xml:space="preserve"> (–5 % K</w:t>
       </w:r>
       <w:r>
         <w:rPr>
@@ -1113,7 +909,7 @@
           <w:szCs w:val="24"/>
           <w14:ligatures w14:val="none"/>
         </w:rPr>
-        <w:t>)</w:t>
+        <w:t>) reduction of their</w:t>
       </w:r>
       <w:r>
         <w:rPr>
@@ -1124,17 +920,6 @@
           <w:szCs w:val="24"/>
           <w14:ligatures w14:val="none"/>
         </w:rPr>
-        <w:t xml:space="preserve"> reduction of their</w:t>
-      </w:r>
-      <w:r>
-        <w:rPr>
-          <w:rFonts w:ascii="Aptos" w:eastAsiaTheme="minorHAnsi" w:hAnsi="Aptos" w:cstheme="minorBidi"/>
-          <w:color w:val="000000" w:themeColor="text1"/>
-          <w:kern w:val="0"/>
-          <w:sz w:val="24"/>
-          <w:szCs w:val="24"/>
-          <w14:ligatures w14:val="none"/>
-        </w:rPr>
         <w:t xml:space="preserve"> large-scale circulation.</w:t>
       </w:r>
       <w:r>
@@ -1157,18 +942,7 @@
           <w:szCs w:val="24"/>
           <w14:ligatures w14:val="none"/>
         </w:rPr>
-        <w:t>Humidity changes increase both large-scale drying and cloud moisture flux, with cancelling effects on cloud fraction.</w:t>
-      </w:r>
-      <w:r>
-        <w:rPr>
-          <w:rFonts w:ascii="Aptos" w:eastAsiaTheme="minorHAnsi" w:hAnsi="Aptos" w:cstheme="minorBidi"/>
-          <w:color w:val="215E99" w:themeColor="text2" w:themeTint="BF"/>
-          <w:kern w:val="0"/>
-          <w:sz w:val="24"/>
-          <w:szCs w:val="24"/>
-          <w14:ligatures w14:val="none"/>
-        </w:rPr>
-        <w:t xml:space="preserve"> </w:t>
+        <w:t xml:space="preserve">Humidity changes increase both large-scale drying and cloud moisture flux, with cancelling effects on cloud fraction. </w:t>
       </w:r>
       <w:r>
         <w:rPr>
@@ -1241,163 +1015,458 @@
         </w:rPr>
         <w:t xml:space="preserve">. </w:t>
       </w:r>
-      <w:r>
-        <w:rPr>
-          <w:rFonts w:ascii="Aptos" w:hAnsi="Aptos"/>
-        </w:rPr>
+    </w:p>
+    <w:p>
+      <w:pPr>
+        <w:pStyle w:val="FirstParagraph"/>
+        <w:spacing w:line="276" w:lineRule="auto"/>
+      </w:pPr>
+      <w:r>
+        <w:t xml:space="preserve">Climate models </w:t>
+      </w:r>
+      <w:r>
+        <w:t xml:space="preserve">have </w:t>
+      </w:r>
+      <w:r>
+        <w:t>optically thick (</w:t>
+      </w:r>
+      <m:oMath>
+        <m:r>
+          <w:rPr>
+            <w:rFonts w:ascii="Cambria Math" w:hAnsi="Cambria Math"/>
+          </w:rPr>
+          <m:t>τ</m:t>
+        </m:r>
+        <m:r>
+          <w:rPr>
+            <w:rFonts w:ascii="Cambria Math" w:eastAsiaTheme="minorEastAsia" w:hAnsi="Cambria Math"/>
+          </w:rPr>
+          <m:t>=</m:t>
+        </m:r>
+      </m:oMath>
+      <w:r>
+        <w:t xml:space="preserve"> 1.3-23) clouds (ISCCP, Zelinka XXXX, Webb XXXX) near cloud base. </w:t>
+      </w:r>
+      <w:r>
+        <w:t>Changes of clouds at cloud base amplif</w:t>
+      </w:r>
+      <w:r>
+        <w:t xml:space="preserve">y </w:t>
+      </w:r>
+      <w:r>
+        <w:t xml:space="preserve">low cloud </w:t>
+      </w:r>
+      <w:proofErr w:type="gramStart"/>
+      <w:r>
+        <w:t>feedbacks</w:t>
+      </w:r>
+      <w:proofErr w:type="gramEnd"/>
+      <w:r>
+        <w:t xml:space="preserve"> and widen the spread of climate projections.</w:t>
+      </w:r>
+      <w:r>
+        <w:t xml:space="preserve"> </w:t>
+      </w:r>
+      <w:r>
+        <w:rPr>
+          <w:rFonts w:ascii="Aptos" w:hAnsi="Aptos"/>
+        </w:rPr>
+        <w:t>P</w:t>
+      </w:r>
+      <w:r>
+        <w:rPr>
+          <w:rFonts w:ascii="Aptos" w:hAnsi="Aptos"/>
+        </w:rPr>
+        <w:t xml:space="preserve">ositive </w:t>
+      </w:r>
+      <w:proofErr w:type="gramStart"/>
+      <w:r>
+        <w:rPr>
+          <w:rFonts w:ascii="Aptos" w:hAnsi="Aptos"/>
+        </w:rPr>
+        <w:t>feedback</w:t>
+      </w:r>
+      <w:r>
+        <w:rPr>
+          <w:rFonts w:ascii="Aptos" w:hAnsi="Aptos"/>
+        </w:rPr>
+        <w:t>s</w:t>
+      </w:r>
+      <w:proofErr w:type="gramEnd"/>
+      <w:r>
+        <w:rPr>
+          <w:rFonts w:ascii="Aptos" w:hAnsi="Aptos"/>
+        </w:rPr>
+        <w:t xml:space="preserve"> due to reduction of </w:t>
+      </w:r>
+      <w:r>
+        <w:rPr>
+          <w:rFonts w:ascii="Aptos" w:hAnsi="Aptos"/>
+        </w:rPr>
+        <w:t>cloud</w:t>
+      </w:r>
+      <w:r>
+        <w:rPr>
+          <w:rFonts w:ascii="Aptos" w:hAnsi="Aptos"/>
+        </w:rPr>
+        <w:t xml:space="preserve"> </w:t>
+      </w:r>
+      <w:r>
+        <w:rPr>
+          <w:rFonts w:ascii="Aptos" w:hAnsi="Aptos"/>
+        </w:rPr>
+        <w:t>amount</w:t>
+      </w:r>
+      <w:r>
+        <w:rPr>
+          <w:rFonts w:ascii="Aptos" w:hAnsi="Aptos"/>
+        </w:rPr>
+        <w:t xml:space="preserve"> within </w:t>
+      </w:r>
+      <w:r>
+        <w:rPr>
+          <w:rFonts w:ascii="Aptos" w:hAnsi="Aptos"/>
+        </w:rPr>
+        <w:t>shallow cumulus cloud</w:t>
+      </w:r>
+      <w:r>
+        <w:rPr>
+          <w:rFonts w:ascii="Aptos" w:hAnsi="Aptos"/>
+        </w:rPr>
+        <w:t xml:space="preserve"> regime</w:t>
+      </w:r>
+      <w:r>
+        <w:rPr>
+          <w:rFonts w:ascii="Aptos" w:hAnsi="Aptos"/>
+        </w:rPr>
+        <w:t xml:space="preserve">s dominates </w:t>
+      </w:r>
+      <w:proofErr w:type="gramStart"/>
+      <w:r>
+        <w:rPr>
+          <w:rFonts w:ascii="Aptos" w:hAnsi="Aptos"/>
+        </w:rPr>
+        <w:t>feedbacks</w:t>
+      </w:r>
+      <w:proofErr w:type="gramEnd"/>
+      <w:r>
+        <w:rPr>
+          <w:rFonts w:ascii="Aptos" w:hAnsi="Aptos"/>
+        </w:rPr>
+        <w:t xml:space="preserve"> from changes in </w:t>
+      </w:r>
+      <w:r>
+        <w:rPr>
+          <w:rFonts w:ascii="Aptos" w:hAnsi="Aptos"/>
+        </w:rPr>
+        <w:t xml:space="preserve">the frequency of occurrence </w:t>
+      </w:r>
+      <w:r>
+        <w:rPr>
+          <w:rFonts w:ascii="Aptos" w:hAnsi="Aptos"/>
+        </w:rPr>
+        <w:t xml:space="preserve">(days per month) </w:t>
+      </w:r>
+      <w:r>
+        <w:rPr>
+          <w:rFonts w:ascii="Aptos" w:hAnsi="Aptos"/>
+        </w:rPr>
+        <w:t>across</w:t>
+      </w:r>
+      <w:r>
+        <w:rPr>
+          <w:rFonts w:ascii="Aptos" w:hAnsi="Aptos"/>
+        </w:rPr>
+        <w:t xml:space="preserve"> </w:t>
+      </w:r>
+      <w:r>
+        <w:rPr>
+          <w:rFonts w:ascii="Aptos" w:hAnsi="Aptos"/>
+        </w:rPr>
+        <w:t xml:space="preserve">the </w:t>
+      </w:r>
+      <w:r>
+        <w:rPr>
+          <w:rFonts w:ascii="Aptos" w:hAnsi="Aptos"/>
+        </w:rPr>
+        <w:t>regimes</w:t>
+      </w:r>
+      <w:r>
+        <w:rPr>
+          <w:rFonts w:ascii="Aptos" w:hAnsi="Aptos"/>
+        </w:rPr>
+        <w:t xml:space="preserve"> </w:t>
+      </w:r>
+      <w:r>
+        <w:rPr>
+          <w:rFonts w:ascii="Aptos" w:hAnsi="Aptos"/>
+        </w:rPr>
+        <w:t xml:space="preserve">(Zelinka et al. 2023). </w:t>
+      </w:r>
+      <w:r>
+        <w:t>L</w:t>
+      </w:r>
+      <w:r>
+        <w:t>ow</w:t>
+      </w:r>
+      <w:r>
+        <w:t xml:space="preserve"> cloud</w:t>
+      </w:r>
+      <w:r>
+        <w:t xml:space="preserve"> amount</w:t>
+      </w:r>
+      <w:r>
+        <w:t xml:space="preserve"> </w:t>
+      </w:r>
+      <w:r>
+        <w:t>is</w:t>
+      </w:r>
+      <w:r>
+        <w:t xml:space="preserve"> sensitive to humidity at cloud base</w:t>
+      </w:r>
+      <w:r>
+        <w:t xml:space="preserve"> </w:t>
+      </w:r>
+      <w:r>
+        <w:t>(Sherwood et al. 2014; Brient et al. 2016; Vial et al. 2017</w:t>
+      </w:r>
+      <w:r>
+        <w:t>)</w:t>
+      </w:r>
+      <w:r>
+        <w:t>, c</w:t>
+      </w:r>
+      <w:r>
+        <w:t>ontributing to the low cloud feedback</w:t>
+      </w:r>
+      <w:r>
+        <w:t>.</w:t>
+      </w:r>
+      <w:r>
+        <w:t xml:space="preserve"> In the </w:t>
+      </w:r>
+      <w:r>
+        <w:rPr>
+          <w:i/>
+          <w:iCs/>
+        </w:rPr>
+        <w:t>shallow cumulus</w:t>
+      </w:r>
+      <w:r>
+        <w:t xml:space="preserve"> cloud feedback,</w:t>
+      </w:r>
+      <w:r>
+        <w:t xml:space="preserve"> </w:t>
+      </w:r>
+      <w:r>
+        <w:t xml:space="preserve">cumulus clouds mix drier air </w:t>
+      </w:r>
+      <w:r>
+        <w:t>downward</w:t>
+      </w:r>
+      <w:r>
+        <w:t xml:space="preserve">, desiccating more extensive cloud-base clouds. </w:t>
+      </w:r>
+      <w:r>
+        <w:t>Unconstrained differences in the representation of this feedback are hypothesized to account for spread of climate sensitivity.</w:t>
+      </w:r>
+    </w:p>
+    <w:p>
+      <w:pPr>
+        <w:pStyle w:val="FirstParagraph"/>
+        <w:spacing w:line="276" w:lineRule="auto"/>
+      </w:pPr>
+      <w:r>
         <w:t>T</w:t>
       </w:r>
       <w:r>
-        <w:rPr>
-          <w:rFonts w:ascii="Aptos" w:hAnsi="Aptos"/>
-        </w:rPr>
-        <w:t xml:space="preserve">he positive feedback due to reduction of </w:t>
-      </w:r>
-      <w:r>
-        <w:rPr>
-          <w:rFonts w:ascii="Aptos" w:hAnsi="Aptos"/>
-        </w:rPr>
-        <w:t>cloud</w:t>
-      </w:r>
-      <w:r>
-        <w:rPr>
-          <w:rFonts w:ascii="Aptos" w:hAnsi="Aptos"/>
-        </w:rPr>
+        <w:t xml:space="preserve">he </w:t>
+      </w:r>
+      <w:r>
+        <w:t xml:space="preserve">strength of the </w:t>
+      </w:r>
+      <w:r>
+        <w:t xml:space="preserve">shallow cumulus cloud feedback has been questioned on several grounds: (1) </w:t>
+      </w:r>
+      <w:r>
+        <w:t>O</w:t>
+      </w:r>
+      <w:r>
+        <w:t>bservations</w:t>
+      </w:r>
+      <w:r>
         <w:t xml:space="preserve"> </w:t>
       </w:r>
       <w:r>
-        <w:rPr>
-          <w:rFonts w:ascii="Aptos" w:hAnsi="Aptos"/>
-        </w:rPr>
-        <w:t>amount</w:t>
-      </w:r>
-      <w:r>
-        <w:rPr>
-          <w:rFonts w:ascii="Aptos" w:hAnsi="Aptos"/>
-        </w:rPr>
-        <w:t xml:space="preserve"> within </w:t>
-      </w:r>
-      <w:r>
-        <w:rPr>
-          <w:rFonts w:ascii="Aptos" w:hAnsi="Aptos"/>
-        </w:rPr>
-        <w:t xml:space="preserve">shallow cumulus </w:t>
-      </w:r>
-      <w:r>
-        <w:rPr>
-          <w:rFonts w:ascii="Aptos" w:hAnsi="Aptos"/>
-        </w:rPr>
-        <w:t>cloud</w:t>
-      </w:r>
-      <w:r>
-        <w:rPr>
-          <w:rFonts w:ascii="Aptos" w:hAnsi="Aptos"/>
-        </w:rPr>
-        <w:t xml:space="preserve"> regime</w:t>
-      </w:r>
-      <w:r>
-        <w:rPr>
-          <w:rFonts w:ascii="Aptos" w:hAnsi="Aptos"/>
-        </w:rPr>
+        <w:t xml:space="preserve">and LES </w:t>
+      </w:r>
+      <w:r>
+        <w:t>suggest that subcloud layer turbulence moderates cloud base moisture</w:t>
+      </w:r>
+      <w:r>
+        <w:t xml:space="preserve"> and </w:t>
+      </w:r>
+      <w:r>
+        <w:t xml:space="preserve">cloud fraction </w:t>
+      </w:r>
+      <w:r>
+        <w:t>(Nuijens et al. 2013; Brient et al. 2016; Vial et al. 2017; Vogel et al. 2022</w:t>
+      </w:r>
+      <w:r>
+        <w:t xml:space="preserve">; Bretherton et al. 2013). </w:t>
+      </w:r>
+      <w:r>
+        <w:t xml:space="preserve">(2) In the winter northeastern tropical Pacific, </w:t>
+      </w:r>
+      <w:r>
         <w:t>s</w:t>
       </w:r>
       <w:r>
-        <w:rPr>
-          <w:rFonts w:ascii="Aptos" w:hAnsi="Aptos"/>
-        </w:rPr>
+        <w:t>atellite shallow cumulus clouds have 0.5-3 km heights and weak cloud fraction at cloud base (3 % by random overlap or 8 % by maximum overlap; Fig. 1)</w:t>
+      </w:r>
+      <w:r>
+        <w:t xml:space="preserve">. </w:t>
+      </w:r>
+      <w:r>
+        <w:t>EUREC4A airborne lidar and radar cloud-base cloud fraction is only 5.4 % (BASTILIAS XXXX, Vogel et al. 2022)</w:t>
+      </w:r>
+      <w:r>
+        <w:t xml:space="preserve">. (3) </w:t>
+      </w:r>
+      <w:r>
+        <w:t>All</w:t>
+      </w:r>
+      <w:r>
+        <w:t xml:space="preserve"> CMIP6 atmosphere models </w:t>
+      </w:r>
+      <w:r>
+        <w:t>in</w:t>
+      </w:r>
+      <w:r>
+        <w:t xml:space="preserve"> the Cloud Forcing Intercomparison Project (CFMIP) have excessive stratocumulus clouds</w:t>
+      </w:r>
+      <w:r>
         <w:t xml:space="preserve"> </w:t>
       </w:r>
       <w:r>
-        <w:rPr>
-          <w:rFonts w:ascii="Aptos" w:hAnsi="Aptos"/>
-        </w:rPr>
-        <w:t xml:space="preserve">dominates </w:t>
+        <w:t>(</w:t>
+      </w:r>
+      <m:oMath>
+        <m:r>
+          <w:rPr>
+            <w:rFonts w:ascii="Cambria Math" w:hAnsi="Cambria Math"/>
+          </w:rPr>
+          <m:t>3.6≤τ&lt;23)</m:t>
+        </m:r>
+      </m:oMath>
+      <w:r>
+        <w:rPr>
+          <w:rFonts w:eastAsiaTheme="minorEastAsia"/>
+        </w:rPr>
+        <w:t xml:space="preserve"> </w:t>
+      </w:r>
+      <w:r>
+        <w:t>in the northern tropical Atlantic</w:t>
+      </w:r>
+      <w:r>
+        <w:t xml:space="preserve">, </w:t>
+      </w:r>
+      <w:r>
+        <w:t>but</w:t>
+      </w:r>
+      <w:r>
+        <w:t xml:space="preserve"> the</w:t>
+      </w:r>
+      <w:r>
+        <w:t>se</w:t>
+      </w:r>
+      <w:r>
+        <w:t xml:space="preserve"> stratocumulus clouds </w:t>
+      </w:r>
+      <w:r>
+        <w:t>increase with</w:t>
+      </w:r>
+      <w:r>
+        <w:t xml:space="preserve"> warming</w:t>
+      </w:r>
+      <w:r>
+        <w:t xml:space="preserve"> in 4 of 5 models</w:t>
+      </w:r>
+      <w:r>
+        <w:t xml:space="preserve">, </w:t>
       </w:r>
       <w:proofErr w:type="gramStart"/>
       <w:r>
-        <w:rPr>
-          <w:rFonts w:ascii="Aptos" w:hAnsi="Aptos"/>
-        </w:rPr>
-        <w:t>feedbacks</w:t>
+        <w:t>a</w:t>
+      </w:r>
+      <w:r>
+        <w:t xml:space="preserve"> </w:t>
+      </w:r>
+      <w:r>
+        <w:t>negative feedback (Huang et al. 2026)</w:t>
       </w:r>
       <w:proofErr w:type="gramEnd"/>
       <w:r>
-        <w:rPr>
-          <w:rFonts w:ascii="Aptos" w:hAnsi="Aptos"/>
-        </w:rPr>
-        <w:t xml:space="preserve"> from </w:t>
-      </w:r>
-      <w:r>
-        <w:rPr>
-          <w:rFonts w:ascii="Aptos" w:hAnsi="Aptos"/>
-        </w:rPr>
-        <w:t>changes in cloud properties within regimes</w:t>
-      </w:r>
-      <w:r>
-        <w:rPr>
-          <w:rFonts w:ascii="Aptos" w:hAnsi="Aptos"/>
-        </w:rPr>
-        <w:t xml:space="preserve">, and those due to changes in </w:t>
-      </w:r>
-      <w:r>
-        <w:rPr>
-          <w:rFonts w:ascii="Aptos" w:hAnsi="Aptos"/>
-        </w:rPr>
-        <w:t xml:space="preserve">frequency </w:t>
-      </w:r>
-      <w:r>
-        <w:rPr>
-          <w:rFonts w:ascii="Aptos" w:hAnsi="Aptos"/>
-        </w:rPr>
-        <w:t xml:space="preserve">(days per month) </w:t>
-      </w:r>
-      <w:r>
-        <w:rPr>
-          <w:rFonts w:ascii="Aptos" w:hAnsi="Aptos"/>
-        </w:rPr>
-        <w:t xml:space="preserve">of occurrence among </w:t>
-      </w:r>
-      <w:r>
-        <w:rPr>
-          <w:rFonts w:ascii="Aptos" w:hAnsi="Aptos"/>
-        </w:rPr>
-        <w:t>cloud</w:t>
-      </w:r>
-      <w:r>
-        <w:rPr>
-          <w:rFonts w:ascii="Aptos" w:hAnsi="Aptos"/>
-        </w:rPr>
-        <w:t xml:space="preserve"> regimes</w:t>
-      </w:r>
-      <w:r>
-        <w:rPr>
-          <w:rFonts w:ascii="Aptos" w:hAnsi="Aptos"/>
-        </w:rPr>
-        <w:t xml:space="preserve"> </w:t>
-      </w:r>
-      <w:r>
-        <w:rPr>
-          <w:rFonts w:ascii="Aptos" w:hAnsi="Aptos"/>
-        </w:rPr>
-        <w:t>(Zelinka et al. 202</w:t>
-      </w:r>
-      <w:r>
-        <w:rPr>
-          <w:rFonts w:ascii="Aptos" w:hAnsi="Aptos"/>
-        </w:rPr>
-        <w:t>3</w:t>
-      </w:r>
-      <w:r>
-        <w:rPr>
-          <w:rFonts w:ascii="Aptos" w:hAnsi="Aptos"/>
-        </w:rPr>
-        <w:t>)</w:t>
-      </w:r>
-      <w:r>
-        <w:rPr>
-          <w:rFonts w:ascii="Aptos" w:hAnsi="Aptos"/>
-        </w:rPr>
-        <w:t xml:space="preserve">. </w:t>
+        <w:t>.</w:t>
+      </w:r>
+    </w:p>
+    <w:p>
+      <w:pPr>
+        <w:pStyle w:val="BodyText"/>
+      </w:pPr>
+      <w:r>
+        <w:rPr>
+          <w:noProof/>
+        </w:rPr>
+        <w:drawing>
+          <wp:inline distT="0" distB="0" distL="0" distR="0" wp14:anchorId="7B8CA703" wp14:editId="5DF00B8F">
+            <wp:extent cx="5003800" cy="3759200"/>
+            <wp:effectExtent l="0" t="0" r="0" b="0"/>
+            <wp:docPr id="733237792" name="Picture 1" descr="A graph of different types of reflectance&#10;&#10;AI-generated content may be incorrect."/>
+            <wp:cNvGraphicFramePr>
+              <a:graphicFrameLocks xmlns:a="http://schemas.openxmlformats.org/drawingml/2006/main" noChangeAspect="1"/>
+            </wp:cNvGraphicFramePr>
+            <a:graphic xmlns:a="http://schemas.openxmlformats.org/drawingml/2006/main">
+              <a:graphicData uri="http://schemas.openxmlformats.org/drawingml/2006/picture">
+                <pic:pic xmlns:pic="http://schemas.openxmlformats.org/drawingml/2006/picture">
+                  <pic:nvPicPr>
+                    <pic:cNvPr id="623495658" name="Picture 1" descr="A graph of different types of reflectance&#10;&#10;AI-generated content may be incorrect."/>
+                    <pic:cNvPicPr/>
+                  </pic:nvPicPr>
+                  <pic:blipFill>
+                    <a:blip r:embed="rId5">
+                      <a:extLst>
+                        <a:ext uri="{28A0092B-C50C-407E-A947-70E740481C1C}">
+                          <a14:useLocalDpi xmlns:a14="http://schemas.microsoft.com/office/drawing/2010/main" val="0"/>
+                        </a:ext>
+                      </a:extLst>
+                    </a:blip>
+                    <a:stretch>
+                      <a:fillRect/>
+                    </a:stretch>
+                  </pic:blipFill>
+                  <pic:spPr>
+                    <a:xfrm>
+                      <a:off x="0" y="0"/>
+                      <a:ext cx="5003800" cy="3759200"/>
+                    </a:xfrm>
+                    <a:prstGeom prst="rect">
+                      <a:avLst/>
+                    </a:prstGeom>
+                  </pic:spPr>
+                </pic:pic>
+              </a:graphicData>
+            </a:graphic>
+          </wp:inline>
+        </w:drawing>
+      </w:r>
+    </w:p>
+    <w:p>
+      <w:pPr>
+        <w:pStyle w:val="BodyText"/>
+      </w:pPr>
+      <w:r>
+        <w:t>Fig 1.</w:t>
       </w:r>
     </w:p>
     <w:p>
@@ -1519,14 +1588,7 @@
         <w:rPr>
           <w:rFonts w:ascii="Aptos" w:hAnsi="Aptos"/>
         </w:rPr>
-        <w:t xml:space="preserve"> circulation </w:t>
-      </w:r>
-      <w:r>
-        <w:rPr>
-          <w:rFonts w:ascii="Aptos" w:hAnsi="Aptos"/>
-        </w:rPr>
-        <w:lastRenderedPageBreak/>
-        <w:t>is thus compensated by the opposite moistening by the divergence of the shallow cumulus cloud eddy flux.</w:t>
+        <w:t xml:space="preserve"> circulation is thus compensated by the opposite moistening by the divergence of the shallow cumulus cloud eddy flux.</w:t>
       </w:r>
     </w:p>
     <w:p>
@@ -1538,19 +1600,83 @@
       </w:r>
     </w:p>
     <w:p>
+      <w:proofErr w:type="gramStart"/>
+      <w:r>
+        <w:t>T</w:t>
+      </w:r>
+      <w:r>
+        <w:t>he Dynamical Inhibition of Moisture (DIM) cloud equilibrium hypothesis,</w:t>
+      </w:r>
+      <w:proofErr w:type="gramEnd"/>
+      <w:r>
+        <w:t xml:space="preserve"> </w:t>
+      </w:r>
+      <w:r>
+        <w:t>predicts the</w:t>
+      </w:r>
+      <w:r>
+        <w:t xml:space="preserve"> direct effect of large-scale circulation on shallow cumulus clouds. </w:t>
+      </w:r>
+      <w:r>
+        <w:t xml:space="preserve">For </w:t>
+      </w:r>
+      <w:r>
+        <w:t>a climatological mean with a balanced moisture budge</w:t>
+      </w:r>
+      <w:r>
+        <w:t>, t</w:t>
+      </w:r>
+      <w:r>
+        <w:t>he DIM hypothesis predicts a reduction of shallow c</w:t>
+      </w:r>
+      <w:r>
+        <w:t>umulus clouds,</w:t>
+      </w:r>
+      <w:r>
+        <w:t xml:space="preserve"> </w:t>
+      </w:r>
+      <w:r>
+        <w:t>dimming</w:t>
+      </w:r>
+      <w:r>
+        <w:rPr>
+          <w:i/>
+          <w:iCs/>
+        </w:rPr>
+        <w:t xml:space="preserve"> </w:t>
+      </w:r>
+      <w:r>
+        <w:t>the planetary albedo</w:t>
+      </w:r>
+      <w:r>
+        <w:t xml:space="preserve">, with </w:t>
+      </w:r>
+      <w:proofErr w:type="gramStart"/>
+      <w:r>
+        <w:t>a weak positive feedback</w:t>
+      </w:r>
+      <w:proofErr w:type="gramEnd"/>
+      <w:r>
+        <w:t xml:space="preserve"> that scales with the shallow cumulus cloud fraction.</w:t>
+      </w:r>
+    </w:p>
+    <w:p>
       <w:pPr>
         <w:rPr>
           <w:rFonts w:eastAsiaTheme="minorEastAsia"/>
         </w:rPr>
       </w:pPr>
       <w:r>
-        <w:t>We propose the</w:t>
+        <w:t>In</w:t>
+      </w:r>
+      <w:r>
+        <w:t xml:space="preserve"> the</w:t>
       </w:r>
       <w:r>
         <w:t xml:space="preserve"> dynamical inhibition of moisture flux (DIM) hypothesis</w:t>
       </w:r>
       <w:r>
-        <w:t xml:space="preserve">: </w:t>
+        <w:t xml:space="preserve"> </w:t>
       </w:r>
       <w:r>
         <w:t xml:space="preserve">shallow cumulus cloud fraction </w:t>
@@ -1629,19 +1755,19 @@
         <w:rPr>
           <w:rFonts w:eastAsiaTheme="minorEastAsia"/>
         </w:rPr>
-        <w:t xml:space="preserve"> on relationships</w:t>
-      </w:r>
-      <w:r>
-        <w:rPr>
-          <w:rFonts w:eastAsiaTheme="minorEastAsia"/>
-        </w:rPr>
-        <w:t xml:space="preserve"> in three parts</w:t>
-      </w:r>
-      <w:r>
-        <w:rPr>
-          <w:rFonts w:eastAsiaTheme="minorEastAsia"/>
-        </w:rPr>
-        <w:t>:</w:t>
+        <w:t xml:space="preserve"> on </w:t>
+      </w:r>
+      <w:r>
+        <w:rPr>
+          <w:rFonts w:eastAsiaTheme="minorEastAsia"/>
+        </w:rPr>
+        <w:t xml:space="preserve">three </w:t>
+      </w:r>
+      <w:r>
+        <w:rPr>
+          <w:rFonts w:eastAsiaTheme="minorEastAsia"/>
+        </w:rPr>
+        <w:t>relationships:</w:t>
       </w:r>
     </w:p>
     <w:p>
@@ -1652,85 +1778,14 @@
           <w:numId w:val="3"/>
         </w:numPr>
       </w:pPr>
-      <m:oMath>
-        <m:r>
-          <m:rPr>
-            <m:sty m:val="bi"/>
-          </m:rPr>
-          <w:rPr>
-            <w:rFonts w:ascii="Cambria Math" w:hAnsi="Cambria Math"/>
-          </w:rPr>
-          <m:t>d</m:t>
-        </m:r>
-        <m:func>
-          <m:funcPr>
-            <m:ctrlPr>
-              <w:rPr>
-                <w:rFonts w:ascii="Cambria Math" w:hAnsi="Cambria Math"/>
-                <w:b/>
-                <w:bCs/>
-                <w:i/>
-              </w:rPr>
-            </m:ctrlPr>
-          </m:funcPr>
-          <m:fName>
-            <m:r>
-              <m:rPr>
-                <m:sty m:val="b"/>
-              </m:rPr>
-              <w:rPr>
-                <w:rFonts w:ascii="Cambria Math" w:hAnsi="Cambria Math"/>
-              </w:rPr>
-              <m:t>ln</m:t>
-            </m:r>
-          </m:fName>
-          <m:e>
-            <m:r>
-              <m:rPr>
-                <m:sty m:val="bi"/>
-              </m:rPr>
-              <w:rPr>
-                <w:rFonts w:ascii="Cambria Math" w:hAnsi="Cambria Math"/>
-              </w:rPr>
-              <m:t>W</m:t>
-            </m:r>
-          </m:e>
-        </m:func>
-        <m:r>
-          <m:rPr>
-            <m:sty m:val="bi"/>
-          </m:rPr>
-          <w:rPr>
-            <w:rFonts w:ascii="Cambria Math" w:hAnsi="Cambria Math"/>
-          </w:rPr>
-          <m:t>/dT&lt;0</m:t>
-        </m:r>
-      </m:oMath>
-      <w:r>
-        <w:rPr>
-          <w:rFonts w:eastAsiaTheme="minorEastAsia"/>
-          <w:b/>
-          <w:bCs/>
-        </w:rPr>
-        <w:t>:</w:t>
-      </w:r>
-      <w:r>
-        <w:t xml:space="preserve"> </w:t>
-      </w:r>
-      <w:r>
-        <w:t>The subsidence decreases with warming. Held and Soden (2006</w:t>
-      </w:r>
-      <w:r>
-        <w:t>, HS06</w:t>
-      </w:r>
-      <w:r>
-        <w:t xml:space="preserve">) hypothesize </w:t>
-      </w:r>
-      <w:r>
-        <w:t>based on</w:t>
-      </w:r>
-      <w:r>
-        <w:t xml:space="preserve"> energetics that </w:t>
+      <w:r>
+        <w:t>S</w:t>
+      </w:r>
+      <w:r>
+        <w:t>ubsidence decreases with warming</w:t>
+      </w:r>
+      <w:r>
+        <w:t xml:space="preserve"> (</w:t>
       </w:r>
       <m:oMath>
         <m:r>
@@ -1744,6 +1799,7 @@
             <m:ctrlPr>
               <w:rPr>
                 <w:rFonts w:ascii="Cambria Math" w:hAnsi="Cambria Math"/>
+                <w:bCs/>
                 <w:i/>
               </w:rPr>
             </m:ctrlPr>
@@ -1772,25 +1828,72 @@
           <w:rPr>
             <w:rFonts w:ascii="Cambria Math" w:hAnsi="Cambria Math"/>
           </w:rPr>
-          <m:t>/</m:t>
+          <m:t>/dT&lt;0</m:t>
         </m:r>
+      </m:oMath>
+      <w:r>
+        <w:rPr>
+          <w:rFonts w:eastAsiaTheme="minorEastAsia"/>
+          <w:bCs/>
+        </w:rPr>
+        <w:t>)</w:t>
+      </w:r>
+      <w:r>
+        <w:t>. Held and Soden (2006</w:t>
+      </w:r>
+      <w:r>
+        <w:t>, HS06</w:t>
+      </w:r>
+      <w:r>
+        <w:t xml:space="preserve">) hypothesize </w:t>
+      </w:r>
+      <w:r>
+        <w:t>based on</w:t>
+      </w:r>
+      <w:r>
+        <w:t xml:space="preserve"> energetics that </w:t>
+      </w:r>
+      <m:oMath>
         <m:r>
           <w:rPr>
             <w:rFonts w:ascii="Cambria Math" w:hAnsi="Cambria Math"/>
           </w:rPr>
-          <m:t>dT</m:t>
+          <m:t>d</m:t>
         </m:r>
+        <m:func>
+          <m:funcPr>
+            <m:ctrlPr>
+              <w:rPr>
+                <w:rFonts w:ascii="Cambria Math" w:hAnsi="Cambria Math"/>
+                <w:i/>
+              </w:rPr>
+            </m:ctrlPr>
+          </m:funcPr>
+          <m:fName>
+            <m:r>
+              <m:rPr>
+                <m:sty m:val="p"/>
+              </m:rPr>
+              <w:rPr>
+                <w:rFonts w:ascii="Cambria Math" w:hAnsi="Cambria Math"/>
+              </w:rPr>
+              <m:t>ln</m:t>
+            </m:r>
+          </m:fName>
+          <m:e>
+            <m:r>
+              <w:rPr>
+                <w:rFonts w:ascii="Cambria Math" w:hAnsi="Cambria Math"/>
+              </w:rPr>
+              <m:t>W</m:t>
+            </m:r>
+          </m:e>
+        </m:func>
         <m:r>
           <w:rPr>
             <w:rFonts w:ascii="Cambria Math" w:hAnsi="Cambria Math"/>
           </w:rPr>
-          <m:t>≈</m:t>
-        </m:r>
-        <m:r>
-          <w:rPr>
-            <w:rFonts w:ascii="Cambria Math" w:hAnsi="Cambria Math"/>
-          </w:rPr>
-          <m:t xml:space="preserve">-5 % </m:t>
+          <m:t xml:space="preserve">/dT≈-5 % </m:t>
         </m:r>
         <m:sSup>
           <m:sSupPr>
@@ -1887,11 +1990,35 @@
           <w:numId w:val="3"/>
         </w:numPr>
       </w:pPr>
+      <w:r>
+        <w:t>T</w:t>
+      </w:r>
+      <w:r>
+        <w:t xml:space="preserve">he </w:t>
+      </w:r>
+      <w:r>
+        <w:t xml:space="preserve">vertical </w:t>
+      </w:r>
+      <w:r>
+        <w:t xml:space="preserve">cloud moisture flux divergence </w:t>
+      </w:r>
+      <w:r>
+        <w:t xml:space="preserve">source </w:t>
+      </w:r>
+      <w:r>
+        <w:t xml:space="preserve">balances the drying </w:t>
+      </w:r>
+      <w:r>
+        <w:t xml:space="preserve">sink </w:t>
+      </w:r>
+      <w:r>
+        <w:rPr>
+          <w:rFonts w:eastAsiaTheme="minorEastAsia"/>
+        </w:rPr>
+        <w:t>(</w:t>
+      </w:r>
       <m:oMath>
         <m:r>
-          <m:rPr>
-            <m:sty m:val="bi"/>
-          </m:rPr>
           <w:rPr>
             <w:rFonts w:ascii="Cambria Math" w:hAnsi="Cambria Math"/>
           </w:rPr>
@@ -1901,40 +2028,14 @@
       <w:r>
         <w:rPr>
           <w:rFonts w:eastAsiaTheme="minorEastAsia"/>
-          <w:b/>
-          <w:bCs/>
-        </w:rPr>
-        <w:t xml:space="preserve">: </w:t>
-      </w:r>
-      <w:r>
-        <w:t xml:space="preserve">The </w:t>
-      </w:r>
-      <w:r>
-        <w:t>central</w:t>
-      </w:r>
-      <w:r>
-        <w:t xml:space="preserve"> part of th</w:t>
-      </w:r>
-      <w:r>
-        <w:t xml:space="preserve">e DIM </w:t>
-      </w:r>
-      <w:r>
-        <w:t xml:space="preserve">hypothesis is that the </w:t>
-      </w:r>
-      <w:r>
-        <w:t xml:space="preserve">vertical </w:t>
-      </w:r>
-      <w:r>
-        <w:t xml:space="preserve">cloud moisture flux divergence </w:t>
-      </w:r>
-      <w:r>
-        <w:t xml:space="preserve">source </w:t>
-      </w:r>
-      <w:r>
-        <w:t xml:space="preserve">balances the drying </w:t>
-      </w:r>
-      <w:r>
-        <w:t xml:space="preserve">sink </w:t>
+        </w:rPr>
+        <w:t>)</w:t>
+      </w:r>
+      <w:r>
+        <w:rPr>
+          <w:rFonts w:eastAsiaTheme="minorEastAsia"/>
+        </w:rPr>
+        <w:t xml:space="preserve"> </w:t>
       </w:r>
       <w:r>
         <w:t xml:space="preserve">by </w:t>
@@ -1957,7 +2058,13 @@
         <w:rPr>
           <w:rFonts w:eastAsiaTheme="minorEastAsia"/>
         </w:rPr>
-        <w:t xml:space="preserve"> through,</w:t>
+        <w:t xml:space="preserve"> </w:t>
+      </w:r>
+      <w:r>
+        <w:rPr>
+          <w:rFonts w:eastAsiaTheme="minorEastAsia"/>
+        </w:rPr>
+        <w:t>through,</w:t>
       </w:r>
       <w:r>
         <w:rPr>
@@ -1970,19 +2077,7 @@
           <w:rPr>
             <w:rFonts w:ascii="Cambria Math" w:eastAsiaTheme="minorEastAsia" w:hAnsi="Cambria Math"/>
           </w:rPr>
-          <m:t xml:space="preserve">0=-∂/∂z </m:t>
-        </m:r>
-        <m:r>
-          <w:rPr>
-            <w:rFonts w:ascii="Cambria Math" w:eastAsiaTheme="minorEastAsia" w:hAnsi="Cambria Math"/>
-          </w:rPr>
-          <m:t>[</m:t>
-        </m:r>
-        <m:r>
-          <w:rPr>
-            <w:rFonts w:ascii="Cambria Math" w:eastAsiaTheme="minorEastAsia" w:hAnsi="Cambria Math"/>
-          </w:rPr>
-          <m:t>M</m:t>
+          <m:t>0=-∂/∂z [M</m:t>
         </m:r>
         <m:d>
           <m:dPr>
@@ -2058,13 +2153,7 @@
           <w:rPr>
             <w:rFonts w:ascii="Cambria Math" w:eastAsiaTheme="minorEastAsia" w:hAnsi="Cambria Math"/>
           </w:rPr>
-          <m:t>]</m:t>
-        </m:r>
-        <m:r>
-          <w:rPr>
-            <w:rFonts w:ascii="Cambria Math" w:eastAsiaTheme="minorEastAsia" w:hAnsi="Cambria Math"/>
-          </w:rPr>
-          <m:t>-W∂</m:t>
+          <m:t>]-W∂</m:t>
         </m:r>
         <m:sSub>
           <m:sSubPr>
@@ -2315,12 +2404,21 @@
       <w:r>
         <w:rPr>
           <w:rFonts w:eastAsiaTheme="minorEastAsia"/>
+          <w:color w:val="4EA72E" w:themeColor="accent6"/>
+        </w:rPr>
+        <w:t>[</w:t>
+      </w:r>
+      <w:r>
+        <w:rPr>
+          <w:rFonts w:eastAsiaTheme="minorEastAsia"/>
+          <w:color w:val="4EA72E" w:themeColor="accent6"/>
         </w:rPr>
         <w:t>We c</w:t>
       </w:r>
       <w:r>
         <w:rPr>
           <w:rFonts w:eastAsiaTheme="minorEastAsia"/>
+          <w:color w:val="4EA72E" w:themeColor="accent6"/>
         </w:rPr>
         <w:t xml:space="preserve">ompare cumulus mass flux </w:t>
       </w:r>
@@ -2328,6 +2426,7 @@
         <m:r>
           <w:rPr>
             <w:rFonts w:ascii="Cambria Math" w:eastAsiaTheme="minorEastAsia" w:hAnsi="Cambria Math"/>
+            <w:color w:val="4EA72E" w:themeColor="accent6"/>
           </w:rPr>
           <m:t>M</m:t>
         </m:r>
@@ -2335,12 +2434,14 @@
       <w:r>
         <w:rPr>
           <w:rFonts w:eastAsiaTheme="minorEastAsia"/>
+          <w:color w:val="4EA72E" w:themeColor="accent6"/>
         </w:rPr>
         <w:t xml:space="preserve"> </w:t>
       </w:r>
       <w:r>
         <w:rPr>
           <w:rFonts w:eastAsiaTheme="minorEastAsia"/>
+          <w:color w:val="4EA72E" w:themeColor="accent6"/>
         </w:rPr>
         <w:t xml:space="preserve">and </w:t>
       </w:r>
@@ -2348,6 +2449,7 @@
         <m:r>
           <w:rPr>
             <w:rFonts w:ascii="Cambria Math" w:eastAsiaTheme="minorEastAsia" w:hAnsi="Cambria Math"/>
+            <w:color w:val="4EA72E" w:themeColor="accent6"/>
           </w:rPr>
           <m:t>W</m:t>
         </m:r>
@@ -2355,12 +2457,14 @@
       <w:r>
         <w:rPr>
           <w:rFonts w:eastAsiaTheme="minorEastAsia"/>
+          <w:color w:val="4EA72E" w:themeColor="accent6"/>
         </w:rPr>
         <w:t xml:space="preserve"> from CFMIP models</w:t>
       </w:r>
       <w:r>
         <w:rPr>
           <w:rFonts w:eastAsiaTheme="minorEastAsia"/>
+          <w:color w:val="4EA72E" w:themeColor="accent6"/>
         </w:rPr>
         <w:t xml:space="preserve"> in Fig. </w:t>
       </w:r>
@@ -2368,6 +2472,7 @@
       <w:r>
         <w:rPr>
           <w:rFonts w:eastAsiaTheme="minorEastAsia"/>
+          <w:color w:val="4EA72E" w:themeColor="accent6"/>
         </w:rPr>
         <w:t>CFMWa</w:t>
       </w:r>
@@ -2375,12 +2480,21 @@
       <w:r>
         <w:rPr>
           <w:rFonts w:eastAsiaTheme="minorEastAsia"/>
+          <w:color w:val="4EA72E" w:themeColor="accent6"/>
         </w:rPr>
         <w:t>.</w:t>
       </w:r>
       <w:r>
         <w:rPr>
           <w:rFonts w:eastAsiaTheme="minorEastAsia"/>
+          <w:color w:val="4EA72E" w:themeColor="accent6"/>
+        </w:rPr>
+        <w:t>]</w:t>
+      </w:r>
+      <w:r>
+        <w:rPr>
+          <w:rFonts w:eastAsiaTheme="minorEastAsia"/>
+          <w:color w:val="4EA72E" w:themeColor="accent6"/>
         </w:rPr>
         <w:t xml:space="preserve"> </w:t>
       </w:r>
@@ -2394,13 +2508,13 @@
         <w:rPr>
           <w:rFonts w:eastAsiaTheme="minorEastAsia"/>
         </w:rPr>
-        <w:t xml:space="preserve">oisture balance </w:t>
-      </w:r>
-      <w:r>
-        <w:rPr>
-          <w:rFonts w:eastAsiaTheme="minorEastAsia"/>
-        </w:rPr>
-        <w:t>by fiat, we assess</w:t>
+        <w:t>oisture balance</w:t>
+      </w:r>
+      <w:r>
+        <w:rPr>
+          <w:rFonts w:eastAsiaTheme="minorEastAsia"/>
+        </w:rPr>
+        <w:t>, we assess</w:t>
       </w:r>
       <w:r>
         <w:rPr>
@@ -2516,61 +2630,21 @@
           <w:ilvl w:val="0"/>
           <w:numId w:val="3"/>
         </w:numPr>
+        <w:rPr>
+          <w:color w:val="4EA72E" w:themeColor="accent6"/>
+        </w:rPr>
       </w:pPr>
-      <m:oMath>
-        <m:r>
-          <m:rPr>
-            <m:sty m:val="bi"/>
-          </m:rPr>
-          <w:rPr>
-            <w:rFonts w:ascii="Cambria Math" w:eastAsiaTheme="minorEastAsia" w:hAnsi="Cambria Math"/>
-          </w:rPr>
-          <m:t>C∝M</m:t>
-        </m:r>
-      </m:oMath>
-      <w:r>
-        <w:rPr>
-          <w:rFonts w:eastAsiaTheme="minorEastAsia"/>
-          <w:b/>
-          <w:bCs/>
-        </w:rPr>
-        <w:t>:</w:t>
-      </w:r>
-      <w:r>
-        <w:rPr>
-          <w:rFonts w:eastAsiaTheme="minorEastAsia"/>
-        </w:rPr>
-        <w:t xml:space="preserve"> </w:t>
-      </w:r>
-      <w:r>
-        <w:rPr>
-          <w:rFonts w:eastAsiaTheme="minorEastAsia"/>
-        </w:rPr>
-        <w:t xml:space="preserve"> </w:t>
-      </w:r>
-      <w:r>
-        <w:rPr>
-          <w:rFonts w:eastAsiaTheme="minorEastAsia"/>
-        </w:rPr>
-        <w:t xml:space="preserve">We </w:t>
-      </w:r>
-      <w:r>
-        <w:rPr>
-          <w:rFonts w:eastAsiaTheme="minorEastAsia"/>
-        </w:rPr>
-        <w:t xml:space="preserve">also </w:t>
-      </w:r>
-      <w:r>
-        <w:rPr>
-          <w:rFonts w:eastAsiaTheme="minorEastAsia"/>
-        </w:rPr>
-        <w:t>hypothesize that the</w:t>
-      </w:r>
-      <w:r>
-        <w:rPr>
-          <w:rFonts w:eastAsiaTheme="minorEastAsia"/>
-        </w:rPr>
-        <w:t xml:space="preserve"> cloud fraction </w:t>
+      <w:r>
+        <w:rPr>
+          <w:rFonts w:eastAsiaTheme="minorEastAsia"/>
+        </w:rPr>
+        <w:t xml:space="preserve">The shallow cumulus </w:t>
+      </w:r>
+      <w:r>
+        <w:rPr>
+          <w:rFonts w:eastAsiaTheme="minorEastAsia"/>
+        </w:rPr>
+        <w:t xml:space="preserve">cloud fraction </w:t>
       </w:r>
       <m:oMath>
         <m:r>
@@ -2609,26 +2683,14 @@
           <w:rPr>
             <w:rFonts w:ascii="Cambria Math" w:eastAsiaTheme="minorEastAsia" w:hAnsi="Cambria Math"/>
           </w:rPr>
-          <m:t>C</m:t>
-        </m:r>
-        <m:r>
-          <w:rPr>
-            <w:rFonts w:ascii="Cambria Math" w:eastAsiaTheme="minorEastAsia" w:hAnsi="Cambria Math"/>
-          </w:rPr>
-          <m:t>∝M</m:t>
+          <m:t>C∝M</m:t>
         </m:r>
       </m:oMath>
       <w:r>
         <w:rPr>
           <w:rFonts w:eastAsiaTheme="minorEastAsia"/>
         </w:rPr>
-        <w:t xml:space="preserve">. </w:t>
-      </w:r>
-      <w:r>
-        <w:rPr>
-          <w:rFonts w:eastAsiaTheme="minorEastAsia"/>
-        </w:rPr>
-        <w:t xml:space="preserve">This is supported by the cloud mass flux </w:t>
+        <w:t xml:space="preserve">. This is supported by the cloud mass flux </w:t>
       </w:r>
       <w:r>
         <w:rPr>
@@ -2674,181 +2736,150 @@
         <w:rPr>
           <w:rFonts w:eastAsiaTheme="minorEastAsia"/>
         </w:rPr>
-        <w:t>, and</w:t>
-      </w:r>
-      <w:r>
-        <w:rPr>
-          <w:rFonts w:eastAsiaTheme="minorEastAsia"/>
+        <w:t xml:space="preserve">. It </w:t>
+      </w:r>
+      <w:r>
+        <w:rPr>
+          <w:rFonts w:eastAsiaTheme="minorEastAsia"/>
+        </w:rPr>
+        <w:t>results from</w:t>
+      </w:r>
+      <w:r>
+        <w:rPr>
+          <w:rFonts w:eastAsiaTheme="minorEastAsia"/>
+        </w:rPr>
+        <w:t xml:space="preserve"> a heuristic model with entrainment rates tuned to reproduce moisture balance with the observed distribution of cloud top heights. </w:t>
+      </w:r>
+      <w:r>
+        <w:rPr>
+          <w:rFonts w:eastAsiaTheme="minorEastAsia"/>
+          <w:color w:val="4EA72E" w:themeColor="accent6"/>
+        </w:rPr>
+        <w:t xml:space="preserve">Cumulus mass flux and low cloud fraction from </w:t>
+      </w:r>
+      <w:r>
+        <w:rPr>
+          <w:rFonts w:eastAsiaTheme="minorEastAsia"/>
+          <w:color w:val="4EA72E" w:themeColor="accent6"/>
+        </w:rPr>
+        <w:t>CFMIP</w:t>
+      </w:r>
+      <w:r>
+        <w:rPr>
+          <w:rFonts w:eastAsiaTheme="minorEastAsia"/>
+          <w:color w:val="4EA72E" w:themeColor="accent6"/>
         </w:rPr>
         <w:t xml:space="preserve"> </w:t>
       </w:r>
       <w:r>
         <w:rPr>
           <w:rFonts w:eastAsiaTheme="minorEastAsia"/>
-        </w:rPr>
-        <w:t>results from</w:t>
-      </w:r>
-      <w:r>
-        <w:rPr>
-          <w:rFonts w:eastAsiaTheme="minorEastAsia"/>
-        </w:rPr>
-        <w:t xml:space="preserve"> a heuristic model with entrainment rates tuned to reproduce moisture balance with the observed distribution of cloud top heights. </w:t>
-      </w:r>
-      <w:proofErr w:type="spellStart"/>
-      <w:r>
-        <w:rPr>
-          <w:rFonts w:eastAsiaTheme="minorEastAsia"/>
-        </w:rPr>
-        <w:t>Cumulus</w:t>
-      </w:r>
-      <w:proofErr w:type="spellEnd"/>
-      <w:r>
-        <w:rPr>
-          <w:rFonts w:eastAsiaTheme="minorEastAsia"/>
-        </w:rPr>
-        <w:t xml:space="preserve"> mass flux and low cloud fraction from </w:t>
-      </w:r>
-      <w:r>
-        <w:rPr>
-          <w:rFonts w:eastAsiaTheme="minorEastAsia"/>
-        </w:rPr>
-        <w:t>CFMIP</w:t>
-      </w:r>
-      <w:r>
-        <w:rPr>
-          <w:rFonts w:eastAsiaTheme="minorEastAsia"/>
+          <w:color w:val="4EA72E" w:themeColor="accent6"/>
+        </w:rPr>
+        <w:t>models</w:t>
+      </w:r>
+      <w:r>
+        <w:rPr>
+          <w:rFonts w:eastAsiaTheme="minorEastAsia"/>
+          <w:color w:val="4EA72E" w:themeColor="accent6"/>
         </w:rPr>
         <w:t xml:space="preserve"> </w:t>
       </w:r>
       <w:r>
         <w:rPr>
           <w:rFonts w:eastAsiaTheme="minorEastAsia"/>
-        </w:rPr>
-        <w:t>models</w:t>
-      </w:r>
-      <w:r>
-        <w:rPr>
-          <w:rFonts w:eastAsiaTheme="minorEastAsia"/>
+          <w:color w:val="4EA72E" w:themeColor="accent6"/>
+        </w:rPr>
+        <w:t xml:space="preserve">(Cloud Forcing Project, Webb et al. XXXX; </w:t>
+      </w:r>
+      <w:r>
+        <w:rPr>
+          <w:rFonts w:eastAsiaTheme="minorEastAsia"/>
+          <w:color w:val="4EA72E" w:themeColor="accent6"/>
+        </w:rPr>
+        <w:t>COSP REF XXXX)</w:t>
+      </w:r>
+      <w:r>
+        <w:rPr>
+          <w:rFonts w:eastAsiaTheme="minorEastAsia"/>
+          <w:color w:val="4EA72E" w:themeColor="accent6"/>
+        </w:rPr>
+        <w:t xml:space="preserve"> are</w:t>
+      </w:r>
+      <w:r>
+        <w:rPr>
+          <w:rFonts w:eastAsiaTheme="minorEastAsia"/>
+          <w:color w:val="4EA72E" w:themeColor="accent6"/>
+        </w:rPr>
+        <w:t xml:space="preserve"> compare</w:t>
+      </w:r>
+      <w:r>
+        <w:rPr>
+          <w:rFonts w:eastAsiaTheme="minorEastAsia"/>
+          <w:color w:val="4EA72E" w:themeColor="accent6"/>
+        </w:rPr>
+        <w:t>d</w:t>
+      </w:r>
+      <w:r>
+        <w:rPr>
+          <w:rFonts w:eastAsiaTheme="minorEastAsia"/>
+          <w:color w:val="4EA72E" w:themeColor="accent6"/>
         </w:rPr>
         <w:t xml:space="preserve"> </w:t>
       </w:r>
       <w:r>
         <w:rPr>
           <w:rFonts w:eastAsiaTheme="minorEastAsia"/>
-        </w:rPr>
-        <w:t>(Cloud Forcing Project, Webb et al. XXXX</w:t>
-      </w:r>
-      <w:r>
-        <w:rPr>
-          <w:rFonts w:eastAsiaTheme="minorEastAsia"/>
-        </w:rPr>
-        <w:t xml:space="preserve">; </w:t>
-      </w:r>
-      <w:r>
-        <w:rPr>
-          <w:rFonts w:eastAsiaTheme="minorEastAsia"/>
-        </w:rPr>
-        <w:t>COSP REF XXXX)</w:t>
-      </w:r>
-      <w:r>
-        <w:rPr>
-          <w:rFonts w:eastAsiaTheme="minorEastAsia"/>
-        </w:rPr>
-        <w:t xml:space="preserve"> are</w:t>
-      </w:r>
-      <w:r>
-        <w:rPr>
-          <w:rFonts w:eastAsiaTheme="minorEastAsia"/>
-        </w:rPr>
-        <w:t xml:space="preserve"> compare</w:t>
-      </w:r>
-      <w:r>
-        <w:rPr>
-          <w:rFonts w:eastAsiaTheme="minorEastAsia"/>
-        </w:rPr>
-        <w:t>d</w:t>
-      </w:r>
-      <w:r>
-        <w:rPr>
-          <w:rFonts w:eastAsiaTheme="minorEastAsia"/>
+          <w:color w:val="4EA72E" w:themeColor="accent6"/>
+        </w:rPr>
+        <w:t>in</w:t>
+      </w:r>
+      <w:r>
+        <w:rPr>
+          <w:rFonts w:eastAsiaTheme="minorEastAsia"/>
+          <w:color w:val="4EA72E" w:themeColor="accent6"/>
         </w:rPr>
         <w:t xml:space="preserve"> </w:t>
       </w:r>
       <w:r>
         <w:rPr>
           <w:rFonts w:eastAsiaTheme="minorEastAsia"/>
-        </w:rPr>
-        <w:t>in</w:t>
-      </w:r>
-      <w:r>
-        <w:rPr>
-          <w:rFonts w:eastAsiaTheme="minorEastAsia"/>
-        </w:rPr>
-        <w:t xml:space="preserve"> </w:t>
-      </w:r>
-      <w:r>
-        <w:rPr>
-          <w:rFonts w:eastAsiaTheme="minorEastAsia"/>
-        </w:rPr>
-        <w:t xml:space="preserve">present </w:t>
-      </w:r>
-      <w:r>
-        <w:rPr>
-          <w:rFonts w:eastAsiaTheme="minorEastAsia"/>
-        </w:rPr>
-        <w:t>(</w:t>
-      </w:r>
-      <w:r>
-        <w:rPr>
-          <w:rFonts w:eastAsiaTheme="minorEastAsia"/>
-        </w:rPr>
-        <w:t>AMIP</w:t>
-      </w:r>
-      <w:r>
-        <w:rPr>
-          <w:rFonts w:eastAsiaTheme="minorEastAsia"/>
-        </w:rPr>
-        <w:t>)</w:t>
-      </w:r>
-      <w:r>
-        <w:rPr>
-          <w:rFonts w:eastAsiaTheme="minorEastAsia"/>
-        </w:rPr>
-        <w:t xml:space="preserve"> </w:t>
-      </w:r>
-      <w:r>
-        <w:rPr>
-          <w:rFonts w:eastAsiaTheme="minorEastAsia"/>
-        </w:rPr>
-        <w:t xml:space="preserve">and </w:t>
-      </w:r>
-      <w:r>
-        <w:rPr>
-          <w:rFonts w:eastAsiaTheme="minorEastAsia"/>
+          <w:color w:val="4EA72E" w:themeColor="accent6"/>
+        </w:rPr>
+        <w:t xml:space="preserve">present (AMIP) and </w:t>
+      </w:r>
+      <w:r>
+        <w:rPr>
+          <w:rFonts w:eastAsiaTheme="minorEastAsia"/>
+          <w:color w:val="4EA72E" w:themeColor="accent6"/>
         </w:rPr>
         <w:t>warming (AMIP-</w:t>
       </w:r>
       <w:r>
         <w:rPr>
           <w:rFonts w:eastAsiaTheme="minorEastAsia"/>
+          <w:color w:val="4EA72E" w:themeColor="accent6"/>
         </w:rPr>
         <w:t>p4K</w:t>
       </w:r>
       <w:r>
         <w:rPr>
           <w:rFonts w:eastAsiaTheme="minorEastAsia"/>
+          <w:color w:val="4EA72E" w:themeColor="accent6"/>
         </w:rPr>
         <w:t xml:space="preserve">) </w:t>
       </w:r>
       <w:r>
         <w:rPr>
           <w:rFonts w:eastAsiaTheme="minorEastAsia"/>
+          <w:color w:val="4EA72E" w:themeColor="accent6"/>
         </w:rPr>
         <w:t>simulation</w:t>
       </w:r>
       <w:r>
         <w:rPr>
           <w:rFonts w:eastAsiaTheme="minorEastAsia"/>
+          <w:color w:val="4EA72E" w:themeColor="accent6"/>
         </w:rPr>
         <w:t xml:space="preserve">s to assess </w:t>
       </w:r>
@@ -2856,6 +2887,7 @@
         <m:r>
           <w:rPr>
             <w:rFonts w:ascii="Cambria Math" w:eastAsiaTheme="minorEastAsia" w:hAnsi="Cambria Math"/>
+            <w:color w:val="4EA72E" w:themeColor="accent6"/>
           </w:rPr>
           <m:t>C∝M∝W</m:t>
         </m:r>
@@ -2863,6 +2895,7 @@
       <w:r>
         <w:rPr>
           <w:rFonts w:eastAsiaTheme="minorEastAsia"/>
+          <w:color w:val="4EA72E" w:themeColor="accent6"/>
         </w:rPr>
         <w:t xml:space="preserve"> in Fig. CFMW.</w:t>
       </w:r>
@@ -3042,13 +3075,7 @@
           <w:rPr>
             <w:rFonts w:ascii="Cambria Math" w:hAnsi="Cambria Math"/>
           </w:rPr>
-          <m:t>/dT</m:t>
-        </m:r>
-        <m:r>
-          <w:rPr>
-            <w:rFonts w:ascii="Cambria Math" w:hAnsi="Cambria Math"/>
-          </w:rPr>
-          <m:t>≈</m:t>
+          <m:t>/dT≈</m:t>
         </m:r>
         <m:r>
           <w:rPr>
@@ -3184,7 +3211,6 @@
           <w:rFonts w:eastAsiaTheme="minorEastAsia"/>
           <w:iCs/>
         </w:rPr>
-        <w:lastRenderedPageBreak/>
         <w:t>Differences</w:t>
       </w:r>
       <w:r>
@@ -3408,9 +3434,36 @@
       <w:r>
         <w:rPr>
           <w:rFonts w:eastAsiaTheme="minorEastAsia"/>
+        </w:rPr>
+        <w:t xml:space="preserve">The DIM hypothesis predicts the change in area of low clouds responsible for the moisture </w:t>
+      </w:r>
+      <w:proofErr w:type="gramStart"/>
+      <w:r>
+        <w:rPr>
+          <w:rFonts w:eastAsiaTheme="minorEastAsia"/>
+        </w:rPr>
+        <w:t>flux, but</w:t>
+      </w:r>
+      <w:proofErr w:type="gramEnd"/>
+      <w:r>
+        <w:rPr>
+          <w:rFonts w:eastAsiaTheme="minorEastAsia"/>
+        </w:rPr>
+        <w:t xml:space="preserve"> does not account for secondary desiccation of the optically thick stratocumulus clouds at cloud base in most climate models. </w:t>
+      </w:r>
+      <w:r>
+        <w:rPr>
+          <w:rFonts w:eastAsiaTheme="minorEastAsia"/>
           <w:iCs/>
         </w:rPr>
-        <w:t xml:space="preserve">Divergence from </w:t>
+        <w:t xml:space="preserve">Divergence of the vertically developed shallow cumulus cloud fraction </w:t>
+      </w:r>
+      <w:r>
+        <w:rPr>
+          <w:rFonts w:eastAsiaTheme="minorEastAsia"/>
+          <w:iCs/>
+        </w:rPr>
+        <w:t xml:space="preserve">from </w:t>
       </w:r>
       <m:oMath>
         <m:r>
@@ -3502,25 +3555,27 @@
         <w:rPr>
           <w:rFonts w:eastAsiaTheme="minorEastAsia"/>
         </w:rPr>
-        <w:t xml:space="preserve">to the </w:t>
-      </w:r>
-      <w:r>
-        <w:rPr>
-          <w:rFonts w:eastAsiaTheme="minorEastAsia"/>
-        </w:rPr>
-        <w:t xml:space="preserve">“active” </w:t>
-      </w:r>
-      <w:r>
-        <w:rPr>
-          <w:rFonts w:eastAsiaTheme="minorEastAsia"/>
-        </w:rPr>
-        <w:t xml:space="preserve">updraft </w:t>
-      </w:r>
-      <w:r>
-        <w:rPr>
-          <w:rFonts w:eastAsiaTheme="minorEastAsia"/>
-        </w:rPr>
-        <w:t xml:space="preserve">area with moisture flux </w:t>
+        <w:t xml:space="preserve">to the “active” updraft area </w:t>
+      </w:r>
+      <m:oMath>
+        <m:r>
+          <w:rPr>
+            <w:rFonts w:ascii="Cambria Math" w:eastAsiaTheme="minorEastAsia" w:hAnsi="Cambria Math"/>
+          </w:rPr>
+          <m:t>A</m:t>
+        </m:r>
+      </m:oMath>
+      <w:r>
+        <w:rPr>
+          <w:rFonts w:eastAsiaTheme="minorEastAsia"/>
+        </w:rPr>
+        <w:t xml:space="preserve"> </w:t>
+      </w:r>
+      <w:r>
+        <w:rPr>
+          <w:rFonts w:eastAsiaTheme="minorEastAsia"/>
+        </w:rPr>
+        <w:t xml:space="preserve">with moisture flux </w:t>
       </w:r>
       <m:oMath>
         <m:sSub>
@@ -3624,31 +3679,39 @@
         <w:rPr>
           <w:rFonts w:eastAsiaTheme="minorEastAsia"/>
         </w:rPr>
-        <w:t xml:space="preserve"> changes</w:t>
-      </w:r>
-      <w:r>
-        <w:rPr>
-          <w:rFonts w:eastAsiaTheme="minorEastAsia"/>
-        </w:rPr>
-        <w:t xml:space="preserve"> </w:t>
-      </w:r>
-      <w:r>
-        <w:rPr>
-          <w:rFonts w:eastAsiaTheme="minorEastAsia"/>
-        </w:rPr>
-        <w:t xml:space="preserve">for clouds </w:t>
-      </w:r>
-      <w:r>
-        <w:rPr>
-          <w:rFonts w:eastAsiaTheme="minorEastAsia"/>
-        </w:rPr>
-        <w:t>in a different climate.</w:t>
-      </w:r>
-      <w:r>
-        <w:rPr>
-          <w:rFonts w:eastAsiaTheme="minorEastAsia"/>
-        </w:rPr>
-        <w:t xml:space="preserve"> </w:t>
+        <w:t xml:space="preserve"> changes for clouds in a different climate.</w:t>
+      </w:r>
+      <w:r>
+        <w:rPr>
+          <w:rFonts w:eastAsiaTheme="minorEastAsia"/>
+        </w:rPr>
+        <w:t xml:space="preserve"> [Vogel or ref therein says </w:t>
+      </w:r>
+      <m:oMath>
+        <m:r>
+          <w:rPr>
+            <w:rFonts w:ascii="Cambria Math" w:eastAsiaTheme="minorEastAsia" w:hAnsi="Cambria Math"/>
+          </w:rPr>
+          <m:t>C/A</m:t>
+        </m:r>
+        <m:r>
+          <w:rPr>
+            <w:rFonts w:ascii="Cambria Math" w:eastAsiaTheme="minorEastAsia" w:hAnsi="Cambria Math"/>
+          </w:rPr>
+          <m:t>≈</m:t>
+        </m:r>
+        <m:r>
+          <w:rPr>
+            <w:rFonts w:ascii="Cambria Math" w:eastAsiaTheme="minorEastAsia" w:hAnsi="Cambria Math"/>
+          </w:rPr>
+          <m:t>2</m:t>
+        </m:r>
+      </m:oMath>
+      <w:r>
+        <w:rPr>
+          <w:rFonts w:eastAsiaTheme="minorEastAsia"/>
+        </w:rPr>
+        <w:t>???]</w:t>
       </w:r>
     </w:p>
     <w:p>
@@ -3665,10 +3728,7 @@
         <w:t xml:space="preserve">parts </w:t>
       </w:r>
       <w:r>
-        <w:t>2 and 3)</w:t>
-      </w:r>
-      <w:r>
-        <w:t xml:space="preserve"> </w:t>
+        <w:t xml:space="preserve">2 and 3) </w:t>
       </w:r>
       <m:oMath>
         <m:r>
@@ -3817,25 +3877,19 @@
         <w:rPr>
           <w:rFonts w:eastAsiaTheme="minorEastAsia"/>
         </w:rPr>
-        <w:t>A</w:t>
-      </w:r>
-      <w:r>
-        <w:rPr>
-          <w:rFonts w:eastAsiaTheme="minorEastAsia"/>
-        </w:rPr>
-        <w:t xml:space="preserve"> </w:t>
-      </w:r>
-      <w:r>
-        <w:rPr>
-          <w:rFonts w:eastAsiaTheme="minorEastAsia"/>
-        </w:rPr>
-        <w:t>few</w:t>
-      </w:r>
-      <w:r>
-        <w:rPr>
-          <w:rFonts w:eastAsiaTheme="minorEastAsia"/>
-        </w:rPr>
-        <w:t xml:space="preserve"> cloud parameterizations </w:t>
+        <w:t>C</w:t>
+      </w:r>
+      <w:r>
+        <w:rPr>
+          <w:rFonts w:eastAsiaTheme="minorEastAsia"/>
+        </w:rPr>
+        <w:t xml:space="preserve">loud parameterizations </w:t>
+      </w:r>
+      <w:r>
+        <w:rPr>
+          <w:rFonts w:eastAsiaTheme="minorEastAsia"/>
+        </w:rPr>
+        <w:t xml:space="preserve">used in these models </w:t>
       </w:r>
       <w:r>
         <w:rPr>
@@ -3929,91 +3983,42 @@
           <w:rFonts w:eastAsiaTheme="minorEastAsia"/>
           <w:iCs/>
         </w:rPr>
-        <w:t>I</w:t>
+        <w:t>In our heuristic shallow cumulus model, cloud-scale turbulent processes are represented by</w:t>
       </w:r>
       <w:r>
         <w:rPr>
           <w:rFonts w:eastAsiaTheme="minorEastAsia"/>
           <w:iCs/>
         </w:rPr>
-        <w:t xml:space="preserve">n our </w:t>
+        <w:t xml:space="preserve"> </w:t>
       </w:r>
       <w:r>
         <w:rPr>
           <w:rFonts w:eastAsiaTheme="minorEastAsia"/>
           <w:iCs/>
         </w:rPr>
-        <w:t xml:space="preserve">heuristic shallow cumulus </w:t>
+        <w:t xml:space="preserve">lateral </w:t>
       </w:r>
       <w:r>
         <w:rPr>
           <w:rFonts w:eastAsiaTheme="minorEastAsia"/>
           <w:iCs/>
         </w:rPr>
-        <w:t>model</w:t>
+        <w:t>entrainment</w:t>
       </w:r>
       <w:r>
         <w:rPr>
           <w:rFonts w:eastAsiaTheme="minorEastAsia"/>
           <w:iCs/>
         </w:rPr>
-        <w:t>, c</w:t>
+        <w:t xml:space="preserve"> into clouds</w:t>
       </w:r>
       <w:r>
         <w:rPr>
           <w:rFonts w:eastAsiaTheme="minorEastAsia"/>
           <w:iCs/>
         </w:rPr>
-        <w:t>loud-scale turbulent processes</w:t>
-      </w:r>
-      <w:r>
-        <w:rPr>
-          <w:rFonts w:eastAsiaTheme="minorEastAsia"/>
-          <w:iCs/>
-        </w:rPr>
-        <w:t xml:space="preserve"> are represented by</w:t>
-      </w:r>
-      <w:r>
-        <w:rPr>
-          <w:rFonts w:eastAsiaTheme="minorEastAsia"/>
-          <w:iCs/>
-        </w:rPr>
-        <w:t xml:space="preserve"> </w:t>
-      </w:r>
-      <w:r>
-        <w:rPr>
-          <w:rFonts w:eastAsiaTheme="minorEastAsia"/>
-          <w:iCs/>
-        </w:rPr>
-        <w:t xml:space="preserve">lateral </w:t>
-      </w:r>
-      <w:r>
-        <w:rPr>
-          <w:rFonts w:eastAsiaTheme="minorEastAsia"/>
-          <w:iCs/>
-        </w:rPr>
-        <w:t>entrainment</w:t>
-      </w:r>
-      <w:r>
-        <w:rPr>
-          <w:rFonts w:eastAsiaTheme="minorEastAsia"/>
-          <w:iCs/>
-        </w:rPr>
-        <w:t xml:space="preserve"> into clouds</w:t>
-      </w:r>
-      <w:r>
-        <w:rPr>
-          <w:rFonts w:eastAsiaTheme="minorEastAsia"/>
-          <w:iCs/>
-        </w:rPr>
-        <w:t>. Each entrainment rate</w:t>
-      </w:r>
-      <w:r>
-        <w:rPr>
-          <w:rFonts w:eastAsiaTheme="minorEastAsia"/>
-          <w:iCs/>
-        </w:rPr>
-        <w:t xml:space="preserve"> </w:t>
+        <w:t xml:space="preserve">. Each entrainment rate </w:t>
       </w:r>
       <w:r>
         <w:rPr>
@@ -4175,133 +4180,56 @@
           <w:rFonts w:eastAsiaTheme="minorEastAsia"/>
           <w:iCs/>
         </w:rPr>
-        <w:t xml:space="preserve"> cloud top height distribution</w:t>
+        <w:t xml:space="preserve"> cloud top height distribution and moisture flux </w:t>
       </w:r>
       <w:r>
         <w:rPr>
           <w:rFonts w:eastAsiaTheme="minorEastAsia"/>
           <w:iCs/>
         </w:rPr>
-        <w:t xml:space="preserve"> and</w:t>
+        <w:t>divergence</w:t>
       </w:r>
       <w:r>
         <w:rPr>
           <w:rFonts w:eastAsiaTheme="minorEastAsia"/>
           <w:iCs/>
         </w:rPr>
-        <w:t xml:space="preserve"> moisture flux </w:t>
+        <w:t xml:space="preserve"> </w:t>
       </w:r>
       <w:r>
         <w:rPr>
           <w:rFonts w:eastAsiaTheme="minorEastAsia"/>
           <w:iCs/>
         </w:rPr>
-        <w:t>divergence</w:t>
+        <w:t>i</w:t>
       </w:r>
       <w:r>
         <w:rPr>
           <w:rFonts w:eastAsiaTheme="minorEastAsia"/>
           <w:iCs/>
         </w:rPr>
-        <w:t xml:space="preserve"> </w:t>
+        <w:t>n the present climate</w:t>
       </w:r>
       <w:r>
         <w:rPr>
           <w:rFonts w:eastAsiaTheme="minorEastAsia"/>
           <w:iCs/>
         </w:rPr>
-        <w:t>i</w:t>
+        <w:t xml:space="preserve">. </w:t>
       </w:r>
       <w:r>
         <w:rPr>
           <w:rFonts w:eastAsiaTheme="minorEastAsia"/>
           <w:iCs/>
         </w:rPr>
-        <w:t>n the present climate</w:t>
+        <w:t>This entrainment distribution represents cloud-scale processes l</w:t>
       </w:r>
       <w:r>
         <w:rPr>
           <w:rFonts w:eastAsiaTheme="minorEastAsia"/>
           <w:iCs/>
         </w:rPr>
-        <w:t xml:space="preserve">. </w:t>
-      </w:r>
-      <w:r>
-        <w:rPr>
-          <w:rFonts w:eastAsiaTheme="minorEastAsia"/>
-          <w:iCs/>
-        </w:rPr>
-        <w:t>T</w:t>
-      </w:r>
-      <w:r>
-        <w:rPr>
-          <w:rFonts w:eastAsiaTheme="minorEastAsia"/>
-          <w:iCs/>
-        </w:rPr>
-        <w:t>his entrainment distribution represent</w:t>
-      </w:r>
-      <w:r>
-        <w:rPr>
-          <w:rFonts w:eastAsiaTheme="minorEastAsia"/>
-          <w:iCs/>
-        </w:rPr>
-        <w:t>s</w:t>
-      </w:r>
-      <w:r>
-        <w:rPr>
-          <w:rFonts w:eastAsiaTheme="minorEastAsia"/>
-          <w:iCs/>
-        </w:rPr>
-        <w:t xml:space="preserve"> cloud</w:t>
-      </w:r>
-      <w:r>
-        <w:rPr>
-          <w:rFonts w:eastAsiaTheme="minorEastAsia"/>
-          <w:iCs/>
-        </w:rPr>
-        <w:t>-</w:t>
-      </w:r>
-      <w:r>
-        <w:rPr>
-          <w:rFonts w:eastAsiaTheme="minorEastAsia"/>
-          <w:iCs/>
-        </w:rPr>
-        <w:t>scale processes</w:t>
-      </w:r>
-      <w:r>
-        <w:rPr>
-          <w:rFonts w:eastAsiaTheme="minorEastAsia"/>
-          <w:iCs/>
-        </w:rPr>
-        <w:t xml:space="preserve"> l</w:t>
-      </w:r>
-      <w:r>
-        <w:rPr>
-          <w:rFonts w:eastAsiaTheme="minorEastAsia"/>
-          <w:iCs/>
-        </w:rPr>
-        <w:t>i</w:t>
-      </w:r>
-      <w:r>
-        <w:rPr>
-          <w:rFonts w:eastAsiaTheme="minorEastAsia"/>
-          <w:iCs/>
-        </w:rPr>
-        <w:t>ke cloud parameter</w:t>
-      </w:r>
-      <w:r>
-        <w:rPr>
-          <w:rFonts w:eastAsiaTheme="minorEastAsia"/>
-          <w:iCs/>
-        </w:rPr>
-        <w:t>izations</w:t>
-      </w:r>
-      <w:r>
-        <w:rPr>
-          <w:rFonts w:eastAsiaTheme="minorEastAsia"/>
-          <w:iCs/>
-        </w:rPr>
-        <w:t xml:space="preserve"> determined from observations and/or large-eddy simulations</w:t>
+        <w:t>ike cloud parameterizations determined from observations and/or large-eddy simulations</w:t>
       </w:r>
       <w:r>
         <w:rPr>
@@ -4372,14 +4300,7 @@
           <w:rFonts w:eastAsiaTheme="minorEastAsia"/>
           <w:iCs/>
         </w:rPr>
-        <w:t>described in the m</w:t>
-      </w:r>
-      <w:r>
-        <w:rPr>
-          <w:rFonts w:eastAsiaTheme="minorEastAsia"/>
-          <w:iCs/>
-        </w:rPr>
-        <w:t>ethods</w:t>
+        <w:t>described in the methods</w:t>
       </w:r>
       <w:r>
         <w:rPr>
@@ -4717,7 +4638,6 @@
         <w:pStyle w:val="Heading1"/>
       </w:pPr>
       <w:r>
-        <w:lastRenderedPageBreak/>
         <w:t>Results</w:t>
       </w:r>
     </w:p>
@@ -5424,13 +5344,7 @@
           <w:rPr>
             <w:rFonts w:ascii="Cambria Math" w:eastAsiaTheme="minorEastAsia" w:hAnsi="Cambria Math" w:cs="Times New Roman"/>
           </w:rPr>
-          <m:t>/</m:t>
-        </m:r>
-        <m:r>
-          <w:rPr>
-            <w:rFonts w:ascii="Cambria Math" w:eastAsiaTheme="minorEastAsia" w:hAnsi="Cambria Math" w:cs="Times New Roman"/>
-          </w:rPr>
-          <m:t>∂z=-ϵ</m:t>
+          <m:t>/∂z=-ϵ</m:t>
         </m:r>
         <m:d>
           <m:dPr>
@@ -5529,13 +5443,7 @@
         <w:rPr>
           <w:rFonts w:ascii="Aptos" w:hAnsi="Aptos"/>
         </w:rPr>
-        <w:t xml:space="preserve">balances the condensation heating. </w:t>
-      </w:r>
-      <w:r>
-        <w:rPr>
-          <w:rFonts w:ascii="Aptos" w:hAnsi="Aptos"/>
-        </w:rPr>
-        <w:t xml:space="preserve">Total water </w:t>
+        <w:t xml:space="preserve">balances the condensation heating. Total water </w:t>
       </w:r>
       <w:proofErr w:type="gramStart"/>
       <w:r>
@@ -5551,19 +5459,11 @@
         </w:rPr>
         <w:t xml:space="preserve"> the saturation specific humidity condenses as cloud liquid. </w:t>
       </w:r>
-      <w:proofErr w:type="spellStart"/>
-      <w:r>
-        <w:rPr>
-          <w:rFonts w:ascii="Aptos" w:hAnsi="Aptos"/>
-        </w:rPr>
-        <w:t>The</w:t>
-      </w:r>
-      <w:proofErr w:type="spellEnd"/>
-      <w:r>
-        <w:rPr>
-          <w:rFonts w:ascii="Aptos" w:hAnsi="Aptos"/>
-        </w:rPr>
-        <w:t xml:space="preserve"> </w:t>
+      <w:r>
+        <w:rPr>
+          <w:rFonts w:ascii="Aptos" w:hAnsi="Aptos"/>
+        </w:rPr>
+        <w:t xml:space="preserve">The </w:t>
       </w:r>
       <w:r>
         <w:rPr>
@@ -5899,7 +5799,7 @@
                     <pic:cNvPicPr/>
                   </pic:nvPicPr>
                   <pic:blipFill rotWithShape="1">
-                    <a:blip r:embed="rId5"/>
+                    <a:blip r:embed="rId6"/>
                     <a:srcRect r="49691" b="47154"/>
                     <a:stretch>
                       <a:fillRect/>
@@ -5970,14 +5870,7 @@
         <w:rPr>
           <w:rFonts w:ascii="Aptos Narrow" w:eastAsiaTheme="minorEastAsia" w:hAnsi="Aptos Narrow" w:cs="Times New Roman"/>
         </w:rPr>
-        <w:t xml:space="preserve"> </w:t>
-      </w:r>
-      <w:r>
-        <w:rPr>
-          <w:rFonts w:ascii="Aptos Narrow" w:eastAsiaTheme="minorEastAsia" w:hAnsi="Aptos Narrow" w:cs="Times New Roman"/>
-        </w:rPr>
-        <w:lastRenderedPageBreak/>
-        <w:t>from 11 CMIP6 climate models</w:t>
+        <w:t xml:space="preserve"> from 11 CMIP6 climate models</w:t>
       </w:r>
       <w:r>
         <w:rPr>
@@ -6117,13 +6010,7 @@
         <w:rPr>
           <w:rFonts w:ascii="Aptos Narrow" w:eastAsiaTheme="minorEastAsia" w:hAnsi="Aptos Narrow" w:cs="Times New Roman"/>
         </w:rPr>
-        <w:t xml:space="preserve"> </w:t>
-      </w:r>
-      <w:r>
-        <w:rPr>
-          <w:rFonts w:ascii="Aptos Narrow" w:eastAsiaTheme="minorEastAsia" w:hAnsi="Aptos Narrow" w:cs="Times New Roman"/>
-        </w:rPr>
-        <w:t xml:space="preserve">(subsidence </w:t>
+        <w:t xml:space="preserve"> (subsidence </w:t>
       </w:r>
       <m:oMath>
         <m:r>
@@ -6137,37 +6024,13 @@
         <w:rPr>
           <w:rFonts w:ascii="Aptos Narrow" w:eastAsiaTheme="minorEastAsia" w:hAnsi="Aptos Narrow" w:cs="Times New Roman"/>
         </w:rPr>
-        <w:t>)</w:t>
+        <w:t xml:space="preserve">). </w:t>
       </w:r>
       <w:r>
         <w:rPr>
           <w:rFonts w:ascii="Aptos Narrow" w:eastAsiaTheme="minorEastAsia" w:hAnsi="Aptos Narrow" w:cs="Times New Roman"/>
         </w:rPr>
-        <w:t xml:space="preserve">. </w:t>
-      </w:r>
-      <w:r>
-        <w:rPr>
-          <w:rFonts w:ascii="Aptos Narrow" w:eastAsiaTheme="minorEastAsia" w:hAnsi="Aptos Narrow" w:cs="Times New Roman"/>
-        </w:rPr>
-        <w:t xml:space="preserve">Variation of the </w:t>
-      </w:r>
-      <w:r>
-        <w:rPr>
-          <w:rFonts w:ascii="Aptos Narrow" w:eastAsiaTheme="minorEastAsia" w:hAnsi="Aptos Narrow" w:cs="Times New Roman"/>
-        </w:rPr>
-        <w:t xml:space="preserve">subsidence to the </w:t>
-      </w:r>
-      <w:r>
-        <w:rPr>
-          <w:rFonts w:ascii="Aptos Narrow" w:eastAsiaTheme="minorEastAsia" w:hAnsi="Aptos Narrow" w:cs="Times New Roman"/>
-        </w:rPr>
-        <w:t xml:space="preserve">ECS </w:t>
-      </w:r>
-      <w:r>
-        <w:rPr>
-          <w:rFonts w:ascii="Aptos Narrow" w:eastAsiaTheme="minorEastAsia" w:hAnsi="Aptos Narrow" w:cs="Times New Roman"/>
-        </w:rPr>
-        <w:t>among models follows the HS06 sensitivity line, but a</w:t>
+        <w:t>Variation of the subsidence to the ECS among models follows the HS06 sensitivity line, but a</w:t>
       </w:r>
       <w:r>
         <w:rPr>
@@ -6341,19 +6204,7 @@
         <w:t>-1</w:t>
       </w:r>
       <w:r>
-        <w:t xml:space="preserve">] agrees with the correlations between cloud base mass flux and </w:t>
-      </w:r>
-      <w:r>
-        <w:t>cloud fraction observed</w:t>
-      </w:r>
-      <w:r>
-        <w:t xml:space="preserve"> from dropsonde circles in EUREC4A (</w:t>
-      </w:r>
-      <w:r>
-        <w:t xml:space="preserve">2.4 – X.X % </w:t>
-      </w:r>
-      <w:r>
-        <w:t>(mm s</w:t>
+        <w:t>] agrees with the correlations between cloud base mass flux and cloud fraction observed from dropsonde circles in EUREC4A (2.4 – X.X % (mm s</w:t>
       </w:r>
       <w:r>
         <w:rPr>
@@ -6371,16 +6222,7 @@
         <w:t>-1</w:t>
       </w:r>
       <w:r>
-        <w:t>;</w:t>
-      </w:r>
-      <w:r>
-        <w:t xml:space="preserve"> Vogel et al. 2022). We use this proportionality between </w:t>
-      </w:r>
-      <w:r>
-        <w:t xml:space="preserve">cloud </w:t>
-      </w:r>
-      <w:r>
-        <w:t xml:space="preserve">mass flux and reflectance to scale the response of shallow cumulus clouds to changes in the </w:t>
+        <w:t xml:space="preserve">; Vogel et al. 2022). We use this proportionality between cloud mass flux and reflectance to scale the response of shallow cumulus clouds to changes in the </w:t>
       </w:r>
       <w:proofErr w:type="gramStart"/>
       <w:r>
@@ -6419,7 +6261,7 @@
                     <pic:cNvPicPr/>
                   </pic:nvPicPr>
                   <pic:blipFill>
-                    <a:blip r:embed="rId6"/>
+                    <a:blip r:embed="rId7"/>
                     <a:stretch>
                       <a:fillRect/>
                     </a:stretch>
@@ -6720,7 +6562,6 @@
         <w:rPr>
           <w:rFonts w:ascii="Aptos" w:hAnsi="Aptos"/>
         </w:rPr>
-        <w:lastRenderedPageBreak/>
         <w:t>increases</w:t>
       </w:r>
       <w:proofErr w:type="gramEnd"/>
@@ -6923,19 +6764,7 @@
         <w:rPr>
           <w:rFonts w:ascii="Aptos" w:hAnsi="Aptos"/>
         </w:rPr>
-        <w:t xml:space="preserve">Figure </w:t>
-      </w:r>
-      <w:r>
-        <w:rPr>
-          <w:rFonts w:ascii="Aptos" w:hAnsi="Aptos"/>
-        </w:rPr>
-        <w:t>MODISISCCP</w:t>
-      </w:r>
-      <w:r>
-        <w:rPr>
-          <w:rFonts w:ascii="Aptos" w:hAnsi="Aptos"/>
-        </w:rPr>
-        <w:t xml:space="preserve"> shows ISCCP-H cloud top height and optical thickness cloud fraction histograms observed from the 1-km pixel MODIS observations in the Northern Atlantic shallow cumulus region (80-20°W, 15-35°N) for January-February of 2019-2021. These high-resolution observations avoid partially cloudy pixels and are designed to be compared to COSP satellite simulators in climate models. Most (29.1%) of the clouds are below 800 </w:t>
+        <w:t xml:space="preserve">Figure MODISISCCP shows ISCCP-H cloud top height and optical thickness cloud fraction histograms observed from the 1-km pixel MODIS observations in the Northern Atlantic shallow cumulus region (80-20°W, 15-35°N) for January-February of 2019-2021. These high-resolution observations avoid partially cloudy pixels and are designed to be compared to COSP satellite simulators in climate models. Most (29.1%) of the clouds are below 800 </w:t>
       </w:r>
       <w:proofErr w:type="spellStart"/>
       <w:r>
@@ -6961,7 +6790,7 @@
           <w:noProof/>
         </w:rPr>
         <w:drawing>
-          <wp:inline distT="0" distB="0" distL="0" distR="0" wp14:anchorId="0BD71B56" wp14:editId="56406318">
+          <wp:inline distT="0" distB="0" distL="0" distR="0" wp14:anchorId="0BD71B56" wp14:editId="3C7066E6">
             <wp:extent cx="3817495" cy="2863121"/>
             <wp:effectExtent l="0" t="0" r="5715" b="0"/>
             <wp:docPr id="202002970" name="Picture 3"/>
@@ -6976,7 +6805,7 @@
                     <pic:cNvPicPr/>
                   </pic:nvPicPr>
                   <pic:blipFill>
-                    <a:blip r:embed="rId7" cstate="print">
+                    <a:blip r:embed="rId8" cstate="print">
                       <a:extLst>
                         <a:ext uri="{28A0092B-C50C-407E-A947-70E740481C1C}">
                           <a14:useLocalDpi xmlns:a14="http://schemas.microsoft.com/office/drawing/2010/main" val="0"/>
@@ -7016,6 +6845,17 @@
       <w:r>
         <w:t>15-35 °N, 80-20 °W) in Jan-Feb of 2019-2021.</w:t>
       </w:r>
+      <w:r>
+        <w:t xml:space="preserve"> ISCCP stratocumulus clouds are low clouds (p&gt;680 </w:t>
+      </w:r>
+      <w:proofErr w:type="spellStart"/>
+      <w:r>
+        <w:t>hPa</w:t>
+      </w:r>
+      <w:proofErr w:type="spellEnd"/>
+      <w:r>
+        <w:t>) with optical thickness of 1.3-23.</w:t>
+      </w:r>
     </w:p>
     <w:p>
       <w:r>
@@ -7036,11 +6876,7 @@
       </w:r>
       <w:proofErr w:type="gramEnd"/>
       <w:r>
-        <w:t xml:space="preserve"> trade cumulus water (vapor + liquid) flux due to updrafts </w:t>
-      </w:r>
-      <w:r>
-        <w:lastRenderedPageBreak/>
-        <w:t xml:space="preserve">and precipitation balances mean subsidence. Cloud mass flux is initialized at cloud base to match the mean observed surface evaporation minus precipitation. </w:t>
+        <w:t xml:space="preserve"> trade cumulus water (vapor + liquid) flux due to updrafts and precipitation balances mean subsidence. Cloud mass flux is initialized at cloud base to match the mean observed surface evaporation minus precipitation. </w:t>
       </w:r>
     </w:p>
     <w:p>
@@ -7325,7 +7161,7 @@
                     <pic:cNvPicPr/>
                   </pic:nvPicPr>
                   <pic:blipFill>
-                    <a:blip r:embed="rId8">
+                    <a:blip r:embed="rId5">
                       <a:extLst>
                         <a:ext uri="{28A0092B-C50C-407E-A947-70E740481C1C}">
                           <a14:useLocalDpi xmlns:a14="http://schemas.microsoft.com/office/drawing/2010/main" val="0"/>
@@ -7964,14 +7800,7 @@
         <w:rPr>
           <w:rFonts w:eastAsiaTheme="minorEastAsia"/>
         </w:rPr>
-        <w:t xml:space="preserve">. </w:t>
-      </w:r>
-      <w:r>
-        <w:rPr>
-          <w:rFonts w:eastAsiaTheme="minorEastAsia"/>
-        </w:rPr>
-        <w:lastRenderedPageBreak/>
-        <w:t xml:space="preserve">This flux difference is assumed to be carried by the clouds with area fraction </w:t>
+        <w:t xml:space="preserve">. This flux difference is assumed to be carried by the clouds with area fraction </w:t>
       </w:r>
       <m:oMath>
         <m:sSub>
@@ -8924,7 +8753,6 @@
         <w:pStyle w:val="Heading3"/>
       </w:pPr>
       <w:r>
-        <w:lastRenderedPageBreak/>
         <w:t>Clouds</w:t>
       </w:r>
     </w:p>
@@ -10879,7 +10707,6 @@
           <w:rFonts w:ascii="Times New Roman" w:eastAsiaTheme="minorEastAsia" w:hAnsi="Times New Roman" w:cs="Times New Roman"/>
           <w:noProof/>
         </w:rPr>
-        <w:lastRenderedPageBreak/>
         <w:drawing>
           <wp:inline distT="0" distB="0" distL="0" distR="0" wp14:anchorId="68DD7473" wp14:editId="12C93EF0">
             <wp:extent cx="4631961" cy="3699022"/>
@@ -11815,7 +11642,6 @@
         <w:rPr>
           <w:rFonts w:ascii="Aptos" w:eastAsiaTheme="minorEastAsia" w:hAnsi="Aptos" w:cs="Times New Roman"/>
         </w:rPr>
-        <w:lastRenderedPageBreak/>
         <w:t xml:space="preserve">The solution for each cloud type </w:t>
       </w:r>
       <m:oMath>
@@ -12925,7 +12751,6 @@
           <w:rFonts w:ascii="Aptos Narrow" w:eastAsia="Times New Roman" w:hAnsi="Aptos Narrow" w:cstheme="minorHAnsi"/>
           <w:color w:val="323130"/>
         </w:rPr>
-        <w:lastRenderedPageBreak/>
         <w:t>Figure QMASSFLX. Total moisture flux to balance the large-scale moisture sink (blue), cloud moisture flux (orange), and (downward) precipitation flux (green), and mass flux (red) from the model.</w:t>
       </w:r>
     </w:p>
@@ -13316,7 +13141,6 @@
           <w:rFonts w:ascii="Aptos Narrow" w:eastAsiaTheme="minorEastAsia" w:hAnsi="Aptos Narrow" w:cs="Times New Roman"/>
           <w:noProof/>
         </w:rPr>
-        <w:lastRenderedPageBreak/>
         <w:drawing>
           <wp:inline distT="0" distB="0" distL="0" distR="0" wp14:anchorId="6A10348B" wp14:editId="0ABCB3A5">
             <wp:extent cx="3759200" cy="2971800"/>
@@ -14621,11 +14445,7 @@
       </w:r>
       <w:proofErr w:type="gramEnd"/>
       <w:r>
-        <w:t xml:space="preserve"> whereby shallow cumulus convection dries lower levels near </w:t>
-      </w:r>
-      <w:r>
-        <w:lastRenderedPageBreak/>
-        <w:t xml:space="preserve">cloud base that support stratocumulus clouds. Based on their similar behavior and </w:t>
+        <w:t xml:space="preserve"> whereby shallow cumulus convection dries lower levels near cloud base that support stratocumulus clouds. Based on their similar behavior and </w:t>
       </w:r>
       <w:proofErr w:type="gramStart"/>
       <w:r>
@@ -15894,6 +15714,7 @@
   <w:style w:type="character" w:default="1" w:styleId="DefaultParagraphFont">
     <w:name w:val="Default Paragraph Font"/>
     <w:uiPriority w:val="1"/>
+    <w:semiHidden/>
     <w:unhideWhenUsed/>
   </w:style>
   <w:style w:type="table" w:default="1" w:styleId="TableNormal">

</xml_diff>

<commit_message>
export fcns for interpolating tot_sink as a fcn of cloud top height
</commit_message>
<xml_diff>
--- a/doc/DiM_ms20260511.docx
+++ b/doc/DiM_ms20260511.docx
@@ -1,6 +1,6 @@
 
 <file path=word/document.xml><?xml version="1.0" encoding="utf-8"?>
-<w:document xmlns:wpc="http://schemas.microsoft.com/office/word/2010/wordprocessingCanvas" xmlns:cx="http://schemas.microsoft.com/office/drawing/2014/chartex" xmlns:cx1="http://schemas.microsoft.com/office/drawing/2015/9/8/chartex" xmlns:cx2="http://schemas.microsoft.com/office/drawing/2015/10/21/chartex" xmlns:cx3="http://schemas.microsoft.com/office/drawing/2016/5/9/chartex" xmlns:cx4="http://schemas.microsoft.com/office/drawing/2016/5/10/chartex" xmlns:cx5="http://schemas.microsoft.com/office/drawing/2016/5/11/chartex" xmlns:cx6="http://schemas.microsoft.com/office/drawing/2016/5/12/chartex" xmlns:cx7="http://schemas.microsoft.com/office/drawing/2016/5/13/chartex" xmlns:cx8="http://schemas.microsoft.com/office/drawing/2016/5/14/chartex" xmlns:mc="http://schemas.openxmlformats.org/markup-compatibility/2006" xmlns:aink="http://schemas.microsoft.com/office/drawing/2016/ink" xmlns:am3d="http://schemas.microsoft.com/office/drawing/2017/model3d" xmlns:o="urn:schemas-microsoft-com:office:office" xmlns:oel="http://schemas.microsoft.com/office/2019/extlst" xmlns:r="http://schemas.openxmlformats.org/officeDocument/2006/relationships" xmlns:m="http://schemas.openxmlformats.org/officeDocument/2006/math" xmlns:v="urn:schemas-microsoft-com:vml" xmlns:wp14="http://schemas.microsoft.com/office/word/2010/wordprocessingDrawing" xmlns:wp="http://schemas.openxmlformats.org/drawingml/2006/wordprocessingDrawing" xmlns:w10="urn:schemas-microsoft-com:office:word" xmlns:w="http://schemas.openxmlformats.org/wordprocessingml/2006/main" xmlns:w14="http://schemas.microsoft.com/office/word/2010/wordml" xmlns:w15="http://schemas.microsoft.com/office/word/2012/wordml" xmlns:w16cex="http://schemas.microsoft.com/office/word/2018/wordml/cex" xmlns:w16cid="http://schemas.microsoft.com/office/word/2016/wordml/cid" xmlns:w16="http://schemas.microsoft.com/office/word/2018/wordml" xmlns:w16du="http://schemas.microsoft.com/office/word/2023/wordml/word16du" xmlns:w16sdtdh="http://schemas.microsoft.com/office/word/2020/wordml/sdtdatahash" xmlns:w16sdtfl="http://schemas.microsoft.com/office/word/2024/wordml/sdtformatlock" xmlns:w16se="http://schemas.microsoft.com/office/word/2015/wordml/symex" xmlns:wpg="http://schemas.microsoft.com/office/word/2010/wordprocessingGroup" xmlns:wpi="http://schemas.microsoft.com/office/word/2010/wordprocessingInk" xmlns:wne="http://schemas.microsoft.com/office/word/2006/wordml" xmlns:wps="http://schemas.microsoft.com/office/word/2010/wordprocessingShape" mc:Ignorable="w14 w15 w16se w16cid w16 w16cex w16sdtdh w16sdtfl w16du wp14">
+<w:document xmlns:wpc="http://schemas.microsoft.com/office/word/2010/wordprocessingCanvas" xmlns:cx="http://schemas.microsoft.com/office/drawing/2014/chartex" xmlns:cx1="http://schemas.microsoft.com/office/drawing/2015/9/8/chartex" xmlns:cx2="http://schemas.microsoft.com/office/drawing/2015/10/21/chartex" xmlns:cx3="http://schemas.microsoft.com/office/drawing/2016/5/9/chartex" xmlns:cx4="http://schemas.microsoft.com/office/drawing/2016/5/10/chartex" xmlns:cx5="http://schemas.microsoft.com/office/drawing/2016/5/11/chartex" xmlns:cx6="http://schemas.microsoft.com/office/drawing/2016/5/12/chartex" xmlns:cx7="http://schemas.microsoft.com/office/drawing/2016/5/13/chartex" xmlns:cx8="http://schemas.microsoft.com/office/drawing/2016/5/14/chartex" xmlns:mc="http://schemas.openxmlformats.org/markup-compatibility/2006" xmlns:m="http://schemas.openxmlformats.org/officeDocument/2006/math" xmlns:aink="http://schemas.microsoft.com/office/drawing/2016/ink" xmlns:am3d="http://schemas.microsoft.com/office/drawing/2017/model3d" xmlns:oel="http://schemas.microsoft.com/office/2019/extlst" xmlns:r="http://schemas.openxmlformats.org/officeDocument/2006/relationships" xmlns:wp14="http://schemas.microsoft.com/office/word/2010/wordprocessingDrawing" xmlns:wp="http://schemas.openxmlformats.org/drawingml/2006/wordprocessingDrawing" xmlns:wpg="http://schemas.microsoft.com/office/word/2010/wordprocessingGroup" xmlns:wpi="http://schemas.microsoft.com/office/word/2010/wordprocessingInk" xmlns:wps="http://schemas.microsoft.com/office/word/2010/wordprocessingShape" xmlns:o="urn:schemas-microsoft-com:office:office" xmlns:v="urn:schemas-microsoft-com:vml" xmlns:w10="urn:schemas-microsoft-com:office:word" xmlns:w="http://schemas.openxmlformats.org/wordprocessingml/2006/main" xmlns:w14="http://schemas.microsoft.com/office/word/2010/wordml" xmlns:w15="http://schemas.microsoft.com/office/word/2012/wordml" xmlns:w16cex="http://schemas.microsoft.com/office/word/2018/wordml/cex" xmlns:w16cid="http://schemas.microsoft.com/office/word/2016/wordml/cid" xmlns:w16="http://schemas.microsoft.com/office/word/2018/wordml" xmlns:w16sdtdh="http://schemas.microsoft.com/office/word/2020/wordml/sdtdatahash" xmlns:w16sdtfl="http://schemas.microsoft.com/office/word/2024/wordml/sdtformatlock" xmlns:w16se="http://schemas.microsoft.com/office/word/2015/wordml/symex" xmlns:w16du="http://schemas.microsoft.com/office/word/2023/wordml/word16du" xmlns:wne="http://schemas.microsoft.com/office/word/2006/wordml" mc:Ignorable="w14 w15 w16se w16cid w16 w16cex w16sdtdh w16sdtfl w16du wp14">
   <w:body>
     <w:p>
       <w:pPr>
@@ -44,21 +44,7 @@
         <w:rPr>
           <w:rFonts w:ascii="Aptos" w:hAnsi="Aptos"/>
         </w:rPr>
-        <w:t xml:space="preserve">Shallow cumulus clouds affect Earth’s planetary albedo and cloud </w:t>
-      </w:r>
-      <w:proofErr w:type="gramStart"/>
-      <w:r>
-        <w:rPr>
-          <w:rFonts w:ascii="Aptos" w:hAnsi="Aptos"/>
-        </w:rPr>
-        <w:t>feedback, and</w:t>
-      </w:r>
-      <w:proofErr w:type="gramEnd"/>
-      <w:r>
-        <w:rPr>
-          <w:rFonts w:ascii="Aptos" w:hAnsi="Aptos"/>
-        </w:rPr>
-        <w:t xml:space="preserve"> explain climate model sensitivity to atmospheric CO</w:t>
+        <w:t>Shallow cumulus clouds affect Earth’s planetary albedo and cloud feedback, and explain climate model sensitivity to atmospheric CO</w:t>
       </w:r>
       <m:oMath>
         <m:sSub>
@@ -231,7 +217,6 @@
         </w:rPr>
         <w:t xml:space="preserve"> </w:t>
       </w:r>
-      <w:proofErr w:type="gramStart"/>
       <w:r>
         <w:rPr>
           <w:rFonts w:ascii="Aptos" w:hAnsi="Aptos"/>
@@ -242,9 +227,32 @@
         <w:rPr>
           <w:rFonts w:ascii="Aptos" w:hAnsi="Aptos"/>
         </w:rPr>
-        <w:t>, and</w:t>
-      </w:r>
-      <w:proofErr w:type="gramEnd"/>
+        <w:t xml:space="preserve">, and </w:t>
+      </w:r>
+      <w:r>
+        <w:rPr>
+          <w:rFonts w:ascii="Aptos" w:hAnsi="Aptos"/>
+        </w:rPr>
+        <w:t>show t</w:t>
+      </w:r>
+      <w:r>
+        <w:rPr>
+          <w:rFonts w:ascii="Aptos" w:hAnsi="Aptos"/>
+        </w:rPr>
+        <w:t>hat m</w:t>
+      </w:r>
+      <w:r>
+        <w:rPr>
+          <w:rFonts w:ascii="Aptos" w:hAnsi="Aptos"/>
+        </w:rPr>
+        <w:t xml:space="preserve">odels </w:t>
+      </w:r>
+      <w:r>
+        <w:rPr>
+          <w:rFonts w:ascii="Aptos" w:hAnsi="Aptos"/>
+        </w:rPr>
+        <w:t>reproducing</w:t>
+      </w:r>
       <w:r>
         <w:rPr>
           <w:rFonts w:ascii="Aptos" w:hAnsi="Aptos"/>
@@ -255,25 +263,61 @@
         <w:rPr>
           <w:rFonts w:ascii="Aptos" w:hAnsi="Aptos"/>
         </w:rPr>
-        <w:t>show t</w:t>
-      </w:r>
-      <w:r>
-        <w:rPr>
-          <w:rFonts w:ascii="Aptos" w:hAnsi="Aptos"/>
-        </w:rPr>
-        <w:t>hat m</w:t>
-      </w:r>
-      <w:r>
-        <w:rPr>
-          <w:rFonts w:ascii="Aptos" w:hAnsi="Aptos"/>
-        </w:rPr>
-        <w:t xml:space="preserve">odels </w:t>
-      </w:r>
-      <w:r>
-        <w:rPr>
-          <w:rFonts w:ascii="Aptos" w:hAnsi="Aptos"/>
-        </w:rPr>
-        <w:t>reproducing</w:t>
+        <w:t xml:space="preserve">this mesoscale </w:t>
+      </w:r>
+      <w:r>
+        <w:rPr>
+          <w:rFonts w:ascii="Aptos" w:hAnsi="Aptos"/>
+        </w:rPr>
+        <w:t xml:space="preserve">correlation have weaker </w:t>
+      </w:r>
+      <w:r>
+        <w:rPr>
+          <w:rFonts w:ascii="Aptos" w:hAnsi="Aptos"/>
+        </w:rPr>
+        <w:t xml:space="preserve">climate sensitivity. </w:t>
+      </w:r>
+      <w:r>
+        <w:rPr>
+          <w:rFonts w:ascii="Aptos" w:hAnsi="Aptos"/>
+        </w:rPr>
+        <w:t>Here</w:t>
+      </w:r>
+      <w:r>
+        <w:rPr>
+          <w:rFonts w:ascii="Aptos" w:hAnsi="Aptos"/>
+        </w:rPr>
+        <w:t xml:space="preserve"> we predict a decrease of shallow cumulus cloud fraction using a heuristic </w:t>
+      </w:r>
+      <w:r>
+        <w:rPr>
+          <w:rFonts w:ascii="Aptos" w:hAnsi="Aptos"/>
+        </w:rPr>
+        <w:t xml:space="preserve">model </w:t>
+      </w:r>
+      <w:r>
+        <w:rPr>
+          <w:rFonts w:ascii="Aptos" w:hAnsi="Aptos"/>
+        </w:rPr>
+        <w:t>of</w:t>
+      </w:r>
+      <w:r>
+        <w:rPr>
+          <w:rFonts w:ascii="Aptos" w:hAnsi="Aptos"/>
+        </w:rPr>
+        <w:t xml:space="preserve"> clouds </w:t>
+      </w:r>
+      <w:r>
+        <w:rPr>
+          <w:rFonts w:ascii="Aptos" w:hAnsi="Aptos"/>
+        </w:rPr>
+        <w:t>whose</w:t>
+      </w:r>
+      <w:r>
+        <w:rPr>
+          <w:rFonts w:ascii="Aptos" w:hAnsi="Aptos"/>
+        </w:rPr>
+        <w:t xml:space="preserve"> moisture flux balances</w:t>
       </w:r>
       <w:r>
         <w:rPr>
@@ -285,72 +329,6 @@
         <w:rPr>
           <w:rFonts w:ascii="Aptos" w:hAnsi="Aptos"/>
         </w:rPr>
-        <w:t xml:space="preserve">this mesoscale </w:t>
-      </w:r>
-      <w:r>
-        <w:rPr>
-          <w:rFonts w:ascii="Aptos" w:hAnsi="Aptos"/>
-        </w:rPr>
-        <w:t xml:space="preserve">correlation have weaker </w:t>
-      </w:r>
-      <w:r>
-        <w:rPr>
-          <w:rFonts w:ascii="Aptos" w:hAnsi="Aptos"/>
-        </w:rPr>
-        <w:t xml:space="preserve">climate sensitivity. </w:t>
-      </w:r>
-      <w:r>
-        <w:rPr>
-          <w:rFonts w:ascii="Aptos" w:hAnsi="Aptos"/>
-        </w:rPr>
-        <w:t>Here</w:t>
-      </w:r>
-      <w:r>
-        <w:rPr>
-          <w:rFonts w:ascii="Aptos" w:hAnsi="Aptos"/>
-        </w:rPr>
-        <w:t xml:space="preserve"> we predict a decrease of shallow cumulus cloud fraction using a heuristic </w:t>
-      </w:r>
-      <w:r>
-        <w:rPr>
-          <w:rFonts w:ascii="Aptos" w:hAnsi="Aptos"/>
-        </w:rPr>
-        <w:t xml:space="preserve">model </w:t>
-      </w:r>
-      <w:r>
-        <w:rPr>
-          <w:rFonts w:ascii="Aptos" w:hAnsi="Aptos"/>
-        </w:rPr>
-        <w:t>of</w:t>
-      </w:r>
-      <w:r>
-        <w:rPr>
-          <w:rFonts w:ascii="Aptos" w:hAnsi="Aptos"/>
-        </w:rPr>
-        <w:t xml:space="preserve"> clouds </w:t>
-      </w:r>
-      <w:r>
-        <w:rPr>
-          <w:rFonts w:ascii="Aptos" w:hAnsi="Aptos"/>
-        </w:rPr>
-        <w:t>whose</w:t>
-      </w:r>
-      <w:r>
-        <w:rPr>
-          <w:rFonts w:ascii="Aptos" w:hAnsi="Aptos"/>
-        </w:rPr>
-        <w:t xml:space="preserve"> moisture flux balances</w:t>
-      </w:r>
-      <w:r>
-        <w:rPr>
-          <w:rFonts w:ascii="Aptos" w:hAnsi="Aptos"/>
-        </w:rPr>
-        <w:t xml:space="preserve"> </w:t>
-      </w:r>
-      <w:r>
-        <w:rPr>
-          <w:rFonts w:ascii="Aptos" w:hAnsi="Aptos"/>
-        </w:rPr>
         <w:t>the</w:t>
       </w:r>
       <w:r>
@@ -429,21 +407,7 @@
         <w:rPr>
           <w:rFonts w:ascii="Aptos" w:hAnsi="Aptos"/>
         </w:rPr>
-        <w:t xml:space="preserve"> the </w:t>
-      </w:r>
-      <w:proofErr w:type="gramStart"/>
-      <w:r>
-        <w:rPr>
-          <w:rFonts w:ascii="Aptos" w:hAnsi="Aptos"/>
-        </w:rPr>
-        <w:t>large scale</w:t>
-      </w:r>
-      <w:proofErr w:type="gramEnd"/>
-      <w:r>
-        <w:rPr>
-          <w:rFonts w:ascii="Aptos" w:hAnsi="Aptos"/>
-        </w:rPr>
-        <w:t xml:space="preserve"> circulation</w:t>
+        <w:t xml:space="preserve"> the large scale circulation</w:t>
       </w:r>
       <w:r>
         <w:rPr>
@@ -757,31 +721,7 @@
           <w:szCs w:val="24"/>
           <w14:ligatures w14:val="none"/>
         </w:rPr>
-        <w:t xml:space="preserve">s balances drying by the </w:t>
-      </w:r>
-      <w:proofErr w:type="gramStart"/>
-      <w:r>
-        <w:rPr>
-          <w:rFonts w:ascii="Aptos" w:eastAsiaTheme="minorHAnsi" w:hAnsi="Aptos" w:cstheme="minorBidi"/>
-          <w:color w:val="auto"/>
-          <w:kern w:val="0"/>
-          <w:sz w:val="24"/>
-          <w:szCs w:val="24"/>
-          <w14:ligatures w14:val="none"/>
-        </w:rPr>
-        <w:t>large scale</w:t>
-      </w:r>
-      <w:proofErr w:type="gramEnd"/>
-      <w:r>
-        <w:rPr>
-          <w:rFonts w:ascii="Aptos" w:eastAsiaTheme="minorHAnsi" w:hAnsi="Aptos" w:cstheme="minorBidi"/>
-          <w:color w:val="auto"/>
-          <w:kern w:val="0"/>
-          <w:sz w:val="24"/>
-          <w:szCs w:val="24"/>
-          <w14:ligatures w14:val="none"/>
-        </w:rPr>
-        <w:t xml:space="preserve"> circulation.</w:t>
+        <w:t>s balances drying by the large scale circulation.</w:t>
       </w:r>
       <w:r>
         <w:rPr>
@@ -1086,15 +1026,7 @@
         <w:t xml:space="preserve">y </w:t>
       </w:r>
       <w:r>
-        <w:t xml:space="preserve">low cloud </w:t>
-      </w:r>
-      <w:proofErr w:type="gramStart"/>
-      <w:r>
-        <w:t>feedbacks</w:t>
-      </w:r>
-      <w:proofErr w:type="gramEnd"/>
-      <w:r>
-        <w:t xml:space="preserve"> and widen the spread of climate projections. </w:t>
+        <w:t xml:space="preserve">low cloud feedbacks and widen the spread of climate projections. </w:t>
       </w:r>
       <w:r>
         <w:rPr>
@@ -1106,14 +1038,7 @@
         <w:rPr>
           <w:rFonts w:ascii="Aptos" w:hAnsi="Aptos"/>
         </w:rPr>
-        <w:t xml:space="preserve">ositive </w:t>
-      </w:r>
-      <w:proofErr w:type="gramStart"/>
-      <w:r>
-        <w:rPr>
-          <w:rFonts w:ascii="Aptos" w:hAnsi="Aptos"/>
-        </w:rPr>
-        <w:t>feedback</w:t>
+        <w:t>ositive feedback</w:t>
       </w:r>
       <w:r>
         <w:rPr>
@@ -1121,7 +1046,6 @@
         </w:rPr>
         <w:t>s</w:t>
       </w:r>
-      <w:proofErr w:type="gramEnd"/>
       <w:r>
         <w:rPr>
           <w:rFonts w:ascii="Aptos" w:hAnsi="Aptos"/>
@@ -1168,21 +1092,7 @@
         <w:rPr>
           <w:rFonts w:ascii="Aptos" w:hAnsi="Aptos"/>
         </w:rPr>
-        <w:t xml:space="preserve">s dominates </w:t>
-      </w:r>
-      <w:proofErr w:type="gramStart"/>
-      <w:r>
-        <w:rPr>
-          <w:rFonts w:ascii="Aptos" w:hAnsi="Aptos"/>
-        </w:rPr>
-        <w:t>feedbacks</w:t>
-      </w:r>
-      <w:proofErr w:type="gramEnd"/>
-      <w:r>
-        <w:rPr>
-          <w:rFonts w:ascii="Aptos" w:hAnsi="Aptos"/>
-        </w:rPr>
-        <w:t xml:space="preserve"> from changes in </w:t>
+        <w:t xml:space="preserve">s dominates feedbacks from changes in </w:t>
       </w:r>
       <w:r>
         <w:rPr>
@@ -1377,21 +1287,13 @@
         <w:t xml:space="preserve"> in 4 of 5 models</w:t>
       </w:r>
       <w:r>
-        <w:t xml:space="preserve">, </w:t>
-      </w:r>
-      <w:proofErr w:type="gramStart"/>
-      <w:r>
-        <w:t>a</w:t>
+        <w:t>, a</w:t>
       </w:r>
       <w:r>
         <w:t xml:space="preserve"> </w:t>
       </w:r>
       <w:r>
-        <w:t>negative feedback (Huang et al. 2026)</w:t>
-      </w:r>
-      <w:proofErr w:type="gramEnd"/>
-      <w:r>
-        <w:t>.</w:t>
+        <w:t>negative feedback (Huang et al. 2026).</w:t>
       </w:r>
     </w:p>
     <w:p>
@@ -1558,21 +1460,7 @@
         <w:rPr>
           <w:rFonts w:ascii="Aptos" w:hAnsi="Aptos"/>
         </w:rPr>
-        <w:t xml:space="preserve">can be used to understand mean climates of the shallow cumulus regime. In a steady climate, the moisture budget over the shallow cumulus regime is balanced. A change in the drying by the </w:t>
-      </w:r>
-      <w:proofErr w:type="gramStart"/>
-      <w:r>
-        <w:rPr>
-          <w:rFonts w:ascii="Aptos" w:hAnsi="Aptos"/>
-        </w:rPr>
-        <w:t>large scale</w:t>
-      </w:r>
-      <w:proofErr w:type="gramEnd"/>
-      <w:r>
-        <w:rPr>
-          <w:rFonts w:ascii="Aptos" w:hAnsi="Aptos"/>
-        </w:rPr>
-        <w:t xml:space="preserve"> circulation is thus compensated by the opposite moistening by the divergence of the shallow cumulus cloud eddy flux.</w:t>
+        <w:t>can be used to understand mean climates of the shallow cumulus regime. In a steady climate, the moisture budget over the shallow cumulus regime is balanced. A change in the drying by the large scale circulation is thus compensated by the opposite moistening by the divergence of the shallow cumulus cloud eddy flux.</w:t>
       </w:r>
     </w:p>
     <w:p>
@@ -1584,13 +1472,8 @@
       </w:r>
     </w:p>
     <w:p>
-      <w:proofErr w:type="gramStart"/>
-      <w:r>
-        <w:t>The Dynamical Inhibition of Moisture (DIM) cloud equilibrium hypothesis,</w:t>
-      </w:r>
-      <w:proofErr w:type="gramEnd"/>
-      <w:r>
-        <w:t xml:space="preserve"> predicts the direct effect of large-scale circulation on shallow cumulus clouds. For a climatological mean with a balanced moisture budge</w:t>
+      <w:r>
+        <w:t>The Dynamical Inhibition of Moisture (DIM) cloud equilibrium hypothesis, predicts the direct effect of large-scale circulation on shallow cumulus clouds. For a climatological mean with a balanced moisture budge</w:t>
       </w:r>
       <w:r>
         <w:t>t</w:t>
@@ -1606,15 +1489,7 @@
         <w:t xml:space="preserve"> </w:t>
       </w:r>
       <w:r>
-        <w:t xml:space="preserve">the planetary albedo, with </w:t>
-      </w:r>
-      <w:proofErr w:type="gramStart"/>
-      <w:r>
-        <w:t>a weak positive feedback</w:t>
-      </w:r>
-      <w:proofErr w:type="gramEnd"/>
-      <w:r>
-        <w:t xml:space="preserve"> that scales with the shallow cumulus cloud fraction.</w:t>
+        <w:t>the planetary albedo, with a weak positive feedback that scales with the shallow cumulus cloud fraction.</w:t>
       </w:r>
     </w:p>
     <w:p>
@@ -1802,16 +1677,7 @@
         <w:t xml:space="preserve">. </w:t>
       </w:r>
       <w:r>
-        <w:t>B</w:t>
-      </w:r>
-      <w:r>
-        <w:t>ased on energetics</w:t>
-      </w:r>
-      <w:r>
-        <w:t>,</w:t>
-      </w:r>
-      <w:r>
-        <w:t xml:space="preserve"> </w:t>
+        <w:t xml:space="preserve">Based on energetics, </w:t>
       </w:r>
       <w:r>
         <w:t>Held and Soden (2006</w:t>
@@ -2129,13 +1995,7 @@
           <w:rPr>
             <w:rFonts w:ascii="Cambria Math" w:eastAsiaTheme="minorEastAsia" w:hAnsi="Cambria Math"/>
           </w:rPr>
-          <m:t>-P</m:t>
-        </m:r>
-        <m:r>
-          <w:rPr>
-            <w:rFonts w:ascii="Cambria Math" w:eastAsiaTheme="minorEastAsia" w:hAnsi="Cambria Math"/>
-          </w:rPr>
-          <m:t>]-W∂</m:t>
+          <m:t>-P]-W∂</m:t>
         </m:r>
         <m:sSub>
           <m:sSubPr>
@@ -2340,13 +2200,7 @@
         <w:rPr>
           <w:rFonts w:eastAsiaTheme="minorEastAsia"/>
         </w:rPr>
-        <w:t xml:space="preserve"> (&gt;0) is the precipitation</w:t>
-      </w:r>
-      <w:r>
-        <w:rPr>
-          <w:rFonts w:eastAsiaTheme="minorEastAsia"/>
-        </w:rPr>
-        <w:t>.</w:t>
+        <w:t xml:space="preserve"> (&gt;0) is the precipitation.</w:t>
       </w:r>
       <w:r>
         <w:rPr>
@@ -2396,14 +2250,12 @@
         </w:rPr>
         <w:t xml:space="preserve">each </w:t>
       </w:r>
-      <w:proofErr w:type="gramStart"/>
       <w:r>
         <w:rPr>
           <w:rFonts w:eastAsiaTheme="minorEastAsia"/>
         </w:rPr>
         <w:t>terms</w:t>
       </w:r>
-      <w:proofErr w:type="gramEnd"/>
       <w:r>
         <w:rPr>
           <w:rFonts w:eastAsiaTheme="minorEastAsia"/>
@@ -2430,7 +2282,6 @@
         </w:rPr>
         <w:t xml:space="preserve">We will show precipitation also scales with the mass flux and the humidity. </w:t>
       </w:r>
-      <w:proofErr w:type="gramStart"/>
       <w:r>
         <w:rPr>
           <w:rFonts w:eastAsiaTheme="minorEastAsia"/>
@@ -2438,7 +2289,6 @@
         </w:rPr>
         <w:t>[</w:t>
       </w:r>
-      <w:proofErr w:type="gramEnd"/>
       <w:r>
         <w:rPr>
           <w:rFonts w:eastAsiaTheme="minorEastAsia"/>
@@ -2497,36 +2347,20 @@
           <w:rFonts w:eastAsiaTheme="minorEastAsia"/>
           <w:color w:val="4EA72E" w:themeColor="accent6"/>
         </w:rPr>
-        <w:t xml:space="preserve"> in Fig. </w:t>
-      </w:r>
-      <w:proofErr w:type="spellStart"/>
+        <w:t xml:space="preserve"> in Fig. CFMWa.</w:t>
+      </w:r>
       <w:r>
         <w:rPr>
           <w:rFonts w:eastAsiaTheme="minorEastAsia"/>
           <w:color w:val="4EA72E" w:themeColor="accent6"/>
         </w:rPr>
-        <w:t>CFMWa</w:t>
-      </w:r>
-      <w:proofErr w:type="spellEnd"/>
+        <w:t>]</w:t>
+      </w:r>
       <w:r>
         <w:rPr>
           <w:rFonts w:eastAsiaTheme="minorEastAsia"/>
           <w:color w:val="4EA72E" w:themeColor="accent6"/>
         </w:rPr>
-        <w:t>.</w:t>
-      </w:r>
-      <w:r>
-        <w:rPr>
-          <w:rFonts w:eastAsiaTheme="minorEastAsia"/>
-          <w:color w:val="4EA72E" w:themeColor="accent6"/>
-        </w:rPr>
-        <w:t>]</w:t>
-      </w:r>
-      <w:r>
-        <w:rPr>
-          <w:rFonts w:eastAsiaTheme="minorEastAsia"/>
-          <w:color w:val="4EA72E" w:themeColor="accent6"/>
-        </w:rPr>
         <w:t xml:space="preserve"> </w:t>
       </w:r>
       <w:r>
@@ -2557,21 +2391,7 @@
         <w:rPr>
           <w:rFonts w:eastAsiaTheme="minorEastAsia"/>
         </w:rPr>
-        <w:t xml:space="preserve">the effect of </w:t>
-      </w:r>
-      <w:proofErr w:type="gramStart"/>
-      <w:r>
-        <w:rPr>
-          <w:rFonts w:eastAsiaTheme="minorEastAsia"/>
-        </w:rPr>
-        <w:t>large scale</w:t>
-      </w:r>
-      <w:proofErr w:type="gramEnd"/>
-      <w:r>
-        <w:rPr>
-          <w:rFonts w:eastAsiaTheme="minorEastAsia"/>
-        </w:rPr>
-        <w:t xml:space="preserve"> circulation </w:t>
+        <w:t xml:space="preserve">the effect of large scale circulation </w:t>
       </w:r>
       <m:oMath>
         <m:r>
@@ -3500,21 +3320,7 @@
         <w:rPr>
           <w:rFonts w:eastAsiaTheme="minorEastAsia"/>
         </w:rPr>
-        <w:t xml:space="preserve">The DIM hypothesis predicts the change in area of low clouds responsible for the moisture </w:t>
-      </w:r>
-      <w:proofErr w:type="gramStart"/>
-      <w:r>
-        <w:rPr>
-          <w:rFonts w:eastAsiaTheme="minorEastAsia"/>
-        </w:rPr>
-        <w:t>flux, but</w:t>
-      </w:r>
-      <w:proofErr w:type="gramEnd"/>
-      <w:r>
-        <w:rPr>
-          <w:rFonts w:eastAsiaTheme="minorEastAsia"/>
-        </w:rPr>
-        <w:t xml:space="preserve"> does not account for secondary desiccation of the optically thick stratocumulus clouds at cloud base in most climate models. </w:t>
+        <w:t xml:space="preserve">The DIM hypothesis predicts the change in area of low clouds responsible for the moisture flux, but does not account for secondary desiccation of the optically thick stratocumulus clouds at cloud base in most climate models. </w:t>
       </w:r>
       <w:r>
         <w:rPr>
@@ -3953,14 +3759,7 @@
         <w:rPr>
           <w:rFonts w:eastAsiaTheme="minorEastAsia"/>
         </w:rPr>
-        <w:t xml:space="preserve"> many global </w:t>
-      </w:r>
-      <w:proofErr w:type="gramStart"/>
-      <w:r>
-        <w:rPr>
-          <w:rFonts w:eastAsiaTheme="minorEastAsia"/>
-        </w:rPr>
-        <w:t>constraints</w:t>
+        <w:t xml:space="preserve"> many global constraints</w:t>
       </w:r>
       <w:r>
         <w:rPr>
@@ -3972,14 +3771,7 @@
         <w:rPr>
           <w:rFonts w:eastAsiaTheme="minorEastAsia"/>
         </w:rPr>
-        <w:t>but</w:t>
-      </w:r>
-      <w:proofErr w:type="gramEnd"/>
-      <w:r>
-        <w:rPr>
-          <w:rFonts w:eastAsiaTheme="minorEastAsia"/>
-        </w:rPr>
-        <w:t xml:space="preserve"> </w:t>
+        <w:t xml:space="preserve">but </w:t>
       </w:r>
       <w:r>
         <w:rPr>
@@ -4459,31 +4251,22 @@
           <w:rFonts w:eastAsiaTheme="minorEastAsia"/>
           <w:iCs/>
         </w:rPr>
-        <w:t xml:space="preserve"> cloud fraction observed in </w:t>
-      </w:r>
-      <w:proofErr w:type="gramStart"/>
+        <w:t xml:space="preserve"> cloud fraction observed in EUREC4A</w:t>
+      </w:r>
       <w:r>
         <w:rPr>
           <w:rFonts w:eastAsiaTheme="minorEastAsia"/>
           <w:iCs/>
         </w:rPr>
-        <w:t>EUREC4A</w:t>
+        <w:t>,</w:t>
       </w:r>
       <w:r>
         <w:rPr>
           <w:rFonts w:eastAsiaTheme="minorEastAsia"/>
           <w:iCs/>
         </w:rPr>
-        <w:t>,</w:t>
-      </w:r>
-      <w:r>
-        <w:rPr>
-          <w:rFonts w:eastAsiaTheme="minorEastAsia"/>
-          <w:iCs/>
-        </w:rPr>
         <w:t xml:space="preserve"> and</w:t>
       </w:r>
-      <w:proofErr w:type="gramEnd"/>
       <w:r>
         <w:rPr>
           <w:rFonts w:eastAsiaTheme="minorEastAsia"/>
@@ -4664,23 +4447,7 @@
           <w:rFonts w:eastAsiaTheme="minorEastAsia"/>
           <w:iCs/>
         </w:rPr>
-        <w:t xml:space="preserve"> cloud top height distribution to change to match the </w:t>
-      </w:r>
-      <w:proofErr w:type="gramStart"/>
-      <w:r>
-        <w:rPr>
-          <w:rFonts w:eastAsiaTheme="minorEastAsia"/>
-          <w:iCs/>
-        </w:rPr>
-        <w:t>large scale</w:t>
-      </w:r>
-      <w:proofErr w:type="gramEnd"/>
-      <w:r>
-        <w:rPr>
-          <w:rFonts w:eastAsiaTheme="minorEastAsia"/>
-          <w:iCs/>
-        </w:rPr>
-        <w:t xml:space="preserve"> drying term in a changed climate.</w:t>
+        <w:t xml:space="preserve"> cloud top height distribution to change to match the large scale drying term in a changed climate.</w:t>
       </w:r>
       <w:r>
         <w:rPr>
@@ -4908,21 +4675,7 @@
         <w:rPr>
           <w:rFonts w:ascii="Aptos" w:hAnsi="Aptos"/>
         </w:rPr>
-        <w:t xml:space="preserve">, leaving a proportionality between the </w:t>
-      </w:r>
-      <w:proofErr w:type="gramStart"/>
-      <w:r>
-        <w:rPr>
-          <w:rFonts w:ascii="Aptos" w:hAnsi="Aptos"/>
-        </w:rPr>
-        <w:t>large scale</w:t>
-      </w:r>
-      <w:proofErr w:type="gramEnd"/>
-      <w:r>
-        <w:rPr>
-          <w:rFonts w:ascii="Aptos" w:hAnsi="Aptos"/>
-        </w:rPr>
-        <w:t xml:space="preserve"> </w:t>
+        <w:t xml:space="preserve">, leaving a proportionality between the large scale </w:t>
       </w:r>
       <w:r>
         <w:rPr>
@@ -5237,21 +4990,10 @@
         <w:t>T</w:t>
       </w:r>
       <w:r>
-        <w:t xml:space="preserve">he </w:t>
-      </w:r>
-      <w:r>
-        <w:t>distribution</w:t>
-      </w:r>
-      <w:r>
-        <w:t xml:space="preserve"> of entrainment rates </w:t>
-      </w:r>
-      <w:proofErr w:type="gramStart"/>
-      <w:r>
-        <w:t>are</w:t>
-      </w:r>
-      <w:proofErr w:type="gramEnd"/>
-      <w:r>
-        <w:t xml:space="preserve"> set </w:t>
+        <w:t xml:space="preserve">he distribution of entrainment rates </w:t>
+      </w:r>
+      <w:r>
+        <w:t xml:space="preserve">are set </w:t>
       </w:r>
       <w:r>
         <w:t>to match the cloud top</w:t>
@@ -5293,21 +5035,7 @@
         <w:rPr>
           <w:rFonts w:ascii="Aptos" w:hAnsi="Aptos"/>
         </w:rPr>
-        <w:t xml:space="preserve">balances the condensation heating. Total water </w:t>
-      </w:r>
-      <w:proofErr w:type="gramStart"/>
-      <w:r>
-        <w:rPr>
-          <w:rFonts w:ascii="Aptos" w:hAnsi="Aptos"/>
-        </w:rPr>
-        <w:t>in excess of</w:t>
-      </w:r>
-      <w:proofErr w:type="gramEnd"/>
-      <w:r>
-        <w:rPr>
-          <w:rFonts w:ascii="Aptos" w:hAnsi="Aptos"/>
-        </w:rPr>
-        <w:t xml:space="preserve"> the saturation specific humidity condenses as cloud liquid.</w:t>
+        <w:t>balances the condensation heating. Total water in excess of the saturation specific humidity condenses as cloud liquid.</w:t>
       </w:r>
       <w:bookmarkEnd w:id="0"/>
       <w:bookmarkEnd w:id="2"/>
@@ -5599,24 +5327,7 @@
         </w:rPr>
       </w:pPr>
       <w:r>
-        <w:t>We use th</w:t>
-      </w:r>
-      <w:r>
-        <w:t>e</w:t>
-      </w:r>
-      <w:r>
-        <w:t xml:space="preserve"> proportionality between cloud mass flux and reflectance to scale the response of shallow cumulus clouds to changes in the </w:t>
-      </w:r>
-      <w:proofErr w:type="gramStart"/>
-      <w:r>
-        <w:t>large scale</w:t>
-      </w:r>
-      <w:proofErr w:type="gramEnd"/>
-      <w:r>
-        <w:t xml:space="preserve"> circulation.</w:t>
-      </w:r>
-      <w:r>
-        <w:t xml:space="preserve"> </w:t>
+        <w:t xml:space="preserve">We use the proportionality between cloud mass flux and reflectance to scale the response of shallow cumulus clouds to changes in the large scale circulation. </w:t>
       </w:r>
       <w:r>
         <w:rPr>
@@ -5714,21 +5425,7 @@
         <w:rPr>
           <w:rFonts w:ascii="Aptos" w:hAnsi="Aptos"/>
         </w:rPr>
-        <w:t xml:space="preserve">and precipitation </w:t>
-      </w:r>
-      <w:proofErr w:type="gramStart"/>
-      <w:r>
-        <w:rPr>
-          <w:rFonts w:ascii="Aptos" w:hAnsi="Aptos"/>
-        </w:rPr>
-        <w:t>increases</w:t>
-      </w:r>
-      <w:proofErr w:type="gramEnd"/>
-      <w:r>
-        <w:rPr>
-          <w:rFonts w:ascii="Aptos" w:hAnsi="Aptos"/>
-        </w:rPr>
-        <w:t xml:space="preserve"> </w:t>
+        <w:t xml:space="preserve">and precipitation increases </w:t>
       </w:r>
       <w:r>
         <w:rPr>
@@ -6260,21 +5957,7 @@
         <w:rPr>
           <w:rFonts w:ascii="Aptos Narrow" w:eastAsiaTheme="minorEastAsia" w:hAnsi="Aptos Narrow" w:cs="Times New Roman"/>
         </w:rPr>
-        <w:t xml:space="preserve"> </w:t>
-      </w:r>
-      <w:proofErr w:type="spellStart"/>
-      <w:r>
-        <w:rPr>
-          <w:rFonts w:ascii="Aptos Narrow" w:eastAsiaTheme="minorEastAsia" w:hAnsi="Aptos Narrow" w:cs="Times New Roman"/>
-        </w:rPr>
-        <w:t>hPa</w:t>
-      </w:r>
-      <w:proofErr w:type="spellEnd"/>
-      <w:r>
-        <w:rPr>
-          <w:rFonts w:ascii="Aptos Narrow" w:eastAsiaTheme="minorEastAsia" w:hAnsi="Aptos Narrow" w:cs="Times New Roman"/>
-        </w:rPr>
-        <w:t xml:space="preserve"> day</w:t>
+        <w:t xml:space="preserve"> hPa day</w:t>
       </w:r>
       <w:r>
         <w:rPr>
@@ -6311,16 +5994,8 @@
         <w:rPr>
           <w:rFonts w:ascii="Aptos Narrow" w:eastAsiaTheme="minorEastAsia" w:hAnsi="Aptos Narrow" w:cs="Times New Roman"/>
         </w:rPr>
-        <w:t xml:space="preserve"> </w:t>
-      </w:r>
-      <w:proofErr w:type="spellStart"/>
-      <w:r>
-        <w:rPr>
-          <w:rFonts w:ascii="Aptos Narrow" w:eastAsiaTheme="minorEastAsia" w:hAnsi="Aptos Narrow" w:cs="Times New Roman"/>
-        </w:rPr>
-        <w:t>hPa</w:t>
-      </w:r>
-      <w:proofErr w:type="spellEnd"/>
+        <w:t xml:space="preserve"> hPa</w:t>
+      </w:r>
       <w:r>
         <w:rPr>
           <w:rFonts w:ascii="Aptos Narrow" w:eastAsiaTheme="minorEastAsia" w:hAnsi="Aptos Narrow" w:cs="Times New Roman"/>
@@ -6399,47 +6074,7 @@
           <w:sz w:val="20"/>
           <w:szCs w:val="20"/>
         </w:rPr>
-        <w:t>/Users/</w:t>
-      </w:r>
-      <w:proofErr w:type="spellStart"/>
-      <w:r>
-        <w:rPr>
-          <w:rFonts w:ascii="Menlo" w:hAnsi="Menlo" w:cs="Menlo"/>
-          <w:color w:val="3B2322"/>
-          <w:sz w:val="20"/>
-          <w:szCs w:val="20"/>
-        </w:rPr>
-        <w:t>deszoeks</w:t>
-      </w:r>
-      <w:proofErr w:type="spellEnd"/>
-      <w:r>
-        <w:rPr>
-          <w:rFonts w:ascii="Menlo" w:hAnsi="Menlo" w:cs="Menlo"/>
-          <w:color w:val="3B2322"/>
-          <w:sz w:val="20"/>
-          <w:szCs w:val="20"/>
-        </w:rPr>
-        <w:t>/Projects/ATOMIC/cmip6/</w:t>
-      </w:r>
-      <w:proofErr w:type="spellStart"/>
-      <w:r>
-        <w:rPr>
-          <w:rFonts w:ascii="Menlo" w:hAnsi="Menlo" w:cs="Menlo"/>
-          <w:color w:val="3B2322"/>
-          <w:sz w:val="20"/>
-          <w:szCs w:val="20"/>
-        </w:rPr>
-        <w:t>src</w:t>
-      </w:r>
-      <w:proofErr w:type="spellEnd"/>
-      <w:r>
-        <w:rPr>
-          <w:rFonts w:ascii="Menlo" w:hAnsi="Menlo" w:cs="Menlo"/>
-          <w:color w:val="3B2322"/>
-          <w:sz w:val="20"/>
-          <w:szCs w:val="20"/>
-        </w:rPr>
-        <w:t>/axes_5.pdf</w:t>
+        <w:t>/Users/deszoeks/Projects/ATOMIC/cmip6/src/axes_5.pdf</w:t>
       </w:r>
     </w:p>
     <w:p>
@@ -6462,27 +6097,7 @@
         <w:rPr>
           <w:rFonts w:ascii="Aptos" w:hAnsi="Aptos"/>
         </w:rPr>
-        <w:t xml:space="preserve">While shallow cumulus </w:t>
-      </w:r>
-      <w:proofErr w:type="gramStart"/>
-      <w:r>
-        <w:rPr>
-          <w:rFonts w:ascii="Aptos" w:hAnsi="Aptos"/>
-        </w:rPr>
-        <w:t>decrease</w:t>
-      </w:r>
-      <w:proofErr w:type="gramEnd"/>
-      <w:r>
-        <w:rPr>
-          <w:rFonts w:ascii="Aptos" w:hAnsi="Aptos"/>
-        </w:rPr>
-        <w:t xml:space="preserve"> with reduced large-scale overturning, local scaling of the moist turbulent subcloud boundary layer </w:t>
-      </w:r>
-      <w:r>
-        <w:rPr>
-          <w:rFonts w:ascii="Aptos" w:hAnsi="Aptos"/>
-        </w:rPr>
-        <w:t>sugges</w:t>
+        <w:t>While shallow cumulus decrease with reduced large-scale overturning, local scaling of the moist turbulent subcloud boundary layer sugges</w:t>
       </w:r>
       <w:r>
         <w:rPr>
@@ -6666,21 +6281,7 @@
         <w:rPr>
           <w:rFonts w:ascii="Aptos" w:hAnsi="Aptos"/>
         </w:rPr>
-        <w:t>(</w:t>
-      </w:r>
-      <w:proofErr w:type="spellStart"/>
-      <w:r>
-        <w:rPr>
-          <w:rFonts w:ascii="Aptos" w:hAnsi="Aptos"/>
-        </w:rPr>
-        <w:t>Sommeria</w:t>
-      </w:r>
-      <w:proofErr w:type="spellEnd"/>
-      <w:r>
-        <w:rPr>
-          <w:rFonts w:ascii="Aptos" w:hAnsi="Aptos"/>
-        </w:rPr>
-        <w:t xml:space="preserve"> and Deardorff, 1977; Mellor 1977). For a normal distribution of relative humidity, the cloud fraction is</w:t>
+        <w:t>(Sommeria and Deardorff, 1977; Mellor 1977). For a normal distribution of relative humidity, the cloud fraction is</w:t>
       </w:r>
       <w:r>
         <w:rPr>
@@ -6740,16 +6341,7 @@
                 <w:rPr>
                   <w:rFonts w:ascii="Cambria Math" w:hAnsi="Cambria Math"/>
                 </w:rPr>
-                <m:t>1</m:t>
-              </m:r>
-              <m:r>
-                <m:rPr>
-                  <m:sty m:val="p"/>
-                </m:rPr>
-                <w:rPr>
-                  <w:rFonts w:ascii="Cambria Math" w:hAnsi="Cambria Math"/>
-                </w:rPr>
-                <m:t>-erf</m:t>
+                <m:t>1-erf</m:t>
               </m:r>
               <m:d>
                 <m:dPr>
@@ -6777,18 +6369,12 @@
             <w:rPr>
               <w:rFonts w:ascii="Cambria Math" w:hAnsi="Cambria Math"/>
             </w:rPr>
-            <m:t>/</m:t>
+            <m:t>/2</m:t>
           </m:r>
           <m:r>
             <m:rPr>
               <m:sty m:val="p"/>
             </m:rPr>
-            <w:rPr>
-              <w:rFonts w:ascii="Cambria Math" w:hAnsi="Cambria Math"/>
-            </w:rPr>
-            <m:t>2</m:t>
-          </m:r>
-          <m:r>
             <w:rPr>
               <w:rFonts w:ascii="Aptos" w:hAnsi="Aptos"/>
             </w:rPr>
@@ -6949,16 +6535,7 @@
             <w:rPr>
               <w:rFonts w:ascii="Cambria Math" w:hAnsi="Cambria Math"/>
             </w:rPr>
-            <m:t>0</m:t>
-          </m:r>
-          <m:r>
-            <m:rPr>
-              <m:sty m:val="p"/>
-            </m:rPr>
-            <w:rPr>
-              <w:rFonts w:ascii="Cambria Math" w:hAnsi="Cambria Math"/>
-            </w:rPr>
-            <m:t>=-</m:t>
+            <m:t>0=-</m:t>
           </m:r>
           <m:bar>
             <m:barPr>
@@ -7099,6 +6676,9 @@
             <m:t>.</m:t>
           </m:r>
           <m:r>
+            <m:rPr>
+              <m:sty m:val="p"/>
+            </m:rPr>
             <w:rPr>
               <w:rFonts w:ascii="Aptos" w:hAnsi="Aptos"/>
             </w:rPr>
@@ -7529,6 +7109,9 @@
             <m:t>,</m:t>
           </m:r>
           <m:r>
+            <m:rPr>
+              <m:sty m:val="p"/>
+            </m:rPr>
             <w:rPr>
               <w:rFonts w:ascii="Aptos" w:hAnsi="Aptos"/>
             </w:rPr>
@@ -7630,25 +7213,7 @@
               <w:rPr>
                 <w:rFonts w:ascii="Cambria Math" w:hAnsi="Cambria Math"/>
               </w:rPr>
-              <m:t>1</m:t>
-            </m:r>
-            <m:r>
-              <m:rPr>
-                <m:sty m:val="p"/>
-              </m:rPr>
-              <w:rPr>
-                <w:rFonts w:ascii="Cambria Math" w:hAnsi="Cambria Math"/>
-              </w:rPr>
-              <m:t>/</m:t>
-            </m:r>
-            <m:r>
-              <m:rPr>
-                <m:sty m:val="p"/>
-              </m:rPr>
-              <w:rPr>
-                <w:rFonts w:ascii="Cambria Math" w:hAnsi="Cambria Math"/>
-              </w:rPr>
-              <m:t>2</m:t>
+              <m:t>1/2</m:t>
             </m:r>
           </m:sup>
         </m:sSup>
@@ -7913,6 +7478,9 @@
             <m:t>,</m:t>
           </m:r>
           <m:r>
+            <m:rPr>
+              <m:sty m:val="p"/>
+            </m:rPr>
             <w:rPr>
               <w:rFonts w:ascii="Aptos" w:hAnsi="Aptos"/>
             </w:rPr>
@@ -8560,25 +8128,7 @@
                 <w:rPr>
                   <w:rFonts w:ascii="Cambria Math" w:hAnsi="Cambria Math"/>
                 </w:rPr>
-                <m:t>1</m:t>
-              </m:r>
-              <m:r>
-                <m:rPr>
-                  <m:sty m:val="p"/>
-                </m:rPr>
-                <w:rPr>
-                  <w:rFonts w:ascii="Cambria Math" w:hAnsi="Cambria Math"/>
-                </w:rPr>
-                <m:t>/</m:t>
-              </m:r>
-              <m:r>
-                <m:rPr>
-                  <m:sty m:val="p"/>
-                </m:rPr>
-                <w:rPr>
-                  <w:rFonts w:ascii="Cambria Math" w:hAnsi="Cambria Math"/>
-                </w:rPr>
-                <m:t>2</m:t>
+                <m:t>1/2</m:t>
               </m:r>
             </m:sup>
           </m:sSup>
@@ -8758,25 +8308,7 @@
                 <w:rPr>
                   <w:rFonts w:ascii="Cambria Math" w:hAnsi="Cambria Math"/>
                 </w:rPr>
-                <m:t>1</m:t>
-              </m:r>
-              <m:r>
-                <m:rPr>
-                  <m:sty m:val="p"/>
-                </m:rPr>
-                <w:rPr>
-                  <w:rFonts w:ascii="Cambria Math" w:hAnsi="Cambria Math"/>
-                </w:rPr>
-                <m:t>/</m:t>
-              </m:r>
-              <m:r>
-                <m:rPr>
-                  <m:sty m:val="p"/>
-                </m:rPr>
-                <w:rPr>
-                  <w:rFonts w:ascii="Cambria Math" w:hAnsi="Cambria Math"/>
-                </w:rPr>
-                <m:t>2</m:t>
+                <m:t>1/2</m:t>
               </m:r>
             </m:sup>
           </m:sSup>
@@ -8790,6 +8322,9 @@
             <m:t>,</m:t>
           </m:r>
           <m:r>
+            <m:rPr>
+              <m:sty m:val="p"/>
+            </m:rPr>
             <w:rPr>
               <w:rFonts w:ascii="Aptos" w:eastAsiaTheme="minorEastAsia" w:hAnsi="Aptos"/>
             </w:rPr>
@@ -9078,25 +8613,7 @@
                 <w:rPr>
                   <w:rFonts w:ascii="Cambria Math" w:hAnsi="Cambria Math"/>
                 </w:rPr>
-                <m:t>1</m:t>
-              </m:r>
-              <m:r>
-                <m:rPr>
-                  <m:sty m:val="p"/>
-                </m:rPr>
-                <w:rPr>
-                  <w:rFonts w:ascii="Cambria Math" w:hAnsi="Cambria Math"/>
-                </w:rPr>
-                <m:t>/</m:t>
-              </m:r>
-              <m:r>
-                <m:rPr>
-                  <m:sty m:val="p"/>
-                </m:rPr>
-                <w:rPr>
-                  <w:rFonts w:ascii="Cambria Math" w:hAnsi="Cambria Math"/>
-                </w:rPr>
-                <m:t>2</m:t>
+                <m:t>1/2</m:t>
               </m:r>
             </m:sup>
           </m:sSup>
@@ -9107,6 +8624,9 @@
             <m:t>.</m:t>
           </m:r>
           <m:r>
+            <m:rPr>
+              <m:sty m:val="p"/>
+            </m:rPr>
             <w:rPr>
               <w:rFonts w:ascii="Aptos" w:hAnsi="Aptos"/>
             </w:rPr>
@@ -9160,21 +8680,7 @@
         <w:rPr>
           <w:rFonts w:ascii="Aptos" w:hAnsi="Aptos"/>
         </w:rPr>
-        <w:t>, the subcloud mean humidity d</w:t>
-      </w:r>
-      <w:proofErr w:type="spellStart"/>
-      <w:r>
-        <w:rPr>
-          <w:rFonts w:ascii="Aptos" w:hAnsi="Aptos"/>
-        </w:rPr>
-        <w:t>ifference</w:t>
-      </w:r>
-      <w:proofErr w:type="spellEnd"/>
-      <w:r>
-        <w:rPr>
-          <w:rFonts w:ascii="Aptos" w:hAnsi="Aptos"/>
-        </w:rPr>
-        <w:t>, and the saturation specific humidity.</w:t>
+        <w:t>, the subcloud mean humidity difference, and the saturation specific humidity.</w:t>
       </w:r>
     </w:p>
     <w:p>
@@ -9388,16 +8894,7 @@
           <w:rPr>
             <w:rFonts w:ascii="Cambria Math" w:hAnsi="Cambria Math"/>
           </w:rPr>
-          <m:t>1</m:t>
-        </m:r>
-        <m:r>
-          <m:rPr>
-            <m:sty m:val="p"/>
-          </m:rPr>
-          <w:rPr>
-            <w:rFonts w:ascii="Cambria Math" w:hAnsi="Cambria Math"/>
-          </w:rPr>
-          <m:t>-RH</m:t>
+          <m:t>1-RH</m:t>
         </m:r>
       </m:oMath>
       <w:r>
@@ -10016,6 +9513,9 @@
             <m:t>[0.02+0.07]-0.07=-0.025.</m:t>
           </m:r>
           <m:r>
+            <m:rPr>
+              <m:sty m:val="p"/>
+            </m:rPr>
             <w:rPr>
               <w:rFonts w:ascii="Aptos" w:hAnsi="Aptos"/>
             </w:rPr>
@@ -10319,16 +9819,7 @@
                 <w:rPr>
                   <w:rFonts w:ascii="Cambria Math" w:hAnsi="Cambria Math"/>
                 </w:rPr>
-                <m:t>1</m:t>
-              </m:r>
-              <m:r>
-                <m:rPr>
-                  <m:sty m:val="p"/>
-                </m:rPr>
-                <w:rPr>
-                  <w:rFonts w:ascii="Cambria Math" w:hAnsi="Cambria Math"/>
-                </w:rPr>
-                <m:t>-erf</m:t>
+                <m:t>1-erf</m:t>
               </m:r>
               <m:d>
                 <m:dPr>
@@ -10378,45 +9869,12 @@
             <w:rPr>
               <w:rFonts w:ascii="Cambria Math" w:hAnsi="Cambria Math"/>
             </w:rPr>
-            <m:t>/</m:t>
+            <m:t>/2=0.055,</m:t>
           </m:r>
           <m:r>
             <m:rPr>
               <m:sty m:val="p"/>
             </m:rPr>
-            <w:rPr>
-              <w:rFonts w:ascii="Cambria Math" w:hAnsi="Cambria Math"/>
-            </w:rPr>
-            <m:t>2</m:t>
-          </m:r>
-          <m:r>
-            <m:rPr>
-              <m:sty m:val="p"/>
-            </m:rPr>
-            <w:rPr>
-              <w:rFonts w:ascii="Cambria Math" w:hAnsi="Cambria Math"/>
-            </w:rPr>
-            <m:t>=</m:t>
-          </m:r>
-          <m:r>
-            <m:rPr>
-              <m:sty m:val="p"/>
-            </m:rPr>
-            <w:rPr>
-              <w:rFonts w:ascii="Cambria Math" w:hAnsi="Cambria Math"/>
-            </w:rPr>
-            <m:t>0.055</m:t>
-          </m:r>
-          <m:r>
-            <m:rPr>
-              <m:sty m:val="p"/>
-            </m:rPr>
-            <w:rPr>
-              <w:rFonts w:ascii="Cambria Math" w:hAnsi="Cambria Math"/>
-            </w:rPr>
-            <m:t>,</m:t>
-          </m:r>
-          <m:r>
             <w:rPr>
               <w:rFonts w:ascii="Aptos" w:hAnsi="Aptos"/>
             </w:rPr>
@@ -10466,16 +9924,7 @@
           <w:rPr>
             <w:rFonts w:ascii="Cambria Math" w:hAnsi="Cambria Math"/>
           </w:rPr>
-          <m:t>=</m:t>
-        </m:r>
-        <m:r>
-          <m:rPr>
-            <m:sty m:val="p"/>
-          </m:rPr>
-          <w:rPr>
-            <w:rFonts w:ascii="Cambria Math" w:hAnsi="Cambria Math"/>
-          </w:rPr>
-          <m:t>1.13</m:t>
+          <m:t>=1.13</m:t>
         </m:r>
       </m:oMath>
       <w:r>
@@ -10620,27 +10069,12 @@
             <w:rPr>
               <w:rFonts w:ascii="Cambria Math" w:hAnsi="Cambria Math"/>
             </w:rPr>
-            <m:t>=</m:t>
+            <m:t>=0.06,</m:t>
           </m:r>
           <m:r>
             <m:rPr>
               <m:sty m:val="p"/>
             </m:rPr>
-            <w:rPr>
-              <w:rFonts w:ascii="Cambria Math" w:hAnsi="Cambria Math"/>
-            </w:rPr>
-            <m:t>0.06</m:t>
-          </m:r>
-          <m:r>
-            <m:rPr>
-              <m:sty m:val="p"/>
-            </m:rPr>
-            <w:rPr>
-              <w:rFonts w:ascii="Cambria Math" w:hAnsi="Cambria Math"/>
-            </w:rPr>
-            <m:t>,</m:t>
-          </m:r>
-          <m:r>
             <w:rPr>
               <w:rFonts w:ascii="Aptos" w:hAnsi="Aptos"/>
             </w:rPr>
@@ -10726,21 +10160,7 @@
         <w:rPr>
           <w:rFonts w:ascii="Aptos" w:hAnsi="Aptos"/>
         </w:rPr>
-        <w:t xml:space="preserve">Figure MODISISCCP shows ISCCP-H cloud top height and optical thickness cloud fraction histograms observed from the 1-km pixel MODIS observations in the Northern Atlantic shallow cumulus region (80-20°W, 15-35°N) for January-February of 2019-2021. These high-resolution observations avoid partially cloudy pixels and are designed to be compared to COSP satellite simulators in climate models. Most (29.1%) of the clouds are below 800 </w:t>
-      </w:r>
-      <w:proofErr w:type="spellStart"/>
-      <w:r>
-        <w:rPr>
-          <w:rFonts w:ascii="Aptos" w:hAnsi="Aptos"/>
-        </w:rPr>
-        <w:t>hPa</w:t>
-      </w:r>
-      <w:proofErr w:type="spellEnd"/>
-      <w:r>
-        <w:rPr>
-          <w:rFonts w:ascii="Aptos" w:hAnsi="Aptos"/>
-        </w:rPr>
-        <w:t xml:space="preserve"> with cloud optical thickness between 1.3-9.4.</w:t>
+        <w:t>Figure MODISISCCP shows ISCCP-H cloud top height and optical thickness cloud fraction histograms observed from the 1-km pixel MODIS observations in the Northern Atlantic shallow cumulus region (80-20°W, 15-35°N) for January-February of 2019-2021. These high-resolution observations avoid partially cloudy pixels and are designed to be compared to COSP satellite simulators in climate models. Most (29.1%) of the clouds are below 800 hPa with cloud optical thickness between 1.3-9.4.</w:t>
       </w:r>
     </w:p>
     <w:p>
@@ -10754,15 +10174,7 @@
         <w:t>2</w:t>
       </w:r>
       <w:r>
-        <w:t xml:space="preserve"> regions, assuming updraft cores are cloudy with saturated specific humidity. The horizontal-time ensemble </w:t>
-      </w:r>
-      <w:proofErr w:type="gramStart"/>
-      <w:r>
-        <w:t>mean</w:t>
-      </w:r>
-      <w:proofErr w:type="gramEnd"/>
-      <w:r>
-        <w:t xml:space="preserve"> trade cumulus water (vapor + liquid) flux due to updrafts and precipitation balances mean subsidence. Cloud mass flux is initialized at cloud base to match the mean observed surface evaporation minus precipitation. </w:t>
+        <w:t xml:space="preserve"> regions, assuming updraft cores are cloudy with saturated specific humidity. The horizontal-time ensemble mean trade cumulus water (vapor + liquid) flux due to updrafts and precipitation balances mean subsidence. Cloud mass flux is initialized at cloud base to match the mean observed surface evaporation minus precipitation. </w:t>
       </w:r>
     </w:p>
     <w:p>
@@ -11453,21 +10865,7 @@
         <w:rPr>
           <w:rFonts w:eastAsiaTheme="minorEastAsia"/>
         </w:rPr>
-        <w:t xml:space="preserve">is an </w:t>
-      </w:r>
-      <w:proofErr w:type="spellStart"/>
-      <w:r>
-        <w:rPr>
-          <w:rFonts w:eastAsiaTheme="minorEastAsia"/>
-        </w:rPr>
-        <w:t>underconstrained</w:t>
-      </w:r>
-      <w:proofErr w:type="spellEnd"/>
-      <w:r>
-        <w:rPr>
-          <w:rFonts w:eastAsiaTheme="minorEastAsia"/>
-        </w:rPr>
-        <w:t xml:space="preserve"> problem</w:t>
+        <w:t>is an underconstrained problem</w:t>
       </w:r>
       <w:r>
         <w:rPr>
@@ -12182,14 +11580,12 @@
       <w:r>
         <w:t xml:space="preserve"> </w:t>
       </w:r>
-      <w:proofErr w:type="spellStart"/>
       <w:r>
         <w:rPr>
           <w:rFonts w:ascii="ComicShannsMono Nerd Font" w:hAnsi="ComicShannsMono Nerd Font"/>
         </w:rPr>
         <w:t>amip</w:t>
       </w:r>
-      <w:proofErr w:type="spellEnd"/>
       <w:r>
         <w:t xml:space="preserve"> (historical) and </w:t>
       </w:r>
@@ -12223,14 +11619,12 @@
       <w:r>
         <w:t xml:space="preserve"> and </w:t>
       </w:r>
-      <w:proofErr w:type="spellStart"/>
       <w:r>
         <w:rPr>
           <w:rFonts w:ascii="ComicShannsMono Nerd Font" w:hAnsi="ComicShannsMono Nerd Font"/>
         </w:rPr>
         <w:t>amip</w:t>
       </w:r>
-      <w:proofErr w:type="spellEnd"/>
       <w:r>
         <w:t xml:space="preserve"> during</w:t>
       </w:r>
@@ -13397,21 +12791,7 @@
         <w:rPr>
           <w:rFonts w:ascii="Aptos" w:eastAsiaTheme="minorEastAsia" w:hAnsi="Aptos" w:cs="Times New Roman"/>
         </w:rPr>
-        <w:t xml:space="preserve"> The dependence on this condensation rate is eliminated in the total cloud water balance equation. Summing the liquid and </w:t>
-      </w:r>
-      <w:proofErr w:type="gramStart"/>
-      <w:r>
-        <w:rPr>
-          <w:rFonts w:ascii="Aptos" w:eastAsiaTheme="minorEastAsia" w:hAnsi="Aptos" w:cs="Times New Roman"/>
-        </w:rPr>
-        <w:t>vapor, and</w:t>
-      </w:r>
-      <w:proofErr w:type="gramEnd"/>
-      <w:r>
-        <w:rPr>
-          <w:rFonts w:ascii="Aptos" w:eastAsiaTheme="minorEastAsia" w:hAnsi="Aptos" w:cs="Times New Roman"/>
-        </w:rPr>
-        <w:t xml:space="preserve"> taking the Eulerian total specific humidity </w:t>
+        <w:t xml:space="preserve"> The dependence on this condensation rate is eliminated in the total cloud water balance equation. Summing the liquid and vapor, and taking the Eulerian total specific humidity </w:t>
       </w:r>
       <m:oMath>
         <m:sSub>
@@ -13715,42 +13095,13 @@
         <w:rPr>
           <w:rFonts w:ascii="Aptos" w:eastAsiaTheme="minorEastAsia" w:hAnsi="Aptos" w:cs="Times New Roman"/>
         </w:rPr>
-        <w:t xml:space="preserve"> in the cloud. The updraft </w:t>
-      </w:r>
-      <w:proofErr w:type="spellStart"/>
+        <w:t xml:space="preserve"> in the cloud. The updraft advects moisture upwards, but the solution</w:t>
+      </w:r>
       <w:r>
         <w:rPr>
           <w:rFonts w:ascii="Aptos" w:eastAsiaTheme="minorEastAsia" w:hAnsi="Aptos" w:cs="Times New Roman"/>
         </w:rPr>
-        <w:t>advects</w:t>
-      </w:r>
-      <w:proofErr w:type="spellEnd"/>
-      <w:r>
-        <w:rPr>
-          <w:rFonts w:ascii="Aptos" w:eastAsiaTheme="minorEastAsia" w:hAnsi="Aptos" w:cs="Times New Roman"/>
-        </w:rPr>
-        <w:t xml:space="preserve"> moisture upwards, but the solution is quantitatively insensitive to the updraft velocity.</w:t>
-      </w:r>
-    </w:p>
-    <w:p>
-      <w:pPr>
-        <w:rPr>
-          <w:rFonts w:ascii="Aptos" w:eastAsiaTheme="minorEastAsia" w:hAnsi="Aptos" w:cs="Times New Roman"/>
-        </w:rPr>
-      </w:pPr>
-      <w:r>
-        <w:rPr>
-          <w:rFonts w:ascii="Aptos" w:eastAsiaTheme="minorEastAsia" w:hAnsi="Aptos" w:cs="Times New Roman"/>
-          <w:i/>
-          <w:iCs/>
-        </w:rPr>
-        <w:t>Above the cloud,</w:t>
-      </w:r>
-      <w:r>
-        <w:rPr>
-          <w:rFonts w:ascii="Aptos" w:eastAsiaTheme="minorEastAsia" w:hAnsi="Aptos" w:cs="Times New Roman"/>
-        </w:rPr>
-        <w:t xml:space="preserve"> </w:t>
+        <w:t xml:space="preserve"> for </w:t>
       </w:r>
       <m:oMath>
         <m:sSub>
@@ -13774,6 +13125,78 @@
             <m:r>
               <w:rPr>
                 <w:rFonts w:ascii="Cambria Math" w:eastAsiaTheme="minorEastAsia" w:hAnsi="Cambria Math" w:cs="Times New Roman"/>
+              </w:rPr>
+              <m:t>T</m:t>
+            </m:r>
+          </m:sub>
+        </m:sSub>
+      </m:oMath>
+      <w:r>
+        <w:rPr>
+          <w:rFonts w:ascii="Aptos" w:eastAsiaTheme="minorEastAsia" w:hAnsi="Aptos" w:cs="Times New Roman"/>
+        </w:rPr>
+        <w:t xml:space="preserve"> is quantitatively insensitive to the updraft velocity</w:t>
+      </w:r>
+      <w:r>
+        <w:rPr>
+          <w:rFonts w:ascii="Aptos" w:eastAsiaTheme="minorEastAsia" w:hAnsi="Aptos" w:cs="Times New Roman"/>
+        </w:rPr>
+        <w:t xml:space="preserve"> and to the moisture flux</w:t>
+      </w:r>
+      <w:r>
+        <w:rPr>
+          <w:rFonts w:ascii="Aptos" w:eastAsiaTheme="minorEastAsia" w:hAnsi="Aptos" w:cs="Times New Roman"/>
+        </w:rPr>
+        <w:t>.</w:t>
+      </w:r>
+    </w:p>
+    <w:p>
+      <w:pPr>
+        <w:rPr>
+          <w:rFonts w:ascii="Aptos" w:eastAsiaTheme="minorEastAsia" w:hAnsi="Aptos" w:cs="Times New Roman"/>
+        </w:rPr>
+      </w:pPr>
+      <w:r>
+        <w:rPr>
+          <w:rFonts w:ascii="Aptos" w:eastAsiaTheme="minorEastAsia" w:hAnsi="Aptos" w:cs="Times New Roman"/>
+          <w:i/>
+          <w:iCs/>
+          <w:highlight w:val="darkGray"/>
+        </w:rPr>
+        <w:t>Above the cloud,</w:t>
+      </w:r>
+      <w:r>
+        <w:rPr>
+          <w:rFonts w:ascii="Aptos" w:eastAsiaTheme="minorEastAsia" w:hAnsi="Aptos" w:cs="Times New Roman"/>
+          <w:highlight w:val="darkGray"/>
+        </w:rPr>
+        <w:t xml:space="preserve"> </w:t>
+      </w:r>
+      <m:oMath>
+        <m:sSub>
+          <m:sSubPr>
+            <m:ctrlPr>
+              <w:rPr>
+                <w:rFonts w:ascii="Cambria Math" w:eastAsiaTheme="minorEastAsia" w:hAnsi="Cambria Math" w:cs="Times New Roman"/>
+                <w:i/>
+                <w:highlight w:val="darkGray"/>
+              </w:rPr>
+            </m:ctrlPr>
+          </m:sSubPr>
+          <m:e>
+            <m:r>
+              <w:rPr>
+                <w:rFonts w:ascii="Cambria Math" w:eastAsiaTheme="minorEastAsia" w:hAnsi="Cambria Math" w:cs="Times New Roman"/>
+                <w:highlight w:val="darkGray"/>
+              </w:rPr>
+              <m:t>q</m:t>
+            </m:r>
+          </m:e>
+          <m:sub>
+            <m:r>
+              <w:rPr>
+                <w:rFonts w:ascii="Cambria Math" w:eastAsiaTheme="minorEastAsia" w:hAnsi="Cambria Math" w:cs="Times New Roman"/>
+                <w:highlight w:val="darkGray"/>
               </w:rPr>
               <m:t>l</m:t>
             </m:r>
@@ -13782,6 +13205,7 @@
         <m:r>
           <w:rPr>
             <w:rFonts w:ascii="Cambria Math" w:eastAsiaTheme="minorEastAsia" w:hAnsi="Cambria Math" w:cs="Times New Roman"/>
+            <w:highlight w:val="darkGray"/>
           </w:rPr>
           <m:t>=0</m:t>
         </m:r>
@@ -13789,12 +13213,14 @@
       <w:r>
         <w:rPr>
           <w:rFonts w:ascii="Aptos" w:eastAsiaTheme="minorEastAsia" w:hAnsi="Aptos" w:cs="Times New Roman"/>
+          <w:highlight w:val="darkGray"/>
         </w:rPr>
         <w:t>, so there is no autoconversion. Only entrainment relaxes humidity to that of the environment:</w:t>
       </w:r>
       <w:r>
         <w:rPr>
           <w:rFonts w:ascii="Aptos" w:eastAsiaTheme="minorEastAsia" w:hAnsi="Aptos" w:cs="Times New Roman"/>
+          <w:highlight w:val="darkGray"/>
         </w:rPr>
         <w:br/>
       </w:r>
@@ -13806,6 +13232,7 @@
                 <w:rPr>
                   <w:rFonts w:ascii="Cambria Math" w:eastAsiaTheme="minorEastAsia" w:hAnsi="Cambria Math" w:cs="Times New Roman"/>
                   <w:i/>
+                  <w:highlight w:val="darkGray"/>
                 </w:rPr>
               </m:ctrlPr>
             </m:fPr>
@@ -13813,6 +13240,7 @@
               <m:r>
                 <w:rPr>
                   <w:rFonts w:ascii="Cambria Math" w:hAnsi="Cambria Math" w:cs="Times New Roman"/>
+                  <w:highlight w:val="darkGray"/>
                 </w:rPr>
                 <m:t>∂</m:t>
               </m:r>
@@ -13822,6 +13250,7 @@
                     <w:rPr>
                       <w:rFonts w:ascii="Cambria Math" w:eastAsiaTheme="minorEastAsia" w:hAnsi="Cambria Math" w:cs="Times New Roman"/>
                       <w:i/>
+                      <w:highlight w:val="darkGray"/>
                     </w:rPr>
                   </m:ctrlPr>
                 </m:sSubPr>
@@ -13829,6 +13258,7 @@
                   <m:r>
                     <w:rPr>
                       <w:rFonts w:ascii="Cambria Math" w:eastAsiaTheme="minorEastAsia" w:hAnsi="Cambria Math" w:cs="Times New Roman"/>
+                      <w:highlight w:val="darkGray"/>
                     </w:rPr>
                     <m:t>q</m:t>
                   </m:r>
@@ -13837,6 +13267,7 @@
                   <m:r>
                     <w:rPr>
                       <w:rFonts w:ascii="Cambria Math" w:eastAsiaTheme="minorEastAsia" w:hAnsi="Cambria Math" w:cs="Times New Roman"/>
+                      <w:highlight w:val="darkGray"/>
                     </w:rPr>
                     <m:t>T</m:t>
                   </m:r>
@@ -13847,6 +13278,7 @@
               <m:r>
                 <w:rPr>
                   <w:rFonts w:ascii="Cambria Math" w:eastAsiaTheme="minorEastAsia" w:hAnsi="Cambria Math" w:cs="Times New Roman"/>
+                  <w:highlight w:val="darkGray"/>
                 </w:rPr>
                 <m:t>∂z</m:t>
               </m:r>
@@ -13855,6 +13287,7 @@
           <m:r>
             <w:rPr>
               <w:rFonts w:ascii="Cambria Math" w:eastAsiaTheme="minorEastAsia" w:hAnsi="Cambria Math" w:cs="Times New Roman"/>
+              <w:highlight w:val="darkGray"/>
             </w:rPr>
             <m:t>=-ϵ</m:t>
           </m:r>
@@ -13864,6 +13297,7 @@
                 <w:rPr>
                   <w:rFonts w:ascii="Cambria Math" w:eastAsiaTheme="minorEastAsia" w:hAnsi="Cambria Math" w:cs="Times New Roman"/>
                   <w:i/>
+                  <w:highlight w:val="darkGray"/>
                 </w:rPr>
               </m:ctrlPr>
             </m:dPr>
@@ -13874,6 +13308,7 @@
                     <w:rPr>
                       <w:rFonts w:ascii="Cambria Math" w:eastAsiaTheme="minorEastAsia" w:hAnsi="Cambria Math" w:cs="Times New Roman"/>
                       <w:i/>
+                      <w:highlight w:val="darkGray"/>
                     </w:rPr>
                   </m:ctrlPr>
                 </m:sSubPr>
@@ -13881,6 +13316,7 @@
                   <m:r>
                     <w:rPr>
                       <w:rFonts w:ascii="Cambria Math" w:eastAsiaTheme="minorEastAsia" w:hAnsi="Cambria Math" w:cs="Times New Roman"/>
+                      <w:highlight w:val="darkGray"/>
                     </w:rPr>
                     <m:t>q</m:t>
                   </m:r>
@@ -13889,6 +13325,7 @@
                   <m:r>
                     <w:rPr>
                       <w:rFonts w:ascii="Cambria Math" w:eastAsiaTheme="minorEastAsia" w:hAnsi="Cambria Math" w:cs="Times New Roman"/>
+                      <w:highlight w:val="darkGray"/>
                     </w:rPr>
                     <m:t>T</m:t>
                   </m:r>
@@ -13897,6 +13334,7 @@
               <m:r>
                 <w:rPr>
                   <w:rFonts w:ascii="Cambria Math" w:eastAsiaTheme="minorEastAsia" w:hAnsi="Cambria Math" w:cs="Times New Roman"/>
+                  <w:highlight w:val="darkGray"/>
                 </w:rPr>
                 <m:t>-q</m:t>
               </m:r>
@@ -13905,6 +13343,7 @@
           <m:r>
             <w:rPr>
               <w:rFonts w:ascii="Cambria Math" w:eastAsiaTheme="minorEastAsia" w:hAnsi="Cambria Math" w:cs="Times New Roman"/>
+              <w:highlight w:val="darkGray"/>
             </w:rPr>
             <m:t>.</m:t>
           </m:r>
@@ -13920,8 +13359,6 @@
       <w:r>
         <w:rPr>
           <w:rFonts w:ascii="Aptos" w:eastAsiaTheme="minorEastAsia" w:hAnsi="Aptos" w:cs="Times New Roman"/>
-          <w:i/>
-          <w:iCs/>
         </w:rPr>
         <w:t>In the cloud</w:t>
       </w:r>
@@ -13929,7 +13366,13 @@
         <w:rPr>
           <w:rFonts w:ascii="Aptos" w:eastAsiaTheme="minorEastAsia" w:hAnsi="Aptos" w:cs="Times New Roman"/>
         </w:rPr>
-        <w:t xml:space="preserve">, </w:t>
+        <w:t>,</w:t>
+      </w:r>
+      <w:r>
+        <w:rPr>
+          <w:rFonts w:ascii="Aptos" w:eastAsiaTheme="minorEastAsia" w:hAnsi="Aptos" w:cs="Times New Roman"/>
+        </w:rPr>
+        <w:t xml:space="preserve"> </w:t>
       </w:r>
       <m:oMath>
         <m:sSub>
@@ -14075,7 +13518,19 @@
         <w:rPr>
           <w:rFonts w:ascii="Aptos" w:eastAsiaTheme="minorEastAsia" w:hAnsi="Aptos" w:cs="Times New Roman"/>
         </w:rPr>
-        <w:t>. Thus, equation QTBALANCE, written</w:t>
+        <w:t>. Thus, equation QTBALANCE</w:t>
+      </w:r>
+      <w:r>
+        <w:rPr>
+          <w:rFonts w:ascii="Aptos" w:eastAsiaTheme="minorEastAsia" w:hAnsi="Aptos" w:cs="Times New Roman"/>
+        </w:rPr>
+        <w:t xml:space="preserve"> is</w:t>
+      </w:r>
+      <w:r>
+        <w:rPr>
+          <w:rFonts w:ascii="Aptos" w:eastAsiaTheme="minorEastAsia" w:hAnsi="Aptos" w:cs="Times New Roman"/>
+        </w:rPr>
+        <w:t>, written</w:t>
       </w:r>
       <w:r>
         <w:rPr>
@@ -14262,7 +13717,53 @@
         <w:rPr>
           <w:rFonts w:ascii="Aptos" w:eastAsiaTheme="minorEastAsia" w:hAnsi="Aptos" w:cs="Times New Roman"/>
         </w:rPr>
-        <w:t xml:space="preserve">relaxes </w:t>
+        <w:t>relax</w:t>
+      </w:r>
+      <w:r>
+        <w:rPr>
+          <w:rFonts w:ascii="Aptos" w:eastAsiaTheme="minorEastAsia" w:hAnsi="Aptos" w:cs="Times New Roman"/>
+        </w:rPr>
+        <w:t xml:space="preserve">ing </w:t>
+      </w:r>
+      <m:oMath>
+        <m:sSub>
+          <m:sSubPr>
+            <m:ctrlPr>
+              <w:rPr>
+                <w:rFonts w:ascii="Cambria Math" w:eastAsiaTheme="minorEastAsia" w:hAnsi="Cambria Math" w:cs="Times New Roman"/>
+                <w:i/>
+              </w:rPr>
+            </m:ctrlPr>
+          </m:sSubPr>
+          <m:e>
+            <m:r>
+              <w:rPr>
+                <w:rFonts w:ascii="Cambria Math" w:eastAsiaTheme="minorEastAsia" w:hAnsi="Cambria Math" w:cs="Times New Roman"/>
+              </w:rPr>
+              <m:t>q</m:t>
+            </m:r>
+          </m:e>
+          <m:sub>
+            <m:r>
+              <w:rPr>
+                <w:rFonts w:ascii="Cambria Math" w:eastAsiaTheme="minorEastAsia" w:hAnsi="Cambria Math" w:cs="Times New Roman"/>
+              </w:rPr>
+              <m:t>T</m:t>
+            </m:r>
+          </m:sub>
+        </m:sSub>
+        <m:r>
+          <w:rPr>
+            <w:rFonts w:ascii="Cambria Math" w:eastAsiaTheme="minorEastAsia" w:hAnsi="Cambria Math" w:cs="Times New Roman"/>
+          </w:rPr>
+          <m:t>,</m:t>
+        </m:r>
+      </m:oMath>
+      <w:r>
+        <w:rPr>
+          <w:rFonts w:ascii="Aptos" w:eastAsiaTheme="minorEastAsia" w:hAnsi="Aptos" w:cs="Times New Roman"/>
+        </w:rPr>
+        <w:t xml:space="preserve"> </w:t>
       </w:r>
       <w:r>
         <w:rPr>
@@ -14296,129 +13797,16 @@
         </w:rPr>
         <w:t xml:space="preserve">toward </w:t>
       </w:r>
-      <m:oMath>
-        <m:acc>
-          <m:accPr>
-            <m:chr m:val="̃"/>
-            <m:ctrlPr>
-              <w:rPr>
-                <w:rFonts w:ascii="Cambria Math" w:eastAsiaTheme="minorEastAsia" w:hAnsi="Cambria Math" w:cs="Times New Roman"/>
-                <w:i/>
-              </w:rPr>
-            </m:ctrlPr>
-          </m:accPr>
-          <m:e>
-            <m:r>
-              <w:rPr>
-                <w:rFonts w:ascii="Cambria Math" w:eastAsiaTheme="minorEastAsia" w:hAnsi="Cambria Math" w:cs="Times New Roman"/>
-              </w:rPr>
-              <m:t>q</m:t>
-            </m:r>
-          </m:e>
-        </m:acc>
-      </m:oMath>
       <w:r>
         <w:rPr>
           <w:rFonts w:ascii="Aptos" w:eastAsiaTheme="minorEastAsia" w:hAnsi="Aptos" w:cs="Times New Roman"/>
         </w:rPr>
-        <w:t>. T</w:t>
-      </w:r>
-      <w:r>
-        <w:rPr>
-          <w:rFonts w:ascii="Aptos" w:eastAsiaTheme="minorEastAsia" w:hAnsi="Aptos" w:cs="Times New Roman"/>
-        </w:rPr>
-        <w:t>he intermediate humidity</w:t>
-      </w:r>
-      <w:r>
-        <w:rPr>
-          <w:rFonts w:ascii="Aptos" w:eastAsiaTheme="minorEastAsia" w:hAnsi="Aptos" w:cs="Times New Roman"/>
-        </w:rPr>
-        <w:t> </w:t>
-      </w:r>
-      <m:oMath>
-        <m:acc>
-          <m:accPr>
-            <m:chr m:val="̃"/>
-            <m:ctrlPr>
-              <w:rPr>
-                <w:rFonts w:ascii="Cambria Math" w:eastAsiaTheme="minorEastAsia" w:hAnsi="Cambria Math" w:cs="Times New Roman"/>
-                <w:i/>
-              </w:rPr>
-            </m:ctrlPr>
-          </m:accPr>
-          <m:e>
-            <m:r>
-              <w:rPr>
-                <w:rFonts w:ascii="Cambria Math" w:eastAsiaTheme="minorEastAsia" w:hAnsi="Cambria Math" w:cs="Times New Roman"/>
-              </w:rPr>
-              <m:t>q</m:t>
-            </m:r>
-          </m:e>
-        </m:acc>
-      </m:oMath>
-      <w:r>
-        <w:rPr>
-          <w:rFonts w:ascii="Aptos" w:eastAsiaTheme="minorEastAsia" w:hAnsi="Aptos" w:cs="Times New Roman"/>
-        </w:rPr>
-        <w:t xml:space="preserve"> </w:t>
-      </w:r>
-      <w:r>
-        <w:rPr>
-          <w:rFonts w:ascii="Aptos" w:eastAsiaTheme="minorEastAsia" w:hAnsi="Aptos" w:cs="Times New Roman"/>
-        </w:rPr>
-        <w:t xml:space="preserve">between </w:t>
-      </w:r>
-      <m:oMath>
-        <m:r>
-          <w:rPr>
-            <w:rFonts w:ascii="Cambria Math" w:eastAsiaTheme="minorEastAsia" w:hAnsi="Cambria Math" w:cs="Times New Roman"/>
-          </w:rPr>
-          <m:t xml:space="preserve">q </m:t>
-        </m:r>
-      </m:oMath>
-      <w:r>
-        <w:rPr>
-          <w:rFonts w:ascii="Aptos" w:eastAsiaTheme="minorEastAsia" w:hAnsi="Aptos" w:cs="Times New Roman"/>
-        </w:rPr>
-        <w:t xml:space="preserve">and </w:t>
-      </w:r>
-      <m:oMath>
-        <m:sSub>
-          <m:sSubPr>
-            <m:ctrlPr>
-              <w:rPr>
-                <w:rFonts w:ascii="Cambria Math" w:eastAsiaTheme="minorEastAsia" w:hAnsi="Cambria Math" w:cs="Times New Roman"/>
-                <w:i/>
-              </w:rPr>
-            </m:ctrlPr>
-          </m:sSubPr>
-          <m:e>
-            <m:r>
-              <w:rPr>
-                <w:rFonts w:ascii="Cambria Math" w:eastAsiaTheme="minorEastAsia" w:hAnsi="Cambria Math" w:cs="Times New Roman"/>
-              </w:rPr>
-              <m:t>q</m:t>
-            </m:r>
-          </m:e>
-          <m:sub>
-            <m:r>
-              <w:rPr>
-                <w:rFonts w:ascii="Cambria Math" w:eastAsiaTheme="minorEastAsia" w:hAnsi="Cambria Math" w:cs="Times New Roman"/>
-              </w:rPr>
-              <m:t>s</m:t>
-            </m:r>
-          </m:sub>
-        </m:sSub>
-      </m:oMath>
-      <w:r>
-        <w:rPr>
-          <w:rFonts w:ascii="Aptos" w:eastAsiaTheme="minorEastAsia" w:hAnsi="Aptos" w:cs="Times New Roman"/>
-        </w:rPr>
-        <w:t xml:space="preserve"> is</w:t>
-      </w:r>
-      <w:r>
-        <w:rPr>
-          <w:rFonts w:ascii="Aptos" w:eastAsiaTheme="minorEastAsia" w:hAnsi="Aptos" w:cs="Times New Roman"/>
+        <w:t xml:space="preserve">the humidity </w:t>
+      </w:r>
+      <w:r>
+        <w:rPr>
+          <w:rFonts w:ascii="Cambria Math" w:eastAsiaTheme="minorEastAsia" w:hAnsi="Cambria Math" w:cs="Times New Roman"/>
+          <w:i/>
         </w:rPr>
         <w:br/>
       </w:r>
@@ -14564,6 +13952,97 @@
         <w:rPr>
           <w:rFonts w:ascii="Aptos" w:eastAsiaTheme="minorEastAsia" w:hAnsi="Aptos" w:cs="Times New Roman"/>
         </w:rPr>
+        <w:t xml:space="preserve">between </w:t>
+      </w:r>
+      <m:oMath>
+        <m:r>
+          <w:rPr>
+            <w:rFonts w:ascii="Cambria Math" w:eastAsiaTheme="minorEastAsia" w:hAnsi="Cambria Math" w:cs="Times New Roman"/>
+          </w:rPr>
+          <m:t xml:space="preserve">q </m:t>
+        </m:r>
+      </m:oMath>
+      <w:r>
+        <w:rPr>
+          <w:rFonts w:ascii="Aptos" w:eastAsiaTheme="minorEastAsia" w:hAnsi="Aptos" w:cs="Times New Roman"/>
+        </w:rPr>
+        <w:t xml:space="preserve">and </w:t>
+      </w:r>
+      <m:oMath>
+        <m:sSub>
+          <m:sSubPr>
+            <m:ctrlPr>
+              <w:rPr>
+                <w:rFonts w:ascii="Cambria Math" w:eastAsiaTheme="minorEastAsia" w:hAnsi="Cambria Math" w:cs="Times New Roman"/>
+                <w:i/>
+              </w:rPr>
+            </m:ctrlPr>
+          </m:sSubPr>
+          <m:e>
+            <m:r>
+              <w:rPr>
+                <w:rFonts w:ascii="Cambria Math" w:eastAsiaTheme="minorEastAsia" w:hAnsi="Cambria Math" w:cs="Times New Roman"/>
+              </w:rPr>
+              <m:t>q</m:t>
+            </m:r>
+          </m:e>
+          <m:sub>
+            <m:r>
+              <w:rPr>
+                <w:rFonts w:ascii="Cambria Math" w:eastAsiaTheme="minorEastAsia" w:hAnsi="Cambria Math" w:cs="Times New Roman"/>
+              </w:rPr>
+              <m:t>s</m:t>
+            </m:r>
+          </m:sub>
+        </m:sSub>
+      </m:oMath>
+      <w:r>
+        <w:rPr>
+          <w:rFonts w:ascii="Aptos" w:eastAsiaTheme="minorEastAsia" w:hAnsi="Aptos" w:cs="Times New Roman"/>
+        </w:rPr>
+        <w:t xml:space="preserve">. </w:t>
+      </w:r>
+    </w:p>
+    <w:p>
+      <w:pPr>
+        <w:rPr>
+          <w:rFonts w:ascii="Aptos" w:eastAsiaTheme="minorEastAsia" w:hAnsi="Aptos" w:cs="Times New Roman"/>
+        </w:rPr>
+      </w:pPr>
+      <w:r>
+        <w:rPr>
+          <w:rFonts w:ascii="Aptos" w:eastAsiaTheme="minorEastAsia" w:hAnsi="Aptos" w:cs="Times New Roman"/>
+        </w:rPr>
+        <w:t xml:space="preserve">[q and cloud top where q=qs depends only on the sounding and cloud base initial condition, so it can be computed from the sounding, without the flux condition. </w:t>
+      </w:r>
+      <w:r>
+        <w:rPr>
+          <w:rFonts w:ascii="Aptos" w:eastAsiaTheme="minorEastAsia" w:hAnsi="Aptos" w:cs="Times New Roman"/>
+        </w:rPr>
+        <w:t xml:space="preserve">In practice, cloud top heights are computed for different total sink rates, giving a map between the two. Then these clouds </w:t>
+      </w:r>
+      <w:r>
+        <w:rPr>
+          <w:rFonts w:ascii="Aptos" w:eastAsiaTheme="minorEastAsia" w:hAnsi="Aptos" w:cs="Times New Roman"/>
+        </w:rPr>
+        <w:t>]</w:t>
+      </w:r>
+      <w:r>
+        <w:rPr>
+          <w:rFonts w:ascii="Aptos" w:eastAsiaTheme="minorEastAsia" w:hAnsi="Aptos" w:cs="Times New Roman"/>
+        </w:rPr>
+        <w:br/>
+      </w:r>
+      <w:r>
+        <w:rPr>
+          <w:rFonts w:ascii="Aptos" w:eastAsiaTheme="minorEastAsia" w:hAnsi="Aptos" w:cs="Times New Roman"/>
+        </w:rPr>
+        <w:br/>
+      </w:r>
+      <w:r>
+        <w:rPr>
+          <w:rFonts w:ascii="Aptos" w:eastAsiaTheme="minorEastAsia" w:hAnsi="Aptos" w:cs="Times New Roman"/>
+        </w:rPr>
         <w:t xml:space="preserve">The total sink rate </w:t>
       </w:r>
       <m:oMath>
@@ -14974,16 +14453,8 @@
         <w:rPr>
           <w:rFonts w:ascii="Aptos Narrow" w:eastAsiaTheme="minorEastAsia" w:hAnsi="Aptos Narrow" w:cs="Times New Roman"/>
         </w:rPr>
-        <w:t xml:space="preserve">[ </w:t>
-      </w:r>
-      <w:proofErr w:type="gramStart"/>
-      <w:r>
-        <w:rPr>
-          <w:rFonts w:ascii="Aptos Narrow" w:eastAsiaTheme="minorEastAsia" w:hAnsi="Aptos Narrow" w:cs="Times New Roman"/>
-        </w:rPr>
-        <w:t>/home/deszoeks/Projects/ATOMIC/ATOMIC_GOES/julia/RHB/sonde/moisture_clouds.pdf ]</w:t>
-      </w:r>
-      <w:proofErr w:type="gramEnd"/>
+        <w:t>[ /home/deszoeks/Projects/ATOMIC/ATOMIC_GOES/julia/RHB/sonde/moisture_clouds.pdf ]</w:t>
+      </w:r>
     </w:p>
     <w:p>
       <w:pPr>
@@ -18307,39 +17778,7 @@
         <w:pStyle w:val="BodyText"/>
       </w:pPr>
       <w:r>
-        <w:t xml:space="preserve">[[For discussion on the compensation between cumulus and stratocumulus clouds: Myers and Norris (2014) show, all else being equal, subsidence reduces stratocumulus clouds. Cloud properties and within-regime </w:t>
-      </w:r>
-      <w:proofErr w:type="gramStart"/>
-      <w:r>
-        <w:t>feedbacks</w:t>
-      </w:r>
-      <w:proofErr w:type="gramEnd"/>
-      <w:r>
-        <w:t xml:space="preserve"> are similar between shallow cumulus and optically thicker stratocumulus clouds (</w:t>
-      </w:r>
-      <w:proofErr w:type="spellStart"/>
-      <w:r>
-        <w:t>Tselioudis</w:t>
-      </w:r>
-      <w:proofErr w:type="spellEnd"/>
-      <w:r>
-        <w:t xml:space="preserve"> et al., 2021; Zelinka et al. 2025), suggesting temperature-induced changes result in compensation between stratocumulus and shallow cumulus cloud types. Sherwood’s (2014) desiccation hypothesis describes a version of this </w:t>
-      </w:r>
-      <w:proofErr w:type="gramStart"/>
-      <w:r>
-        <w:t>competition,</w:t>
-      </w:r>
-      <w:proofErr w:type="gramEnd"/>
-      <w:r>
-        <w:t xml:space="preserve"> whereby shallow cumulus convection dries lower levels near cloud base that support stratocumulus clouds. Based on their similar behavior and </w:t>
-      </w:r>
-      <w:proofErr w:type="gramStart"/>
-      <w:r>
-        <w:t>feedbacks</w:t>
-      </w:r>
-      <w:proofErr w:type="gramEnd"/>
-      <w:r>
-        <w:t xml:space="preserve"> (Zelinka et al. 2025) we suggest considering the stratocumulus and shallow cumulus as a continuum. Regardless, here shallow cumulus clouds are nearly ubiquitous, to the exclusion of stratocumulus clouds, over the northern tropical Atlantic in January-February.]]</w:t>
+        <w:t>[[For discussion on the compensation between cumulus and stratocumulus clouds: Myers and Norris (2014) show, all else being equal, subsidence reduces stratocumulus clouds. Cloud properties and within-regime feedbacks are similar between shallow cumulus and optically thicker stratocumulus clouds (Tselioudis et al., 2021; Zelinka et al. 2025), suggesting temperature-induced changes result in compensation between stratocumulus and shallow cumulus cloud types. Sherwood’s (2014) desiccation hypothesis describes a version of this competition, whereby shallow cumulus convection dries lower levels near cloud base that support stratocumulus clouds. Based on their similar behavior and feedbacks (Zelinka et al. 2025) we suggest considering the stratocumulus and shallow cumulus as a continuum. Regardless, here shallow cumulus clouds are nearly ubiquitous, to the exclusion of stratocumulus clouds, over the northern tropical Atlantic in January-February.]]</w:t>
       </w:r>
     </w:p>
     <w:p>
@@ -18468,25 +17907,7 @@
           <w:kern w:val="0"/>
           <w14:ligatures w14:val="none"/>
         </w:rPr>
-        <w:t xml:space="preserve">Figure GOESISCCP. GOES-16 (a) cloud fraction by cloud type for 12.5-16 °N, 60-49 °W, 2020 Jan 15- February 28. (b) Shortwave cloud radiative effect (CRE) for each cloud top pressure and optical depth. The total cloud radiative effect for clouds below 680 </w:t>
-      </w:r>
-      <w:proofErr w:type="spellStart"/>
-      <w:r>
-        <w:rPr>
-          <w:rFonts w:ascii="Aptos Narrow" w:eastAsiaTheme="minorEastAsia" w:hAnsi="Aptos Narrow" w:cs="Times New Roman"/>
-          <w:kern w:val="0"/>
-          <w14:ligatures w14:val="none"/>
-        </w:rPr>
-        <w:t>hPa</w:t>
-      </w:r>
-      <w:proofErr w:type="spellEnd"/>
-      <w:r>
-        <w:rPr>
-          <w:rFonts w:ascii="Aptos Narrow" w:eastAsiaTheme="minorEastAsia" w:hAnsi="Aptos Narrow" w:cs="Times New Roman"/>
-          <w:kern w:val="0"/>
-          <w14:ligatures w14:val="none"/>
-        </w:rPr>
-        <w:t xml:space="preserve"> is 32 W m</w:t>
+        <w:t>Figure GOESISCCP. GOES-16 (a) cloud fraction by cloud type for 12.5-16 °N, 60-49 °W, 2020 Jan 15- February 28. (b) Shortwave cloud radiative effect (CRE) for each cloud top pressure and optical depth. The total cloud radiative effect for clouds below 680 hPa is 32 W m</w:t>
       </w:r>
       <w:r>
         <w:rPr>
@@ -19022,7 +18443,7 @@
 </file>
 
 <file path=word/numbering.xml><?xml version="1.0" encoding="utf-8"?>
-<w:numbering xmlns:wpc="http://schemas.microsoft.com/office/word/2010/wordprocessingCanvas" xmlns:cx="http://schemas.microsoft.com/office/drawing/2014/chartex" xmlns:cx1="http://schemas.microsoft.com/office/drawing/2015/9/8/chartex" xmlns:cx2="http://schemas.microsoft.com/office/drawing/2015/10/21/chartex" xmlns:cx3="http://schemas.microsoft.com/office/drawing/2016/5/9/chartex" xmlns:cx4="http://schemas.microsoft.com/office/drawing/2016/5/10/chartex" xmlns:cx5="http://schemas.microsoft.com/office/drawing/2016/5/11/chartex" xmlns:cx6="http://schemas.microsoft.com/office/drawing/2016/5/12/chartex" xmlns:cx7="http://schemas.microsoft.com/office/drawing/2016/5/13/chartex" xmlns:cx8="http://schemas.microsoft.com/office/drawing/2016/5/14/chartex" xmlns:mc="http://schemas.openxmlformats.org/markup-compatibility/2006" xmlns:aink="http://schemas.microsoft.com/office/drawing/2016/ink" xmlns:am3d="http://schemas.microsoft.com/office/drawing/2017/model3d" xmlns:o="urn:schemas-microsoft-com:office:office" xmlns:oel="http://schemas.microsoft.com/office/2019/extlst" xmlns:r="http://schemas.openxmlformats.org/officeDocument/2006/relationships" xmlns:m="http://schemas.openxmlformats.org/officeDocument/2006/math" xmlns:v="urn:schemas-microsoft-com:vml" xmlns:wp14="http://schemas.microsoft.com/office/word/2010/wordprocessingDrawing" xmlns:wp="http://schemas.openxmlformats.org/drawingml/2006/wordprocessingDrawing" xmlns:w10="urn:schemas-microsoft-com:office:word" xmlns:w="http://schemas.openxmlformats.org/wordprocessingml/2006/main" xmlns:w14="http://schemas.microsoft.com/office/word/2010/wordml" xmlns:w15="http://schemas.microsoft.com/office/word/2012/wordml" xmlns:w16cex="http://schemas.microsoft.com/office/word/2018/wordml/cex" xmlns:w16cid="http://schemas.microsoft.com/office/word/2016/wordml/cid" xmlns:w16="http://schemas.microsoft.com/office/word/2018/wordml" xmlns:w16du="http://schemas.microsoft.com/office/word/2023/wordml/word16du" xmlns:w16sdtdh="http://schemas.microsoft.com/office/word/2020/wordml/sdtdatahash" xmlns:w16sdtfl="http://schemas.microsoft.com/office/word/2024/wordml/sdtformatlock" xmlns:w16se="http://schemas.microsoft.com/office/word/2015/wordml/symex" xmlns:wpg="http://schemas.microsoft.com/office/word/2010/wordprocessingGroup" xmlns:wpi="http://schemas.microsoft.com/office/word/2010/wordprocessingInk" xmlns:wne="http://schemas.microsoft.com/office/word/2006/wordml" xmlns:wps="http://schemas.microsoft.com/office/word/2010/wordprocessingShape" mc:Ignorable="w14 w15 w16se w16cid w16 w16cex w16sdtdh w16sdtfl w16du wp14">
+<w:numbering xmlns:wpc="http://schemas.microsoft.com/office/word/2010/wordprocessingCanvas" xmlns:cx="http://schemas.microsoft.com/office/drawing/2014/chartex" xmlns:cx1="http://schemas.microsoft.com/office/drawing/2015/9/8/chartex" xmlns:cx2="http://schemas.microsoft.com/office/drawing/2015/10/21/chartex" xmlns:cx3="http://schemas.microsoft.com/office/drawing/2016/5/9/chartex" xmlns:cx4="http://schemas.microsoft.com/office/drawing/2016/5/10/chartex" xmlns:cx5="http://schemas.microsoft.com/office/drawing/2016/5/11/chartex" xmlns:cx6="http://schemas.microsoft.com/office/drawing/2016/5/12/chartex" xmlns:cx7="http://schemas.microsoft.com/office/drawing/2016/5/13/chartex" xmlns:cx8="http://schemas.microsoft.com/office/drawing/2016/5/14/chartex" xmlns:mc="http://schemas.openxmlformats.org/markup-compatibility/2006" xmlns:m="http://schemas.openxmlformats.org/officeDocument/2006/math" xmlns:aink="http://schemas.microsoft.com/office/drawing/2016/ink" xmlns:am3d="http://schemas.microsoft.com/office/drawing/2017/model3d" xmlns:oel="http://schemas.microsoft.com/office/2019/extlst" xmlns:r="http://schemas.openxmlformats.org/officeDocument/2006/relationships" xmlns:wp14="http://schemas.microsoft.com/office/word/2010/wordprocessingDrawing" xmlns:wp="http://schemas.openxmlformats.org/drawingml/2006/wordprocessingDrawing" xmlns:wpg="http://schemas.microsoft.com/office/word/2010/wordprocessingGroup" xmlns:wpi="http://schemas.microsoft.com/office/word/2010/wordprocessingInk" xmlns:wps="http://schemas.microsoft.com/office/word/2010/wordprocessingShape" xmlns:o="urn:schemas-microsoft-com:office:office" xmlns:v="urn:schemas-microsoft-com:vml" xmlns:w10="urn:schemas-microsoft-com:office:word" xmlns:w="http://schemas.openxmlformats.org/wordprocessingml/2006/main" xmlns:w14="http://schemas.microsoft.com/office/word/2010/wordml" xmlns:w15="http://schemas.microsoft.com/office/word/2012/wordml" xmlns:w16cex="http://schemas.microsoft.com/office/word/2018/wordml/cex" xmlns:w16cid="http://schemas.microsoft.com/office/word/2016/wordml/cid" xmlns:w16="http://schemas.microsoft.com/office/word/2018/wordml" xmlns:w16sdtdh="http://schemas.microsoft.com/office/word/2020/wordml/sdtdatahash" xmlns:w16sdtfl="http://schemas.microsoft.com/office/word/2024/wordml/sdtformatlock" xmlns:w16se="http://schemas.microsoft.com/office/word/2015/wordml/symex" xmlns:w16du="http://schemas.microsoft.com/office/word/2023/wordml/word16du" xmlns:wne="http://schemas.microsoft.com/office/word/2006/wordml" mc:Ignorable="w14 w15 w16se w16cid w16 w16cex w16sdtdh w16sdtfl w16du wp14">
   <w:abstractNum w:abstractNumId="0" w15:restartNumberingAfterBreak="0">
     <w:nsid w:val="018F7683"/>
     <w:multiLevelType w:val="hybridMultilevel"/>
@@ -19303,7 +18724,7 @@
 </file>
 
 <file path=word/styles.xml><?xml version="1.0" encoding="utf-8"?>
-<w:styles xmlns:mc="http://schemas.openxmlformats.org/markup-compatibility/2006" xmlns:r="http://schemas.openxmlformats.org/officeDocument/2006/relationships" xmlns:w="http://schemas.openxmlformats.org/wordprocessingml/2006/main" xmlns:w14="http://schemas.microsoft.com/office/word/2010/wordml" xmlns:w15="http://schemas.microsoft.com/office/word/2012/wordml" xmlns:w16cex="http://schemas.microsoft.com/office/word/2018/wordml/cex" xmlns:w16cid="http://schemas.microsoft.com/office/word/2016/wordml/cid" xmlns:w16="http://schemas.microsoft.com/office/word/2018/wordml" xmlns:w16du="http://schemas.microsoft.com/office/word/2023/wordml/word16du" xmlns:w16sdtdh="http://schemas.microsoft.com/office/word/2020/wordml/sdtdatahash" xmlns:w16sdtfl="http://schemas.microsoft.com/office/word/2024/wordml/sdtformatlock" xmlns:w16se="http://schemas.microsoft.com/office/word/2015/wordml/symex" mc:Ignorable="w14 w15 w16se w16cid w16 w16cex w16sdtdh w16sdtfl w16du">
+<w:styles xmlns:mc="http://schemas.openxmlformats.org/markup-compatibility/2006" xmlns:r="http://schemas.openxmlformats.org/officeDocument/2006/relationships" xmlns:w="http://schemas.openxmlformats.org/wordprocessingml/2006/main" xmlns:w14="http://schemas.microsoft.com/office/word/2010/wordml" xmlns:w15="http://schemas.microsoft.com/office/word/2012/wordml" xmlns:w16cex="http://schemas.microsoft.com/office/word/2018/wordml/cex" xmlns:w16cid="http://schemas.microsoft.com/office/word/2016/wordml/cid" xmlns:w16="http://schemas.microsoft.com/office/word/2018/wordml" xmlns:w16sdtdh="http://schemas.microsoft.com/office/word/2020/wordml/sdtdatahash" xmlns:w16sdtfl="http://schemas.microsoft.com/office/word/2024/wordml/sdtformatlock" xmlns:w16se="http://schemas.microsoft.com/office/word/2015/wordml/symex" xmlns:w16du="http://schemas.microsoft.com/office/word/2023/wordml/word16du" mc:Ignorable="w14 w15 w16se w16cid w16 w16cex w16sdtdh w16sdtfl w16du">
   <w:docDefaults>
     <w:rPrDefault>
       <w:rPr>

</xml_diff>

<commit_message>
upd table in ms.
</commit_message>
<xml_diff>
--- a/doc/DiM_ms20260511.docx
+++ b/doc/DiM_ms20260511.docx
@@ -179,19 +179,7 @@
         <w:rPr>
           <w:rFonts w:ascii="Aptos" w:hAnsi="Aptos"/>
         </w:rPr>
-        <w:t xml:space="preserve">, </w:t>
-      </w:r>
-      <w:r>
-        <w:rPr>
-          <w:rFonts w:ascii="Aptos" w:hAnsi="Aptos"/>
-        </w:rPr>
-        <w:t>rather than humidity</w:t>
-      </w:r>
-      <w:r>
-        <w:rPr>
-          <w:rFonts w:ascii="Aptos" w:hAnsi="Aptos"/>
-        </w:rPr>
-        <w:t>, mesoscale</w:t>
+        <w:t>, rather than humidity, mesoscale</w:t>
       </w:r>
       <w:r>
         <w:rPr>
@@ -552,6 +540,341 @@
         </w:rPr>
         <w:t>.</w:t>
       </w:r>
+    </w:p>
+    <w:p>
+      <w:pPr>
+        <w:pStyle w:val="BodyText"/>
+      </w:pPr>
+    </w:p>
+    <w:p>
+      <w:pPr>
+        <w:pStyle w:val="BodyText"/>
+      </w:pPr>
+      <w:r>
+        <w:t>Model results</w:t>
+      </w:r>
+    </w:p>
+    <w:p>
+      <w:pPr>
+        <w:pStyle w:val="BodyText"/>
+      </w:pPr>
+      <w:r>
+        <w:t>Table 1. C</w:t>
+      </w:r>
+      <w:r>
+        <w:t xml:space="preserve">loud </w:t>
+      </w:r>
+      <w:proofErr w:type="gramStart"/>
+      <w:r>
+        <w:t>fraction</w:t>
+      </w:r>
+      <w:proofErr w:type="gramEnd"/>
+      <w:r>
+        <w:t xml:space="preserve"> change </w:t>
+      </w:r>
+      <w:proofErr w:type="gramStart"/>
+      <w:r>
+        <w:t>relative</w:t>
+      </w:r>
+      <w:proofErr w:type="gramEnd"/>
+      <w:r>
+        <w:t xml:space="preserve"> to the control simulation (</w:t>
+      </w:r>
+      <w:r>
+        <w:t>%</w:t>
+      </w:r>
+      <w:r>
+        <w:t>).</w:t>
+      </w:r>
+    </w:p>
+    <w:tbl>
+      <w:tblPr>
+        <w:tblW w:w="0" w:type="auto"/>
+        <w:tblCellSpacing w:w="15" w:type="dxa"/>
+        <w:tblCellMar>
+          <w:top w:w="15" w:type="dxa"/>
+          <w:left w:w="15" w:type="dxa"/>
+          <w:bottom w:w="15" w:type="dxa"/>
+          <w:right w:w="15" w:type="dxa"/>
+        </w:tblCellMar>
+        <w:tblLook w:val="04A0" w:firstRow="1" w:lastRow="0" w:firstColumn="1" w:lastColumn="0" w:noHBand="0" w:noVBand="1"/>
+      </w:tblPr>
+      <w:tblGrid>
+        <w:gridCol w:w="3295"/>
+        <w:gridCol w:w="1035"/>
+      </w:tblGrid>
+      <w:tr>
+        <w:trPr>
+          <w:tblCellSpacing w:w="15" w:type="dxa"/>
+        </w:trPr>
+        <w:tc>
+          <w:tcPr>
+            <w:tcW w:w="3250" w:type="dxa"/>
+            <w:tcBorders>
+              <w:bottom w:val="single" w:sz="4" w:space="0" w:color="DCDFE5"/>
+            </w:tcBorders>
+            <w:hideMark/>
+          </w:tcPr>
+          <w:p>
+            <w:pPr>
+              <w:pStyle w:val="BodyText"/>
+              <w:spacing w:before="0" w:after="0"/>
+              <w:rPr>
+                <w:b/>
+                <w:bCs/>
+              </w:rPr>
+            </w:pPr>
+            <w:r>
+              <w:rPr>
+                <w:b/>
+                <w:bCs/>
+              </w:rPr>
+              <w:t>experiment</w:t>
+            </w:r>
+          </w:p>
+        </w:tc>
+        <w:tc>
+          <w:tcPr>
+            <w:tcW w:w="990" w:type="dxa"/>
+            <w:tcBorders>
+              <w:bottom w:val="single" w:sz="4" w:space="0" w:color="DCDFE5"/>
+            </w:tcBorders>
+            <w:hideMark/>
+          </w:tcPr>
+          <w:p>
+            <w:pPr>
+              <w:pStyle w:val="BodyText"/>
+              <w:spacing w:before="0" w:after="0"/>
+              <w:rPr>
+                <w:b/>
+                <w:bCs/>
+              </w:rPr>
+            </w:pPr>
+            <m:oMath>
+              <m:r>
+                <m:rPr>
+                  <m:sty m:val="bi"/>
+                </m:rPr>
+                <w:rPr>
+                  <w:rFonts w:ascii="Cambria Math" w:hAnsi="Cambria Math"/>
+                </w:rPr>
+                <m:t>d</m:t>
+              </m:r>
+              <m:r>
+                <m:rPr>
+                  <m:sty m:val="b"/>
+                </m:rPr>
+                <w:rPr>
+                  <w:rFonts w:ascii="Cambria Math" w:hAnsi="Cambria Math"/>
+                </w:rPr>
+                <m:t>ln</m:t>
+              </m:r>
+              <m:r>
+                <m:rPr>
+                  <m:sty m:val="bi"/>
+                </m:rPr>
+                <w:rPr>
+                  <w:rFonts w:ascii="Cambria Math" w:hAnsi="Cambria Math"/>
+                </w:rPr>
+                <m:t>a</m:t>
+              </m:r>
+            </m:oMath>
+            <w:r>
+              <w:rPr>
+                <w:b/>
+                <w:bCs/>
+              </w:rPr>
+              <w:t xml:space="preserve"> (%)</w:t>
+            </w:r>
+          </w:p>
+        </w:tc>
+      </w:tr>
+      <w:tr>
+        <w:trPr>
+          <w:tblCellSpacing w:w="15" w:type="dxa"/>
+        </w:trPr>
+        <w:tc>
+          <w:tcPr>
+            <w:tcW w:w="3250" w:type="dxa"/>
+            <w:hideMark/>
+          </w:tcPr>
+          <w:p>
+            <w:pPr>
+              <w:pStyle w:val="BodyText"/>
+              <w:spacing w:before="0" w:after="0"/>
+            </w:pPr>
+            <w:r>
+              <w:t>subsidence-5%</w:t>
+            </w:r>
+          </w:p>
+        </w:tc>
+        <w:tc>
+          <w:tcPr>
+            <w:tcW w:w="990" w:type="dxa"/>
+            <w:hideMark/>
+          </w:tcPr>
+          <w:p>
+            <w:pPr>
+              <w:pStyle w:val="BodyText"/>
+              <w:spacing w:before="0" w:after="0"/>
+            </w:pPr>
+            <w:r>
+              <w:t>-5.13</w:t>
+            </w:r>
+          </w:p>
+        </w:tc>
+      </w:tr>
+      <w:tr>
+        <w:trPr>
+          <w:tblCellSpacing w:w="15" w:type="dxa"/>
+        </w:trPr>
+        <w:tc>
+          <w:tcPr>
+            <w:tcW w:w="3250" w:type="dxa"/>
+            <w:hideMark/>
+          </w:tcPr>
+          <w:p>
+            <w:pPr>
+              <w:pStyle w:val="BodyText"/>
+              <w:spacing w:before="0" w:after="0"/>
+            </w:pPr>
+            <w:r>
+              <w:t>q&amp;qs+7%</w:t>
+            </w:r>
+          </w:p>
+        </w:tc>
+        <w:tc>
+          <w:tcPr>
+            <w:tcW w:w="990" w:type="dxa"/>
+            <w:hideMark/>
+          </w:tcPr>
+          <w:p>
+            <w:pPr>
+              <w:pStyle w:val="BodyText"/>
+              <w:spacing w:before="0" w:after="0"/>
+            </w:pPr>
+            <w:r>
+              <w:t>-7.86</w:t>
+            </w:r>
+          </w:p>
+        </w:tc>
+      </w:tr>
+      <w:tr>
+        <w:trPr>
+          <w:tblCellSpacing w:w="15" w:type="dxa"/>
+        </w:trPr>
+        <w:tc>
+          <w:tcPr>
+            <w:tcW w:w="3250" w:type="dxa"/>
+            <w:hideMark/>
+          </w:tcPr>
+          <w:p>
+            <w:pPr>
+              <w:pStyle w:val="BodyText"/>
+              <w:spacing w:before="0" w:after="0"/>
+            </w:pPr>
+            <w:r>
+              <w:t>Ecb+2%</w:t>
+            </w:r>
+          </w:p>
+        </w:tc>
+        <w:tc>
+          <w:tcPr>
+            <w:tcW w:w="990" w:type="dxa"/>
+            <w:hideMark/>
+          </w:tcPr>
+          <w:p>
+            <w:pPr>
+              <w:pStyle w:val="BodyText"/>
+              <w:spacing w:before="0" w:after="0"/>
+            </w:pPr>
+            <w:r>
+              <w:t>-7.86</w:t>
+            </w:r>
+          </w:p>
+        </w:tc>
+      </w:tr>
+      <w:tr>
+        <w:trPr>
+          <w:tblCellSpacing w:w="15" w:type="dxa"/>
+        </w:trPr>
+        <w:tc>
+          <w:tcPr>
+            <w:tcW w:w="3250" w:type="dxa"/>
+            <w:hideMark/>
+          </w:tcPr>
+          <w:p>
+            <w:pPr>
+              <w:pStyle w:val="BodyText"/>
+              <w:spacing w:before="0" w:after="0"/>
+            </w:pPr>
+            <w:r>
+              <w:t>lclRH+0.00875</w:t>
+            </w:r>
+          </w:p>
+        </w:tc>
+        <w:tc>
+          <w:tcPr>
+            <w:tcW w:w="990" w:type="dxa"/>
+            <w:hideMark/>
+          </w:tcPr>
+          <w:p>
+            <w:pPr>
+              <w:pStyle w:val="BodyText"/>
+              <w:spacing w:before="0" w:after="0"/>
+            </w:pPr>
+            <w:r>
+              <w:t>-5.14</w:t>
+            </w:r>
+          </w:p>
+        </w:tc>
+      </w:tr>
+      <w:tr>
+        <w:trPr>
+          <w:tblCellSpacing w:w="15" w:type="dxa"/>
+        </w:trPr>
+        <w:tc>
+          <w:tcPr>
+            <w:tcW w:w="3250" w:type="dxa"/>
+            <w:tcBorders>
+              <w:bottom w:val="nil"/>
+            </w:tcBorders>
+            <w:hideMark/>
+          </w:tcPr>
+          <w:p>
+            <w:pPr>
+              <w:pStyle w:val="BodyText"/>
+              <w:spacing w:before="0" w:after="0"/>
+            </w:pPr>
+            <w:r>
+              <w:t>lclRH+0.0175</w:t>
+            </w:r>
+          </w:p>
+        </w:tc>
+        <w:tc>
+          <w:tcPr>
+            <w:tcW w:w="990" w:type="dxa"/>
+            <w:tcBorders>
+              <w:bottom w:val="nil"/>
+            </w:tcBorders>
+            <w:hideMark/>
+          </w:tcPr>
+          <w:p>
+            <w:pPr>
+              <w:pStyle w:val="BodyText"/>
+              <w:spacing w:before="0" w:after="0"/>
+            </w:pPr>
+            <w:r>
+              <w:t>-2.27</w:t>
+            </w:r>
+          </w:p>
+        </w:tc>
+      </w:tr>
+    </w:tbl>
+    <w:p>
+      <w:pPr>
+        <w:pStyle w:val="BodyText"/>
+      </w:pPr>
     </w:p>
     <w:p>
       <w:pPr>
@@ -20145,7 +20468,6 @@
   <w:style w:type="character" w:default="1" w:styleId="DefaultParagraphFont">
     <w:name w:val="Default Paragraph Font"/>
     <w:uiPriority w:val="1"/>
-    <w:semiHidden/>
     <w:unhideWhenUsed/>
   </w:style>
   <w:style w:type="table" w:default="1" w:styleId="TableNormal">
@@ -20527,6 +20849,25 @@
       <w14:ligatures w14:val="none"/>
     </w:rPr>
   </w:style>
+  <w:style w:type="table" w:styleId="TableGrid">
+    <w:name w:val="Table Grid"/>
+    <w:basedOn w:val="TableNormal"/>
+    <w:uiPriority w:val="39"/>
+    <w:rsid w:val="0055084D"/>
+    <w:pPr>
+      <w:spacing w:after="0" w:line="240" w:lineRule="auto"/>
+    </w:pPr>
+    <w:tblPr>
+      <w:tblBorders>
+        <w:top w:val="single" w:sz="4" w:space="0" w:color="auto"/>
+        <w:left w:val="single" w:sz="4" w:space="0" w:color="auto"/>
+        <w:bottom w:val="single" w:sz="4" w:space="0" w:color="auto"/>
+        <w:right w:val="single" w:sz="4" w:space="0" w:color="auto"/>
+        <w:insideH w:val="single" w:sz="4" w:space="0" w:color="auto"/>
+        <w:insideV w:val="single" w:sz="4" w:space="0" w:color="auto"/>
+      </w:tblBorders>
+    </w:tblPr>
+  </w:style>
 </w:styles>
 </file>
 

</xml_diff>

<commit_message>
put subs and Ecb experients together
</commit_message>
<xml_diff>
--- a/doc/DiM_ms20260511.docx
+++ b/doc/DiM_ms20260511.docx
@@ -74,7 +74,7 @@
         <w:rPr>
           <w:rFonts w:ascii="Aptos" w:hAnsi="Aptos"/>
         </w:rPr>
-        <w:t xml:space="preserve">various </w:t>
+        <w:t xml:space="preserve">the spread in </w:t>
       </w:r>
       <w:r>
         <w:rPr>
@@ -155,7 +155,7 @@
         <w:rPr>
           <w:rFonts w:ascii="Aptos" w:hAnsi="Aptos"/>
         </w:rPr>
-        <w:t xml:space="preserve">reduce the shallow cumulus </w:t>
+        <w:t xml:space="preserve">reduce shallow cumulus </w:t>
       </w:r>
       <w:r>
         <w:rPr>
@@ -197,7 +197,13 @@
         <w:rPr>
           <w:rFonts w:ascii="Aptos" w:hAnsi="Aptos"/>
         </w:rPr>
-        <w:t>explain cloud</w:t>
+        <w:t>explain</w:t>
+      </w:r>
+      <w:r>
+        <w:rPr>
+          <w:rFonts w:ascii="Aptos" w:hAnsi="Aptos"/>
+        </w:rPr>
+        <w:t xml:space="preserve"> cloud</w:t>
       </w:r>
       <w:r>
         <w:rPr>
@@ -215,31 +221,19 @@
         <w:rPr>
           <w:rFonts w:ascii="Aptos" w:hAnsi="Aptos"/>
         </w:rPr>
-        <w:t>. M</w:t>
-      </w:r>
-      <w:r>
-        <w:rPr>
-          <w:rFonts w:ascii="Aptos" w:hAnsi="Aptos"/>
-        </w:rPr>
-        <w:t xml:space="preserve">odels </w:t>
-      </w:r>
-      <w:r>
-        <w:rPr>
-          <w:rFonts w:ascii="Aptos" w:hAnsi="Aptos"/>
-        </w:rPr>
-        <w:t xml:space="preserve">that </w:t>
-      </w:r>
-      <w:r>
-        <w:rPr>
-          <w:rFonts w:ascii="Aptos" w:hAnsi="Aptos"/>
-        </w:rPr>
-        <w:t>reproduc</w:t>
-      </w:r>
-      <w:r>
-        <w:rPr>
-          <w:rFonts w:ascii="Aptos" w:hAnsi="Aptos"/>
-        </w:rPr>
-        <w:t>e</w:t>
+        <w:t>.</w:t>
+      </w:r>
+      <w:r>
+        <w:rPr>
+          <w:rFonts w:ascii="Aptos" w:hAnsi="Aptos"/>
+        </w:rPr>
+        <w:t xml:space="preserve"> Here, we extend that result to climate change</w:t>
+      </w:r>
+      <w:r>
+        <w:rPr>
+          <w:rFonts w:ascii="Aptos" w:hAnsi="Aptos"/>
+        </w:rPr>
+        <w:t>. A</w:t>
       </w:r>
       <w:r>
         <w:rPr>
@@ -251,31 +245,7 @@
         <w:rPr>
           <w:rFonts w:ascii="Aptos" w:hAnsi="Aptos"/>
         </w:rPr>
-        <w:t xml:space="preserve">this mesoscale </w:t>
-      </w:r>
-      <w:r>
-        <w:rPr>
-          <w:rFonts w:ascii="Aptos" w:hAnsi="Aptos"/>
-        </w:rPr>
-        <w:t xml:space="preserve">correlation have weaker </w:t>
-      </w:r>
-      <w:r>
-        <w:rPr>
-          <w:rFonts w:ascii="Aptos" w:hAnsi="Aptos"/>
-        </w:rPr>
-        <w:t xml:space="preserve">climate sensitivity. </w:t>
-      </w:r>
-      <w:r>
-        <w:rPr>
-          <w:rFonts w:ascii="Aptos" w:hAnsi="Aptos"/>
-        </w:rPr>
-        <w:t>Here</w:t>
-      </w:r>
-      <w:r>
-        <w:rPr>
-          <w:rFonts w:ascii="Aptos" w:hAnsi="Aptos"/>
-        </w:rPr>
-        <w:t xml:space="preserve"> we predict a decrease of shallow cumulus cloud fraction using a heuristic </w:t>
+        <w:t xml:space="preserve">moisture balance </w:t>
       </w:r>
       <w:r>
         <w:rPr>
@@ -287,19 +257,92 @@
         <w:rPr>
           <w:rFonts w:ascii="Aptos" w:hAnsi="Aptos"/>
         </w:rPr>
-        <w:t>of</w:t>
-      </w:r>
-      <w:r>
-        <w:rPr>
-          <w:rFonts w:ascii="Aptos" w:hAnsi="Aptos"/>
-        </w:rPr>
-        <w:t xml:space="preserve"> clouds </w:t>
-      </w:r>
-      <w:r>
-        <w:rPr>
-          <w:rFonts w:ascii="Aptos" w:hAnsi="Aptos"/>
-        </w:rPr>
-        <w:t>whose</w:t>
+        <w:t>of the lower troposphere</w:t>
+      </w:r>
+      <w:r>
+        <w:rPr>
+          <w:rFonts w:ascii="Aptos" w:hAnsi="Aptos"/>
+        </w:rPr>
+        <w:t xml:space="preserve"> </w:t>
+      </w:r>
+      <w:r>
+        <w:rPr>
+          <w:rFonts w:ascii="Aptos" w:hAnsi="Aptos"/>
+        </w:rPr>
+        <w:t>predict</w:t>
+      </w:r>
+      <w:r>
+        <w:rPr>
+          <w:rFonts w:ascii="Aptos" w:hAnsi="Aptos"/>
+        </w:rPr>
+        <w:t>s</w:t>
+      </w:r>
+      <w:r>
+        <w:rPr>
+          <w:rFonts w:ascii="Aptos" w:hAnsi="Aptos"/>
+        </w:rPr>
+        <w:t xml:space="preserve"> a </w:t>
+      </w:r>
+      <w:r>
+        <w:rPr>
+          <w:rFonts w:ascii="Aptos" w:hAnsi="Aptos"/>
+        </w:rPr>
+        <w:t>5-7% K</w:t>
+      </w:r>
+      <w:r>
+        <w:rPr>
+          <w:rFonts w:ascii="Aptos" w:hAnsi="Aptos"/>
+          <w:vertAlign w:val="superscript"/>
+        </w:rPr>
+        <w:t>-1</w:t>
+      </w:r>
+      <w:r>
+        <w:rPr>
+          <w:rFonts w:ascii="Aptos" w:hAnsi="Aptos"/>
+        </w:rPr>
+        <w:t xml:space="preserve"> </w:t>
+      </w:r>
+      <w:r>
+        <w:rPr>
+          <w:rFonts w:ascii="Aptos" w:hAnsi="Aptos"/>
+        </w:rPr>
+        <w:t xml:space="preserve">decrease of shallow cumulus </w:t>
+      </w:r>
+      <w:r>
+        <w:rPr>
+          <w:rFonts w:ascii="Aptos" w:hAnsi="Aptos"/>
+        </w:rPr>
+        <w:t xml:space="preserve">mass flux and thus </w:t>
+      </w:r>
+      <w:r>
+        <w:rPr>
+          <w:rFonts w:ascii="Aptos" w:hAnsi="Aptos"/>
+        </w:rPr>
+        <w:t>cloud fraction</w:t>
+      </w:r>
+      <w:r>
+        <w:rPr>
+          <w:rFonts w:ascii="Aptos" w:hAnsi="Aptos"/>
+        </w:rPr>
+        <w:t>.</w:t>
+      </w:r>
+      <w:r>
+        <w:rPr>
+          <w:rFonts w:ascii="Aptos" w:hAnsi="Aptos"/>
+        </w:rPr>
+        <w:t xml:space="preserve"> The r</w:t>
+      </w:r>
+      <w:r>
+        <w:rPr>
+          <w:rFonts w:ascii="Aptos" w:hAnsi="Aptos"/>
+        </w:rPr>
+        <w:t xml:space="preserve">educed </w:t>
+      </w:r>
+      <w:r>
+        <w:rPr>
+          <w:rFonts w:ascii="Aptos" w:hAnsi="Aptos"/>
+        </w:rPr>
+        <w:t>cloud</w:t>
       </w:r>
       <w:r>
         <w:rPr>
@@ -317,13 +360,13 @@
         <w:rPr>
           <w:rFonts w:ascii="Aptos" w:hAnsi="Aptos"/>
         </w:rPr>
-        <w:t>the</w:t>
-      </w:r>
-      <w:r>
-        <w:rPr>
-          <w:rFonts w:ascii="Aptos" w:hAnsi="Aptos"/>
-        </w:rPr>
-        <w:t xml:space="preserve"> drying by </w:t>
+        <w:t xml:space="preserve">reduced </w:t>
+      </w:r>
+      <w:r>
+        <w:rPr>
+          <w:rFonts w:ascii="Aptos" w:hAnsi="Aptos"/>
+        </w:rPr>
+        <w:t xml:space="preserve">drying by </w:t>
       </w:r>
       <w:r>
         <w:rPr>
@@ -353,81 +396,31 @@
         <w:rPr>
           <w:rFonts w:ascii="Aptos" w:hAnsi="Aptos"/>
         </w:rPr>
-        <w:t xml:space="preserve">. </w:t>
-      </w:r>
-      <w:r>
-        <w:rPr>
-          <w:rFonts w:ascii="Aptos" w:hAnsi="Aptos"/>
-        </w:rPr>
-        <w:t>Th</w:t>
-      </w:r>
-      <w:r>
-        <w:rPr>
-          <w:rFonts w:ascii="Aptos" w:hAnsi="Aptos"/>
-        </w:rPr>
-        <w:t xml:space="preserve">e </w:t>
-      </w:r>
-      <w:r>
-        <w:rPr>
-          <w:rFonts w:ascii="Aptos" w:hAnsi="Aptos"/>
-        </w:rPr>
-        <w:t xml:space="preserve">moisture balance predicts clouds decrease </w:t>
-      </w:r>
-      <w:r>
-        <w:rPr>
-          <w:rFonts w:ascii="Aptos" w:hAnsi="Aptos"/>
-        </w:rPr>
-        <w:t xml:space="preserve">with warming in </w:t>
-      </w:r>
-      <w:r>
-        <w:rPr>
-          <w:rFonts w:ascii="Aptos" w:hAnsi="Aptos"/>
-        </w:rPr>
-        <w:t>proportion</w:t>
-      </w:r>
-      <w:r>
-        <w:rPr>
-          <w:rFonts w:ascii="Aptos" w:hAnsi="Aptos"/>
-        </w:rPr>
-        <w:t xml:space="preserve"> to</w:t>
-      </w:r>
-      <w:r>
-        <w:rPr>
-          <w:rFonts w:ascii="Aptos" w:hAnsi="Aptos"/>
-        </w:rPr>
-        <w:t xml:space="preserve"> the </w:t>
-      </w:r>
-      <w:proofErr w:type="gramStart"/>
-      <w:r>
-        <w:rPr>
-          <w:rFonts w:ascii="Aptos" w:hAnsi="Aptos"/>
-        </w:rPr>
-        <w:t>large scale</w:t>
-      </w:r>
-      <w:proofErr w:type="gramEnd"/>
-      <w:r>
-        <w:rPr>
-          <w:rFonts w:ascii="Aptos" w:hAnsi="Aptos"/>
-        </w:rPr>
-        <w:t xml:space="preserve"> circulation</w:t>
-      </w:r>
-      <w:r>
-        <w:rPr>
-          <w:rFonts w:ascii="Aptos" w:hAnsi="Aptos"/>
-        </w:rPr>
-        <w:t xml:space="preserve">, which in turn decreases </w:t>
-      </w:r>
-      <w:r>
-        <w:rPr>
-          <w:rFonts w:ascii="Aptos" w:hAnsi="Aptos"/>
-        </w:rPr>
-        <w:t>–</w:t>
-      </w:r>
-      <w:r>
-        <w:rPr>
-          <w:rFonts w:ascii="Aptos" w:hAnsi="Aptos"/>
-        </w:rPr>
-        <w:t>5 % K</w:t>
+        <w:t>,</w:t>
+      </w:r>
+      <w:r>
+        <w:rPr>
+          <w:rFonts w:ascii="Aptos" w:hAnsi="Aptos"/>
+        </w:rPr>
+        <w:t xml:space="preserve"> which </w:t>
+      </w:r>
+      <w:r>
+        <w:rPr>
+          <w:rFonts w:ascii="Aptos" w:hAnsi="Aptos"/>
+        </w:rPr>
+        <w:t xml:space="preserve">has been shown to </w:t>
+      </w:r>
+      <w:r>
+        <w:rPr>
+          <w:rFonts w:ascii="Aptos" w:hAnsi="Aptos"/>
+        </w:rPr>
+        <w:t xml:space="preserve">decrease </w:t>
+      </w:r>
+      <w:r>
+        <w:rPr>
+          <w:rFonts w:ascii="Aptos" w:hAnsi="Aptos"/>
+        </w:rPr>
+        <w:t>–5 % K</w:t>
       </w:r>
       <w:r>
         <w:rPr>
@@ -439,6 +432,7 @@
       <w:r>
         <w:rPr>
           <w:rFonts w:ascii="Aptos" w:hAnsi="Aptos"/>
+          <w:vertAlign w:val="superscript"/>
         </w:rPr>
         <w:t xml:space="preserve"> </w:t>
       </w:r>
@@ -446,61 +440,31 @@
         <w:rPr>
           <w:rFonts w:ascii="Aptos" w:hAnsi="Aptos"/>
         </w:rPr>
-        <w:t xml:space="preserve">surface temperature </w:t>
-      </w:r>
-      <w:r>
-        <w:rPr>
-          <w:rFonts w:ascii="Aptos" w:hAnsi="Aptos"/>
-        </w:rPr>
         <w:t>by energetics</w:t>
       </w:r>
       <w:r>
         <w:rPr>
           <w:rFonts w:ascii="Aptos" w:hAnsi="Aptos"/>
         </w:rPr>
-        <w:t xml:space="preserve">. </w:t>
-      </w:r>
-      <w:r>
-        <w:rPr>
-          <w:rFonts w:ascii="Aptos" w:hAnsi="Aptos"/>
-        </w:rPr>
-        <w:t xml:space="preserve">Tuned to </w:t>
-      </w:r>
-      <w:r>
-        <w:rPr>
-          <w:rFonts w:ascii="Aptos" w:hAnsi="Aptos"/>
-        </w:rPr>
-        <w:t xml:space="preserve">the </w:t>
-      </w:r>
-      <w:r>
-        <w:rPr>
-          <w:rFonts w:ascii="Aptos" w:hAnsi="Aptos"/>
-        </w:rPr>
-        <w:t xml:space="preserve">observed </w:t>
-      </w:r>
-      <w:r>
-        <w:rPr>
-          <w:rFonts w:ascii="Aptos" w:hAnsi="Aptos"/>
-        </w:rPr>
-        <w:t xml:space="preserve">moisture budget and </w:t>
-      </w:r>
-      <w:r>
-        <w:rPr>
-          <w:rFonts w:ascii="Aptos" w:hAnsi="Aptos"/>
-        </w:rPr>
-        <w:t xml:space="preserve">cloud top height distribution, the cloud model independently </w:t>
-      </w:r>
-      <w:r>
-        <w:rPr>
-          <w:rFonts w:ascii="Aptos" w:hAnsi="Aptos"/>
-        </w:rPr>
-        <w:t>reproduces the mesoscale correlation of cloud fraction to cloud base mass flux found over the northeastern tropical Atlantic Ocean in EUREC4A.</w:t>
-      </w:r>
-      <w:r>
-        <w:rPr>
-          <w:rFonts w:ascii="Aptos" w:hAnsi="Aptos"/>
-        </w:rPr>
-        <w:t xml:space="preserve"> The –5 % K</w:t>
+        <w:t>.</w:t>
+      </w:r>
+      <w:r>
+        <w:rPr>
+          <w:rFonts w:ascii="Aptos" w:hAnsi="Aptos"/>
+        </w:rPr>
+        <w:t xml:space="preserve"> </w:t>
+      </w:r>
+      <w:r>
+        <w:rPr>
+          <w:rFonts w:ascii="Aptos" w:hAnsi="Aptos"/>
+        </w:rPr>
+        <w:t xml:space="preserve">A </w:t>
+      </w:r>
+      <w:r>
+        <w:rPr>
+          <w:rFonts w:ascii="Aptos" w:hAnsi="Aptos"/>
+        </w:rPr>
+        <w:t>–5 % K</w:t>
       </w:r>
       <w:r>
         <w:rPr>
@@ -513,7 +477,31 @@
         <w:rPr>
           <w:rFonts w:ascii="Aptos" w:hAnsi="Aptos"/>
         </w:rPr>
-        <w:t xml:space="preserve"> reduction of cloud fraction decreases </w:t>
+        <w:t xml:space="preserve"> reduction of </w:t>
+      </w:r>
+      <w:r>
+        <w:rPr>
+          <w:rFonts w:ascii="Aptos" w:hAnsi="Aptos"/>
+        </w:rPr>
+        <w:t>shallow cum</w:t>
+      </w:r>
+      <w:r>
+        <w:rPr>
+          <w:rFonts w:ascii="Aptos" w:hAnsi="Aptos"/>
+        </w:rPr>
+        <w:t>u</w:t>
+      </w:r>
+      <w:r>
+        <w:rPr>
+          <w:rFonts w:ascii="Aptos" w:hAnsi="Aptos"/>
+        </w:rPr>
+        <w:t xml:space="preserve">lus </w:t>
+      </w:r>
+      <w:r>
+        <w:rPr>
+          <w:rFonts w:ascii="Aptos" w:hAnsi="Aptos"/>
+        </w:rPr>
+        <w:t xml:space="preserve">cloud fraction decreases </w:t>
       </w:r>
       <w:r>
         <w:rPr>
@@ -545,827 +533,6 @@
       <w:pPr>
         <w:pStyle w:val="BodyText"/>
       </w:pPr>
-    </w:p>
-    <w:p>
-      <w:pPr>
-        <w:pStyle w:val="BodyText"/>
-      </w:pPr>
-      <w:r>
-        <w:t>Model results</w:t>
-      </w:r>
-    </w:p>
-    <w:p>
-      <w:pPr>
-        <w:pStyle w:val="BodyText"/>
-      </w:pPr>
-      <w:r>
-        <w:t>Table 1. C</w:t>
-      </w:r>
-      <w:r>
-        <w:t xml:space="preserve">loud </w:t>
-      </w:r>
-      <w:proofErr w:type="gramStart"/>
-      <w:r>
-        <w:t>fraction</w:t>
-      </w:r>
-      <w:proofErr w:type="gramEnd"/>
-      <w:r>
-        <w:t xml:space="preserve"> change </w:t>
-      </w:r>
-      <w:proofErr w:type="gramStart"/>
-      <w:r>
-        <w:t>relative</w:t>
-      </w:r>
-      <w:proofErr w:type="gramEnd"/>
-      <w:r>
-        <w:t xml:space="preserve"> to the control simulation (</w:t>
-      </w:r>
-      <w:r>
-        <w:t>%</w:t>
-      </w:r>
-      <w:r>
-        <w:t>).</w:t>
-      </w:r>
-    </w:p>
-    <w:tbl>
-      <w:tblPr>
-        <w:tblW w:w="0" w:type="auto"/>
-        <w:tblCellSpacing w:w="15" w:type="dxa"/>
-        <w:tblCellMar>
-          <w:top w:w="15" w:type="dxa"/>
-          <w:left w:w="15" w:type="dxa"/>
-          <w:bottom w:w="15" w:type="dxa"/>
-          <w:right w:w="15" w:type="dxa"/>
-        </w:tblCellMar>
-        <w:tblLook w:val="04A0" w:firstRow="1" w:lastRow="0" w:firstColumn="1" w:lastColumn="0" w:noHBand="0" w:noVBand="1"/>
-      </w:tblPr>
-      <w:tblGrid>
-        <w:gridCol w:w="3295"/>
-        <w:gridCol w:w="1035"/>
-      </w:tblGrid>
-      <w:tr>
-        <w:trPr>
-          <w:tblCellSpacing w:w="15" w:type="dxa"/>
-        </w:trPr>
-        <w:tc>
-          <w:tcPr>
-            <w:tcW w:w="3250" w:type="dxa"/>
-            <w:tcBorders>
-              <w:bottom w:val="single" w:sz="4" w:space="0" w:color="DCDFE5"/>
-            </w:tcBorders>
-            <w:hideMark/>
-          </w:tcPr>
-          <w:p>
-            <w:pPr>
-              <w:pStyle w:val="BodyText"/>
-              <w:spacing w:before="0" w:after="0"/>
-              <w:rPr>
-                <w:b/>
-                <w:bCs/>
-              </w:rPr>
-            </w:pPr>
-            <w:r>
-              <w:rPr>
-                <w:b/>
-                <w:bCs/>
-              </w:rPr>
-              <w:t>experiment</w:t>
-            </w:r>
-          </w:p>
-        </w:tc>
-        <w:tc>
-          <w:tcPr>
-            <w:tcW w:w="990" w:type="dxa"/>
-            <w:tcBorders>
-              <w:bottom w:val="single" w:sz="4" w:space="0" w:color="DCDFE5"/>
-            </w:tcBorders>
-            <w:hideMark/>
-          </w:tcPr>
-          <w:p>
-            <w:pPr>
-              <w:pStyle w:val="BodyText"/>
-              <w:spacing w:before="0" w:after="0"/>
-              <w:rPr>
-                <w:b/>
-                <w:bCs/>
-              </w:rPr>
-            </w:pPr>
-            <m:oMath>
-              <m:r>
-                <m:rPr>
-                  <m:sty m:val="bi"/>
-                </m:rPr>
-                <w:rPr>
-                  <w:rFonts w:ascii="Cambria Math" w:hAnsi="Cambria Math"/>
-                </w:rPr>
-                <m:t>d</m:t>
-              </m:r>
-              <m:r>
-                <m:rPr>
-                  <m:sty m:val="b"/>
-                </m:rPr>
-                <w:rPr>
-                  <w:rFonts w:ascii="Cambria Math" w:hAnsi="Cambria Math"/>
-                </w:rPr>
-                <m:t>ln</m:t>
-              </m:r>
-              <m:r>
-                <m:rPr>
-                  <m:sty m:val="bi"/>
-                </m:rPr>
-                <w:rPr>
-                  <w:rFonts w:ascii="Cambria Math" w:hAnsi="Cambria Math"/>
-                </w:rPr>
-                <m:t>a</m:t>
-              </m:r>
-            </m:oMath>
-            <w:r>
-              <w:rPr>
-                <w:b/>
-                <w:bCs/>
-              </w:rPr>
-              <w:t xml:space="preserve"> (%)</w:t>
-            </w:r>
-          </w:p>
-        </w:tc>
-      </w:tr>
-      <w:tr>
-        <w:trPr>
-          <w:tblCellSpacing w:w="15" w:type="dxa"/>
-        </w:trPr>
-        <w:tc>
-          <w:tcPr>
-            <w:tcW w:w="3250" w:type="dxa"/>
-            <w:hideMark/>
-          </w:tcPr>
-          <w:p>
-            <w:pPr>
-              <w:pStyle w:val="BodyText"/>
-              <w:spacing w:before="0" w:after="0"/>
-            </w:pPr>
-            <w:r>
-              <w:t>subsidence-5%</w:t>
-            </w:r>
-          </w:p>
-        </w:tc>
-        <w:tc>
-          <w:tcPr>
-            <w:tcW w:w="990" w:type="dxa"/>
-            <w:hideMark/>
-          </w:tcPr>
-          <w:p>
-            <w:pPr>
-              <w:pStyle w:val="BodyText"/>
-              <w:spacing w:before="0" w:after="0"/>
-            </w:pPr>
-            <w:r>
-              <w:t>-5.13</w:t>
-            </w:r>
-          </w:p>
-        </w:tc>
-      </w:tr>
-      <w:tr>
-        <w:trPr>
-          <w:tblCellSpacing w:w="15" w:type="dxa"/>
-        </w:trPr>
-        <w:tc>
-          <w:tcPr>
-            <w:tcW w:w="3250" w:type="dxa"/>
-            <w:hideMark/>
-          </w:tcPr>
-          <w:p>
-            <w:pPr>
-              <w:pStyle w:val="BodyText"/>
-              <w:spacing w:before="0" w:after="0"/>
-            </w:pPr>
-            <w:r>
-              <w:t>q&amp;qs+7%</w:t>
-            </w:r>
-          </w:p>
-        </w:tc>
-        <w:tc>
-          <w:tcPr>
-            <w:tcW w:w="990" w:type="dxa"/>
-            <w:hideMark/>
-          </w:tcPr>
-          <w:p>
-            <w:pPr>
-              <w:pStyle w:val="BodyText"/>
-              <w:spacing w:before="0" w:after="0"/>
-            </w:pPr>
-            <w:r>
-              <w:t>-7.86</w:t>
-            </w:r>
-          </w:p>
-        </w:tc>
-      </w:tr>
-      <w:tr>
-        <w:trPr>
-          <w:tblCellSpacing w:w="15" w:type="dxa"/>
-        </w:trPr>
-        <w:tc>
-          <w:tcPr>
-            <w:tcW w:w="3250" w:type="dxa"/>
-            <w:hideMark/>
-          </w:tcPr>
-          <w:p>
-            <w:pPr>
-              <w:pStyle w:val="BodyText"/>
-              <w:spacing w:before="0" w:after="0"/>
-            </w:pPr>
-            <w:r>
-              <w:t>Ecb+2%</w:t>
-            </w:r>
-          </w:p>
-        </w:tc>
-        <w:tc>
-          <w:tcPr>
-            <w:tcW w:w="990" w:type="dxa"/>
-            <w:hideMark/>
-          </w:tcPr>
-          <w:p>
-            <w:pPr>
-              <w:pStyle w:val="BodyText"/>
-              <w:spacing w:before="0" w:after="0"/>
-            </w:pPr>
-            <w:r>
-              <w:t>-7.86</w:t>
-            </w:r>
-          </w:p>
-        </w:tc>
-      </w:tr>
-      <w:tr>
-        <w:trPr>
-          <w:tblCellSpacing w:w="15" w:type="dxa"/>
-        </w:trPr>
-        <w:tc>
-          <w:tcPr>
-            <w:tcW w:w="3250" w:type="dxa"/>
-            <w:hideMark/>
-          </w:tcPr>
-          <w:p>
-            <w:pPr>
-              <w:pStyle w:val="BodyText"/>
-              <w:spacing w:before="0" w:after="0"/>
-            </w:pPr>
-            <w:r>
-              <w:t>lclRH+0.00875</w:t>
-            </w:r>
-          </w:p>
-        </w:tc>
-        <w:tc>
-          <w:tcPr>
-            <w:tcW w:w="990" w:type="dxa"/>
-            <w:hideMark/>
-          </w:tcPr>
-          <w:p>
-            <w:pPr>
-              <w:pStyle w:val="BodyText"/>
-              <w:spacing w:before="0" w:after="0"/>
-            </w:pPr>
-            <w:r>
-              <w:t>-5.14</w:t>
-            </w:r>
-          </w:p>
-        </w:tc>
-      </w:tr>
-      <w:tr>
-        <w:trPr>
-          <w:tblCellSpacing w:w="15" w:type="dxa"/>
-        </w:trPr>
-        <w:tc>
-          <w:tcPr>
-            <w:tcW w:w="3250" w:type="dxa"/>
-            <w:tcBorders>
-              <w:bottom w:val="nil"/>
-            </w:tcBorders>
-            <w:hideMark/>
-          </w:tcPr>
-          <w:p>
-            <w:pPr>
-              <w:pStyle w:val="BodyText"/>
-              <w:spacing w:before="0" w:after="0"/>
-            </w:pPr>
-            <w:r>
-              <w:t>lclRH+0.0175</w:t>
-            </w:r>
-          </w:p>
-        </w:tc>
-        <w:tc>
-          <w:tcPr>
-            <w:tcW w:w="990" w:type="dxa"/>
-            <w:tcBorders>
-              <w:bottom w:val="nil"/>
-            </w:tcBorders>
-            <w:hideMark/>
-          </w:tcPr>
-          <w:p>
-            <w:pPr>
-              <w:pStyle w:val="BodyText"/>
-              <w:spacing w:before="0" w:after="0"/>
-            </w:pPr>
-            <w:r>
-              <w:t>-2.27</w:t>
-            </w:r>
-          </w:p>
-        </w:tc>
-      </w:tr>
-    </w:tbl>
-    <w:p>
-      <w:pPr>
-        <w:pStyle w:val="BodyText"/>
-      </w:pPr>
-    </w:p>
-    <w:p>
-      <w:pPr>
-        <w:pStyle w:val="Heading1"/>
-      </w:pPr>
-      <w:r>
-        <w:lastRenderedPageBreak/>
-        <w:t>Abstract - alternate ideas</w:t>
-      </w:r>
-    </w:p>
-    <w:p>
-      <w:pPr>
-        <w:pStyle w:val="Heading2"/>
-        <w:rPr>
-          <w:rFonts w:ascii="Aptos" w:eastAsiaTheme="minorHAnsi" w:hAnsi="Aptos" w:cstheme="minorBidi"/>
-          <w:color w:val="EE0000"/>
-          <w:kern w:val="0"/>
-          <w:sz w:val="24"/>
-          <w:szCs w:val="24"/>
-          <w14:ligatures w14:val="none"/>
-        </w:rPr>
-      </w:pPr>
-      <w:r>
-        <w:rPr>
-          <w:rFonts w:ascii="Aptos" w:eastAsiaTheme="minorHAnsi" w:hAnsi="Aptos" w:cstheme="minorBidi"/>
-          <w:color w:val="auto"/>
-          <w:kern w:val="0"/>
-          <w:sz w:val="24"/>
-          <w:szCs w:val="24"/>
-          <w14:ligatures w14:val="none"/>
-        </w:rPr>
-        <w:t xml:space="preserve">Sensitivity of climate models to </w:t>
-      </w:r>
-      <w:r>
-        <w:rPr>
-          <w:rFonts w:ascii="Aptos" w:eastAsiaTheme="minorHAnsi" w:hAnsi="Aptos" w:cstheme="minorBidi"/>
-          <w:color w:val="auto"/>
-          <w:kern w:val="0"/>
-          <w:sz w:val="24"/>
-          <w:szCs w:val="24"/>
-          <w14:ligatures w14:val="none"/>
-        </w:rPr>
-        <w:t xml:space="preserve">atmospheric </w:t>
-      </w:r>
-      <w:r>
-        <w:rPr>
-          <w:rFonts w:ascii="Aptos" w:eastAsiaTheme="minorHAnsi" w:hAnsi="Aptos" w:cstheme="minorBidi"/>
-          <w:color w:val="auto"/>
-          <w:kern w:val="0"/>
-          <w:sz w:val="24"/>
-          <w:szCs w:val="24"/>
-          <w14:ligatures w14:val="none"/>
-        </w:rPr>
-        <w:t xml:space="preserve">CO2 has been explained by </w:t>
-      </w:r>
-      <w:proofErr w:type="gramStart"/>
-      <w:r>
-        <w:rPr>
-          <w:rFonts w:ascii="Aptos" w:eastAsiaTheme="minorHAnsi" w:hAnsi="Aptos" w:cstheme="minorBidi"/>
-          <w:color w:val="auto"/>
-          <w:kern w:val="0"/>
-          <w:sz w:val="24"/>
-          <w:szCs w:val="24"/>
-          <w14:ligatures w14:val="none"/>
-        </w:rPr>
-        <w:t>shallow cumulus</w:t>
-      </w:r>
-      <w:proofErr w:type="gramEnd"/>
-      <w:r>
-        <w:rPr>
-          <w:rFonts w:ascii="Aptos" w:eastAsiaTheme="minorHAnsi" w:hAnsi="Aptos" w:cstheme="minorBidi"/>
-          <w:color w:val="auto"/>
-          <w:kern w:val="0"/>
-          <w:sz w:val="24"/>
-          <w:szCs w:val="24"/>
-          <w14:ligatures w14:val="none"/>
-        </w:rPr>
-        <w:t xml:space="preserve"> cloud feedback. It has been proposed that increased vertical mixing reduces cloud fraction by </w:t>
-      </w:r>
-      <w:r>
-        <w:rPr>
-          <w:rFonts w:ascii="Aptos" w:eastAsiaTheme="minorHAnsi" w:hAnsi="Aptos" w:cstheme="minorBidi"/>
-          <w:color w:val="auto"/>
-          <w:kern w:val="0"/>
-          <w:sz w:val="24"/>
-          <w:szCs w:val="24"/>
-          <w14:ligatures w14:val="none"/>
-        </w:rPr>
-        <w:t>drying</w:t>
-      </w:r>
-      <w:r>
-        <w:rPr>
-          <w:rFonts w:ascii="Aptos" w:eastAsiaTheme="minorHAnsi" w:hAnsi="Aptos" w:cstheme="minorBidi"/>
-          <w:color w:val="auto"/>
-          <w:kern w:val="0"/>
-          <w:sz w:val="24"/>
-          <w:szCs w:val="24"/>
-          <w14:ligatures w14:val="none"/>
-        </w:rPr>
-        <w:t xml:space="preserve"> the shallow cumulus layer, yet </w:t>
-      </w:r>
-      <w:r>
-        <w:rPr>
-          <w:rFonts w:ascii="Aptos" w:eastAsiaTheme="minorHAnsi" w:hAnsi="Aptos" w:cstheme="minorBidi"/>
-          <w:color w:val="auto"/>
-          <w:kern w:val="0"/>
-          <w:sz w:val="24"/>
-          <w:szCs w:val="24"/>
-          <w14:ligatures w14:val="none"/>
-        </w:rPr>
-        <w:t xml:space="preserve">observations show cloud fraction is related to cloud base mass flux rather than humidity, </w:t>
-      </w:r>
-      <w:r>
-        <w:rPr>
-          <w:rFonts w:ascii="Aptos" w:eastAsiaTheme="minorHAnsi" w:hAnsi="Aptos" w:cstheme="minorBidi"/>
-          <w:color w:val="auto"/>
-          <w:kern w:val="0"/>
-          <w:sz w:val="24"/>
-          <w:szCs w:val="24"/>
-          <w14:ligatures w14:val="none"/>
-        </w:rPr>
-        <w:t xml:space="preserve">suggesting clouds are relatively insensitive </w:t>
-      </w:r>
-      <w:r>
-        <w:rPr>
-          <w:rFonts w:ascii="Aptos" w:eastAsiaTheme="minorHAnsi" w:hAnsi="Aptos" w:cstheme="minorBidi"/>
-          <w:color w:val="auto"/>
-          <w:kern w:val="0"/>
-          <w:sz w:val="24"/>
-          <w:szCs w:val="24"/>
-          <w14:ligatures w14:val="none"/>
-        </w:rPr>
-        <w:t xml:space="preserve">to </w:t>
-      </w:r>
-      <w:r>
-        <w:rPr>
-          <w:rFonts w:ascii="Aptos" w:eastAsiaTheme="minorHAnsi" w:hAnsi="Aptos" w:cstheme="minorBidi"/>
-          <w:color w:val="auto"/>
-          <w:kern w:val="0"/>
-          <w:sz w:val="24"/>
-          <w:szCs w:val="24"/>
-          <w14:ligatures w14:val="none"/>
-        </w:rPr>
-        <w:t>desiccation by mixing</w:t>
-      </w:r>
-      <w:r>
-        <w:rPr>
-          <w:rFonts w:ascii="Aptos" w:eastAsiaTheme="minorHAnsi" w:hAnsi="Aptos" w:cstheme="minorBidi"/>
-          <w:color w:val="auto"/>
-          <w:kern w:val="0"/>
-          <w:sz w:val="24"/>
-          <w:szCs w:val="24"/>
-          <w14:ligatures w14:val="none"/>
-        </w:rPr>
-        <w:t xml:space="preserve">. </w:t>
-      </w:r>
-      <w:r>
-        <w:rPr>
-          <w:rFonts w:ascii="Aptos" w:eastAsiaTheme="minorHAnsi" w:hAnsi="Aptos" w:cstheme="minorBidi"/>
-          <w:color w:val="auto"/>
-          <w:kern w:val="0"/>
-          <w:sz w:val="24"/>
-          <w:szCs w:val="24"/>
-          <w14:ligatures w14:val="none"/>
-        </w:rPr>
-        <w:t>Here we hypothesize that</w:t>
-      </w:r>
-      <w:r>
-        <w:rPr>
-          <w:rFonts w:ascii="Aptos" w:eastAsiaTheme="minorHAnsi" w:hAnsi="Aptos" w:cstheme="minorBidi"/>
-          <w:color w:val="auto"/>
-          <w:kern w:val="0"/>
-          <w:sz w:val="24"/>
-          <w:szCs w:val="24"/>
-          <w14:ligatures w14:val="none"/>
-        </w:rPr>
-        <w:t xml:space="preserve">, in a steady climate, </w:t>
-      </w:r>
-      <w:r>
-        <w:rPr>
-          <w:rFonts w:ascii="Aptos" w:eastAsiaTheme="minorHAnsi" w:hAnsi="Aptos" w:cstheme="minorBidi"/>
-          <w:color w:val="auto"/>
-          <w:kern w:val="0"/>
-          <w:sz w:val="24"/>
-          <w:szCs w:val="24"/>
-          <w14:ligatures w14:val="none"/>
-        </w:rPr>
-        <w:t xml:space="preserve">the moisture </w:t>
-      </w:r>
-      <w:proofErr w:type="gramStart"/>
-      <w:r>
-        <w:rPr>
-          <w:rFonts w:ascii="Aptos" w:eastAsiaTheme="minorHAnsi" w:hAnsi="Aptos" w:cstheme="minorBidi"/>
-          <w:color w:val="auto"/>
-          <w:kern w:val="0"/>
-          <w:sz w:val="24"/>
-          <w:szCs w:val="24"/>
-          <w14:ligatures w14:val="none"/>
-        </w:rPr>
-        <w:t>flux</w:t>
-      </w:r>
-      <w:proofErr w:type="gramEnd"/>
-      <w:r>
-        <w:rPr>
-          <w:rFonts w:ascii="Aptos" w:eastAsiaTheme="minorHAnsi" w:hAnsi="Aptos" w:cstheme="minorBidi"/>
-          <w:color w:val="auto"/>
-          <w:kern w:val="0"/>
-          <w:sz w:val="24"/>
-          <w:szCs w:val="24"/>
-          <w14:ligatures w14:val="none"/>
-        </w:rPr>
-        <w:t xml:space="preserve"> </w:t>
-      </w:r>
-      <w:r>
-        <w:rPr>
-          <w:rFonts w:ascii="Aptos" w:eastAsiaTheme="minorHAnsi" w:hAnsi="Aptos" w:cstheme="minorBidi"/>
-          <w:color w:val="auto"/>
-          <w:kern w:val="0"/>
-          <w:sz w:val="24"/>
-          <w:szCs w:val="24"/>
-          <w14:ligatures w14:val="none"/>
-        </w:rPr>
-        <w:t xml:space="preserve">by </w:t>
-      </w:r>
-      <w:r>
-        <w:rPr>
-          <w:rFonts w:ascii="Aptos" w:eastAsiaTheme="minorHAnsi" w:hAnsi="Aptos" w:cstheme="minorBidi"/>
-          <w:color w:val="auto"/>
-          <w:kern w:val="0"/>
-          <w:sz w:val="24"/>
-          <w:szCs w:val="24"/>
-          <w14:ligatures w14:val="none"/>
-        </w:rPr>
-        <w:t>shallow cumulus cloud</w:t>
-      </w:r>
-      <w:r>
-        <w:rPr>
-          <w:rFonts w:ascii="Aptos" w:eastAsiaTheme="minorHAnsi" w:hAnsi="Aptos" w:cstheme="minorBidi"/>
-          <w:color w:val="auto"/>
-          <w:kern w:val="0"/>
-          <w:sz w:val="24"/>
-          <w:szCs w:val="24"/>
-          <w14:ligatures w14:val="none"/>
-        </w:rPr>
-        <w:t xml:space="preserve">s balances drying by the </w:t>
-      </w:r>
-      <w:proofErr w:type="gramStart"/>
-      <w:r>
-        <w:rPr>
-          <w:rFonts w:ascii="Aptos" w:eastAsiaTheme="minorHAnsi" w:hAnsi="Aptos" w:cstheme="minorBidi"/>
-          <w:color w:val="auto"/>
-          <w:kern w:val="0"/>
-          <w:sz w:val="24"/>
-          <w:szCs w:val="24"/>
-          <w14:ligatures w14:val="none"/>
-        </w:rPr>
-        <w:t>large scale</w:t>
-      </w:r>
-      <w:proofErr w:type="gramEnd"/>
-      <w:r>
-        <w:rPr>
-          <w:rFonts w:ascii="Aptos" w:eastAsiaTheme="minorHAnsi" w:hAnsi="Aptos" w:cstheme="minorBidi"/>
-          <w:color w:val="auto"/>
-          <w:kern w:val="0"/>
-          <w:sz w:val="24"/>
-          <w:szCs w:val="24"/>
-          <w14:ligatures w14:val="none"/>
-        </w:rPr>
-        <w:t xml:space="preserve"> circulation.</w:t>
-      </w:r>
-      <w:r>
-        <w:rPr>
-          <w:rFonts w:ascii="Aptos" w:eastAsiaTheme="minorHAnsi" w:hAnsi="Aptos" w:cstheme="minorBidi"/>
-          <w:color w:val="auto"/>
-          <w:kern w:val="0"/>
-          <w:sz w:val="24"/>
-          <w:szCs w:val="24"/>
-          <w14:ligatures w14:val="none"/>
-        </w:rPr>
-        <w:t xml:space="preserve"> </w:t>
-      </w:r>
-      <w:r>
-        <w:rPr>
-          <w:rFonts w:ascii="Aptos" w:eastAsiaTheme="minorHAnsi" w:hAnsi="Aptos" w:cstheme="minorBidi"/>
-          <w:color w:val="000000" w:themeColor="text1"/>
-          <w:kern w:val="0"/>
-          <w:sz w:val="24"/>
-          <w:szCs w:val="24"/>
-          <w14:ligatures w14:val="none"/>
-        </w:rPr>
-        <w:t>From this model,</w:t>
-      </w:r>
-      <w:r>
-        <w:rPr>
-          <w:rFonts w:ascii="Aptos" w:eastAsiaTheme="minorHAnsi" w:hAnsi="Aptos" w:cstheme="minorBidi"/>
-          <w:color w:val="000000" w:themeColor="text1"/>
-          <w:kern w:val="0"/>
-          <w:sz w:val="24"/>
-          <w:szCs w:val="24"/>
-          <w14:ligatures w14:val="none"/>
-        </w:rPr>
-        <w:t xml:space="preserve"> </w:t>
-      </w:r>
-      <w:r>
-        <w:rPr>
-          <w:rFonts w:ascii="Aptos" w:eastAsiaTheme="minorHAnsi" w:hAnsi="Aptos" w:cstheme="minorBidi"/>
-          <w:color w:val="000000" w:themeColor="text1"/>
-          <w:kern w:val="0"/>
-          <w:sz w:val="24"/>
-          <w:szCs w:val="24"/>
-          <w14:ligatures w14:val="none"/>
-        </w:rPr>
-        <w:t xml:space="preserve">shallow cumulus cloud </w:t>
-      </w:r>
-      <w:r>
-        <w:rPr>
-          <w:rFonts w:ascii="Aptos" w:eastAsiaTheme="minorHAnsi" w:hAnsi="Aptos" w:cstheme="minorBidi"/>
-          <w:color w:val="000000" w:themeColor="text1"/>
-          <w:kern w:val="0"/>
-          <w:sz w:val="24"/>
-          <w:szCs w:val="24"/>
-          <w14:ligatures w14:val="none"/>
-        </w:rPr>
-        <w:t xml:space="preserve">fraction </w:t>
-      </w:r>
-      <w:r>
-        <w:rPr>
-          <w:rFonts w:ascii="Aptos" w:eastAsiaTheme="minorHAnsi" w:hAnsi="Aptos" w:cstheme="minorBidi"/>
-          <w:color w:val="000000" w:themeColor="text1"/>
-          <w:kern w:val="0"/>
-          <w:sz w:val="24"/>
-          <w:szCs w:val="24"/>
-          <w14:ligatures w14:val="none"/>
-        </w:rPr>
-        <w:t xml:space="preserve">decreases in </w:t>
-      </w:r>
-      <w:r>
-        <w:rPr>
-          <w:rFonts w:ascii="Aptos" w:eastAsiaTheme="minorHAnsi" w:hAnsi="Aptos" w:cstheme="minorBidi"/>
-          <w:color w:val="000000" w:themeColor="text1"/>
-          <w:kern w:val="0"/>
-          <w:sz w:val="24"/>
-          <w:szCs w:val="24"/>
-          <w14:ligatures w14:val="none"/>
-        </w:rPr>
-        <w:t>proportion to the reduction of</w:t>
-      </w:r>
-      <w:r>
-        <w:rPr>
-          <w:rFonts w:ascii="Aptos" w:eastAsiaTheme="minorHAnsi" w:hAnsi="Aptos" w:cstheme="minorBidi"/>
-          <w:color w:val="000000" w:themeColor="text1"/>
-          <w:kern w:val="0"/>
-          <w:sz w:val="24"/>
-          <w:szCs w:val="24"/>
-          <w14:ligatures w14:val="none"/>
-        </w:rPr>
-        <w:t xml:space="preserve"> their </w:t>
-      </w:r>
-      <w:r>
-        <w:rPr>
-          <w:rFonts w:ascii="Aptos" w:eastAsiaTheme="minorHAnsi" w:hAnsi="Aptos" w:cstheme="minorBidi"/>
-          <w:color w:val="000000" w:themeColor="text1"/>
-          <w:kern w:val="0"/>
-          <w:sz w:val="24"/>
-          <w:szCs w:val="24"/>
-          <w14:ligatures w14:val="none"/>
-        </w:rPr>
-        <w:t>mass flux</w:t>
-      </w:r>
-      <w:r>
-        <w:rPr>
-          <w:rFonts w:ascii="Aptos" w:eastAsiaTheme="minorHAnsi" w:hAnsi="Aptos" w:cstheme="minorBidi"/>
-          <w:color w:val="000000" w:themeColor="text1"/>
-          <w:kern w:val="0"/>
-          <w:sz w:val="24"/>
-          <w:szCs w:val="24"/>
-          <w14:ligatures w14:val="none"/>
-        </w:rPr>
-        <w:t xml:space="preserve"> </w:t>
-      </w:r>
-      <w:r>
-        <w:rPr>
-          <w:rFonts w:ascii="Aptos" w:eastAsiaTheme="minorHAnsi" w:hAnsi="Aptos" w:cstheme="minorBidi"/>
-          <w:color w:val="000000" w:themeColor="text1"/>
-          <w:kern w:val="0"/>
-          <w:sz w:val="24"/>
-          <w:szCs w:val="24"/>
-          <w14:ligatures w14:val="none"/>
-        </w:rPr>
-        <w:t xml:space="preserve">and </w:t>
-      </w:r>
-      <w:r>
-        <w:rPr>
-          <w:rFonts w:ascii="Aptos" w:eastAsiaTheme="minorHAnsi" w:hAnsi="Aptos" w:cstheme="minorBidi"/>
-          <w:color w:val="000000" w:themeColor="text1"/>
-          <w:kern w:val="0"/>
-          <w:sz w:val="24"/>
-          <w:szCs w:val="24"/>
-          <w14:ligatures w14:val="none"/>
-        </w:rPr>
-        <w:t>the</w:t>
-      </w:r>
-      <w:r>
-        <w:rPr>
-          <w:rFonts w:ascii="Aptos" w:eastAsiaTheme="minorHAnsi" w:hAnsi="Aptos" w:cstheme="minorBidi"/>
-          <w:color w:val="000000" w:themeColor="text1"/>
-          <w:kern w:val="0"/>
-          <w:sz w:val="24"/>
-          <w:szCs w:val="24"/>
-          <w14:ligatures w14:val="none"/>
-        </w:rPr>
-        <w:t xml:space="preserve"> (–5 % K</w:t>
-      </w:r>
-      <w:r>
-        <w:rPr>
-          <w:rFonts w:ascii="Aptos" w:eastAsiaTheme="minorHAnsi" w:hAnsi="Aptos" w:cstheme="minorBidi"/>
-          <w:color w:val="000000" w:themeColor="text1"/>
-          <w:kern w:val="0"/>
-          <w:sz w:val="24"/>
-          <w:szCs w:val="24"/>
-          <w:vertAlign w:val="superscript"/>
-          <w14:ligatures w14:val="none"/>
-        </w:rPr>
-        <w:t>–1</w:t>
-      </w:r>
-      <w:r>
-        <w:rPr>
-          <w:rFonts w:ascii="Aptos" w:eastAsiaTheme="minorHAnsi" w:hAnsi="Aptos" w:cstheme="minorBidi"/>
-          <w:color w:val="000000" w:themeColor="text1"/>
-          <w:kern w:val="0"/>
-          <w:sz w:val="24"/>
-          <w:szCs w:val="24"/>
-          <w14:ligatures w14:val="none"/>
-        </w:rPr>
-        <w:t>) reduction of their</w:t>
-      </w:r>
-      <w:r>
-        <w:rPr>
-          <w:rFonts w:ascii="Aptos" w:eastAsiaTheme="minorHAnsi" w:hAnsi="Aptos" w:cstheme="minorBidi"/>
-          <w:color w:val="000000" w:themeColor="text1"/>
-          <w:kern w:val="0"/>
-          <w:sz w:val="24"/>
-          <w:szCs w:val="24"/>
-          <w14:ligatures w14:val="none"/>
-        </w:rPr>
-        <w:t xml:space="preserve"> large-scale circulation.</w:t>
-      </w:r>
-      <w:r>
-        <w:rPr>
-          <w:rFonts w:ascii="Aptos" w:eastAsiaTheme="minorHAnsi" w:hAnsi="Aptos" w:cstheme="minorBidi"/>
-          <w:color w:val="EE0000"/>
-          <w:kern w:val="0"/>
-          <w:sz w:val="24"/>
-          <w:szCs w:val="24"/>
-          <w14:ligatures w14:val="none"/>
-        </w:rPr>
-        <w:t xml:space="preserve"> </w:t>
-      </w:r>
-      <w:r>
-        <w:rPr>
-          <w:rFonts w:ascii="Aptos" w:eastAsiaTheme="minorHAnsi" w:hAnsi="Aptos" w:cstheme="minorBidi"/>
-          <w:color w:val="215E99" w:themeColor="text2" w:themeTint="BF"/>
-          <w:kern w:val="0"/>
-          <w:sz w:val="24"/>
-          <w:szCs w:val="24"/>
-          <w14:ligatures w14:val="none"/>
-        </w:rPr>
-        <w:t xml:space="preserve">Humidity changes increase both large-scale drying and cloud moisture flux, with cancelling effects on cloud fraction. </w:t>
-      </w:r>
-      <w:r>
-        <w:rPr>
-          <w:rFonts w:ascii="Aptos" w:eastAsiaTheme="minorHAnsi" w:hAnsi="Aptos" w:cstheme="minorBidi"/>
-          <w:color w:val="EE0000"/>
-          <w:kern w:val="0"/>
-          <w:sz w:val="24"/>
-          <w:szCs w:val="24"/>
-          <w14:ligatures w14:val="none"/>
-        </w:rPr>
-        <w:t>Local differences in shallow cloud feedback among different climates can be explained by differences in their Hadley circulation and differences in changes of the ratio of cloud albedo to cloud mass flux.</w:t>
-      </w:r>
-      <w:r>
-        <w:rPr>
-          <w:rFonts w:ascii="Aptos" w:eastAsiaTheme="minorHAnsi" w:hAnsi="Aptos" w:cstheme="minorBidi"/>
-          <w:color w:val="EE0000"/>
-          <w:kern w:val="0"/>
-          <w:sz w:val="24"/>
-          <w:szCs w:val="24"/>
-          <w14:ligatures w14:val="none"/>
-        </w:rPr>
-        <w:t xml:space="preserve"> </w:t>
-      </w:r>
     </w:p>
     <w:p>
       <w:pPr>
@@ -1658,6 +825,7 @@
         <w:spacing w:line="276" w:lineRule="auto"/>
       </w:pPr>
       <w:r>
+        <w:lastRenderedPageBreak/>
         <w:t>T</w:t>
       </w:r>
       <w:r>
@@ -1711,11 +879,7 @@
         <w:t>s</w:t>
       </w:r>
       <w:r>
-        <w:t xml:space="preserve">atellite shallow cumulus clouds have 0.5-3 km heights and weak cloud fraction at </w:t>
-      </w:r>
-      <w:r>
-        <w:lastRenderedPageBreak/>
-        <w:t>cloud base (3 % by random overlap or 8 % by maximum overlap; Fig. 1)</w:t>
+        <w:t>atellite shallow cumulus clouds have 0.5-3 km heights and weak cloud fraction at cloud base (3 % by random overlap or 8 % by maximum overlap; Fig. 1)</w:t>
       </w:r>
       <w:r>
         <w:t>. EUREC4A airborne lidar and radar cloud-base cloud fraction is only 5.4 % (BASTILIAS XXXX, Vogel et al. 2022)</w:t>
@@ -1879,7 +1043,14 @@
         <w:rPr>
           <w:rFonts w:ascii="Aptos" w:hAnsi="Aptos"/>
         </w:rPr>
-        <w:t xml:space="preserve">limate models that reproduce the observed mesoscale correlation of cloud fraction to cloud-base mass flux have weaker </w:t>
+        <w:t xml:space="preserve">limate models that reproduce the observed </w:t>
+      </w:r>
+      <w:r>
+        <w:rPr>
+          <w:rFonts w:ascii="Aptos" w:hAnsi="Aptos"/>
+        </w:rPr>
+        <w:lastRenderedPageBreak/>
+        <w:t xml:space="preserve">mesoscale correlation of cloud fraction to cloud-base mass flux have weaker </w:t>
       </w:r>
       <w:r>
         <w:rPr>
@@ -1974,14 +1145,7 @@
         <w:rPr>
           <w:rFonts w:ascii="Aptos" w:hAnsi="Aptos"/>
         </w:rPr>
-        <w:t xml:space="preserve"> circulation </w:t>
-      </w:r>
-      <w:r>
-        <w:rPr>
-          <w:rFonts w:ascii="Aptos" w:hAnsi="Aptos"/>
-        </w:rPr>
-        <w:lastRenderedPageBreak/>
-        <w:t>is thus compensated by the opposite moistening by the divergence of the shallow cumulus cloud eddy flux.</w:t>
+        <w:t xml:space="preserve"> circulation is thus compensated by the opposite moistening by the divergence of the shallow cumulus cloud eddy flux.</w:t>
       </w:r>
     </w:p>
     <w:p>
@@ -3274,15 +2438,7 @@
           <w:rFonts w:eastAsiaTheme="minorEastAsia"/>
           <w:color w:val="4EA72E" w:themeColor="accent6"/>
         </w:rPr>
-        <w:t xml:space="preserve">COSP REF </w:t>
-      </w:r>
-      <w:r>
-        <w:rPr>
-          <w:rFonts w:eastAsiaTheme="minorEastAsia"/>
-          <w:color w:val="4EA72E" w:themeColor="accent6"/>
-        </w:rPr>
-        <w:lastRenderedPageBreak/>
-        <w:t>XXXX)</w:t>
+        <w:t>COSP REF XXXX)</w:t>
       </w:r>
       <w:r>
         <w:rPr>
@@ -4771,6 +3927,7 @@
           <w:rFonts w:eastAsiaTheme="minorEastAsia"/>
           <w:iCs/>
         </w:rPr>
+        <w:lastRenderedPageBreak/>
         <w:t>The</w:t>
       </w:r>
       <w:r>
@@ -5039,15 +4196,7 @@
           <w:rFonts w:eastAsiaTheme="minorEastAsia"/>
           <w:iCs/>
         </w:rPr>
-        <w:t xml:space="preserve">the mean </w:t>
-      </w:r>
-      <w:r>
-        <w:rPr>
-          <w:rFonts w:eastAsiaTheme="minorEastAsia"/>
-          <w:iCs/>
-        </w:rPr>
-        <w:lastRenderedPageBreak/>
-        <w:t xml:space="preserve">shallow cumulus mass flux and cloud fraction decreases in proportion to the reduction of the mean tropical circulation </w:t>
+        <w:t xml:space="preserve">the mean shallow cumulus mass flux and cloud fraction decreases in proportion to the reduction of the mean tropical circulation </w:t>
       </w:r>
       <w:r>
         <w:rPr>
@@ -5735,19 +4884,13 @@
         <w:rPr>
           <w:rFonts w:ascii="Aptos" w:hAnsi="Aptos"/>
         </w:rPr>
-        <w:t xml:space="preserve">Plumes have temperature equal to their environment, in the approximation that expansion </w:t>
-      </w:r>
-      <w:r>
-        <w:rPr>
-          <w:rFonts w:ascii="Aptos" w:hAnsi="Aptos"/>
-        </w:rPr>
-        <w:t xml:space="preserve">cooling </w:t>
-      </w:r>
-      <w:r>
-        <w:rPr>
-          <w:rFonts w:ascii="Aptos" w:hAnsi="Aptos"/>
-        </w:rPr>
-        <w:t xml:space="preserve">balances the condensation heating. Total water </w:t>
+        <w:t>Updraft</w:t>
+      </w:r>
+      <w:r>
+        <w:rPr>
+          <w:rFonts w:ascii="Aptos" w:hAnsi="Aptos"/>
+        </w:rPr>
+        <w:t xml:space="preserve"> water </w:t>
       </w:r>
       <w:proofErr w:type="gramStart"/>
       <w:r>
@@ -6913,19 +6056,21 @@
     </w:p>
     <w:p>
       <w:pPr>
+        <w:pStyle w:val="BodyText"/>
+        <w:rPr>
+          <w:rFonts w:ascii="Menlo" w:hAnsi="Menlo" w:cs="Menlo"/>
+          <w:color w:val="3B2322"/>
+          <w:sz w:val="20"/>
+          <w:szCs w:val="20"/>
+        </w:rPr>
+      </w:pPr>
+    </w:p>
+    <w:p>
+      <w:pPr>
         <w:pStyle w:val="Heading2"/>
       </w:pPr>
-      <w:bookmarkStart w:id="3" w:name="cloud-base-clouds"/>
-      <w:r>
-        <w:t>Cloud-</w:t>
-      </w:r>
-      <w:proofErr w:type="gramStart"/>
-      <w:r>
-        <w:t>base</w:t>
-      </w:r>
-      <w:proofErr w:type="gramEnd"/>
-      <w:r>
-        <w:t xml:space="preserve"> clouds</w:t>
+      <w:r>
+        <w:t>Model results</w:t>
       </w:r>
     </w:p>
     <w:p>
@@ -6939,61 +6084,105 @@
         <w:rPr>
           <w:rFonts w:ascii="Aptos" w:hAnsi="Aptos"/>
         </w:rPr>
-        <w:t xml:space="preserve">While shallow cumulus </w:t>
+        <w:t xml:space="preserve">A series of experiments predict the mass and moisture flux for </w:t>
+      </w:r>
+      <w:r>
+        <w:rPr>
+          <w:rFonts w:ascii="Aptos" w:hAnsi="Aptos"/>
+        </w:rPr>
+        <w:t xml:space="preserve">cloud </w:t>
+      </w:r>
+      <w:r>
+        <w:rPr>
+          <w:rFonts w:ascii="Aptos" w:hAnsi="Aptos"/>
+        </w:rPr>
+        <w:t xml:space="preserve">updrafts </w:t>
+      </w:r>
+      <w:r>
+        <w:rPr>
+          <w:rFonts w:ascii="Aptos" w:hAnsi="Aptos"/>
+        </w:rPr>
+        <w:t xml:space="preserve">with </w:t>
+      </w:r>
+      <w:r>
+        <w:rPr>
+          <w:rFonts w:ascii="Aptos" w:hAnsi="Aptos"/>
+        </w:rPr>
+        <w:t xml:space="preserve">perturbed atmospheric soundings and </w:t>
       </w:r>
       <w:proofErr w:type="gramStart"/>
       <w:r>
         <w:rPr>
           <w:rFonts w:ascii="Aptos" w:hAnsi="Aptos"/>
         </w:rPr>
-        <w:t>decrease</w:t>
+        <w:t>large scale</w:t>
       </w:r>
       <w:proofErr w:type="gramEnd"/>
       <w:r>
         <w:rPr>
           <w:rFonts w:ascii="Aptos" w:hAnsi="Aptos"/>
         </w:rPr>
-        <w:t xml:space="preserve"> with reduced large-scale overturning, local scaling of the moist turbulent </w:t>
-      </w:r>
-      <w:proofErr w:type="spellStart"/>
-      <w:r>
-        <w:rPr>
-          <w:rFonts w:ascii="Aptos" w:hAnsi="Aptos"/>
-        </w:rPr>
-        <w:t>subcloud</w:t>
-      </w:r>
-      <w:proofErr w:type="spellEnd"/>
-      <w:r>
-        <w:rPr>
-          <w:rFonts w:ascii="Aptos" w:hAnsi="Aptos"/>
-        </w:rPr>
-        <w:t xml:space="preserve"> boundary layer sugges</w:t>
-      </w:r>
-      <w:r>
-        <w:rPr>
-          <w:rFonts w:ascii="Aptos" w:hAnsi="Aptos"/>
-        </w:rPr>
-        <w:t>ts</w:t>
-      </w:r>
-      <w:r>
-        <w:rPr>
-          <w:rFonts w:ascii="Aptos" w:hAnsi="Aptos"/>
-        </w:rPr>
-        <w:t xml:space="preserve"> that cloud base clouds increase by about the same amount. The net cloud radiative effect depends on the relative amount of shallow cumulus vs. cloud-</w:t>
-      </w:r>
-      <w:proofErr w:type="gramStart"/>
-      <w:r>
-        <w:rPr>
-          <w:rFonts w:ascii="Aptos" w:hAnsi="Aptos"/>
-        </w:rPr>
-        <w:t>base</w:t>
-      </w:r>
-      <w:proofErr w:type="gramEnd"/>
-      <w:r>
-        <w:rPr>
-          <w:rFonts w:ascii="Aptos" w:hAnsi="Aptos"/>
-        </w:rPr>
-        <w:t xml:space="preserve"> clouds.</w:t>
+        <w:t xml:space="preserve"> moisture flux</w:t>
+      </w:r>
+      <w:r>
+        <w:rPr>
+          <w:rFonts w:ascii="Aptos" w:hAnsi="Aptos"/>
+        </w:rPr>
+        <w:t>, nominally corresponding to a 1 K of surface temperature warming</w:t>
+      </w:r>
+      <w:r>
+        <w:rPr>
+          <w:rFonts w:ascii="Aptos" w:hAnsi="Aptos"/>
+        </w:rPr>
+        <w:t xml:space="preserve">. </w:t>
+      </w:r>
+      <w:r>
+        <w:rPr>
+          <w:rFonts w:ascii="Aptos" w:hAnsi="Aptos"/>
+        </w:rPr>
+        <w:t xml:space="preserve">Each experiment has </w:t>
+      </w:r>
+      <w:r>
+        <w:rPr>
+          <w:rFonts w:ascii="Aptos" w:hAnsi="Aptos"/>
+        </w:rPr>
+        <w:t xml:space="preserve">updrafts with </w:t>
+      </w:r>
+      <w:r>
+        <w:rPr>
+          <w:rFonts w:ascii="Aptos" w:hAnsi="Aptos"/>
+        </w:rPr>
+        <w:t>the same set of total sink rates as the control simulation. The cloud top height distribution</w:t>
+      </w:r>
+      <w:r>
+        <w:rPr>
+          <w:rFonts w:ascii="Aptos" w:hAnsi="Aptos"/>
+        </w:rPr>
+        <w:t xml:space="preserve"> from the</w:t>
+      </w:r>
+      <w:r>
+        <w:rPr>
+          <w:rFonts w:ascii="Aptos" w:hAnsi="Aptos"/>
+        </w:rPr>
+        <w:t xml:space="preserve"> control simulation </w:t>
+      </w:r>
+      <w:r>
+        <w:rPr>
+          <w:rFonts w:ascii="Aptos" w:hAnsi="Aptos"/>
+        </w:rPr>
+        <w:t>sets the</w:t>
+      </w:r>
+      <w:r>
+        <w:rPr>
+          <w:rFonts w:ascii="Aptos" w:hAnsi="Aptos"/>
+        </w:rPr>
+        <w:t xml:space="preserve"> </w:t>
+      </w:r>
+      <w:r>
+        <w:rPr>
+          <w:rFonts w:ascii="Aptos" w:hAnsi="Aptos"/>
+        </w:rPr>
+        <w:t xml:space="preserve">distribution of sink rates for all these experiments. The cloud top height is solved for each cloud in each experiment, the cloud flux </w:t>
       </w:r>
     </w:p>
     <w:p>
@@ -7007,61 +6196,291 @@
         <w:rPr>
           <w:rFonts w:ascii="Aptos" w:hAnsi="Aptos"/>
         </w:rPr>
-        <w:t>T</w:t>
-      </w:r>
-      <w:r>
-        <w:rPr>
-          <w:rFonts w:ascii="Aptos" w:hAnsi="Aptos"/>
-        </w:rPr>
-        <w:t xml:space="preserve">he cloud top height distribution in GOES observations is uniform with no maximum near cloud base. In </w:t>
-      </w:r>
-      <w:r>
-        <w:rPr>
-          <w:rFonts w:ascii="Aptos" w:hAnsi="Aptos"/>
-        </w:rPr>
-        <w:t>some observations and large-eddy simulation (LES) models</w:t>
-      </w:r>
-      <w:r>
-        <w:rPr>
-          <w:rFonts w:ascii="Aptos" w:hAnsi="Aptos"/>
-        </w:rPr>
-        <w:t xml:space="preserve">, however, </w:t>
-      </w:r>
-      <w:r>
-        <w:rPr>
-          <w:rFonts w:ascii="Aptos" w:hAnsi="Aptos"/>
-        </w:rPr>
-        <w:t>a</w:t>
-      </w:r>
-      <w:r>
-        <w:rPr>
-          <w:rFonts w:ascii="Aptos" w:hAnsi="Aptos"/>
-        </w:rPr>
-        <w:t xml:space="preserve"> cloud fraction </w:t>
-      </w:r>
-      <w:r>
-        <w:rPr>
-          <w:rFonts w:ascii="Aptos" w:hAnsi="Aptos"/>
-        </w:rPr>
-        <w:t xml:space="preserve">maximum of </w:t>
-      </w:r>
-      <w:r>
-        <w:rPr>
-          <w:rFonts w:ascii="Aptos" w:hAnsi="Aptos"/>
-        </w:rPr>
-        <w:t xml:space="preserve">about 5 % </w:t>
-      </w:r>
-      <w:r>
-        <w:rPr>
-          <w:rFonts w:ascii="Aptos" w:hAnsi="Aptos"/>
-        </w:rPr>
-        <w:t xml:space="preserve">is found </w:t>
-      </w:r>
-      <w:r>
-        <w:rPr>
-          <w:rFonts w:ascii="Aptos" w:hAnsi="Aptos"/>
-        </w:rPr>
-        <w:t xml:space="preserve">at cloud base (Bretherton et al. XXXX, Blossey et al. XXXX, Vogel et al. 2022). </w:t>
+        <w:t xml:space="preserve">The first experiment, </w:t>
+      </w:r>
+      <w:r>
+        <w:rPr>
+          <w:rFonts w:ascii="Aptos" w:hAnsi="Aptos"/>
+        </w:rPr>
+        <w:t>subsidence</w:t>
+      </w:r>
+      <w:r>
+        <w:rPr>
+          <w:rFonts w:ascii="Aptos" w:hAnsi="Aptos"/>
+        </w:rPr>
+        <w:t xml:space="preserve">-5%, decreases the large-scale subsidence by -5%, corresponding to large-scale moisture flux increasing +2% in radiative-convective equilibrium under +1 K warming. Because the saturation vapor pressure </w:t>
+      </w:r>
+      <m:oMath>
+        <m:r>
+          <w:rPr>
+            <w:rFonts w:ascii="Cambria Math" w:hAnsi="Cambria Math"/>
+          </w:rPr>
+          <m:t>d</m:t>
+        </m:r>
+        <m:func>
+          <m:funcPr>
+            <m:ctrlPr>
+              <w:rPr>
+                <w:rFonts w:ascii="Cambria Math" w:hAnsi="Cambria Math"/>
+                <w:i/>
+              </w:rPr>
+            </m:ctrlPr>
+          </m:funcPr>
+          <m:fName>
+            <m:r>
+              <m:rPr>
+                <m:sty m:val="p"/>
+              </m:rPr>
+              <w:rPr>
+                <w:rFonts w:ascii="Cambria Math" w:hAnsi="Cambria Math"/>
+              </w:rPr>
+              <m:t>ln</m:t>
+            </m:r>
+          </m:fName>
+          <m:e>
+            <m:r>
+              <w:rPr>
+                <w:rFonts w:ascii="Cambria Math" w:hAnsi="Cambria Math"/>
+              </w:rPr>
+              <m:t>q</m:t>
+            </m:r>
+          </m:e>
+        </m:func>
+        <m:r>
+          <w:rPr>
+            <w:rFonts w:ascii="Cambria Math" w:hAnsi="Cambria Math"/>
+          </w:rPr>
+          <m:t>/dT</m:t>
+        </m:r>
+      </m:oMath>
+      <w:r>
+        <w:rPr>
+          <w:rFonts w:ascii="Aptos" w:hAnsi="Aptos"/>
+        </w:rPr>
+        <w:t xml:space="preserve"> </w:t>
+      </w:r>
+      <w:r>
+        <w:rPr>
+          <w:rFonts w:ascii="Aptos" w:hAnsi="Aptos"/>
+        </w:rPr>
+        <w:t>=</w:t>
+      </w:r>
+      <w:r>
+        <w:rPr>
+          <w:rFonts w:ascii="Aptos" w:hAnsi="Aptos"/>
+        </w:rPr>
+        <w:t xml:space="preserve"> +7% K</w:t>
+      </w:r>
+      <w:r>
+        <w:rPr>
+          <w:rFonts w:ascii="Aptos" w:hAnsi="Aptos"/>
+          <w:vertAlign w:val="superscript"/>
+        </w:rPr>
+        <w:t>-1</w:t>
+      </w:r>
+      <w:r>
+        <w:rPr>
+          <w:rFonts w:ascii="Aptos" w:hAnsi="Aptos"/>
+        </w:rPr>
+        <w:t xml:space="preserve">, subsidence decreases by </w:t>
+      </w:r>
+      <m:oMath>
+        <m:r>
+          <w:rPr>
+            <w:rFonts w:ascii="Cambria Math" w:hAnsi="Cambria Math"/>
+          </w:rPr>
+          <m:t>d</m:t>
+        </m:r>
+        <m:func>
+          <m:funcPr>
+            <m:ctrlPr>
+              <w:rPr>
+                <w:rFonts w:ascii="Cambria Math" w:hAnsi="Cambria Math"/>
+                <w:i/>
+              </w:rPr>
+            </m:ctrlPr>
+          </m:funcPr>
+          <m:fName>
+            <m:r>
+              <m:rPr>
+                <m:sty m:val="p"/>
+              </m:rPr>
+              <w:rPr>
+                <w:rFonts w:ascii="Cambria Math" w:hAnsi="Cambria Math"/>
+              </w:rPr>
+              <m:t>ln</m:t>
+            </m:r>
+          </m:fName>
+          <m:e>
+            <m:r>
+              <w:rPr>
+                <w:rFonts w:ascii="Cambria Math" w:hAnsi="Cambria Math"/>
+              </w:rPr>
+              <m:t>W</m:t>
+            </m:r>
+          </m:e>
+        </m:func>
+        <m:r>
+          <w:rPr>
+            <w:rFonts w:ascii="Cambria Math" w:hAnsi="Cambria Math"/>
+          </w:rPr>
+          <m:t>/dT</m:t>
+        </m:r>
+      </m:oMath>
+      <w:r>
+        <w:rPr>
+          <w:rFonts w:ascii="Aptos" w:eastAsiaTheme="minorEastAsia" w:hAnsi="Aptos"/>
+        </w:rPr>
+        <w:t xml:space="preserve"> = -</w:t>
+      </w:r>
+      <w:r>
+        <w:rPr>
+          <w:rFonts w:ascii="Aptos" w:hAnsi="Aptos"/>
+        </w:rPr>
+        <w:t>5% K</w:t>
+      </w:r>
+      <w:r>
+        <w:rPr>
+          <w:rFonts w:ascii="Aptos" w:hAnsi="Aptos"/>
+          <w:vertAlign w:val="superscript"/>
+        </w:rPr>
+        <w:t>-1</w:t>
+      </w:r>
+      <w:r>
+        <w:rPr>
+          <w:rFonts w:ascii="Aptos" w:hAnsi="Aptos"/>
+        </w:rPr>
+        <w:t>.</w:t>
+      </w:r>
+      <w:r>
+        <w:rPr>
+          <w:rFonts w:ascii="Aptos" w:hAnsi="Aptos"/>
+        </w:rPr>
+        <w:t xml:space="preserve"> In the second experiment, q&amp;qs+7%, specific humidity and saturation specific humidity increase +7% (</w:t>
+      </w:r>
+      <m:oMath>
+        <m:r>
+          <w:rPr>
+            <w:rFonts w:ascii="Cambria Math" w:hAnsi="Cambria Math"/>
+          </w:rPr>
+          <m:t>d</m:t>
+        </m:r>
+        <m:func>
+          <m:funcPr>
+            <m:ctrlPr>
+              <w:rPr>
+                <w:rFonts w:ascii="Cambria Math" w:hAnsi="Cambria Math"/>
+                <w:i/>
+              </w:rPr>
+            </m:ctrlPr>
+          </m:funcPr>
+          <m:fName>
+            <m:r>
+              <m:rPr>
+                <m:sty m:val="p"/>
+              </m:rPr>
+              <w:rPr>
+                <w:rFonts w:ascii="Cambria Math" w:hAnsi="Cambria Math"/>
+              </w:rPr>
+              <m:t>ln</m:t>
+            </m:r>
+          </m:fName>
+          <m:e>
+            <m:r>
+              <w:rPr>
+                <w:rFonts w:ascii="Cambria Math" w:hAnsi="Cambria Math"/>
+              </w:rPr>
+              <m:t>q</m:t>
+            </m:r>
+          </m:e>
+        </m:func>
+        <m:r>
+          <w:rPr>
+            <w:rFonts w:ascii="Cambria Math" w:hAnsi="Cambria Math"/>
+          </w:rPr>
+          <m:t>/dT</m:t>
+        </m:r>
+      </m:oMath>
+      <w:r>
+        <w:rPr>
+          <w:rFonts w:ascii="Aptos" w:hAnsi="Aptos"/>
+        </w:rPr>
+        <w:t xml:space="preserve"> </w:t>
+      </w:r>
+      <w:r>
+        <w:rPr>
+          <w:rFonts w:ascii="Aptos" w:hAnsi="Aptos"/>
+        </w:rPr>
+        <w:t xml:space="preserve">= </w:t>
+      </w:r>
+      <w:r>
+        <w:rPr>
+          <w:rFonts w:ascii="Aptos" w:hAnsi="Aptos"/>
+        </w:rPr>
+        <w:t>+7% K</w:t>
+      </w:r>
+      <w:r>
+        <w:rPr>
+          <w:rFonts w:ascii="Aptos" w:hAnsi="Aptos"/>
+          <w:vertAlign w:val="superscript"/>
+        </w:rPr>
+        <w:t>-1</w:t>
+      </w:r>
+      <w:r>
+        <w:rPr>
+          <w:rFonts w:ascii="Aptos" w:hAnsi="Aptos"/>
+        </w:rPr>
+        <w:t>),</w:t>
+      </w:r>
+      <w:r>
+        <w:rPr>
+          <w:rFonts w:ascii="Aptos" w:hAnsi="Aptos"/>
+        </w:rPr>
+        <w:t xml:space="preserve"> keeping the relative humidity </w:t>
+      </w:r>
+      <w:r>
+        <w:rPr>
+          <w:rFonts w:ascii="Aptos" w:hAnsi="Aptos"/>
+        </w:rPr>
+        <w:t>constant</w:t>
+      </w:r>
+      <w:r>
+        <w:rPr>
+          <w:rFonts w:ascii="Aptos" w:hAnsi="Aptos"/>
+        </w:rPr>
+        <w:t>.</w:t>
+      </w:r>
+      <w:r>
+        <w:rPr>
+          <w:rFonts w:ascii="Aptos" w:hAnsi="Aptos"/>
+        </w:rPr>
+        <w:t xml:space="preserve"> Third, in </w:t>
+      </w:r>
+      <w:r>
+        <w:t>Ecb+2%</w:t>
+      </w:r>
+      <w:r>
+        <w:t xml:space="preserve">, </w:t>
+      </w:r>
+      <w:r>
+        <w:rPr>
+          <w:rFonts w:ascii="Aptos" w:hAnsi="Aptos"/>
+        </w:rPr>
+        <w:t>we increase the cloud-</w:t>
+      </w:r>
+      <w:proofErr w:type="gramStart"/>
+      <w:r>
+        <w:rPr>
+          <w:rFonts w:ascii="Aptos" w:hAnsi="Aptos"/>
+        </w:rPr>
+        <w:t>base</w:t>
+      </w:r>
+      <w:proofErr w:type="gramEnd"/>
+      <w:r>
+        <w:rPr>
+          <w:rFonts w:ascii="Aptos" w:hAnsi="Aptos"/>
+        </w:rPr>
+        <w:t xml:space="preserve"> moisture flux +2% in proportion to the increase in precipitation [this has no effect on the mass flux and clouds].</w:t>
       </w:r>
     </w:p>
     <w:p>
@@ -7075,40 +6494,922 @@
         <w:rPr>
           <w:rFonts w:ascii="Aptos" w:hAnsi="Aptos"/>
         </w:rPr>
-        <w:t>The c</w:t>
-      </w:r>
-      <w:r>
-        <w:rPr>
-          <w:rFonts w:ascii="Aptos" w:hAnsi="Aptos"/>
-        </w:rPr>
-        <w:t>oherent cloudy updraft plumes</w:t>
-      </w:r>
-      <w:r>
-        <w:rPr>
-          <w:rFonts w:ascii="Aptos" w:hAnsi="Aptos"/>
-        </w:rPr>
-        <w:t xml:space="preserve"> of our mass flux model</w:t>
-      </w:r>
-      <w:r>
-        <w:rPr>
-          <w:rFonts w:ascii="Aptos" w:hAnsi="Aptos"/>
-        </w:rPr>
-        <w:t xml:space="preserve"> are not representative of cloud-</w:t>
+        <w:lastRenderedPageBreak/>
+        <w:t xml:space="preserve">Two additional experiments determine the sensitivity to increasing the relative humidity. </w:t>
+      </w:r>
+      <w:r>
+        <w:rPr>
+          <w:rFonts w:ascii="Aptos" w:hAnsi="Aptos"/>
+        </w:rPr>
+        <w:t xml:space="preserve">If wind speed and the vapor transfer coefficient stay the same and </w:t>
+      </w:r>
+      <m:oMath>
+        <m:sSub>
+          <m:sSubPr>
+            <m:ctrlPr>
+              <w:rPr>
+                <w:rFonts w:ascii="Cambria Math" w:hAnsi="Cambria Math"/>
+              </w:rPr>
+            </m:ctrlPr>
+          </m:sSubPr>
+          <m:e>
+            <m:r>
+              <w:rPr>
+                <w:rFonts w:ascii="Cambria Math" w:hAnsi="Cambria Math"/>
+              </w:rPr>
+              <m:t>q</m:t>
+            </m:r>
+          </m:e>
+          <m:sub>
+            <m:r>
+              <w:rPr>
+                <w:rFonts w:ascii="Cambria Math" w:hAnsi="Cambria Math"/>
+              </w:rPr>
+              <m:t>s</m:t>
+            </m:r>
+          </m:sub>
+        </m:sSub>
+      </m:oMath>
+      <w:r>
+        <w:rPr>
+          <w:rFonts w:ascii="Aptos" w:hAnsi="Aptos"/>
+        </w:rPr>
+        <w:t xml:space="preserve"> increases by +7 % K</w:t>
+      </w:r>
+      <w:r>
+        <w:rPr>
+          <w:rFonts w:ascii="Aptos" w:hAnsi="Aptos"/>
+          <w:vertAlign w:val="superscript"/>
+        </w:rPr>
+        <w:t>–1</w:t>
+      </w:r>
+      <w:r>
+        <w:rPr>
+          <w:rFonts w:ascii="Aptos" w:hAnsi="Aptos"/>
+        </w:rPr>
+        <w:t xml:space="preserve">, the sensitivity of the surface evaporation flux </w:t>
+      </w:r>
+      <m:oMath>
+        <m:sSub>
+          <m:sSubPr>
+            <m:ctrlPr>
+              <w:rPr>
+                <w:rFonts w:ascii="Cambria Math" w:hAnsi="Cambria Math"/>
+              </w:rPr>
+            </m:ctrlPr>
+          </m:sSubPr>
+          <m:e>
+            <m:r>
+              <w:rPr>
+                <w:rFonts w:ascii="Cambria Math" w:hAnsi="Cambria Math"/>
+              </w:rPr>
+              <m:t>E</m:t>
+            </m:r>
+          </m:e>
+          <m:sub>
+            <m:r>
+              <m:rPr>
+                <m:sty m:val="p"/>
+              </m:rPr>
+              <w:rPr>
+                <w:rFonts w:ascii="Cambria Math" w:hAnsi="Cambria Math"/>
+              </w:rPr>
+              <m:t>0</m:t>
+            </m:r>
+          </m:sub>
+        </m:sSub>
+        <m:r>
+          <m:rPr>
+            <m:sty m:val="p"/>
+          </m:rPr>
+          <w:rPr>
+            <w:rFonts w:ascii="Cambria Math" w:hAnsi="Cambria Math"/>
+          </w:rPr>
+          <m:t>=</m:t>
+        </m:r>
+        <m:r>
+          <w:rPr>
+            <w:rFonts w:ascii="Cambria Math" w:hAnsi="Cambria Math"/>
+          </w:rPr>
+          <m:t>ρL</m:t>
+        </m:r>
+        <m:sSub>
+          <m:sSubPr>
+            <m:ctrlPr>
+              <w:rPr>
+                <w:rFonts w:ascii="Cambria Math" w:hAnsi="Cambria Math"/>
+              </w:rPr>
+            </m:ctrlPr>
+          </m:sSubPr>
+          <m:e>
+            <m:r>
+              <w:rPr>
+                <w:rFonts w:ascii="Cambria Math" w:hAnsi="Cambria Math"/>
+              </w:rPr>
+              <m:t>C</m:t>
+            </m:r>
+          </m:e>
+          <m:sub>
+            <m:r>
+              <w:rPr>
+                <w:rFonts w:ascii="Cambria Math" w:hAnsi="Cambria Math"/>
+              </w:rPr>
+              <m:t>E</m:t>
+            </m:r>
+          </m:sub>
+        </m:sSub>
+        <m:r>
+          <w:rPr>
+            <w:rFonts w:ascii="Cambria Math" w:hAnsi="Cambria Math"/>
+          </w:rPr>
+          <m:t>U</m:t>
+        </m:r>
+        <m:sSub>
+          <m:sSubPr>
+            <m:ctrlPr>
+              <w:rPr>
+                <w:rFonts w:ascii="Cambria Math" w:hAnsi="Cambria Math"/>
+              </w:rPr>
+            </m:ctrlPr>
+          </m:sSubPr>
+          <m:e>
+            <m:r>
+              <w:rPr>
+                <w:rFonts w:ascii="Cambria Math" w:hAnsi="Cambria Math"/>
+              </w:rPr>
+              <m:t>q</m:t>
+            </m:r>
+          </m:e>
+          <m:sub>
+            <m:r>
+              <w:rPr>
+                <w:rFonts w:ascii="Cambria Math" w:hAnsi="Cambria Math"/>
+              </w:rPr>
+              <m:t>s</m:t>
+            </m:r>
+          </m:sub>
+        </m:sSub>
+        <m:r>
+          <m:rPr>
+            <m:sty m:val="p"/>
+          </m:rPr>
+          <w:rPr>
+            <w:rFonts w:ascii="Cambria Math" w:hAnsi="Cambria Math"/>
+          </w:rPr>
+          <m:t>(1-RH)</m:t>
+        </m:r>
+      </m:oMath>
+      <w:r>
+        <w:rPr>
+          <w:rFonts w:ascii="Aptos" w:hAnsi="Aptos"/>
+        </w:rPr>
+        <w:t xml:space="preserve"> is limited to </w:t>
+      </w:r>
+      <m:oMath>
+        <m:r>
+          <w:rPr>
+            <w:rFonts w:ascii="Cambria Math" w:hAnsi="Cambria Math"/>
+          </w:rPr>
+          <m:t>d</m:t>
+        </m:r>
+        <m:func>
+          <m:funcPr>
+            <m:ctrlPr>
+              <w:rPr>
+                <w:rFonts w:ascii="Cambria Math" w:hAnsi="Cambria Math"/>
+                <w:i/>
+              </w:rPr>
+            </m:ctrlPr>
+          </m:funcPr>
+          <m:fName>
+            <m:r>
+              <m:rPr>
+                <m:sty m:val="p"/>
+              </m:rPr>
+              <w:rPr>
+                <w:rFonts w:ascii="Cambria Math" w:hAnsi="Cambria Math"/>
+              </w:rPr>
+              <m:t>ln</m:t>
+            </m:r>
+          </m:fName>
+          <m:e>
+            <m:sSub>
+              <m:sSubPr>
+                <m:ctrlPr>
+                  <w:rPr>
+                    <w:rFonts w:ascii="Cambria Math" w:hAnsi="Cambria Math"/>
+                    <w:i/>
+                  </w:rPr>
+                </m:ctrlPr>
+              </m:sSubPr>
+              <m:e>
+                <m:r>
+                  <w:rPr>
+                    <w:rFonts w:ascii="Cambria Math" w:hAnsi="Cambria Math"/>
+                  </w:rPr>
+                  <m:t>E</m:t>
+                </m:r>
+              </m:e>
+              <m:sub>
+                <m:r>
+                  <w:rPr>
+                    <w:rFonts w:ascii="Cambria Math" w:hAnsi="Cambria Math"/>
+                  </w:rPr>
+                  <m:t>0</m:t>
+                </m:r>
+              </m:sub>
+            </m:sSub>
+          </m:e>
+        </m:func>
+        <m:r>
+          <w:rPr>
+            <w:rFonts w:ascii="Cambria Math" w:hAnsi="Cambria Math"/>
+          </w:rPr>
+          <m:t>/dT=</m:t>
+        </m:r>
+      </m:oMath>
+      <w:r>
+        <w:rPr>
+          <w:rFonts w:ascii="Aptos" w:eastAsiaTheme="minorEastAsia" w:hAnsi="Aptos"/>
+        </w:rPr>
+        <w:t xml:space="preserve"> </w:t>
+      </w:r>
+      <w:r>
+        <w:rPr>
+          <w:rFonts w:ascii="Aptos" w:hAnsi="Aptos"/>
+        </w:rPr>
+        <w:t>+2 % K</w:t>
+      </w:r>
+      <w:r>
+        <w:rPr>
+          <w:rFonts w:ascii="Aptos" w:hAnsi="Aptos"/>
+          <w:vertAlign w:val="superscript"/>
+        </w:rPr>
+        <w:t>–1</w:t>
+      </w:r>
+      <w:r>
+        <w:rPr>
+          <w:rFonts w:ascii="Aptos" w:hAnsi="Aptos"/>
+        </w:rPr>
+        <w:t xml:space="preserve"> by</w:t>
+      </w:r>
+      <w:r>
+        <w:rPr>
+          <w:rFonts w:ascii="Aptos" w:hAnsi="Aptos"/>
+        </w:rPr>
+        <w:t xml:space="preserve"> quenching the surface relative saturation deficit </w:t>
+      </w:r>
+      <m:oMath>
+        <m:r>
+          <m:rPr>
+            <m:sty m:val="p"/>
+          </m:rPr>
+          <w:rPr>
+            <w:rFonts w:ascii="Cambria Math" w:hAnsi="Cambria Math"/>
+          </w:rPr>
+          <m:t>1-RH</m:t>
+        </m:r>
+      </m:oMath>
+      <w:r>
+        <w:rPr>
+          <w:rFonts w:ascii="Aptos" w:hAnsi="Aptos"/>
+        </w:rPr>
+        <w:t xml:space="preserve"> by –5 % K</w:t>
+      </w:r>
+      <w:r>
+        <w:rPr>
+          <w:rFonts w:ascii="Aptos" w:hAnsi="Aptos"/>
+          <w:vertAlign w:val="superscript"/>
+        </w:rPr>
+        <w:t>–1</w:t>
+      </w:r>
+      <w:r>
+        <w:rPr>
+          <w:rFonts w:ascii="Aptos" w:hAnsi="Aptos"/>
+        </w:rPr>
+        <w:t>. Taking the mean surface relative humidity at which vapor evaporates in the tropical circulation to be RH = 0.73, the relative saturation deficit 1-RH = 0.27 decreases by –5 % K</w:t>
+      </w:r>
+      <w:r>
+        <w:rPr>
+          <w:rFonts w:ascii="Aptos" w:hAnsi="Aptos"/>
+          <w:vertAlign w:val="superscript"/>
+        </w:rPr>
+        <w:t>–1</w:t>
+      </w:r>
+      <w:r>
+        <w:rPr>
+          <w:rFonts w:ascii="Aptos" w:hAnsi="Aptos"/>
+        </w:rPr>
+        <w:t xml:space="preserve"> to 1–RH = 0.26, an absolute increase of RH of about +0.01</w:t>
+      </w:r>
+      <w:r>
+        <w:rPr>
+          <w:rFonts w:ascii="Aptos" w:hAnsi="Aptos"/>
+        </w:rPr>
+        <w:t>8</w:t>
+      </w:r>
+      <w:r>
+        <w:rPr>
+          <w:rFonts w:ascii="Aptos" w:hAnsi="Aptos"/>
+        </w:rPr>
+        <w:t xml:space="preserve"> K</w:t>
+      </w:r>
+      <w:r>
+        <w:rPr>
+          <w:rFonts w:ascii="Aptos" w:hAnsi="Aptos"/>
+          <w:vertAlign w:val="superscript"/>
+        </w:rPr>
+        <w:t>–1</w:t>
+      </w:r>
+      <w:r>
+        <w:rPr>
+          <w:rFonts w:ascii="Aptos" w:hAnsi="Aptos"/>
+        </w:rPr>
+        <w:t>.</w:t>
+      </w:r>
+    </w:p>
+    <w:p>
+      <w:pPr>
+        <w:pStyle w:val="BodyText"/>
+        <w:rPr>
+          <w:rFonts w:ascii="Aptos" w:hAnsi="Aptos"/>
+        </w:rPr>
+      </w:pPr>
+    </w:p>
+    <w:p>
+      <w:pPr>
+        <w:pStyle w:val="BodyText"/>
+      </w:pPr>
+      <w:r>
+        <w:t>Table 1. C</w:t>
+      </w:r>
+      <w:r>
+        <w:t xml:space="preserve">loud </w:t>
       </w:r>
       <w:proofErr w:type="gramStart"/>
       <w:r>
-        <w:rPr>
-          <w:rFonts w:ascii="Aptos" w:hAnsi="Aptos"/>
-        </w:rPr>
+        <w:t>fraction</w:t>
+      </w:r>
+      <w:proofErr w:type="gramEnd"/>
+      <w:r>
+        <w:t xml:space="preserve"> change </w:t>
+      </w:r>
+      <w:proofErr w:type="gramStart"/>
+      <w:r>
+        <w:t>relative</w:t>
+      </w:r>
+      <w:proofErr w:type="gramEnd"/>
+      <w:r>
+        <w:t xml:space="preserve"> to the control simulation (</w:t>
+      </w:r>
+      <w:r>
+        <w:t>%</w:t>
+      </w:r>
+      <w:r>
+        <w:t>).</w:t>
+      </w:r>
+    </w:p>
+    <w:tbl>
+      <w:tblPr>
+        <w:tblW w:w="0" w:type="auto"/>
+        <w:tblCellSpacing w:w="15" w:type="dxa"/>
+        <w:tblCellMar>
+          <w:top w:w="15" w:type="dxa"/>
+          <w:left w:w="15" w:type="dxa"/>
+          <w:bottom w:w="15" w:type="dxa"/>
+          <w:right w:w="15" w:type="dxa"/>
+        </w:tblCellMar>
+        <w:tblLook w:val="04A0" w:firstRow="1" w:lastRow="0" w:firstColumn="1" w:lastColumn="0" w:noHBand="0" w:noVBand="1"/>
+      </w:tblPr>
+      <w:tblGrid>
+        <w:gridCol w:w="3295"/>
+        <w:gridCol w:w="1035"/>
+      </w:tblGrid>
+      <w:tr>
+        <w:trPr>
+          <w:tblCellSpacing w:w="15" w:type="dxa"/>
+        </w:trPr>
+        <w:tc>
+          <w:tcPr>
+            <w:tcW w:w="3250" w:type="dxa"/>
+            <w:tcBorders>
+              <w:bottom w:val="single" w:sz="4" w:space="0" w:color="DCDFE5"/>
+            </w:tcBorders>
+            <w:hideMark/>
+          </w:tcPr>
+          <w:p>
+            <w:pPr>
+              <w:pStyle w:val="BodyText"/>
+              <w:spacing w:before="0" w:after="0"/>
+              <w:rPr>
+                <w:b/>
+                <w:bCs/>
+              </w:rPr>
+            </w:pPr>
+            <w:r>
+              <w:rPr>
+                <w:b/>
+                <w:bCs/>
+              </w:rPr>
+              <w:t>experiment</w:t>
+            </w:r>
+          </w:p>
+        </w:tc>
+        <w:tc>
+          <w:tcPr>
+            <w:tcW w:w="990" w:type="dxa"/>
+            <w:tcBorders>
+              <w:bottom w:val="single" w:sz="4" w:space="0" w:color="DCDFE5"/>
+            </w:tcBorders>
+            <w:hideMark/>
+          </w:tcPr>
+          <w:p>
+            <w:pPr>
+              <w:pStyle w:val="BodyText"/>
+              <w:spacing w:before="0" w:after="0"/>
+              <w:rPr>
+                <w:b/>
+                <w:bCs/>
+              </w:rPr>
+            </w:pPr>
+            <m:oMath>
+              <m:r>
+                <m:rPr>
+                  <m:sty m:val="bi"/>
+                </m:rPr>
+                <w:rPr>
+                  <w:rFonts w:ascii="Cambria Math" w:hAnsi="Cambria Math"/>
+                </w:rPr>
+                <m:t>d</m:t>
+              </m:r>
+              <m:r>
+                <m:rPr>
+                  <m:sty m:val="b"/>
+                </m:rPr>
+                <w:rPr>
+                  <w:rFonts w:ascii="Cambria Math" w:hAnsi="Cambria Math"/>
+                </w:rPr>
+                <m:t>ln</m:t>
+              </m:r>
+              <m:r>
+                <m:rPr>
+                  <m:sty m:val="bi"/>
+                </m:rPr>
+                <w:rPr>
+                  <w:rFonts w:ascii="Cambria Math" w:hAnsi="Cambria Math"/>
+                </w:rPr>
+                <m:t>a</m:t>
+              </m:r>
+            </m:oMath>
+            <w:r>
+              <w:rPr>
+                <w:b/>
+                <w:bCs/>
+              </w:rPr>
+              <w:t xml:space="preserve"> (%)</w:t>
+            </w:r>
+          </w:p>
+        </w:tc>
+      </w:tr>
+      <w:tr>
+        <w:trPr>
+          <w:tblCellSpacing w:w="15" w:type="dxa"/>
+        </w:trPr>
+        <w:tc>
+          <w:tcPr>
+            <w:tcW w:w="3250" w:type="dxa"/>
+            <w:hideMark/>
+          </w:tcPr>
+          <w:p>
+            <w:pPr>
+              <w:pStyle w:val="BodyText"/>
+              <w:spacing w:before="0" w:after="0"/>
+            </w:pPr>
+            <w:r>
+              <w:t>subsidence-5%</w:t>
+            </w:r>
+          </w:p>
+        </w:tc>
+        <w:tc>
+          <w:tcPr>
+            <w:tcW w:w="990" w:type="dxa"/>
+            <w:hideMark/>
+          </w:tcPr>
+          <w:p>
+            <w:pPr>
+              <w:pStyle w:val="BodyText"/>
+              <w:spacing w:before="0" w:after="0"/>
+            </w:pPr>
+            <w:r>
+              <w:t>-5.13</w:t>
+            </w:r>
+          </w:p>
+        </w:tc>
+      </w:tr>
+      <w:tr>
+        <w:trPr>
+          <w:tblCellSpacing w:w="15" w:type="dxa"/>
+        </w:trPr>
+        <w:tc>
+          <w:tcPr>
+            <w:tcW w:w="3250" w:type="dxa"/>
+            <w:hideMark/>
+          </w:tcPr>
+          <w:p>
+            <w:pPr>
+              <w:pStyle w:val="BodyText"/>
+              <w:spacing w:before="0" w:after="0"/>
+            </w:pPr>
+            <w:r>
+              <w:t>Ecb+2%</w:t>
+            </w:r>
+          </w:p>
+        </w:tc>
+        <w:tc>
+          <w:tcPr>
+            <w:tcW w:w="990" w:type="dxa"/>
+            <w:hideMark/>
+          </w:tcPr>
+          <w:p>
+            <w:pPr>
+              <w:pStyle w:val="BodyText"/>
+              <w:spacing w:before="0" w:after="0"/>
+            </w:pPr>
+            <w:r>
+              <w:t>-</w:t>
+            </w:r>
+            <w:r>
+              <w:t>5.13</w:t>
+            </w:r>
+          </w:p>
+        </w:tc>
+      </w:tr>
+      <w:tr>
+        <w:trPr>
+          <w:tblCellSpacing w:w="15" w:type="dxa"/>
+        </w:trPr>
+        <w:tc>
+          <w:tcPr>
+            <w:tcW w:w="3250" w:type="dxa"/>
+            <w:hideMark/>
+          </w:tcPr>
+          <w:p>
+            <w:pPr>
+              <w:pStyle w:val="BodyText"/>
+              <w:spacing w:before="0" w:after="0"/>
+            </w:pPr>
+            <w:r>
+              <w:t>q&amp;qs+7%</w:t>
+            </w:r>
+          </w:p>
+        </w:tc>
+        <w:tc>
+          <w:tcPr>
+            <w:tcW w:w="990" w:type="dxa"/>
+            <w:hideMark/>
+          </w:tcPr>
+          <w:p>
+            <w:pPr>
+              <w:pStyle w:val="BodyText"/>
+              <w:spacing w:before="0" w:after="0"/>
+            </w:pPr>
+            <w:r>
+              <w:t>-7.86</w:t>
+            </w:r>
+          </w:p>
+        </w:tc>
+      </w:tr>
+      <w:tr>
+        <w:trPr>
+          <w:tblCellSpacing w:w="15" w:type="dxa"/>
+        </w:trPr>
+        <w:tc>
+          <w:tcPr>
+            <w:tcW w:w="3250" w:type="dxa"/>
+            <w:hideMark/>
+          </w:tcPr>
+          <w:p>
+            <w:pPr>
+              <w:pStyle w:val="BodyText"/>
+              <w:spacing w:before="0" w:after="0"/>
+            </w:pPr>
+            <w:r>
+              <w:t>lclRH+0.00</w:t>
+            </w:r>
+            <w:r>
+              <w:t>3</w:t>
+            </w:r>
+          </w:p>
+        </w:tc>
+        <w:tc>
+          <w:tcPr>
+            <w:tcW w:w="990" w:type="dxa"/>
+            <w:hideMark/>
+          </w:tcPr>
+          <w:p>
+            <w:pPr>
+              <w:pStyle w:val="BodyText"/>
+              <w:spacing w:before="0" w:after="0"/>
+            </w:pPr>
+            <w:r>
+              <w:t>-5.14</w:t>
+            </w:r>
+          </w:p>
+        </w:tc>
+      </w:tr>
+      <w:tr>
+        <w:trPr>
+          <w:trHeight w:val="21"/>
+          <w:tblCellSpacing w:w="15" w:type="dxa"/>
+        </w:trPr>
+        <w:tc>
+          <w:tcPr>
+            <w:tcW w:w="3250" w:type="dxa"/>
+            <w:tcBorders>
+              <w:bottom w:val="nil"/>
+            </w:tcBorders>
+            <w:hideMark/>
+          </w:tcPr>
+          <w:p>
+            <w:pPr>
+              <w:pStyle w:val="BodyText"/>
+              <w:spacing w:before="0" w:after="0"/>
+            </w:pPr>
+            <w:r>
+              <w:t>lclRH+0.0</w:t>
+            </w:r>
+            <w:r>
+              <w:t>06</w:t>
+            </w:r>
+          </w:p>
+        </w:tc>
+        <w:tc>
+          <w:tcPr>
+            <w:tcW w:w="990" w:type="dxa"/>
+            <w:tcBorders>
+              <w:bottom w:val="nil"/>
+            </w:tcBorders>
+            <w:hideMark/>
+          </w:tcPr>
+          <w:p>
+            <w:pPr>
+              <w:pStyle w:val="BodyText"/>
+              <w:spacing w:before="0" w:after="0"/>
+            </w:pPr>
+            <w:r>
+              <w:t>-2.27</w:t>
+            </w:r>
+          </w:p>
+        </w:tc>
+      </w:tr>
+    </w:tbl>
+    <w:p>
+      <w:pPr>
+        <w:pStyle w:val="BodyText"/>
+        <w:rPr>
+          <w:rFonts w:ascii="Aptos" w:hAnsi="Aptos"/>
+        </w:rPr>
+      </w:pPr>
+    </w:p>
+    <w:p>
+      <w:pPr>
+        <w:pStyle w:val="FirstParagraph"/>
+      </w:pPr>
+      <w:r>
+        <w:t xml:space="preserve">Relative humidity (RH) increases clouds, but absolute humidity decreases them. A 0.00875 increase of RH at cloud base increases clouds </w:t>
+      </w:r>
+      <w:proofErr w:type="gramStart"/>
+      <w:r>
+        <w:t>2.7% [???</w:t>
+      </w:r>
+      <w:proofErr w:type="gramEnd"/>
+      <w:r>
+        <w:t>by increasing which clouds?</w:t>
+      </w:r>
+      <w:proofErr w:type="gramStart"/>
+      <w:r>
+        <w:t>??]</w:t>
+      </w:r>
+      <w:proofErr w:type="gramEnd"/>
+      <w:r>
+        <w:t xml:space="preserve">, compensating the 5% reduction of cloud fraction associated with their moisture flux. Increasing absolute (specific) humidity, as due to saturation vapor pressure, increases the cloud moisture flux </w:t>
+      </w:r>
+      <m:oMath>
+        <m:r>
+          <w:rPr>
+            <w:rFonts w:ascii="Cambria Math" w:hAnsi="Cambria Math"/>
+          </w:rPr>
+          <m:t>M</m:t>
+        </m:r>
+        <m:r>
+          <m:rPr>
+            <m:sty m:val="p"/>
+          </m:rPr>
+          <w:rPr>
+            <w:rFonts w:ascii="Cambria Math" w:hAnsi="Cambria Math"/>
+          </w:rPr>
+          <m:t>Δ</m:t>
+        </m:r>
+        <m:r>
+          <w:rPr>
+            <w:rFonts w:ascii="Cambria Math" w:hAnsi="Cambria Math"/>
+          </w:rPr>
+          <m:t>q</m:t>
+        </m:r>
+      </m:oMath>
+      <w:r>
+        <w:t>, so that the mass flux and cloud amount decreases for the same moisture flux required to balance the moisture budget.</w:t>
+      </w:r>
+    </w:p>
+    <w:p>
+      <w:pPr>
+        <w:pStyle w:val="BodyText"/>
+        <w:rPr>
+          <w:rFonts w:ascii="Menlo" w:hAnsi="Menlo" w:cs="Menlo"/>
+          <w:color w:val="3B2322"/>
+          <w:sz w:val="20"/>
+          <w:szCs w:val="20"/>
+        </w:rPr>
+      </w:pPr>
+    </w:p>
+    <w:p>
+      <w:pPr>
+        <w:pStyle w:val="Heading2"/>
+      </w:pPr>
+      <w:bookmarkStart w:id="3" w:name="cloud-base-clouds"/>
+      <w:r>
+        <w:t>Cloud-</w:t>
+      </w:r>
+      <w:proofErr w:type="gramStart"/>
+      <w:r>
         <w:t>base</w:t>
       </w:r>
       <w:proofErr w:type="gramEnd"/>
       <w:r>
-        <w:rPr>
-          <w:rFonts w:ascii="Aptos" w:hAnsi="Aptos"/>
-        </w:rPr>
         <w:t xml:space="preserve"> clouds</w:t>
       </w:r>
+    </w:p>
+    <w:p>
+      <w:pPr>
+        <w:pStyle w:val="BodyText"/>
+        <w:rPr>
+          <w:rFonts w:ascii="Aptos" w:hAnsi="Aptos"/>
+        </w:rPr>
+      </w:pPr>
+      <w:r>
+        <w:rPr>
+          <w:rFonts w:ascii="Aptos" w:hAnsi="Aptos"/>
+        </w:rPr>
+        <w:t xml:space="preserve">While shallow cumulus </w:t>
+      </w:r>
+      <w:proofErr w:type="gramStart"/>
+      <w:r>
+        <w:rPr>
+          <w:rFonts w:ascii="Aptos" w:hAnsi="Aptos"/>
+        </w:rPr>
+        <w:t>decrease</w:t>
+      </w:r>
+      <w:proofErr w:type="gramEnd"/>
+      <w:r>
+        <w:rPr>
+          <w:rFonts w:ascii="Aptos" w:hAnsi="Aptos"/>
+        </w:rPr>
+        <w:t xml:space="preserve"> with reduced large-scale overturning, local scaling of the moist turbulent </w:t>
+      </w:r>
+      <w:proofErr w:type="spellStart"/>
+      <w:r>
+        <w:rPr>
+          <w:rFonts w:ascii="Aptos" w:hAnsi="Aptos"/>
+        </w:rPr>
+        <w:t>subcloud</w:t>
+      </w:r>
+      <w:proofErr w:type="spellEnd"/>
+      <w:r>
+        <w:rPr>
+          <w:rFonts w:ascii="Aptos" w:hAnsi="Aptos"/>
+        </w:rPr>
+        <w:t xml:space="preserve"> boundary layer sugges</w:t>
+      </w:r>
+      <w:r>
+        <w:rPr>
+          <w:rFonts w:ascii="Aptos" w:hAnsi="Aptos"/>
+        </w:rPr>
+        <w:t>ts</w:t>
+      </w:r>
+      <w:r>
+        <w:rPr>
+          <w:rFonts w:ascii="Aptos" w:hAnsi="Aptos"/>
+        </w:rPr>
+        <w:t xml:space="preserve"> that cloud base clouds increase by about the same amount. The net cloud radiative effect depends on the relative amount of shallow cumulus vs. cloud-</w:t>
+      </w:r>
+      <w:proofErr w:type="gramStart"/>
+      <w:r>
+        <w:rPr>
+          <w:rFonts w:ascii="Aptos" w:hAnsi="Aptos"/>
+        </w:rPr>
+        <w:t>base</w:t>
+      </w:r>
+      <w:proofErr w:type="gramEnd"/>
+      <w:r>
+        <w:rPr>
+          <w:rFonts w:ascii="Aptos" w:hAnsi="Aptos"/>
+        </w:rPr>
+        <w:t xml:space="preserve"> clouds.</w:t>
+      </w:r>
+    </w:p>
+    <w:p>
+      <w:pPr>
+        <w:pStyle w:val="BodyText"/>
+        <w:rPr>
+          <w:rFonts w:ascii="Aptos" w:hAnsi="Aptos"/>
+        </w:rPr>
+      </w:pPr>
+      <w:r>
+        <w:rPr>
+          <w:rFonts w:ascii="Aptos" w:hAnsi="Aptos"/>
+        </w:rPr>
+        <w:t xml:space="preserve">In </w:t>
+      </w:r>
+      <w:r>
+        <w:rPr>
+          <w:rFonts w:ascii="Aptos" w:hAnsi="Aptos"/>
+        </w:rPr>
+        <w:t>some observations and large-eddy simulation (LES) models</w:t>
+      </w:r>
+      <w:r>
+        <w:rPr>
+          <w:rFonts w:ascii="Aptos" w:hAnsi="Aptos"/>
+        </w:rPr>
+        <w:t xml:space="preserve">, however, </w:t>
+      </w:r>
+      <w:r>
+        <w:rPr>
+          <w:rFonts w:ascii="Aptos" w:hAnsi="Aptos"/>
+        </w:rPr>
+        <w:t>a</w:t>
+      </w:r>
+      <w:r>
+        <w:rPr>
+          <w:rFonts w:ascii="Aptos" w:hAnsi="Aptos"/>
+        </w:rPr>
+        <w:t xml:space="preserve"> cloud fraction </w:t>
+      </w:r>
+      <w:r>
+        <w:rPr>
+          <w:rFonts w:ascii="Aptos" w:hAnsi="Aptos"/>
+        </w:rPr>
+        <w:t xml:space="preserve">maximum of </w:t>
+      </w:r>
+      <w:r>
+        <w:rPr>
+          <w:rFonts w:ascii="Aptos" w:hAnsi="Aptos"/>
+        </w:rPr>
+        <w:t xml:space="preserve">about 5 % </w:t>
+      </w:r>
+      <w:r>
+        <w:rPr>
+          <w:rFonts w:ascii="Aptos" w:hAnsi="Aptos"/>
+        </w:rPr>
+        <w:t xml:space="preserve">is found </w:t>
+      </w:r>
+      <w:r>
+        <w:rPr>
+          <w:rFonts w:ascii="Aptos" w:hAnsi="Aptos"/>
+        </w:rPr>
+        <w:t xml:space="preserve">at cloud base (Bretherton et al. XXXX, Blossey et al. XXXX, Vogel et al. 2022). </w:t>
+      </w:r>
+      <w:r>
+        <w:rPr>
+          <w:rFonts w:ascii="Aptos" w:hAnsi="Aptos"/>
+        </w:rPr>
+        <w:t>T</w:t>
+      </w:r>
+      <w:r>
+        <w:rPr>
+          <w:rFonts w:ascii="Aptos" w:hAnsi="Aptos"/>
+        </w:rPr>
+        <w:t>he cloud top height distribution in GOES observations is uniform with no maximum near cloud base.</w:t>
+      </w:r>
+    </w:p>
+    <w:p>
+      <w:pPr>
+        <w:pStyle w:val="BodyText"/>
+        <w:rPr>
+          <w:rFonts w:ascii="Aptos" w:hAnsi="Aptos"/>
+        </w:rPr>
+      </w:pPr>
+      <w:r>
+        <w:rPr>
+          <w:rFonts w:ascii="Aptos" w:hAnsi="Aptos"/>
+        </w:rPr>
+        <w:t>C</w:t>
+      </w:r>
+      <w:r>
+        <w:rPr>
+          <w:rFonts w:ascii="Aptos" w:hAnsi="Aptos"/>
+        </w:rPr>
+        <w:t>loud-base clouds</w:t>
+      </w:r>
       <w:r>
         <w:rPr>
           <w:rFonts w:ascii="Aptos" w:hAnsi="Aptos"/>
@@ -7152,6 +7453,12 @@
           <w:rFonts w:ascii="Aptos" w:hAnsi="Aptos"/>
         </w:rPr>
         <w:t xml:space="preserve"> thermals</w:t>
+      </w:r>
+      <w:r>
+        <w:rPr>
+          <w:rFonts w:ascii="Aptos" w:hAnsi="Aptos"/>
+        </w:rPr>
+        <w:t>, are not well represented by mass flux model for moist updraft plumes</w:t>
       </w:r>
       <w:r>
         <w:rPr>
@@ -7312,7 +7619,7 @@
         <w:rPr>
           <w:rFonts w:ascii="Aptos" w:hAnsi="Aptos"/>
         </w:rPr>
-        <w:t xml:space="preserve">with the argument </w:t>
+        <w:t xml:space="preserve">with </w:t>
       </w:r>
       <m:oMath>
         <m:r>
@@ -7400,7 +7707,25 @@
         <w:rPr>
           <w:rFonts w:ascii="Aptos" w:hAnsi="Aptos"/>
         </w:rPr>
-        <w:t xml:space="preserve">, which measures the mean saturation deficit at cloud base relative to the </w:t>
+        <w:t xml:space="preserve"> m</w:t>
+      </w:r>
+      <w:r>
+        <w:rPr>
+          <w:rFonts w:ascii="Aptos" w:hAnsi="Aptos"/>
+        </w:rPr>
+        <w:t>easur</w:t>
+      </w:r>
+      <w:r>
+        <w:rPr>
+          <w:rFonts w:ascii="Aptos" w:hAnsi="Aptos"/>
+        </w:rPr>
+        <w:t>ing</w:t>
+      </w:r>
+      <w:r>
+        <w:rPr>
+          <w:rFonts w:ascii="Aptos" w:hAnsi="Aptos"/>
+        </w:rPr>
+        <w:t xml:space="preserve"> the mean saturation deficit at cloud base relative to the </w:t>
       </w:r>
       <w:r>
         <w:rPr>
@@ -7432,7 +7757,6 @@
         <w:rPr>
           <w:rFonts w:ascii="Aptos" w:hAnsi="Aptos"/>
         </w:rPr>
-        <w:lastRenderedPageBreak/>
         <w:t xml:space="preserve">The mean </w:t>
       </w:r>
       <w:r>
@@ -7625,14 +7949,13 @@
             <m:ctrlPr>
               <w:rPr>
                 <w:rFonts w:ascii="Cambria Math" w:hAnsi="Cambria Math"/>
+                <w:i/>
+                <w:iCs/>
               </w:rPr>
             </m:ctrlPr>
           </m:sSubPr>
           <m:e>
             <m:r>
-              <m:rPr>
-                <m:sty m:val="p"/>
-              </m:rPr>
               <w:rPr>
                 <w:rFonts w:ascii="Cambria Math" w:hAnsi="Cambria Math"/>
               </w:rPr>
@@ -7641,9 +7964,6 @@
           </m:e>
           <m:sub>
             <m:r>
-              <m:rPr>
-                <m:sty m:val="p"/>
-              </m:rPr>
               <w:rPr>
                 <w:rFonts w:ascii="Cambria Math" w:hAnsi="Cambria Math"/>
               </w:rPr>
@@ -7853,7 +8173,13 @@
         <w:rPr>
           <w:rFonts w:ascii="Aptos" w:hAnsi="Aptos"/>
         </w:rPr>
-        <w:t>) is parameterized</w:t>
+        <w:t xml:space="preserve">) is </w:t>
+      </w:r>
+      <w:r>
+        <w:rPr>
+          <w:rFonts w:ascii="Aptos" w:hAnsi="Aptos"/>
+        </w:rPr>
+        <w:t>parameterized as a function of the turbulence,</w:t>
       </w:r>
       <w:r>
         <w:rPr>
@@ -8050,7 +8376,55 @@
         <w:rPr>
           <w:rFonts w:ascii="Aptos" w:hAnsi="Aptos"/>
         </w:rPr>
-        <w:t xml:space="preserve">where </w:t>
+        <w:t>where</w:t>
+      </w:r>
+      <w:r>
+        <w:rPr>
+          <w:rFonts w:ascii="Aptos" w:hAnsi="Aptos"/>
+        </w:rPr>
+        <w:t xml:space="preserve"> </w:t>
+      </w:r>
+      <m:oMath>
+        <m:sSub>
+          <m:sSubPr>
+            <m:ctrlPr>
+              <w:rPr>
+                <w:rFonts w:ascii="Cambria Math" w:hAnsi="Cambria Math"/>
+              </w:rPr>
+            </m:ctrlPr>
+          </m:sSubPr>
+          <m:e>
+            <m:r>
+              <w:rPr>
+                <w:rFonts w:ascii="Cambria Math" w:hAnsi="Cambria Math"/>
+              </w:rPr>
+              <m:t>k</m:t>
+            </m:r>
+          </m:e>
+          <m:sub>
+            <m:r>
+              <m:rPr>
+                <m:sty m:val="p"/>
+              </m:rPr>
+              <w:rPr>
+                <w:rFonts w:ascii="Cambria Math" w:hAnsi="Cambria Math"/>
+              </w:rPr>
+              <m:t>1</m:t>
+            </m:r>
+          </m:sub>
+        </m:sSub>
+      </m:oMath>
+      <w:r>
+        <w:rPr>
+          <w:rFonts w:ascii="Aptos" w:eastAsiaTheme="minorEastAsia" w:hAnsi="Aptos"/>
+        </w:rPr>
+        <w:t xml:space="preserve"> is a constant and</w:t>
+      </w:r>
+      <w:r>
+        <w:rPr>
+          <w:rFonts w:ascii="Aptos" w:hAnsi="Aptos"/>
+        </w:rPr>
+        <w:t xml:space="preserve"> </w:t>
       </w:r>
       <m:oMath>
         <m:sSup>
@@ -8149,7 +8523,7 @@
         <w:rPr>
           <w:rFonts w:ascii="Aptos" w:hAnsi="Aptos"/>
         </w:rPr>
-        <w:t xml:space="preserve"> is the friction velocity. The humidity variance resulting from the production-dissipation balance,</w:t>
+        <w:t xml:space="preserve"> is the friction velocity. The humidity variance </w:t>
       </w:r>
       <w:r>
         <w:rPr>
@@ -8419,6 +8793,18 @@
         <w:rPr>
           <w:rFonts w:ascii="Aptos" w:hAnsi="Aptos"/>
         </w:rPr>
+        <w:t>from the production-dissipation balance,</w:t>
+      </w:r>
+      <w:r>
+        <w:rPr>
+          <w:rFonts w:ascii="Aptos" w:hAnsi="Aptos"/>
+        </w:rPr>
+        <w:t xml:space="preserve"> </w:t>
+      </w:r>
+      <w:r>
+        <w:rPr>
+          <w:rFonts w:ascii="Aptos" w:hAnsi="Aptos"/>
+        </w:rPr>
         <w:t xml:space="preserve">depends on the surface to cloud base humidity difference </w:t>
       </w:r>
       <m:oMath>
@@ -8832,6 +9218,68 @@
               </m:ctrlPr>
             </m:sSupPr>
             <m:e>
+              <m:r>
+                <w:rPr>
+                  <w:rFonts w:ascii="Cambria Math" w:hAnsi="Cambria Math"/>
+                </w:rPr>
+                <m:t>[</m:t>
+              </m:r>
+              <m:sSup>
+                <m:sSupPr>
+                  <m:ctrlPr>
+                    <w:rPr>
+                      <w:rFonts w:ascii="Cambria Math" w:hAnsi="Cambria Math"/>
+                    </w:rPr>
+                  </m:ctrlPr>
+                </m:sSupPr>
+                <m:e>
+                  <m:r>
+                    <w:rPr>
+                      <w:rFonts w:ascii="Cambria Math" w:hAnsi="Cambria Math"/>
+                    </w:rPr>
+                    <m:t>u</m:t>
+                  </m:r>
+                </m:e>
+                <m:sup>
+                  <m:r>
+                    <m:rPr>
+                      <m:sty m:val="p"/>
+                    </m:rPr>
+                    <w:rPr>
+                      <w:rFonts w:ascii="Cambria Math" w:hAnsi="Cambria Math"/>
+                    </w:rPr>
+                    <m:t>*</m:t>
+                  </m:r>
+                </m:sup>
+              </m:sSup>
+              <m:sSup>
+                <m:sSupPr>
+                  <m:ctrlPr>
+                    <w:rPr>
+                      <w:rFonts w:ascii="Cambria Math" w:hAnsi="Cambria Math"/>
+                    </w:rPr>
+                  </m:ctrlPr>
+                </m:sSupPr>
+                <m:e>
+                  <m:r>
+                    <w:rPr>
+                      <w:rFonts w:ascii="Cambria Math" w:hAnsi="Cambria Math"/>
+                    </w:rPr>
+                    <m:t>q</m:t>
+                  </m:r>
+                </m:e>
+                <m:sup>
+                  <m:r>
+                    <m:rPr>
+                      <m:sty m:val="p"/>
+                    </m:rPr>
+                    <w:rPr>
+                      <w:rFonts w:ascii="Cambria Math" w:hAnsi="Cambria Math"/>
+                    </w:rPr>
+                    <m:t>*</m:t>
+                  </m:r>
+                </m:sup>
+              </m:sSup>
               <m:d>
                 <m:dPr>
                   <m:ctrlPr>
@@ -8841,42 +9289,14 @@
                   </m:ctrlPr>
                 </m:dPr>
                 <m:e>
-                  <m:sSup>
-                    <m:sSupPr>
+                  <m:sSub>
+                    <m:sSubPr>
                       <m:ctrlPr>
                         <w:rPr>
                           <w:rFonts w:ascii="Cambria Math" w:hAnsi="Cambria Math"/>
                         </w:rPr>
                       </m:ctrlPr>
-                    </m:sSupPr>
-                    <m:e>
-                      <m:r>
-                        <w:rPr>
-                          <w:rFonts w:ascii="Cambria Math" w:hAnsi="Cambria Math"/>
-                        </w:rPr>
-                        <m:t>u</m:t>
-                      </m:r>
-                    </m:e>
-                    <m:sup>
-                      <m:r>
-                        <m:rPr>
-                          <m:sty m:val="p"/>
-                        </m:rPr>
-                        <w:rPr>
-                          <w:rFonts w:ascii="Cambria Math" w:hAnsi="Cambria Math"/>
-                        </w:rPr>
-                        <m:t>*</m:t>
-                      </m:r>
-                    </m:sup>
-                  </m:sSup>
-                  <m:sSup>
-                    <m:sSupPr>
-                      <m:ctrlPr>
-                        <w:rPr>
-                          <w:rFonts w:ascii="Cambria Math" w:hAnsi="Cambria Math"/>
-                        </w:rPr>
-                      </m:ctrlPr>
-                    </m:sSupPr>
+                    </m:sSubPr>
                     <m:e>
                       <m:r>
                         <w:rPr>
@@ -8885,7 +9305,7 @@
                         <m:t>q</m:t>
                       </m:r>
                     </m:e>
-                    <m:sup>
+                    <m:sub>
                       <m:r>
                         <m:rPr>
                           <m:sty m:val="p"/>
@@ -8893,83 +9313,10 @@
                         <w:rPr>
                           <w:rFonts w:ascii="Cambria Math" w:hAnsi="Cambria Math"/>
                         </w:rPr>
-                        <m:t>*</m:t>
+                        <m:t>0</m:t>
                       </m:r>
-                    </m:sup>
-                  </m:sSup>
-                  <m:d>
-                    <m:dPr>
-                      <m:ctrlPr>
-                        <w:rPr>
-                          <w:rFonts w:ascii="Cambria Math" w:hAnsi="Cambria Math"/>
-                        </w:rPr>
-                      </m:ctrlPr>
-                    </m:dPr>
-                    <m:e>
-                      <m:sSub>
-                        <m:sSubPr>
-                          <m:ctrlPr>
-                            <w:rPr>
-                              <w:rFonts w:ascii="Cambria Math" w:hAnsi="Cambria Math"/>
-                            </w:rPr>
-                          </m:ctrlPr>
-                        </m:sSubPr>
-                        <m:e>
-                          <m:r>
-                            <w:rPr>
-                              <w:rFonts w:ascii="Cambria Math" w:hAnsi="Cambria Math"/>
-                            </w:rPr>
-                            <m:t>q</m:t>
-                          </m:r>
-                        </m:e>
-                        <m:sub>
-                          <m:r>
-                            <m:rPr>
-                              <m:sty m:val="p"/>
-                            </m:rPr>
-                            <w:rPr>
-                              <w:rFonts w:ascii="Cambria Math" w:hAnsi="Cambria Math"/>
-                            </w:rPr>
-                            <m:t>0</m:t>
-                          </m:r>
-                        </m:sub>
-                      </m:sSub>
-                      <m:r>
-                        <m:rPr>
-                          <m:sty m:val="p"/>
-                        </m:rPr>
-                        <w:rPr>
-                          <w:rFonts w:ascii="Cambria Math" w:hAnsi="Cambria Math"/>
-                        </w:rPr>
-                        <m:t>-</m:t>
-                      </m:r>
-                      <m:sSub>
-                        <m:sSubPr>
-                          <m:ctrlPr>
-                            <w:rPr>
-                              <w:rFonts w:ascii="Cambria Math" w:hAnsi="Cambria Math"/>
-                            </w:rPr>
-                          </m:ctrlPr>
-                        </m:sSubPr>
-                        <m:e>
-                          <m:r>
-                            <w:rPr>
-                              <w:rFonts w:ascii="Cambria Math" w:hAnsi="Cambria Math"/>
-                            </w:rPr>
-                            <m:t>q</m:t>
-                          </m:r>
-                        </m:e>
-                        <m:sub>
-                          <m:r>
-                            <w:rPr>
-                              <w:rFonts w:ascii="Cambria Math" w:hAnsi="Cambria Math"/>
-                            </w:rPr>
-                            <m:t>CB</m:t>
-                          </m:r>
-                        </m:sub>
-                      </m:sSub>
-                    </m:e>
-                  </m:d>
+                    </m:sub>
+                  </m:sSub>
                   <m:r>
                     <m:rPr>
                       <m:sty m:val="p"/>
@@ -8977,123 +9324,16 @@
                     <w:rPr>
                       <w:rFonts w:ascii="Cambria Math" w:hAnsi="Cambria Math"/>
                     </w:rPr>
-                    <m:t>/(</m:t>
+                    <m:t>-</m:t>
                   </m:r>
-                  <m:sSup>
-                    <m:sSupPr>
+                  <m:sSub>
+                    <m:sSubPr>
                       <m:ctrlPr>
                         <w:rPr>
                           <w:rFonts w:ascii="Cambria Math" w:hAnsi="Cambria Math"/>
                         </w:rPr>
                       </m:ctrlPr>
-                    </m:sSupPr>
-                    <m:e>
-                      <m:sSub>
-                        <m:sSubPr>
-                          <m:ctrlPr>
-                            <w:rPr>
-                              <w:rFonts w:ascii="Cambria Math" w:hAnsi="Cambria Math"/>
-                            </w:rPr>
-                          </m:ctrlPr>
-                        </m:sSubPr>
-                        <m:e>
-                          <m:r>
-                            <w:rPr>
-                              <w:rFonts w:ascii="Cambria Math" w:hAnsi="Cambria Math"/>
-                            </w:rPr>
-                            <m:t>k</m:t>
-                          </m:r>
-                        </m:e>
-                        <m:sub>
-                          <m:r>
-                            <m:rPr>
-                              <m:sty m:val="p"/>
-                            </m:rPr>
-                            <w:rPr>
-                              <w:rFonts w:ascii="Cambria Math" w:hAnsi="Cambria Math"/>
-                            </w:rPr>
-                            <m:t>1</m:t>
-                          </m:r>
-                        </m:sub>
-                      </m:sSub>
-                      <m:r>
-                        <w:rPr>
-                          <w:rFonts w:ascii="Cambria Math" w:hAnsi="Cambria Math"/>
-                        </w:rPr>
-                        <m:t>u</m:t>
-                      </m:r>
-                    </m:e>
-                    <m:sup>
-                      <m:r>
-                        <m:rPr>
-                          <m:sty m:val="p"/>
-                        </m:rPr>
-                        <w:rPr>
-                          <w:rFonts w:ascii="Cambria Math" w:hAnsi="Cambria Math"/>
-                        </w:rPr>
-                        <m:t>*</m:t>
-                      </m:r>
-                    </m:sup>
-                  </m:sSup>
-                  <m:r>
-                    <m:rPr>
-                      <m:sty m:val="p"/>
-                    </m:rPr>
-                    <w:rPr>
-                      <w:rFonts w:ascii="Cambria Math" w:hAnsi="Cambria Math"/>
-                    </w:rPr>
-                    <m:t>)</m:t>
-                  </m:r>
-                </m:e>
-              </m:d>
-            </m:e>
-            <m:sup>
-              <m:r>
-                <m:rPr>
-                  <m:sty m:val="p"/>
-                </m:rPr>
-                <w:rPr>
-                  <w:rFonts w:ascii="Cambria Math" w:hAnsi="Cambria Math"/>
-                </w:rPr>
-                <m:t>1/2</m:t>
-              </m:r>
-            </m:sup>
-          </m:sSup>
-          <m:r>
-            <m:rPr>
-              <m:sty m:val="p"/>
-            </m:rPr>
-            <w:rPr>
-              <w:rFonts w:ascii="Cambria Math" w:hAnsi="Cambria Math"/>
-            </w:rPr>
-            <m:t>=</m:t>
-          </m:r>
-          <m:sSup>
-            <m:sSupPr>
-              <m:ctrlPr>
-                <w:rPr>
-                  <w:rFonts w:ascii="Cambria Math" w:hAnsi="Cambria Math"/>
-                </w:rPr>
-              </m:ctrlPr>
-            </m:sSupPr>
-            <m:e>
-              <m:d>
-                <m:dPr>
-                  <m:ctrlPr>
-                    <w:rPr>
-                      <w:rFonts w:ascii="Cambria Math" w:hAnsi="Cambria Math"/>
-                    </w:rPr>
-                  </m:ctrlPr>
-                </m:dPr>
-                <m:e>
-                  <m:sSup>
-                    <m:sSupPr>
-                      <m:ctrlPr>
-                        <w:rPr>
-                          <w:rFonts w:ascii="Cambria Math" w:hAnsi="Cambria Math"/>
-                        </w:rPr>
-                      </m:ctrlPr>
-                    </m:sSupPr>
+                    </m:sSubPr>
                     <m:e>
                       <m:r>
                         <w:rPr>
@@ -9102,100 +9342,35 @@
                         <m:t>q</m:t>
                       </m:r>
                     </m:e>
-                    <m:sup>
+                    <m:sub>
                       <m:r>
-                        <m:rPr>
-                          <m:sty m:val="p"/>
-                        </m:rPr>
                         <w:rPr>
                           <w:rFonts w:ascii="Cambria Math" w:hAnsi="Cambria Math"/>
                         </w:rPr>
-                        <m:t>*</m:t>
+                        <m:t>CB</m:t>
                       </m:r>
-                    </m:sup>
-                  </m:sSup>
-                  <m:d>
-                    <m:dPr>
-                      <m:ctrlPr>
-                        <w:rPr>
-                          <w:rFonts w:ascii="Cambria Math" w:hAnsi="Cambria Math"/>
-                        </w:rPr>
-                      </m:ctrlPr>
-                    </m:dPr>
-                    <m:e>
-                      <m:sSub>
-                        <m:sSubPr>
-                          <m:ctrlPr>
-                            <w:rPr>
-                              <w:rFonts w:ascii="Cambria Math" w:hAnsi="Cambria Math"/>
-                            </w:rPr>
-                          </m:ctrlPr>
-                        </m:sSubPr>
-                        <m:e>
-                          <m:r>
-                            <w:rPr>
-                              <w:rFonts w:ascii="Cambria Math" w:hAnsi="Cambria Math"/>
-                            </w:rPr>
-                            <m:t>q</m:t>
-                          </m:r>
-                        </m:e>
-                        <m:sub>
-                          <m:r>
-                            <m:rPr>
-                              <m:sty m:val="p"/>
-                            </m:rPr>
-                            <w:rPr>
-                              <w:rFonts w:ascii="Cambria Math" w:hAnsi="Cambria Math"/>
-                            </w:rPr>
-                            <m:t>0</m:t>
-                          </m:r>
-                        </m:sub>
-                      </m:sSub>
-                      <m:r>
-                        <m:rPr>
-                          <m:sty m:val="p"/>
-                        </m:rPr>
-                        <w:rPr>
-                          <w:rFonts w:ascii="Cambria Math" w:hAnsi="Cambria Math"/>
-                        </w:rPr>
-                        <m:t>-</m:t>
-                      </m:r>
-                      <m:sSub>
-                        <m:sSubPr>
-                          <m:ctrlPr>
-                            <w:rPr>
-                              <w:rFonts w:ascii="Cambria Math" w:hAnsi="Cambria Math"/>
-                            </w:rPr>
-                          </m:ctrlPr>
-                        </m:sSubPr>
-                        <m:e>
-                          <m:r>
-                            <w:rPr>
-                              <w:rFonts w:ascii="Cambria Math" w:hAnsi="Cambria Math"/>
-                            </w:rPr>
-                            <m:t>q</m:t>
-                          </m:r>
-                        </m:e>
-                        <m:sub>
-                          <m:r>
-                            <w:rPr>
-                              <w:rFonts w:ascii="Cambria Math" w:hAnsi="Cambria Math"/>
-                            </w:rPr>
-                            <m:t>CB</m:t>
-                          </m:r>
-                        </m:sub>
-                      </m:sSub>
-                    </m:e>
-                  </m:d>
-                  <m:r>
-                    <m:rPr>
-                      <m:sty m:val="p"/>
-                    </m:rPr>
+                    </m:sub>
+                  </m:sSub>
+                </m:e>
+              </m:d>
+              <m:r>
+                <m:rPr>
+                  <m:sty m:val="p"/>
+                </m:rPr>
+                <w:rPr>
+                  <w:rFonts w:ascii="Cambria Math" w:hAnsi="Cambria Math"/>
+                </w:rPr>
+                <m:t>/(</m:t>
+              </m:r>
+              <m:sSup>
+                <m:sSupPr>
+                  <m:ctrlPr>
                     <w:rPr>
                       <w:rFonts w:ascii="Cambria Math" w:hAnsi="Cambria Math"/>
                     </w:rPr>
-                    <m:t>/</m:t>
-                  </m:r>
+                  </m:ctrlPr>
+                </m:sSupPr>
+                <m:e>
                   <m:sSub>
                     <m:sSubPr>
                       <m:ctrlPr>
@@ -9224,8 +9399,218 @@
                       </m:r>
                     </m:sub>
                   </m:sSub>
+                  <m:r>
+                    <w:rPr>
+                      <w:rFonts w:ascii="Cambria Math" w:hAnsi="Cambria Math"/>
+                    </w:rPr>
+                    <m:t>u</m:t>
+                  </m:r>
+                </m:e>
+                <m:sup>
+                  <m:r>
+                    <m:rPr>
+                      <m:sty m:val="p"/>
+                    </m:rPr>
+                    <w:rPr>
+                      <w:rFonts w:ascii="Cambria Math" w:hAnsi="Cambria Math"/>
+                    </w:rPr>
+                    <m:t>*</m:t>
+                  </m:r>
+                </m:sup>
+              </m:sSup>
+              <m:r>
+                <m:rPr>
+                  <m:sty m:val="p"/>
+                </m:rPr>
+                <w:rPr>
+                  <w:rFonts w:ascii="Cambria Math" w:hAnsi="Cambria Math"/>
+                </w:rPr>
+                <m:t>)</m:t>
+              </m:r>
+              <m:r>
+                <w:rPr>
+                  <w:rFonts w:ascii="Cambria Math" w:hAnsi="Cambria Math"/>
+                </w:rPr>
+                <m:t>]</m:t>
+              </m:r>
+            </m:e>
+            <m:sup>
+              <m:r>
+                <w:rPr>
+                  <w:rFonts w:ascii="Cambria Math" w:hAnsi="Cambria Math"/>
+                </w:rPr>
+                <m:t>1/2</m:t>
+              </m:r>
+            </m:sup>
+          </m:sSup>
+          <m:r>
+            <m:rPr>
+              <m:sty m:val="p"/>
+            </m:rPr>
+            <w:rPr>
+              <w:rFonts w:ascii="Cambria Math" w:hAnsi="Cambria Math"/>
+            </w:rPr>
+            <m:t>=</m:t>
+          </m:r>
+          <m:sSup>
+            <m:sSupPr>
+              <m:ctrlPr>
+                <w:rPr>
+                  <w:rFonts w:ascii="Cambria Math" w:hAnsi="Cambria Math"/>
+                </w:rPr>
+              </m:ctrlPr>
+            </m:sSupPr>
+            <m:e>
+              <m:r>
+                <w:rPr>
+                  <w:rFonts w:ascii="Cambria Math" w:hAnsi="Cambria Math"/>
+                </w:rPr>
+                <m:t>[</m:t>
+              </m:r>
+              <m:sSup>
+                <m:sSupPr>
+                  <m:ctrlPr>
+                    <w:rPr>
+                      <w:rFonts w:ascii="Cambria Math" w:hAnsi="Cambria Math"/>
+                    </w:rPr>
+                  </m:ctrlPr>
+                </m:sSupPr>
+                <m:e>
+                  <m:r>
+                    <w:rPr>
+                      <w:rFonts w:ascii="Cambria Math" w:hAnsi="Cambria Math"/>
+                    </w:rPr>
+                    <m:t>q</m:t>
+                  </m:r>
+                </m:e>
+                <m:sup>
+                  <m:r>
+                    <m:rPr>
+                      <m:sty m:val="p"/>
+                    </m:rPr>
+                    <w:rPr>
+                      <w:rFonts w:ascii="Cambria Math" w:hAnsi="Cambria Math"/>
+                    </w:rPr>
+                    <m:t>*</m:t>
+                  </m:r>
+                </m:sup>
+              </m:sSup>
+              <m:d>
+                <m:dPr>
+                  <m:ctrlPr>
+                    <w:rPr>
+                      <w:rFonts w:ascii="Cambria Math" w:hAnsi="Cambria Math"/>
+                    </w:rPr>
+                  </m:ctrlPr>
+                </m:dPr>
+                <m:e>
+                  <m:sSub>
+                    <m:sSubPr>
+                      <m:ctrlPr>
+                        <w:rPr>
+                          <w:rFonts w:ascii="Cambria Math" w:hAnsi="Cambria Math"/>
+                        </w:rPr>
+                      </m:ctrlPr>
+                    </m:sSubPr>
+                    <m:e>
+                      <m:r>
+                        <w:rPr>
+                          <w:rFonts w:ascii="Cambria Math" w:hAnsi="Cambria Math"/>
+                        </w:rPr>
+                        <m:t>q</m:t>
+                      </m:r>
+                    </m:e>
+                    <m:sub>
+                      <m:r>
+                        <m:rPr>
+                          <m:sty m:val="p"/>
+                        </m:rPr>
+                        <w:rPr>
+                          <w:rFonts w:ascii="Cambria Math" w:hAnsi="Cambria Math"/>
+                        </w:rPr>
+                        <m:t>0</m:t>
+                      </m:r>
+                    </m:sub>
+                  </m:sSub>
+                  <m:r>
+                    <m:rPr>
+                      <m:sty m:val="p"/>
+                    </m:rPr>
+                    <w:rPr>
+                      <w:rFonts w:ascii="Cambria Math" w:hAnsi="Cambria Math"/>
+                    </w:rPr>
+                    <m:t>-</m:t>
+                  </m:r>
+                  <m:sSub>
+                    <m:sSubPr>
+                      <m:ctrlPr>
+                        <w:rPr>
+                          <w:rFonts w:ascii="Cambria Math" w:hAnsi="Cambria Math"/>
+                        </w:rPr>
+                      </m:ctrlPr>
+                    </m:sSubPr>
+                    <m:e>
+                      <m:r>
+                        <w:rPr>
+                          <w:rFonts w:ascii="Cambria Math" w:hAnsi="Cambria Math"/>
+                        </w:rPr>
+                        <m:t>q</m:t>
+                      </m:r>
+                    </m:e>
+                    <m:sub>
+                      <m:r>
+                        <w:rPr>
+                          <w:rFonts w:ascii="Cambria Math" w:hAnsi="Cambria Math"/>
+                        </w:rPr>
+                        <m:t>CB</m:t>
+                      </m:r>
+                    </m:sub>
+                  </m:sSub>
                 </m:e>
               </m:d>
+              <m:r>
+                <m:rPr>
+                  <m:sty m:val="p"/>
+                </m:rPr>
+                <w:rPr>
+                  <w:rFonts w:ascii="Cambria Math" w:hAnsi="Cambria Math"/>
+                </w:rPr>
+                <m:t>/</m:t>
+              </m:r>
+              <m:sSub>
+                <m:sSubPr>
+                  <m:ctrlPr>
+                    <w:rPr>
+                      <w:rFonts w:ascii="Cambria Math" w:hAnsi="Cambria Math"/>
+                    </w:rPr>
+                  </m:ctrlPr>
+                </m:sSubPr>
+                <m:e>
+                  <m:r>
+                    <w:rPr>
+                      <w:rFonts w:ascii="Cambria Math" w:hAnsi="Cambria Math"/>
+                    </w:rPr>
+                    <m:t>k</m:t>
+                  </m:r>
+                </m:e>
+                <m:sub>
+                  <m:r>
+                    <m:rPr>
+                      <m:sty m:val="p"/>
+                    </m:rPr>
+                    <w:rPr>
+                      <w:rFonts w:ascii="Cambria Math" w:hAnsi="Cambria Math"/>
+                    </w:rPr>
+                    <m:t>1</m:t>
+                  </m:r>
+                </m:sub>
+              </m:sSub>
+              <m:r>
+                <w:rPr>
+                  <w:rFonts w:ascii="Cambria Math" w:hAnsi="Cambria Math"/>
+                </w:rPr>
+                <m:t>]</m:t>
+              </m:r>
             </m:e>
             <m:sup>
               <m:r>
@@ -9571,52 +9956,21 @@
         <w:rPr>
           <w:rFonts w:ascii="Aptos" w:hAnsi="Aptos"/>
         </w:rPr>
-        <w:t xml:space="preserve">scales with the flux humidity scale </w:t>
-      </w:r>
-      <m:oMath>
-        <m:sSup>
-          <m:sSupPr>
-            <m:ctrlPr>
-              <w:rPr>
-                <w:rFonts w:ascii="Cambria Math" w:hAnsi="Cambria Math"/>
-              </w:rPr>
-            </m:ctrlPr>
-          </m:sSupPr>
-          <m:e>
-            <m:r>
-              <w:rPr>
-                <w:rFonts w:ascii="Cambria Math" w:hAnsi="Cambria Math"/>
-              </w:rPr>
-              <m:t>q</m:t>
-            </m:r>
-          </m:e>
-          <m:sup>
-            <m:r>
-              <m:rPr>
-                <m:sty m:val="p"/>
-              </m:rPr>
-              <w:rPr>
-                <w:rFonts w:ascii="Cambria Math" w:hAnsi="Cambria Math"/>
-              </w:rPr>
-              <m:t>*</m:t>
-            </m:r>
-          </m:sup>
-        </m:sSup>
-      </m:oMath>
-      <w:r>
-        <w:rPr>
-          <w:rFonts w:ascii="Aptos" w:hAnsi="Aptos"/>
-        </w:rPr>
-        <w:t>, the subcloud mean humidity difference, and the saturation specific humidity.</w:t>
-      </w:r>
-    </w:p>
-    <w:p>
-      <w:pPr>
-        <w:pStyle w:val="Heading30"/>
-      </w:pPr>
-      <w:bookmarkStart w:id="4" w:name="scaling-subcloud-humidity-with-warming"/>
-      <w:r>
-        <w:t>Scaling with warming</w:t>
+        <w:t xml:space="preserve">scales with the humidity scale, the </w:t>
+      </w:r>
+      <w:proofErr w:type="spellStart"/>
+      <w:r>
+        <w:rPr>
+          <w:rFonts w:ascii="Aptos" w:hAnsi="Aptos"/>
+        </w:rPr>
+        <w:t>subcloud</w:t>
+      </w:r>
+      <w:proofErr w:type="spellEnd"/>
+      <w:r>
+        <w:rPr>
+          <w:rFonts w:ascii="Aptos" w:hAnsi="Aptos"/>
+        </w:rPr>
+        <w:t xml:space="preserve"> mean humidity difference, and the saturation specific humidity.</w:t>
       </w:r>
     </w:p>
     <w:p>
@@ -9626,249 +9980,7 @@
           <w:rFonts w:ascii="Aptos" w:hAnsi="Aptos"/>
         </w:rPr>
       </w:pPr>
-      <w:r>
-        <w:rPr>
-          <w:rFonts w:ascii="Aptos" w:hAnsi="Aptos"/>
-        </w:rPr>
-        <w:t xml:space="preserve">If wind speed and the vapor transfer coefficient stay the same and </w:t>
-      </w:r>
-      <m:oMath>
-        <m:sSub>
-          <m:sSubPr>
-            <m:ctrlPr>
-              <w:rPr>
-                <w:rFonts w:ascii="Cambria Math" w:hAnsi="Cambria Math"/>
-              </w:rPr>
-            </m:ctrlPr>
-          </m:sSubPr>
-          <m:e>
-            <m:r>
-              <w:rPr>
-                <w:rFonts w:ascii="Cambria Math" w:hAnsi="Cambria Math"/>
-              </w:rPr>
-              <m:t>q</m:t>
-            </m:r>
-          </m:e>
-          <m:sub>
-            <m:r>
-              <w:rPr>
-                <w:rFonts w:ascii="Cambria Math" w:hAnsi="Cambria Math"/>
-              </w:rPr>
-              <m:t>s</m:t>
-            </m:r>
-          </m:sub>
-        </m:sSub>
-      </m:oMath>
-      <w:r>
-        <w:rPr>
-          <w:rFonts w:ascii="Aptos" w:hAnsi="Aptos"/>
-        </w:rPr>
-        <w:t xml:space="preserve"> increases by +7 % K</w:t>
-      </w:r>
-      <w:r>
-        <w:rPr>
-          <w:rFonts w:ascii="Aptos" w:hAnsi="Aptos"/>
-          <w:vertAlign w:val="superscript"/>
-        </w:rPr>
-        <w:t>–1</w:t>
-      </w:r>
-      <w:r>
-        <w:rPr>
-          <w:rFonts w:ascii="Aptos" w:hAnsi="Aptos"/>
-        </w:rPr>
-        <w:t xml:space="preserve">, the sensitivity of the surface evaporation flux </w:t>
-      </w:r>
-      <m:oMath>
-        <m:sSub>
-          <m:sSubPr>
-            <m:ctrlPr>
-              <w:rPr>
-                <w:rFonts w:ascii="Cambria Math" w:hAnsi="Cambria Math"/>
-              </w:rPr>
-            </m:ctrlPr>
-          </m:sSubPr>
-          <m:e>
-            <m:r>
-              <w:rPr>
-                <w:rFonts w:ascii="Cambria Math" w:hAnsi="Cambria Math"/>
-              </w:rPr>
-              <m:t>E</m:t>
-            </m:r>
-          </m:e>
-          <m:sub>
-            <m:r>
-              <m:rPr>
-                <m:sty m:val="p"/>
-              </m:rPr>
-              <w:rPr>
-                <w:rFonts w:ascii="Cambria Math" w:hAnsi="Cambria Math"/>
-              </w:rPr>
-              <m:t>0</m:t>
-            </m:r>
-          </m:sub>
-        </m:sSub>
-        <m:r>
-          <m:rPr>
-            <m:sty m:val="p"/>
-          </m:rPr>
-          <w:rPr>
-            <w:rFonts w:ascii="Cambria Math" w:hAnsi="Cambria Math"/>
-          </w:rPr>
-          <m:t>=</m:t>
-        </m:r>
-        <m:r>
-          <w:rPr>
-            <w:rFonts w:ascii="Cambria Math" w:hAnsi="Cambria Math"/>
-          </w:rPr>
-          <m:t>ρL</m:t>
-        </m:r>
-        <m:sSub>
-          <m:sSubPr>
-            <m:ctrlPr>
-              <w:rPr>
-                <w:rFonts w:ascii="Cambria Math" w:hAnsi="Cambria Math"/>
-              </w:rPr>
-            </m:ctrlPr>
-          </m:sSubPr>
-          <m:e>
-            <m:r>
-              <w:rPr>
-                <w:rFonts w:ascii="Cambria Math" w:hAnsi="Cambria Math"/>
-              </w:rPr>
-              <m:t>C</m:t>
-            </m:r>
-          </m:e>
-          <m:sub>
-            <m:r>
-              <w:rPr>
-                <w:rFonts w:ascii="Cambria Math" w:hAnsi="Cambria Math"/>
-              </w:rPr>
-              <m:t>E</m:t>
-            </m:r>
-          </m:sub>
-        </m:sSub>
-        <m:r>
-          <w:rPr>
-            <w:rFonts w:ascii="Cambria Math" w:hAnsi="Cambria Math"/>
-          </w:rPr>
-          <m:t>U</m:t>
-        </m:r>
-        <m:sSub>
-          <m:sSubPr>
-            <m:ctrlPr>
-              <w:rPr>
-                <w:rFonts w:ascii="Cambria Math" w:hAnsi="Cambria Math"/>
-              </w:rPr>
-            </m:ctrlPr>
-          </m:sSubPr>
-          <m:e>
-            <m:r>
-              <w:rPr>
-                <w:rFonts w:ascii="Cambria Math" w:hAnsi="Cambria Math"/>
-              </w:rPr>
-              <m:t>q</m:t>
-            </m:r>
-          </m:e>
-          <m:sub>
-            <m:r>
-              <w:rPr>
-                <w:rFonts w:ascii="Cambria Math" w:hAnsi="Cambria Math"/>
-              </w:rPr>
-              <m:t>s</m:t>
-            </m:r>
-          </m:sub>
-        </m:sSub>
-        <m:r>
-          <m:rPr>
-            <m:sty m:val="p"/>
-          </m:rPr>
-          <w:rPr>
-            <w:rFonts w:ascii="Cambria Math" w:hAnsi="Cambria Math"/>
-          </w:rPr>
-          <m:t>(1-RH)</m:t>
-        </m:r>
-      </m:oMath>
-      <w:r>
-        <w:rPr>
-          <w:rFonts w:ascii="Aptos" w:hAnsi="Aptos"/>
-        </w:rPr>
-        <w:t xml:space="preserve"> is limited to +2 % K</w:t>
-      </w:r>
-      <w:r>
-        <w:rPr>
-          <w:rFonts w:ascii="Aptos" w:hAnsi="Aptos"/>
-          <w:vertAlign w:val="superscript"/>
-        </w:rPr>
-        <w:t>–1</w:t>
-      </w:r>
-      <w:r>
-        <w:rPr>
-          <w:rFonts w:ascii="Aptos" w:hAnsi="Aptos"/>
-        </w:rPr>
-        <w:t>. This is achieved by</w:t>
-      </w:r>
-      <w:r>
-        <w:rPr>
-          <w:rFonts w:ascii="Aptos" w:hAnsi="Aptos"/>
-        </w:rPr>
-        <w:t xml:space="preserve"> quenching the surface relative saturation deficit </w:t>
-      </w:r>
-      <m:oMath>
-        <m:r>
-          <m:rPr>
-            <m:sty m:val="p"/>
-          </m:rPr>
-          <w:rPr>
-            <w:rFonts w:ascii="Cambria Math" w:hAnsi="Cambria Math"/>
-          </w:rPr>
-          <m:t>1-RH</m:t>
-        </m:r>
-      </m:oMath>
-      <w:r>
-        <w:rPr>
-          <w:rFonts w:ascii="Aptos" w:hAnsi="Aptos"/>
-        </w:rPr>
-        <w:t xml:space="preserve"> by –5 % K</w:t>
-      </w:r>
-      <w:r>
-        <w:rPr>
-          <w:rFonts w:ascii="Aptos" w:hAnsi="Aptos"/>
-          <w:vertAlign w:val="superscript"/>
-        </w:rPr>
-        <w:t>–1</w:t>
-      </w:r>
-      <w:r>
-        <w:rPr>
-          <w:rFonts w:ascii="Aptos" w:hAnsi="Aptos"/>
-        </w:rPr>
-        <w:t>. Taking the mean surface relative humidity at which vapor evaporates in the tropical circulation to be RH = 0.73, the relative saturation deficit 1-RH = 0.27 decreases by –5 % K</w:t>
-      </w:r>
-      <w:r>
-        <w:rPr>
-          <w:rFonts w:ascii="Aptos" w:hAnsi="Aptos"/>
-          <w:vertAlign w:val="superscript"/>
-        </w:rPr>
-        <w:t>–1</w:t>
-      </w:r>
-      <w:r>
-        <w:rPr>
-          <w:rFonts w:ascii="Aptos" w:hAnsi="Aptos"/>
-        </w:rPr>
-        <w:t xml:space="preserve"> to 1–RH = 0.26, an absolute increase of RH of about +0.01 K</w:t>
-      </w:r>
-      <w:r>
-        <w:rPr>
-          <w:rFonts w:ascii="Aptos" w:hAnsi="Aptos"/>
-          <w:vertAlign w:val="superscript"/>
-        </w:rPr>
-        <w:t>–1</w:t>
-      </w:r>
-      <w:r>
-        <w:rPr>
-          <w:rFonts w:ascii="Aptos" w:hAnsi="Aptos"/>
-        </w:rPr>
-        <w:t>.</w:t>
-      </w:r>
+      <w:bookmarkStart w:id="4" w:name="scaling-subcloud-humidity-with-warming"/>
     </w:p>
     <w:p>
       <w:pPr>
@@ -10674,7 +10786,7 @@
         <w:rPr>
           <w:rFonts w:ascii="Aptos" w:hAnsi="Aptos"/>
         </w:rPr>
-        <w:t xml:space="preserve">31 % </w:t>
+        <w:t xml:space="preserve">31% </w:t>
       </w:r>
       <w:r>
         <w:rPr>
@@ -10686,7 +10798,13 @@
         <w:rPr>
           <w:rFonts w:ascii="Aptos" w:hAnsi="Aptos"/>
         </w:rPr>
-        <w:t>(from BASTALIAS, Bony et al., 2022; Vogel et al., 2022). This is near</w:t>
+        <w:t xml:space="preserve">(from BASTALIAS, Bony et al., 2022; Vogel et al., 2022). This is </w:t>
+      </w:r>
+      <w:r>
+        <w:rPr>
+          <w:rFonts w:ascii="Aptos" w:hAnsi="Aptos"/>
+        </w:rPr>
+        <w:t>indistinguishable from</w:t>
       </w:r>
       <w:r>
         <w:rPr>
@@ -10893,7 +11011,19 @@
         <w:rPr>
           <w:rFonts w:ascii="Aptos" w:hAnsi="Aptos"/>
         </w:rPr>
-        <w:t xml:space="preserve"> by 0.975 K</w:t>
+        <w:t xml:space="preserve"> by </w:t>
+      </w:r>
+      <w:r>
+        <w:rPr>
+          <w:rFonts w:ascii="Aptos" w:hAnsi="Aptos"/>
+        </w:rPr>
+        <w:t xml:space="preserve">1 - 0.025 = </w:t>
+      </w:r>
+      <w:r>
+        <w:rPr>
+          <w:rFonts w:ascii="Aptos" w:hAnsi="Aptos"/>
+        </w:rPr>
+        <w:t>0.975 K</w:t>
       </w:r>
       <w:r>
         <w:rPr>

</xml_diff>